<commit_message>
docs: finalize enterprise trust stack, risk engine and legal privacy compliance in architecture report
</commit_message>
<xml_diff>
--- a/BAO_CAO_KIEN_TRUC_VAN_HANH_CLOOP.docx
+++ b/BAO_CAO_KIEN_TRUC_VAN_HANH_CLOOP.docx
@@ -29,9 +29,9 @@
           <w:color w:val="4B5563"/>
           <w:sz w:val="23"/>
         </w:rPr>
-        <w:t>Tài liệu Kỹ thuật, Luận giải Kiến trúc &amp; Chiến lược Thẩm định Techfest</w:t>
+        <w:t>Tài liệu Kỹ thuật, Luận giải Kiến trúc &amp; Chiến lược Quản trị Rủi ro Thẩm định Techfest</w:t>
         <w:br/>
-        <w:t>Phiên bản 3.0 Enterprise • Cập nhật: Tháng 09/2026 • Trạng thái: Live Production</w:t>
+        <w:t>Phiên bản 3.5 Enterprise • Cập nhật: Tháng 09/2026 • Trạng thái: Live Production</w:t>
       </w:r>
     </w:p>
     <w:p>
@@ -44,7 +44,7 @@
           <w:rFonts w:ascii="Times New Roman" w:hAnsi="Times New Roman"/>
           <w:sz w:val="25"/>
         </w:rPr>
-        <w:t>Báo cáo này trình bày chi tiết toàn bộ kiến trúc hạ tầng công nghệ thời gian thực, mô hình dòng tiền Két Escrow, thuật toán logistics san sẻ 50/50, cơ chế quản trị rủi ro và bài toán kinh tế học của nền tảng thời trang tuần hoàn CLOOP. Đặc biệt, tài liệu áp dụng phương pháp luận Đánh giá Kiến trúc và Đánh đổi Chiến lược (Architecture Trade-off &amp; Strategic Evaluation Framework), bóc tách từng quyết định công nghệ và chính sách vận hành theo 5 tầng phân tích: Mục đích thiết kế, Lợi ích thực tế, Ưu điểm vượt trội, Mặt trái/Thách thức tiềm ẩn, và Phương án thay thế dự phòng.</w:t>
+        <w:t>Báo cáo này trình bày chi tiết toàn bộ kiến trúc hạ tầng công nghệ thời gian thực, mô hình dòng tiền điều phối thanh toán (Orchestration Layer), thuật toán logistics san sẻ 50/50, hệ thống CLOOP Trust Stack, bộ tính điểm rủi ro ngầm (Silent Risk Engine), trần kiểm soát rủi ro (Transaction Exposure Limit) và bài toán kinh tế học tuần hoàn của nền tảng CLOOP. Tài liệu áp dụng phương pháp luận Đánh giá Kiến trúc và Đánh đổi Chiến lược (Architecture Trade-off &amp; Strategic Evaluation Framework), bóc tách từng quyết định công nghệ và chính sách vận hành theo 5 tầng phân tích: Mục đích thiết kế, Lợi ích thực tế, Ưu điểm vượt trội, Mặt trái/Thách thức tiềm ẩn, và Phương án thay thế dự phòng, đồng thời tuân thủ nghiêm ngặt Luật Bảo vệ Dữ liệu Cá nhân số 91/2025/QH15 và Nghị định 356/2025/NĐ-CP.</w:t>
       </w:r>
     </w:p>
     <w:p>
@@ -72,7 +72,7 @@
           <w:rFonts w:ascii="Times New Roman" w:hAnsi="Times New Roman"/>
           <w:sz w:val="25"/>
         </w:rPr>
-        <w:t>Nền tảng CLOOP vận hành trên mô hình API-First kết hợp Serverless Microservices. Toàn bộ các tương tác từ định tuyến logistics, dòng tiền thanh toán đến phân bổ dữ liệu đều được tự động hóa 100% không qua can thiệp thủ công.</w:t>
+        <w:t>Nền tảng CLOOP vận hành trên mô hình API-First kết hợp Serverless Microservices. Toàn bộ các tương tác từ định tuyến logistics, dòng tiền thanh toán đến phân bổ dữ liệu được thiết kế theo nguyên lý Tự Động Hóa Tối Đa và Phục Hồi Duyên Dáng (Graceful Degradation).</w:t>
       </w:r>
     </w:p>
     <w:p>
@@ -131,7 +131,7 @@
           <w:rFonts w:ascii="Times New Roman" w:hAnsi="Times New Roman"/>
           <w:sz w:val="25"/>
         </w:rPr>
-        <w:t>Khách hàng biết chính xác 100% phí giao hàng trước khi thanh toán, triệt tiêu hoàn toàn tình trạng 'báo giá một đằng, shipper thu một nẻo'. Chủ tủ không cần tự liên hệ bưu tá hay ghi phiếu gửi thủ công; mã vận đơn (Tracking Code) tự động được cấp phát và đồng bộ trực tiếp vào giao diện quản trị đơn.</w:t>
+        <w:t>Khách hàng biết rõ phí giao hàng dự kiến trước khi thanh toán, giảm thiểu tối đa tình trạng sai lệch cước vận chuyển. Chủ tủ không cần tự liên hệ bưu tá hay ghi phiếu gửi thủ công; mã vận đơn (Tracking Code) tự động được cấp phát và đồng bộ trực tiếp vào giao diện quản trị đơn.</w:t>
       </w:r>
     </w:p>
     <w:p>
@@ -153,7 +153,7 @@
           <w:rFonts w:ascii="Times New Roman" w:hAnsi="Times New Roman"/>
           <w:sz w:val="25"/>
         </w:rPr>
-        <w:t>Độ phủ rộng khắp 63 tỉnh thành đến tận cấp xã/phường; cơ chế Webhook hai chiều tự động kích hoạt cập nhật trạng thái đơn (Đang giao -&gt; Đã giao) mà không cần bưu tá hay người dùng bấm tay.</w:t>
+        <w:t>Độ phủ rộng khắp 63 tỉnh thành đến tận cấp xã/phường; cơ chế Webhook hai chiều tự động kích hoạt cập nhật trạng thái đơn theo vòng đời giao hàng mà không cần bưu tá hay người dùng bấm tay.</w:t>
       </w:r>
     </w:p>
     <w:p>
@@ -175,7 +175,7 @@
           <w:rFonts w:ascii="Times New Roman" w:hAnsi="Times New Roman"/>
           <w:sz w:val="25"/>
         </w:rPr>
-        <w:t>Phụ thuộc hoàn toàn vào uptime của máy chủ GHN. Nếu API bên thứ 3 bảo trì hoặc quá tải, luồng thanh toán có thể bị nghẽn ở bước tính phí ship. Ngoài ra, người dùng nhập sai định dạng địa chỉ có thể khiến API trả về mã lỗi không tìm thấy bưu cục.</w:t>
+        <w:t>Phụ thuộc vào mức độ khả dụng (Uptime) của máy chủ GHN. Nếu API bên thứ 3 bảo trì hoặc quá tải, luồng thanh toán có thể bị chậm trễ ở bước tính phí ship. Ngoài ra, người dùng nhập sai định dạng địa chỉ có thể khiến API trả về mã lỗi không tìm thấy bưu cục.</w:t>
       </w:r>
     </w:p>
     <w:p>
@@ -197,7 +197,7 @@
           <w:rFonts w:ascii="Times New Roman" w:hAnsi="Times New Roman"/>
           <w:sz w:val="25"/>
         </w:rPr>
-        <w:t>Chiến lược Multi-Carrier Failover: Tích hợp thêm Giao Hàng Tiết Kiệm (GHTK) hoặc Viettel Post làm đối tác dự phòng (Fallback Provider). Khi hệ thống phát hiện GHN timeout quá 3 giây, thuật toán tự động chuyển hướng tính cước sang GHTK. Đối với các đơn tiệc cưới gấp nội thành (dưới 15km), bổ sung lựa chọn giao siêu tốc qua Ahamove/GrabExpress.</w:t>
+        <w:t>Chiến lược Multi-Carrier Failover: Tích hợp thêm Giao Hàng Tiết Kiệm (GHTK) hoặc Viettel Post làm đối tác dự phòng (Fallback Provider). Khi hệ thống phát hiện GHN phản hồi quá 3 giây, thuật toán tự động chuyển hướng tính cước sang GHTK. Đối với các đơn tiệc cưới gấp nội thành (dưới 15km), bổ sung lựa chọn giao siêu tốc qua Ahamove/GrabExpress.</w:t>
       </w:r>
     </w:p>
     <w:p>
@@ -212,7 +212,7 @@
           <w:color w:val="183A2D"/>
           <w:sz w:val="26"/>
         </w:rPr>
-        <w:t>2. Cổng Thanh Toán Trực Tuyến &amp; Két Bảo Chứng Escrow (PayOS / VietQR Động)</w:t>
+        <w:t>2. Cổng Thanh Toán Trực Tuyến &amp; Lớp Điều Phối Dòng Tiền (CLOOP Payment Orchestration Layer)</w:t>
       </w:r>
     </w:p>
     <w:p>
@@ -234,7 +234,7 @@
           <w:rFonts w:ascii="Times New Roman" w:hAnsi="Times New Roman"/>
           <w:sz w:val="25"/>
         </w:rPr>
-        <w:t>Mỗi giao dịch thuê phát sinh một mã QR động (VietQR NAPAS247) mã hóa chính xác số tiền cần thanh toán lẻ đến từng đồng và kèm mã định danh giao dịch độc nhất. Toàn bộ số tiền (Tiền thuê + Tiền cọc đồ + Cước ship lượt đi) được gom và khóa chặt trong Két Escrow của CLOOP, chỉ giải ngân cho Chủ tủ sau khi kết thúc chu kỳ thuê an toàn.</w:t>
+        <w:t>Mỗi giao dịch thuê phát sinh một mã QR động (VietQR NAPAS247 qua cổng PayOS) mã hóa chính xác số tiền cần thanh toán lẻ đến từng đồng và kèm mã định danh giao dịch độc nhất. CLOOP đóng vai trò là Lớp Điều Phối Trạng Thái Giao Dịch (Orchestration Layer), kết nối trực tiếp với Cổng Thanh Toán và Ngân Hàng đối tác để phong tỏa số tiền (Tiền thuê + Cọc đồ + Ship đi) và chỉ kích hoạt lệnh giải ngân cho Chủ tủ sau khi hoàn tất chu kỳ nghiệm thu hợp lệ.</w:t>
       </w:r>
     </w:p>
     <w:p>
@@ -256,7 +256,7 @@
           <w:rFonts w:ascii="Times New Roman" w:hAnsi="Times New Roman"/>
           <w:sz w:val="25"/>
         </w:rPr>
-        <w:t>Tạo niềm tin tuyệt đối (Zero-Doubt) cho cả hai phía: Khách thuê không sợ chủ tủ lừa tiền cọc rồi ôm đồ mất tích; Chủ tủ hoàn toàn an tâm gửi trang phục trị giá hàng triệu đồng vì toàn bộ giá trị đã được ký quỹ sẵn trong két bảo chứng.</w:t>
+        <w:t>Tạo niềm tin vững chắc cho cả hai phía: Khách thuê không sợ chủ tủ chiếm giữ tiền cọc bất hợp lý; Chủ tủ hoàn toàn an tâm gửi trang phục có giá trị cao vì toàn bộ giá trị đã được phong tỏa bảo chứng trong hệ thống thanh toán.</w:t>
       </w:r>
     </w:p>
     <w:p>
@@ -278,7 +278,7 @@
           <w:rFonts w:ascii="Times New Roman" w:hAnsi="Times New Roman"/>
           <w:sz w:val="25"/>
         </w:rPr>
-        <w:t>Chi phí vận hành giao dịch cực thấp (gần như 0đ qua cổng thanh toán chuyển khoản NAPAS247 so với mức phí 2.5% - 3.5% của thẻ tín dụng quốc tế Visa/Mastercard); tốc độ xác nhận biến động số dư qua Webhook diễn ra tức thì trong 1 - 2 giây.</w:t>
+        <w:t>Chi phí vận hành giao dịch cực thấp (gần như 0đ qua cổng thanh toán chuyển khoản NAPAS247 so với mức phí 2.5% - 3.5% của thẻ tín dụng quốc tế Visa/Mastercard); tốc độ xác nhận biến động số dư qua Webhook diễn ra gần như tức thì (dưới 2 giây).</w:t>
       </w:r>
     </w:p>
     <w:p>
@@ -300,7 +300,7 @@
           <w:rFonts w:ascii="Times New Roman" w:hAnsi="Times New Roman"/>
           <w:sz w:val="25"/>
         </w:rPr>
-        <w:t>Khách hàng buộc phải có tài khoản ngân hàng nội địa Việt Nam và sử dụng Mobile Banking. Nếu người dùng quét mã xong nhưng tự ý sửa số tiền hoặc nhập sai nội dung chuyển khoản thủ công, hệ thống phải kích hoạt cơ chế đối soát ngoại lệ (Exception Handling) qua Admin.</w:t>
+        <w:t>Khách hàng cần có tài khoản ngân hàng nội địa Việt Nam và sử dụng ứng dụng Mobile Banking. Nếu người dùng quét mã xong nhưng tự ý sửa số tiền hoặc nhập sai nội dung chuyển khoản thủ công, hệ thống phải kích hoạt cơ chế đối soát ngoại lệ (Exception Handling) qua Admin.</w:t>
       </w:r>
     </w:p>
     <w:p>
@@ -381,7 +381,7 @@
           <w:rFonts w:ascii="Times New Roman" w:hAnsi="Times New Roman"/>
           <w:sz w:val="25"/>
         </w:rPr>
-        <w:t>Loại bỏ 100% nguy cơ trùng lịch thuê (Double-booking) – bài toán nhức nhối nhất của các sàn cho thuê đồ P2P khi 2 người cùng bấm đặt 1 chiếc đầm duy nhất cho cùng một ngày dạ tiệc.</w:t>
+        <w:t>Giảm thiểu tối đa rủi ro tranh chấp dữ liệu (Race Conditions) và loại bỏ nguy cơ trùng lịch thuê (Double-booking) – bài toán cốt lõi của các sàn cho thuê đồ P2P khi 2 người cùng bấm đặt 1 chiếc đầm duy nhất cho cùng một ngày dạ tiệc.</w:t>
       </w:r>
     </w:p>
     <w:p>
@@ -403,7 +403,7 @@
           <w:rFonts w:ascii="Times New Roman" w:hAnsi="Times New Roman"/>
           <w:sz w:val="25"/>
         </w:rPr>
-        <w:t>Đảm bảo tính toàn vẹn dữ liệu chuẩn ACID ở mức nghiêm ngặt nhất (Strict Consistency), không để xảy ra tranh chấp dữ liệu (Race Conditions) ngay cả khi hàng nghìn người cùng truy cập săn đồ dịp lễ Tết.</w:t>
+        <w:t>Đảm bảo tính toàn vẹn dữ liệu chuẩn ACID ở mức nghiêm ngặt (Strict Consistency), duy trì tính nhất quán của trạng thái lịch hẹn ngay cả trong các khung giờ cao điểm có lượng truy cập tăng vọt.</w:t>
       </w:r>
     </w:p>
     <w:p>
@@ -462,7 +462,7 @@
           <w:color w:val="183A2D"/>
           <w:sz w:val="26"/>
         </w:rPr>
-        <w:t>4. Phân Phối &amp; Tối Ưu Hóa Hình Ảnh (Cloudinary CDN &amp; Next.js Image Optimization)</w:t>
+        <w:t>4. Phân Phối &amp; Tối Ưu Hóa Hình Ảnh (Cloudinary CDN &amp; Next.js Image Engine)</w:t>
       </w:r>
     </w:p>
     <w:p>
@@ -506,7 +506,7 @@
           <w:rFonts w:ascii="Times New Roman" w:hAnsi="Times New Roman"/>
           <w:sz w:val="25"/>
         </w:rPr>
-        <w:t>Tốc độ tải trang sản phẩm đạt chuẩn quốc tế dưới 1 giây; giảm đến 70% dung lượng băng thông tiêu thụ trên mạng di động 4G/5G của khách hàng; tăng chỉ số trải nghiệm Google Core Web Vitals (LCP, CLS) lên mức tuyệt đối.</w:t>
+        <w:t>Tốc độ tải trang sản phẩm đạt chuẩn cao cấp; giảm đến 70% dung lượng băng thông tiêu thụ trên mạng di động 4G/5G của khách hàng; tối ưu hóa các chỉ số trải nghiệm Google Core Web Vitals (LCP, CLS).</w:t>
       </w:r>
     </w:p>
     <w:p>
@@ -550,7 +550,7 @@
           <w:rFonts w:ascii="Times New Roman" w:hAnsi="Times New Roman"/>
           <w:sz w:val="25"/>
         </w:rPr>
-        <w:t>Nếu lượng ảnh tải lên tăng đột biến vượt hạn ngạch gói dịch vụ miễn phí/tiêu chuẩn của Cloudinary, chi phí lưu trữ và băng thông API có thể tăng vọt theo cấp số nhân.</w:t>
+        <w:t>Nếu lượng ảnh tải lên tăng đột biến vượt hạn ngạch gói dịch vụ miễn phí/tiêu chuẩn của Cloudinary, chi phí lưu trữ và băng thông API có thể tăng theo cấp số nhân.</w:t>
       </w:r>
     </w:p>
     <w:p>
@@ -631,7 +631,7 @@
           <w:rFonts w:ascii="Times New Roman" w:hAnsi="Times New Roman"/>
           <w:sz w:val="25"/>
         </w:rPr>
-        <w:t>Chủ tủ không cần tốn thời gian gõ mô tả sản phẩm; khách hàng có một chuyên gia thời trang ảo túc trực 24/7. Nâng cao tỷ lệ chuyển đổi mua/thuê hàng (CRO) và giữ chân người dùng trên trang lâu hơn gấp 3 lần.</w:t>
+        <w:t>Chủ tủ không cần tốn thời gian gõ mô tả sản phẩm; khách hàng có một chuyên gia thời trang ảo túc trực 24/7. Nâng cao tỷ lệ chuyển đổi mua/thuê hàng (CRO) và tăng thời gian tương tác trung bình của người dùng trên trang.</w:t>
       </w:r>
     </w:p>
     <w:p>
@@ -653,7 +653,7 @@
           <w:rFonts w:ascii="Times New Roman" w:hAnsi="Times New Roman"/>
           <w:sz w:val="25"/>
         </w:rPr>
-        <w:t>Đạt tổng công suất phục vụ lên tới 9.000 requests/ngày mà hoàn toàn không phát sinh chi phí bản quyền AI trong giai đoạn tiền thương mại hóa của Techfest; tự động vượt rào cản Rate Limit (RPM/RPD) thông qua thuật toán ngắt mạch tự phục hồi (Circuit Breaker).</w:t>
+        <w:t>Đạt công suất thiết kế lên tới 9.000 requests/ngày mà hoàn toàn không phát sinh chi phí bản quyền AI trong giai đoạn tiền thương mại hóa của Techfest; tự động vượt rào cản Rate Limit (RPM/RPD) thông qua thuật toán ngắt mạch tự phục hồi (Circuit Breaker).</w:t>
       </w:r>
     </w:p>
     <w:p>
@@ -756,7 +756,7 @@
           <w:rFonts w:ascii="Times New Roman" w:hAnsi="Times New Roman"/>
           <w:sz w:val="25"/>
         </w:rPr>
-        <w:t>Lưu trữ được hàng chục nghìn video kiểm định độ phân giải 4K mà không làm tiêu hao dung lượng đắt đỏ của cơ sở dữ liệu chính (Supabase) hay kho ảnh (Cloudinary); tạo bằng chứng pháp lý đanh thép giải quyết khiếu nại.</w:t>
+        <w:t>Lưu trữ được hàng chục nghìn video kiểm định độ phân giải cao mà không làm tiêu hao dung lượng đắt đỏ của cơ sở dữ liệu chính (Supabase) hay kho ảnh (Cloudinary); tạo bằng chứng khách quan giải quyết khiếu nại.</w:t>
       </w:r>
     </w:p>
     <w:p>
@@ -778,7 +778,7 @@
           <w:rFonts w:ascii="Times New Roman" w:hAnsi="Times New Roman"/>
           <w:sz w:val="25"/>
         </w:rPr>
-        <w:t>Dung lượng lưu trữ khổng lồ 10TB với chi phí 0 đồng, không bị bóp băng thông bởi các nhà cung cấp hosting web thông thường.</w:t>
+        <w:t>Dung lượng lưu trữ lên tới 10TB với chi phí tối ưu trong giai đoạn khởi nghiệp, không bị bóp băng thông bởi các nhà cung cấp hosting web thông thường.</w:t>
       </w:r>
     </w:p>
     <w:p>
@@ -822,7 +822,7 @@
           <w:rFonts w:ascii="Times New Roman" w:hAnsi="Times New Roman"/>
           <w:sz w:val="25"/>
         </w:rPr>
-        <w:t>Chuyển dịch sang dịch vụ lưu trữ lạnh chuyên nghiệp: AWS S3 Glacier Deep Archive hoặc Cloudflare R2 (không tính phí băng thông tải ra - Zero Egress Fee) với chi phí chỉ khoảng 0.00099$/GB/tháng, đảm bảo lưu trữ an toàn hồ sơ tranh chấp trong 3 năm theo luật thương mại điện tử.</w:t>
+        <w:t>Chuyển dịch sang dịch vụ lưu trữ lạnh chuyên nghiệp: AWS S3 Glacier Deep Archive hoặc Cloudflare R2 (không tính phí băng thông tải ra - Zero Egress Fee) với chi phí chỉ khoảng 0.00099$/GB/tháng, đảm bảo lưu trữ an toàn hồ sơ tranh chấp theo thời hạn quy định.</w:t>
       </w:r>
     </w:p>
     <w:p>
@@ -909,7 +909,7 @@
           <w:rFonts w:ascii="Times New Roman" w:hAnsi="Times New Roman"/>
           <w:sz w:val="25"/>
         </w:rPr>
-        <w:t>Hạ thấp rào cản tâm lý cho khách thuê (chỉ thấy phí ship 25k như mua hàng thông thường); Chủ tủ vui vẻ vì chi phí lượt về được khấu trừ tự động từ lợi nhuận chứ không phải bỏ tiền túi trước. Phần chênh lệch làm tròn tạo ra dòng thặng dư dương (+4.000đ đến +8.000đ mỗi đơn hàng) tích lũy trực tiếp vào Quỹ Phòng Vệ Rủi Ro Vận Chuyển của sàn.</w:t>
+        <w:t>Hạ thấp rào cản tâm lý cho khách thuê (chỉ thấy phí ship 25k như mua hàng thông thường); Chủ tủ thoải mái vì chi phí lượt về được khấu trừ tự động từ doanh thu chứ không phải bỏ tiền túi trước. Phần chênh lệch làm tròn tạo ra dòng thặng dư dương (+4.000đ đến +8.000đ mỗi đơn hàng) tích lũy trực tiếp vào Quỹ Phòng Vệ Rủi Ro Vận Chuyển của sàn.</w:t>
       </w:r>
     </w:p>
     <w:p>
@@ -931,7 +931,7 @@
           <w:rFonts w:ascii="Times New Roman" w:hAnsi="Times New Roman"/>
           <w:sz w:val="25"/>
         </w:rPr>
-        <w:t>Tạo cơ chế tự bảo hiểm rủi ro tài chính (Self-Insured Logistics Pool): Sàn không bao giờ bị âm vốn vận chuyển, kể cả khi bưu tá phụ thu phụ phí giao lại lần 2 hoặc hàng hóa cần chuyển hoàn.</w:t>
+        <w:t>Tạo cơ chế tự bù đắp rủi ro vận hành (Self-Insured Logistics Pool): Giảm thiểu nguy cơ sàn bị âm vốn vận chuyển khi bưu tá phụ thu phụ phí giao lại lần 2 hoặc hàng hóa cần chuyển hoàn.</w:t>
       </w:r>
     </w:p>
     <w:p>
@@ -1634,7 +1634,7 @@
           <w:color w:val="0F4A34"/>
           <w:sz w:val="28"/>
         </w:rPr>
-        <w:t>III. MA TRẬN DÒNG TIỀN KÉT ESCROW &amp; BẢO TOÀN VỐN (ZERO-LEAKAGE)</w:t>
+        <w:t>III. MA TRẬN DÒNG TIỀN &amp; LỚP ĐIỀU PHỐI THANH TOÁN (ORCHESTRATION LAYER)</w:t>
       </w:r>
     </w:p>
     <w:p>
@@ -1647,7 +1647,7 @@
           <w:rFonts w:ascii="Times New Roman" w:hAnsi="Times New Roman"/>
           <w:sz w:val="25"/>
         </w:rPr>
-        <w:t>Toàn bộ tài chính của CLOOP tuân thủ nguyên tắc Kế toán Kép (Double-Entry Bookkeeping). Két Escrow đóng vai trò như một Ngân hàng Ký quỹ Độc lập, kiểm soát chặt chẽ từng đồng luân chuyển.</w:t>
+        <w:t>Toàn bộ tài chính của CLOOP tuân thủ nguyên tắc Kế toán Kép (Double-Entry Bookkeeping). Lớp điều phối đóng vai trò trung gian kiểm soát trạng thái giao dịch, kết nối trực tiếp với cổng thanh toán để đảm bảo tính minh bạch.</w:t>
       </w:r>
     </w:p>
     <w:tbl>
@@ -1746,7 +1746,7 @@
                 <w:color w:val="0A2517"/>
                 <w:sz w:val="22"/>
               </w:rPr>
-              <w:t>Két Escrow CLOOP</w:t>
+              <w:t>Tài khoản Ký quỹ Đối tác</w:t>
             </w:r>
           </w:p>
         </w:tc>
@@ -2470,7 +2470,7 @@
           <w:rFonts w:ascii="Times New Roman" w:hAnsi="Times New Roman"/>
           <w:sz w:val="25"/>
         </w:rPr>
-        <w:t>Khi khách trả hàng, Chủ tủ có thời hạn 24 giờ để kiểm tra tình trạng váy/áo. Nếu đồ nguyên vẹn hoặc quá 24 giờ mà chủ tủ không phản hồi, hệ thống kích hoạt Server Action tự động: Hoàn trả 100% tiền cọc về tài khoản khách thuê, giải ngân tiền thuê về ví chủ tủ và ghi nhận doanh thu phí sàn vào tài khoản CLOOP.</w:t>
+        <w:t>Khi khách trả hàng, Chủ tủ có thời hạn 24 giờ để kiểm tra tình trạng váy/áo. Nếu đồ nguyên vẹn hoặc quá 24 giờ mà chủ tủ không phản hồi, hệ thống kích hoạt Server Action tự động: Hoàn trả 100% tiền cọc về tài khoản khách thuê, giải ngân tiền thuê về ví chủ tủ và ghi nhận doanh thu phí dịch vụ vào tài khoản CLOOP.</w:t>
       </w:r>
     </w:p>
     <w:p>
@@ -2492,7 +2492,7 @@
           <w:rFonts w:ascii="Times New Roman" w:hAnsi="Times New Roman"/>
           <w:sz w:val="25"/>
         </w:rPr>
-        <w:t>Bảo vệ người thuê khỏi hành vi cố tình chây ì không trả cọc của chủ tủ; đồng thời cho chủ tủ đủ thời gian kiểm tra kỹ lưỡng các lỗi rách/bẩn tiềm ẩn dưới ánh sáng tự nhiên trước khi tiền cọc được nhả ra.</w:t>
+        <w:t>Bảo vệ người thuê khỏi hành vi cố tình chây ì không trả cọc của chủ tủ; đồng thời cho chủ tủ đủ thời gian kiểm tra kỹ lưỡng các lỗi rách/bẩn tiềm ẩn dưới ánh sáng tự nhiên trước khi tiền cọc được giải phóng.</w:t>
       </w:r>
     </w:p>
     <w:p>
@@ -2514,7 +2514,7 @@
           <w:rFonts w:ascii="Times New Roman" w:hAnsi="Times New Roman"/>
           <w:sz w:val="25"/>
         </w:rPr>
-        <w:t>Tính kỷ luật tài chính tuyệt đối: Loại trừ hoàn toàn tình trạng thất thoát dòng tiền (Zero-Leakage); dòng tiền của các bên tách bạch độc lập trên sổ cái kế toán.</w:t>
+        <w:t>Tính kỷ luật tài chính cao: Giảm thiểu tối đa nguy cơ thất thoát dòng tiền; dòng tiền của các bên tách bạch độc lập trên sổ cái kế toán.</w:t>
       </w:r>
     </w:p>
     <w:p>
@@ -2536,7 +2536,7 @@
           <w:rFonts w:ascii="Times New Roman" w:hAnsi="Times New Roman"/>
           <w:sz w:val="25"/>
         </w:rPr>
-        <w:t>Thời gian giữ tiền 24H - 48H có thể khiến các chủ tủ cá nhân cảm thấy sốt ruột và so sánh với mô hình giao dịch tiền mặt trực tiếp.</w:t>
+        <w:t>Thời gian phong tỏa tiền 24H - 48H có thể khiến các chủ tủ cá nhân cảm thấy sốt ruột so với mô hình giao dịch tiền mặt trực tiếp.</w:t>
       </w:r>
     </w:p>
     <w:p>
@@ -2588,7 +2588,7 @@
           <w:rFonts w:ascii="Times New Roman" w:hAnsi="Times New Roman"/>
           <w:sz w:val="25"/>
         </w:rPr>
-        <w:t>Hệ thống vận hành được thiết kế với các quy tắc rẽ nhánh tự động (Decision Tree) để bao quát 100% các tình huống biên phát sinh trong thực tế:</w:t>
+        <w:t>Hệ thống vận hành được thiết kế với các quy tắc rẽ nhánh tự động (Decision Tree) để bao quát các tình huống biên phát sinh trong thực tế:</w:t>
       </w:r>
     </w:p>
     <w:p>
@@ -2772,7 +2772,7 @@
           <w:rFonts w:ascii="Times New Roman" w:hAnsi="Times New Roman"/>
           <w:sz w:val="25"/>
         </w:rPr>
-        <w:t>Chủ tủ hoàn toàn không bị thiệt hại tài chính; sàn không phải bỏ tiền túi bù lỗ chi phí vận chuyển 2 chiều cho hành vi bốc đồng của khách.</w:t>
+        <w:t>Chủ tủ giảm thiểu thiệt hại tài chính; sàn hạn chế tối đa việc phải bỏ tiền túi bù lỗ chi phí vận chuyển 2 chiều cho hành vi bốc đồng của khách.</w:t>
       </w:r>
     </w:p>
     <w:p>
@@ -2838,7 +2838,7 @@
           <w:rFonts w:ascii="Times New Roman" w:hAnsi="Times New Roman"/>
           <w:sz w:val="25"/>
         </w:rPr>
-        <w:t>Tích hợp tin nhắn cảnh báo tự động qua Zalo ZNS / SMS trước khi bưu tá đến lấy hàng 1 giờ, kèm nút xác nhận 'Tôi chắc chắn nhận đồ' để giảm tỷ lệ từ chối nhận hàng (Boom hàng) xuống dưới 1%.</w:t>
+        <w:t>Tích hợp tin nhắn cảnh báo tự động qua Zalo ZNS / SMS trước khi bưu tá đến lấy hàng 1 giờ, kèm nút xác nhận 'Tôi chắc chắn nhận đồ' để giảm tỷ lệ từ chối nhận hàng xuống mức tối thiểu.</w:t>
       </w:r>
     </w:p>
     <w:p>
@@ -2875,7 +2875,7 @@
           <w:rFonts w:ascii="Times New Roman" w:hAnsi="Times New Roman"/>
           <w:sz w:val="25"/>
         </w:rPr>
-        <w:t>Bắt buộc Chủ tủ quay video/chụp ảnh tình trạng vải và tem niêm phong lúc đóng gói; nhắc nhở Khách thuê quay video mở hộp unboxing. Khi có khiếu nại, toàn bộ tiền cọc bị khóa trong Két Escrow và kích hoạt Hội đồng Trọng tài 3 bên (Khách - Chủ tủ - Admin CLOOP) phân xử dựa trên dữ liệu video trên kho 10TB.</w:t>
+        <w:t>Bắt buộc Chủ tủ quay video/chụp ảnh tình trạng vải và tem niêm phong lúc đóng gói; nhắc nhở Khách thuê quay video mở hộp unboxing. Khi có khiếu nại, toàn bộ tiền cọc bị phong tỏa trong hệ thống và kích hoạt Hội đồng Trọng tài 3 bên (Khách - Chủ tủ - Admin CLOOP) phân xử dựa trên dữ liệu video trên kho đối soát.</w:t>
       </w:r>
     </w:p>
     <w:p>
@@ -2897,7 +2897,7 @@
           <w:rFonts w:ascii="Times New Roman" w:hAnsi="Times New Roman"/>
           <w:sz w:val="25"/>
         </w:rPr>
-        <w:t>Có bằng chứng khách quan, không thể chối cãi để phân định lỗi thuộc về khâu nào (chủ tủ gửi đồ cũ rách, khách làm bẩn trong lúc mặc tiệc, hay bưu tá làm rách hộp trong lúc vận chuyển).</w:t>
+        <w:t>Có bằng chứng khách quan để phân định lỗi thuộc về khâu nào (chủ tủ gửi đồ cũ rách, khách làm bẩn trong lúc mặc tiệc, hay bưu tá làm rách hộp trong lúc vận chuyển).</w:t>
       </w:r>
     </w:p>
     <w:p>
@@ -2919,7 +2919,7 @@
           <w:rFonts w:ascii="Times New Roman" w:hAnsi="Times New Roman"/>
           <w:sz w:val="25"/>
         </w:rPr>
-        <w:t>Bảo vệ 100% giá trị tài sản trang phục cao cấp; triệt tiêu hoàn toàn tình trạng vu khống hoặc gian lận đền cọc.</w:t>
+        <w:t>Bảo vệ giá trị tài sản trang phục cao cấp; hạn chế tối đa tình trạng vu khống hoặc tranh chấp không có cơ sở.</w:t>
       </w:r>
     </w:p>
     <w:p>
@@ -2963,9 +2963,9 @@
           <w:rFonts w:ascii="Times New Roman" w:hAnsi="Times New Roman"/>
           <w:sz w:val="25"/>
         </w:rPr>
-        <w:t>1. Gói Bảo Hiểm Vi Mô 'CLOOP Care' (10.000đ/đơn): Bảo hiểm chi trả 100% chi phí giặt hấp hoặc xử lý các vết bẩn thông thường (vết rượu vang, cà phê, son môi) mà không cần giữ cọc hay tranh chấp.</w:t>
+        <w:t>1. Gói Bảo Hiểm Vi Mô 'CLOOP Care' (10.000đ/đơn): Bảo hiểm chi trả chi phí giặt hấp hoặc xử lý các vết bẩn thông thường (vết rượu vang, cà phê, son môi) mà không cần giữ cọc hay tranh chấp.</w:t>
         <w:br/>
-        <w:t>2. Ứng dụng AI Computer Vision: Tự động so khớp video/ảnh trước khi gửi và sau khi nhận để tự động phát hiện vết xước rách mà không cần nhân sự xem thủ công.</w:t>
+        <w:t>2. Cơ Chế Phân Xử Vi Mô Tự Động (Micro-Resolution $\le 50.000$đ) kết hợp AI Computer Vision: Tự động đền bù lỗi nhỏ và dùng AI so khớp ảnh trước/sau giao hàng.</w:t>
       </w:r>
     </w:p>
     <w:p>
@@ -3396,7 +3396,7 @@
           <w:rFonts w:ascii="Times New Roman" w:hAnsi="Times New Roman"/>
           <w:sz w:val="25"/>
         </w:rPr>
-        <w:t>Chi phí thu hút khách hàng (CAC) giảm đến 80%; tỷ lệ gắn kết và giữ chân đối tác (Lender Retention) đạt trên 90% do họ cảm thấy được tôn vinh như những người đồng sáng lập.</w:t>
+        <w:t>Chi phí thu hút khách hàng (CAC) giảm mạnh; tỷ lệ gắn kết và giữ chân đối tác (Lender Retention) đạt mức cao do họ cảm thấy được tôn vinh như những người đồng sáng lập.</w:t>
       </w:r>
     </w:p>
     <w:p>
@@ -3418,7 +3418,7 @@
           <w:rFonts w:ascii="Times New Roman" w:hAnsi="Times New Roman"/>
           <w:sz w:val="25"/>
         </w:rPr>
-        <w:t>Sàn phải chịu mức doanh thu hoa hồng bằng 0 trong 3 - 6 tháng đầu tiên, toàn bộ chi phí vận hành server phải dựa vào nguồn vốn hạt giống hoặc tài trợ cuộc thi.</w:t>
+        <w:t>Sàn chịu mức doanh thu hoa hồng bằng 0 trong 3 - 6 tháng đầu tiên, toàn bộ chi phí vận hành server phải dựa vào nguồn vốn hạt giống hoặc tài trợ cuộc thi.</w:t>
       </w:r>
     </w:p>
     <w:p>
@@ -3459,7 +3459,7 @@
           <w:color w:val="0F4A34"/>
           <w:sz w:val="28"/>
         </w:rPr>
-        <w:t>VI. CƠ CHẾ ĐÁNH GIÁ CHỐNG SPAM (VERIFIED RENTERS ONLY) &amp; TOKENOMICS LEAF COINS</w:t>
+        <w:t>VI. CƠ CHẾ ĐÁNH GIÁ XÁC THỰC THEO GIAO DỊCH &amp; TOKENOMICS LEAF COINS</w:t>
       </w:r>
     </w:p>
     <w:p>
@@ -3472,7 +3472,7 @@
           <w:rFonts w:ascii="Times New Roman" w:hAnsi="Times New Roman"/>
           <w:sz w:val="25"/>
         </w:rPr>
-        <w:t>Uy tín (Trust &amp; Safety) là yếu tố sống còn của mô hình kinh tế tuần hoàn P2P. CLOOP áp dụng cơ chế xác thực đánh giá nghiêm ngặt nhất thị trường:</w:t>
+        <w:t>Uy tín (Trust &amp; Safety) là yếu tố sống còn của mô hình kinh tế tuần hoàn P2P. CLOOP áp dụng cơ chế xác thực đánh giá nghiêm ngặt:</w:t>
       </w:r>
     </w:p>
     <w:p>
@@ -3509,7 +3509,7 @@
           <w:rFonts w:ascii="Times New Roman" w:hAnsi="Times New Roman"/>
           <w:sz w:val="25"/>
         </w:rPr>
-        <w:t>Hệ thống khóa chặt chức năng viết đánh giá. Chỉ những tài khoản có đơn hàng thuê thực tế ở trạng thái HOÀN TẤT TRẢ ĐỒ (LENDER_COMPLETED hoặc BORROWER_RETURNED) mới được mở khóa form đánh giá. Khi hoàn tất đánh giá có nội dung và xếp hạng sao thật, hệ thống tự động thưởng +50 Leaf Coins vào ví người dùng và ghi nhật ký vào sổ cái CoinLedgerEntry. Gỡ bỏ hoàn toàn mọi đánh giá ảo hardcode và icon lấp lánh trang trí.</w:t>
+        <w:t>Hệ thống khóa chức năng viết đánh giá. Chỉ những tài khoản có đơn hàng thuê thực tế ở trạng thái HOÀN TẤT TRẢ ĐỒ (LENDER_COMPLETED hoặc BORROWER_RETURNED) mới được mở khóa form đánh giá. Khi hoàn tất đánh giá có nội dung và xếp hạng sao thật, hệ thống tự động thưởng +50 Leaf Coins vào ví người dùng và ghi nhật ký vào sổ cái CoinLedgerEntry. Loại bỏ đánh giá ảo hardcode và các hiệu ứng trang trí không phản ánh dữ liệu thật.</w:t>
       </w:r>
     </w:p>
     <w:p>
@@ -3531,7 +3531,7 @@
           <w:rFonts w:ascii="Times New Roman" w:hAnsi="Times New Roman"/>
           <w:sz w:val="25"/>
         </w:rPr>
-        <w:t>Loại bỏ 100% vấn nạn đánh giá ảo, tự đặt đơn ảo để tự khen, hoặc đối thủ chơi xấu dội review 1 sao; bảo vệ uy tín chân thực của từng bộ váy; Leaf Coins tạo động lực thôi thúc khách hàng tái thuê đồ nhiều lần.</w:t>
+        <w:t>Giảm thiểu tối đa vấn nạn đánh giá ảo, tự đặt đơn ảo để tự khen, hoặc đối thủ chơi xấu dội review 1 sao; bảo vệ uy tín chân thực của từng bộ váy; Leaf Coins tạo động lực thôi thúc khách hàng tái thuê đồ nhiều lần.</w:t>
       </w:r>
     </w:p>
     <w:p>
@@ -3553,7 +3553,7 @@
           <w:rFonts w:ascii="Times New Roman" w:hAnsi="Times New Roman"/>
           <w:sz w:val="25"/>
         </w:rPr>
-        <w:t>Xây dựng niềm tin trung thực tuyệt đối cho cộng đồng; chỉ số xếp hạng phản ánh đúng 100% chất lượng dịch vụ và độ mới của trang phục thực tế.</w:t>
+        <w:t>Xây dựng niềm tin trung thực cho cộng đồng; chỉ số xếp hạng phản ánh đúng chất lượng dịch vụ và độ mới của trang phục thực tế.</w:t>
       </w:r>
     </w:p>
     <w:p>
@@ -3614,7 +3614,7 @@
           <w:color w:val="0F4A34"/>
           <w:sz w:val="28"/>
         </w:rPr>
-        <w:t>VII. KIẾN TRÚC HIỆU NĂNG ZERO-LATENCY &amp; TỐI ƯU HÓA HẠ TẦNG VẬN HÀNH</w:t>
+        <w:t>VII. KIẾN TRÚC HIỆU NĂNG TỐI ƯU &amp; BỘ NHỚ ĐỆM IN-MEMORY SWR</w:t>
       </w:r>
     </w:p>
     <w:p>
@@ -3686,7 +3686,7 @@
           <w:rFonts w:ascii="Times New Roman" w:hAnsi="Times New Roman"/>
           <w:sz w:val="25"/>
         </w:rPr>
-        <w:t>Tốc độ phản hồi trang chi tiết sản phẩm đạt 0 - 1 ms từ bộ nhớ đệm; thời gian build toàn bộ ứng dụng trên máy chủ Vercel giảm hơn 50% (từ 32.7s xuống còn 15.9s); dung lượng lưu trữ build artifacts giảm mạnh, triệt tiêu nguy cơ vượt hạn mức lưu trữ Vercel Storage 10GB.</w:t>
+        <w:t>Mục tiêu độ trễ phản hồi trang sản phẩm đạt dưới 1000ms trong điều kiện kết nối tiêu chuẩn, tối ưu qua bộ nhớ đệm In-memory Cache; thời gian build toàn bộ ứng dụng trên máy chủ Vercel giảm hơn 50% (từ 32.7s xuống còn 15.9s); dung lượng lưu trữ build artifacts giảm mạnh, triệt tiêu nguy cơ vượt hạn mức lưu trữ Vercel Storage 10GB.</w:t>
       </w:r>
     </w:p>
     <w:p>
@@ -3708,7 +3708,7 @@
           <w:rFonts w:ascii="Times New Roman" w:hAnsi="Times New Roman"/>
           <w:sz w:val="25"/>
         </w:rPr>
-        <w:t>Người dùng bấm vào sản phẩm thấy nội dung hiển thị ngay lập tức không có độ trễ xoay vòng tròn (Spinning Loader); tối ưu hóa SEO tối đa cho công cụ tìm kiếm Google.</w:t>
+        <w:t>Người dùng xem sản phẩm thấy nội dung hiển thị nhanh chóng, giảm tối đa độ trễ tải trang; tối ưu hóa SEO cho công cụ tìm kiếm Google.</w:t>
       </w:r>
     </w:p>
     <w:p>
@@ -3767,7 +3767,1327 @@
           <w:color w:val="0F4A34"/>
           <w:sz w:val="28"/>
         </w:rPr>
-        <w:t>VIII. BẢNG TỔNG HỢP MA TRẬN QUẢN TRỊ RỦI RO TOÀN DIỆN (RISK MATRIX)</w:t>
+        <w:t>VIII. KIẾN TRÚC 'CLOOP TRUST STACK' &amp; PROGRESSIVE RISK ENGINE</w:t>
+      </w:r>
+    </w:p>
+    <w:p>
+      <w:pPr>
+        <w:spacing w:after="80"/>
+        <w:jc w:val="both"/>
+      </w:pPr>
+      <w:r>
+        <w:rPr>
+          <w:rFonts w:ascii="Times New Roman" w:hAnsi="Times New Roman"/>
+          <w:sz w:val="25"/>
+        </w:rPr>
+        <w:t>Đây là bước đột phá mang tính bản lề của CLOOP. Thay vì áp dụng cơ chế eKYC nặng nề (bắt chụp CCCD + selfie + giấy viết tay ngay lúc đăng ký - điều vừa gây rớt tỷ lệ chuyển đổi, vừa không chặn được lừa đảo chuyên nghiệp, lại tiềm ẩn rủi ro pháp lý theo Luật Bảo vệ Dữ liệu Cá nhân), CLOOP chuyển dịch sang mô hình 'Trust Stack Tích Lũy Lũy Tiến' và 'Kiểm Soát Trần Thiệt Hại' (Damage Isolation).</w:t>
+      </w:r>
+    </w:p>
+    <w:p>
+      <w:pPr>
+        <w:keepNext/>
+        <w:spacing w:before="200" w:after="80"/>
+      </w:pPr>
+      <w:r>
+        <w:rPr>
+          <w:rFonts w:ascii="Times New Roman" w:hAnsi="Times New Roman"/>
+          <w:b/>
+          <w:color w:val="183A2D"/>
+          <w:sz w:val="26"/>
+        </w:rPr>
+        <w:t>1. Tầng Account Trust (Quyền Kiểm Soát Tài Khoản) &amp; Identity as a Privilege</w:t>
+      </w:r>
+    </w:p>
+    <w:p>
+      <w:pPr>
+        <w:pStyle w:val="ListBullet"/>
+        <w:spacing w:after="60"/>
+        <w:jc w:val="both"/>
+      </w:pPr>
+      <w:r>
+        <w:rPr>
+          <w:rFonts w:ascii="Times New Roman" w:hAnsi="Times New Roman"/>
+          <w:b/>
+          <w:sz w:val="25"/>
+        </w:rPr>
+        <w:t xml:space="preserve">1. Bản chất &amp; Mục đích (Làm như vậy để làm gì?): </w:t>
+      </w:r>
+      <w:r>
+        <w:rPr>
+          <w:rFonts w:ascii="Times New Roman" w:hAnsi="Times New Roman"/>
+          <w:sz w:val="25"/>
+        </w:rPr>
+        <w:t>Đăng ký ban đầu cực nhẹ qua Supabase Auth: Chỉ cần Email OTP / Magic Link và Số điện thoại. Đây là bước chứng minh quyền kiểm soát tài khoản, không gọi là eKYC. Xác minh danh tính sinh viên (@edu.vn) hay giấy tờ chỉ xuất hiện như một QUYỀN LỢI (Privilege) khi người dùng chủ động muốn 'Giảm tiền cọc' hoặc 'Mở rộng hạn mức thuê đồ cao cấp'.</w:t>
+      </w:r>
+    </w:p>
+    <w:p>
+      <w:pPr>
+        <w:pStyle w:val="ListBullet"/>
+        <w:spacing w:after="60"/>
+        <w:jc w:val="both"/>
+      </w:pPr>
+      <w:r>
+        <w:rPr>
+          <w:rFonts w:ascii="Times New Roman" w:hAnsi="Times New Roman"/>
+          <w:b/>
+          <w:sz w:val="25"/>
+        </w:rPr>
+        <w:t xml:space="preserve">2. Lợi ích thực tế (Có lợi ích gì?): </w:t>
+      </w:r>
+      <w:r>
+        <w:rPr>
+          <w:rFonts w:ascii="Times New Roman" w:hAnsi="Times New Roman"/>
+          <w:sz w:val="25"/>
+        </w:rPr>
+        <w:t>Giảm thiểu 90% ma sát đăng ký ban đầu cho người dùng trẻ Gen Z; tỷ lệ kích hoạt tài khoản thành công tăng vọt; tôn trọng quyền riêng tư.</w:t>
+      </w:r>
+    </w:p>
+    <w:p>
+      <w:pPr>
+        <w:pStyle w:val="ListBullet"/>
+        <w:spacing w:after="60"/>
+        <w:jc w:val="both"/>
+      </w:pPr>
+      <w:r>
+        <w:rPr>
+          <w:rFonts w:ascii="Times New Roman" w:hAnsi="Times New Roman"/>
+          <w:b/>
+          <w:sz w:val="25"/>
+        </w:rPr>
+        <w:t xml:space="preserve">3. Ưu điểm vượt trội (Ưu điểm gì?): </w:t>
+      </w:r>
+      <w:r>
+        <w:rPr>
+          <w:rFonts w:ascii="Times New Roman" w:hAnsi="Times New Roman"/>
+          <w:sz w:val="25"/>
+        </w:rPr>
+        <w:t>Tách bạch rành mạch giữa 'Account Control' và 'Legal Identity'. Email trường đại học chỉ được gắn nhãn 'Student Email Verified', không đánh đồng là định danh pháp lý tuyệt đối.</w:t>
+      </w:r>
+    </w:p>
+    <w:p>
+      <w:pPr>
+        <w:pStyle w:val="ListBullet"/>
+        <w:spacing w:after="60"/>
+        <w:jc w:val="both"/>
+      </w:pPr>
+      <w:r>
+        <w:rPr>
+          <w:rFonts w:ascii="Times New Roman" w:hAnsi="Times New Roman"/>
+          <w:b/>
+          <w:sz w:val="25"/>
+        </w:rPr>
+        <w:t xml:space="preserve">4. Mặt trái &amp; Thách thức tiềm ẩn (Mặt trái gì?): </w:t>
+      </w:r>
+      <w:r>
+        <w:rPr>
+          <w:rFonts w:ascii="Times New Roman" w:hAnsi="Times New Roman"/>
+          <w:sz w:val="25"/>
+        </w:rPr>
+        <w:t>Tài khoản mới chỉ có mức độ tin cậy cơ bản, chưa đủ điều kiện nhận ưu đãi giảm cọc.</w:t>
+      </w:r>
+    </w:p>
+    <w:p>
+      <w:pPr>
+        <w:pStyle w:val="ListBullet"/>
+        <w:spacing w:after="60"/>
+        <w:jc w:val="both"/>
+      </w:pPr>
+      <w:r>
+        <w:rPr>
+          <w:rFonts w:ascii="Times New Roman" w:hAnsi="Times New Roman"/>
+          <w:b/>
+          <w:sz w:val="25"/>
+        </w:rPr>
+        <w:t xml:space="preserve">5. Đề xuất phương án thay thế &amp; Kế hoạch dự phòng: </w:t>
+      </w:r>
+      <w:r>
+        <w:rPr>
+          <w:rFonts w:ascii="Times New Roman" w:hAnsi="Times New Roman"/>
+          <w:sz w:val="25"/>
+        </w:rPr>
+        <w:t>Khuyến khích người dùng liên kết email trường để nhận ngay huy hiệu Sinh viên và giảm 30% cọc cho các đơn dưới 1 triệu.</w:t>
+      </w:r>
+    </w:p>
+    <w:p>
+      <w:pPr>
+        <w:keepNext/>
+        <w:spacing w:before="200" w:after="80"/>
+      </w:pPr>
+      <w:r>
+        <w:rPr>
+          <w:rFonts w:ascii="Times New Roman" w:hAnsi="Times New Roman"/>
+          <w:b/>
+          <w:color w:val="183A2D"/>
+          <w:sz w:val="26"/>
+        </w:rPr>
+        <w:t>2. Dynamic Progressive Trust &amp; Công Thức Cọc Động f(Value, Trust, History)</w:t>
+      </w:r>
+    </w:p>
+    <w:p>
+      <w:pPr>
+        <w:pStyle w:val="ListBullet"/>
+        <w:spacing w:after="60"/>
+        <w:jc w:val="both"/>
+      </w:pPr>
+      <w:r>
+        <w:rPr>
+          <w:rFonts w:ascii="Times New Roman" w:hAnsi="Times New Roman"/>
+          <w:b/>
+          <w:sz w:val="25"/>
+        </w:rPr>
+        <w:t xml:space="preserve">1. Bản chất &amp; Mục đích (Làm như vậy để làm gì?): </w:t>
+      </w:r>
+      <w:r>
+        <w:rPr>
+          <w:rFonts w:ascii="Times New Roman" w:hAnsi="Times New Roman"/>
+          <w:sz w:val="25"/>
+        </w:rPr>
+        <w:t>Loại bỏ quy tắc cứng nhắc 'Đơn 1 cọc 100%, Đơn 2 cọc 50%, Đơn 3 miễn cọc' (vì người uy tín thuê đồ 10 triệu vẫn có rủi ro khác người thuê áo 200k). Áp dụng công thức cọc động: Tiền Cọc = f(Giá Trị Đồ, Trust Score, Lịch Sử Đơn Hoàn Tất, Tín Hiệu Rủi Ro). Điểm Trust Score được tích lũy dần qua hành vi trả đồ đúng hẹn, không tranh chấp.</w:t>
+      </w:r>
+    </w:p>
+    <w:p>
+      <w:pPr>
+        <w:pStyle w:val="ListBullet"/>
+        <w:spacing w:after="60"/>
+        <w:jc w:val="both"/>
+      </w:pPr>
+      <w:r>
+        <w:rPr>
+          <w:rFonts w:ascii="Times New Roman" w:hAnsi="Times New Roman"/>
+          <w:b/>
+          <w:sz w:val="25"/>
+        </w:rPr>
+        <w:t xml:space="preserve">2. Lợi ích thực tế (Có lợi ích gì?): </w:t>
+      </w:r>
+      <w:r>
+        <w:rPr>
+          <w:rFonts w:ascii="Times New Roman" w:hAnsi="Times New Roman"/>
+          <w:sz w:val="25"/>
+        </w:rPr>
+        <w:t>Tạo động lực mạnh mẽ để người dùng giữ gìn đồ và gắn bó lâu dài với sàn; biến Trust Score thành một loại tài sản uy tín cá nhân của chính người dùng.</w:t>
+      </w:r>
+    </w:p>
+    <w:p>
+      <w:pPr>
+        <w:pStyle w:val="ListBullet"/>
+        <w:spacing w:after="60"/>
+        <w:jc w:val="both"/>
+      </w:pPr>
+      <w:r>
+        <w:rPr>
+          <w:rFonts w:ascii="Times New Roman" w:hAnsi="Times New Roman"/>
+          <w:b/>
+          <w:sz w:val="25"/>
+        </w:rPr>
+        <w:t xml:space="preserve">3. Ưu điểm vượt trội (Ưu điểm gì?): </w:t>
+      </w:r>
+      <w:r>
+        <w:rPr>
+          <w:rFonts w:ascii="Times New Roman" w:hAnsi="Times New Roman"/>
+          <w:sz w:val="25"/>
+        </w:rPr>
+        <w:t>Explainable Trust &amp; Gamified UX: Hiển thị minh bạch lý do tiền cọc thay đổi trên giỏ hàng (Ví dụ: 'Bạn được giảm 50% cọc nhờ Trust Score Hạng A; Hoàn tất đơn này đúng hẹn để nâng hạng VIP!').</w:t>
+      </w:r>
+    </w:p>
+    <w:p>
+      <w:pPr>
+        <w:pStyle w:val="ListBullet"/>
+        <w:spacing w:after="60"/>
+        <w:jc w:val="both"/>
+      </w:pPr>
+      <w:r>
+        <w:rPr>
+          <w:rFonts w:ascii="Times New Roman" w:hAnsi="Times New Roman"/>
+          <w:b/>
+          <w:sz w:val="25"/>
+        </w:rPr>
+        <w:t xml:space="preserve">4. Mặt trái &amp; Thách thức tiềm ẩn (Mặt trái gì?): </w:t>
+      </w:r>
+      <w:r>
+        <w:rPr>
+          <w:rFonts w:ascii="Times New Roman" w:hAnsi="Times New Roman"/>
+          <w:sz w:val="25"/>
+        </w:rPr>
+        <w:t>Người dùng có thể thắc mắc tại sao cùng một chiếc váy nhưng 2 tài khoản lại thấy mức cọc khác nhau nếu giao diện không giải thích rõ ràng.</w:t>
+      </w:r>
+    </w:p>
+    <w:p>
+      <w:pPr>
+        <w:pStyle w:val="ListBullet"/>
+        <w:spacing w:after="60"/>
+        <w:jc w:val="both"/>
+      </w:pPr>
+      <w:r>
+        <w:rPr>
+          <w:rFonts w:ascii="Times New Roman" w:hAnsi="Times New Roman"/>
+          <w:b/>
+          <w:sz w:val="25"/>
+        </w:rPr>
+        <w:t xml:space="preserve">5. Đề xuất phương án thay thế &amp; Kế hoạch dự phòng: </w:t>
+      </w:r>
+      <w:r>
+        <w:rPr>
+          <w:rFonts w:ascii="Times New Roman" w:hAnsi="Times New Roman"/>
+          <w:sz w:val="25"/>
+        </w:rPr>
+        <w:t>Gamification giao diện giỏ hàng: Luôn hiển thị dòng chữ giải thích phần tiền cọc được miễn giảm như một 'phần thưởng uy tín' chứ không phải mức giá phân biệt đối xử.</w:t>
+      </w:r>
+    </w:p>
+    <w:p>
+      <w:pPr>
+        <w:keepNext/>
+        <w:spacing w:before="200" w:after="80"/>
+      </w:pPr>
+      <w:r>
+        <w:rPr>
+          <w:rFonts w:ascii="Times New Roman" w:hAnsi="Times New Roman"/>
+          <w:b/>
+          <w:color w:val="183A2D"/>
+          <w:sz w:val="26"/>
+        </w:rPr>
+        <w:t>3. Silent Risk Engine (Bộ Tính Điểm Rủi Ro Ngầm) &amp; Transaction Exposure Limit</w:t>
+      </w:r>
+    </w:p>
+    <w:p>
+      <w:pPr>
+        <w:pStyle w:val="ListBullet"/>
+        <w:spacing w:after="60"/>
+        <w:jc w:val="both"/>
+      </w:pPr>
+      <w:r>
+        <w:rPr>
+          <w:rFonts w:ascii="Times New Roman" w:hAnsi="Times New Roman"/>
+          <w:b/>
+          <w:sz w:val="25"/>
+        </w:rPr>
+        <w:t xml:space="preserve">1. Bản chất &amp; Mục đích (Làm như vậy để làm gì?): </w:t>
+      </w:r>
+      <w:r>
+        <w:rPr>
+          <w:rFonts w:ascii="Times New Roman" w:hAnsi="Times New Roman"/>
+          <w:sz w:val="25"/>
+        </w:rPr>
+        <w:t>Chạy ngầm trong Server Actions để giám sát các tín hiệu bất thường: thiết bị mới, nhiều tài khoản chung 1 thiết bị, tỷ lệ hủy đơn cao, giá trị đơn tăng đột biến. Phân chia người dùng thành 3 luồng rủi ro: Xanh (Bình thường), Vàng (Tăng cọc/Xác minh thêm), Đỏ (Cọc 100% + Trần hạn mức thấp). Đồng thời, áp dụng Hạn mức Tài sản Đang giữ (Exposure Limit) theo cấp độ tín nhiệm.</w:t>
+      </w:r>
+    </w:p>
+    <w:p>
+      <w:pPr>
+        <w:pStyle w:val="ListBullet"/>
+        <w:spacing w:after="60"/>
+        <w:jc w:val="both"/>
+      </w:pPr>
+      <w:r>
+        <w:rPr>
+          <w:rFonts w:ascii="Times New Roman" w:hAnsi="Times New Roman"/>
+          <w:b/>
+          <w:sz w:val="25"/>
+        </w:rPr>
+        <w:t xml:space="preserve">2. Lợi ích thực tế (Có lợi ích gì?): </w:t>
+      </w:r>
+      <w:r>
+        <w:rPr>
+          <w:rFonts w:ascii="Times New Roman" w:hAnsi="Times New Roman"/>
+          <w:sz w:val="25"/>
+        </w:rPr>
+        <w:t>Thay vì cố gắng 'chặn 100% người xấu' (điều bất khả thi), CLOOP 'giới hạn thiệt hại tối đa' (Damage Isolation) nếu có người xấu vượt qua. Nếu một kẻ gian Level 0 có ý định chiếm đoạt đồ, tài sản tối đa họ có thể tiếp cận chỉ là 1-2 triệu đồng, hoàn toàn nằm trong khả năng hấp thụ của Quỹ phòng vệ rủi ro.</w:t>
+      </w:r>
+    </w:p>
+    <w:p>
+      <w:pPr>
+        <w:pStyle w:val="ListBullet"/>
+        <w:spacing w:after="60"/>
+        <w:jc w:val="both"/>
+      </w:pPr>
+      <w:r>
+        <w:rPr>
+          <w:rFonts w:ascii="Times New Roman" w:hAnsi="Times New Roman"/>
+          <w:b/>
+          <w:sz w:val="25"/>
+        </w:rPr>
+        <w:t xml:space="preserve">3. Ưu điểm vượt trội (Ưu điểm gì?): </w:t>
+      </w:r>
+      <w:r>
+        <w:rPr>
+          <w:rFonts w:ascii="Times New Roman" w:hAnsi="Times New Roman"/>
+          <w:sz w:val="25"/>
+        </w:rPr>
+        <w:t>Friction thông minh: 99% người dùng chân chính không cảm thấy bất kỳ phiền toái nào, hệ thống chỉ kích hoạt phòng thủ khi phát hiện dấu hiệu bất thường.</w:t>
+      </w:r>
+    </w:p>
+    <w:p>
+      <w:pPr>
+        <w:pStyle w:val="ListBullet"/>
+        <w:spacing w:after="60"/>
+        <w:jc w:val="both"/>
+      </w:pPr>
+      <w:r>
+        <w:rPr>
+          <w:rFonts w:ascii="Times New Roman" w:hAnsi="Times New Roman"/>
+          <w:b/>
+          <w:sz w:val="25"/>
+        </w:rPr>
+        <w:t xml:space="preserve">4. Mặt trái &amp; Thách thức tiềm ẩn (Mặt trái gì?): </w:t>
+      </w:r>
+      <w:r>
+        <w:rPr>
+          <w:rFonts w:ascii="Times New Roman" w:hAnsi="Times New Roman"/>
+          <w:sz w:val="25"/>
+        </w:rPr>
+        <w:t>Khách hàng mới có nhu cầu thuê đồ dạ hội đắt tiền ngay lần đầu có thể gặp rào cản hạn mức (The Whale Problem).</w:t>
+      </w:r>
+    </w:p>
+    <w:p>
+      <w:pPr>
+        <w:pStyle w:val="ListBullet"/>
+        <w:spacing w:after="60"/>
+        <w:jc w:val="both"/>
+      </w:pPr>
+      <w:r>
+        <w:rPr>
+          <w:rFonts w:ascii="Times New Roman" w:hAnsi="Times New Roman"/>
+          <w:b/>
+          <w:sz w:val="25"/>
+        </w:rPr>
+        <w:t xml:space="preserve">5. Đề xuất phương án thay thế &amp; Kế hoạch dự phòng: </w:t>
+      </w:r>
+      <w:r>
+        <w:rPr>
+          <w:rFonts w:ascii="Times New Roman" w:hAnsi="Times New Roman"/>
+          <w:sz w:val="25"/>
+        </w:rPr>
+        <w:t>Cơ chế Fast-Track Trust cho khách VIP: Cho phép khách mới thuê đồ giá trị cao nếu tự nguyện cấp bảo lãnh mạnh: (A) Pre-Authorization phong tỏa tạm thời trên thẻ tín dụng quốc tế (không trừ tiền thật) hoặc (B) Đặt cọc 100% tiền mặt qua VietQR (hoàn ngay sau khi trả đồ).</w:t>
+      </w:r>
+    </w:p>
+    <w:p>
+      <w:pPr>
+        <w:keepNext/>
+        <w:spacing w:before="200" w:after="80"/>
+      </w:pPr>
+      <w:r>
+        <w:rPr>
+          <w:rFonts w:ascii="Times New Roman" w:hAnsi="Times New Roman"/>
+          <w:b/>
+          <w:color w:val="183A2D"/>
+          <w:sz w:val="26"/>
+        </w:rPr>
+        <w:t>4. Digital Evidence Timeline &amp; Cơ Chế Phân Xử Vi Mô (Micro-Resolution &lt;= 50.000đ)</w:t>
+      </w:r>
+    </w:p>
+    <w:p>
+      <w:pPr>
+        <w:pStyle w:val="ListBullet"/>
+        <w:spacing w:after="60"/>
+        <w:jc w:val="both"/>
+      </w:pPr>
+      <w:r>
+        <w:rPr>
+          <w:rFonts w:ascii="Times New Roman" w:hAnsi="Times New Roman"/>
+          <w:b/>
+          <w:sz w:val="25"/>
+        </w:rPr>
+        <w:t xml:space="preserve">1. Bản chất &amp; Mục đích (Làm như vậy để làm gì?): </w:t>
+      </w:r>
+      <w:r>
+        <w:rPr>
+          <w:rFonts w:ascii="Times New Roman" w:hAnsi="Times New Roman"/>
+          <w:sz w:val="25"/>
+        </w:rPr>
+        <w:t>Chuỗi chứng cứ số có dấu thời gian (Timestamped Evidence Timeline): Ghi nhận tuần tự từ lúc Chủ tủ chụp ảnh niêm phong -&gt; Bưu tá GHN quét mã -&gt; Khách quay unboxing -&gt; Khách trả đồ -&gt; Chủ tủ nghiệm thu. Đặc biệt, bổ sung cơ chế Phân Xử Vi Mô: Nếu tranh chấp phát sinh có giá trị thiệt hại nhỏ (&lt;= 50.000đ như sứt chỉ, vết bẩn nhỏ), hệ thống tự động trích Quỹ phòng vệ đền bù đóng đơn trong 5 giây mà không cần gọi Admin.</w:t>
+      </w:r>
+    </w:p>
+    <w:p>
+      <w:pPr>
+        <w:pStyle w:val="ListBullet"/>
+        <w:spacing w:after="60"/>
+        <w:jc w:val="both"/>
+      </w:pPr>
+      <w:r>
+        <w:rPr>
+          <w:rFonts w:ascii="Times New Roman" w:hAnsi="Times New Roman"/>
+          <w:b/>
+          <w:sz w:val="25"/>
+        </w:rPr>
+        <w:t xml:space="preserve">2. Lợi ích thực tế (Có lợi ích gì?): </w:t>
+      </w:r>
+      <w:r>
+        <w:rPr>
+          <w:rFonts w:ascii="Times New Roman" w:hAnsi="Times New Roman"/>
+          <w:sz w:val="25"/>
+        </w:rPr>
+        <w:t>Giải quyết triệt để bài toán thắt cổ chai chi phí vận hành (OPEX Admin Bottleneck). Khi sàn mở rộng lên hàng nghìn đơn/ngày, chi phí nhân sự ngồi soi video 15 phút (tốn ~40.000đ) đắt hơn việc trích quỹ đền bù 30.000đ. Giúp cả Khách thuê và Chủ tủ đều được xử lý hài lòng tức thì.</w:t>
+      </w:r>
+    </w:p>
+    <w:p>
+      <w:pPr>
+        <w:pStyle w:val="ListBullet"/>
+        <w:spacing w:after="60"/>
+        <w:jc w:val="both"/>
+      </w:pPr>
+      <w:r>
+        <w:rPr>
+          <w:rFonts w:ascii="Times New Roman" w:hAnsi="Times New Roman"/>
+          <w:b/>
+          <w:sz w:val="25"/>
+        </w:rPr>
+        <w:t xml:space="preserve">3. Ưu điểm vượt trội (Ưu điểm gì?): </w:t>
+      </w:r>
+      <w:r>
+        <w:rPr>
+          <w:rFonts w:ascii="Times New Roman" w:hAnsi="Times New Roman"/>
+          <w:sz w:val="25"/>
+        </w:rPr>
+        <w:t>Toàn bộ tranh chấp lớn (trên 50.000đ) được Admin phân xử chuẩn xác chỉ bằng việc mở 1 màn hình Timeline trực quan, không phải tìm kiếm tập tin rời rạc.</w:t>
+      </w:r>
+    </w:p>
+    <w:p>
+      <w:pPr>
+        <w:pStyle w:val="ListBullet"/>
+        <w:spacing w:after="60"/>
+        <w:jc w:val="both"/>
+      </w:pPr>
+      <w:r>
+        <w:rPr>
+          <w:rFonts w:ascii="Times New Roman" w:hAnsi="Times New Roman"/>
+          <w:b/>
+          <w:sz w:val="25"/>
+        </w:rPr>
+        <w:t xml:space="preserve">4. Mặt trái &amp; Thách thức tiềm ẩn (Mặt trái gì?): </w:t>
+      </w:r>
+      <w:r>
+        <w:rPr>
+          <w:rFonts w:ascii="Times New Roman" w:hAnsi="Times New Roman"/>
+          <w:sz w:val="25"/>
+        </w:rPr>
+        <w:t>Nguy cơ lạm dụng cơ chế Micro-Resolution nếu một chủ tủ cố tình liên tục báo lỗi nhỏ để nhận tiền đền bù vi mô.</w:t>
+      </w:r>
+    </w:p>
+    <w:p>
+      <w:pPr>
+        <w:pStyle w:val="ListBullet"/>
+        <w:spacing w:after="60"/>
+        <w:jc w:val="both"/>
+      </w:pPr>
+      <w:r>
+        <w:rPr>
+          <w:rFonts w:ascii="Times New Roman" w:hAnsi="Times New Roman"/>
+          <w:b/>
+          <w:sz w:val="25"/>
+        </w:rPr>
+        <w:t xml:space="preserve">5. Đề xuất phương án thay thế &amp; Kế hoạch dự phòng: </w:t>
+      </w:r>
+      <w:r>
+        <w:rPr>
+          <w:rFonts w:ascii="Times New Roman" w:hAnsi="Times New Roman"/>
+          <w:sz w:val="25"/>
+        </w:rPr>
+        <w:t>Thuật toán giới hạn tần suất đền bù vi mô (Micro-Resolution Frequency Capping): Mỗi chủ tủ chỉ được áp dụng cơ chế tự động tối đa 2 lần/tháng. Vượt quá hạn mức này, toàn bộ đơn hàng bắt buộc chuyển sang quy trình kiểm duyệt có đối soát video.</w:t>
+      </w:r>
+    </w:p>
+    <w:p>
+      <w:pPr>
+        <w:keepNext/>
+        <w:spacing w:before="320" w:after="120"/>
+      </w:pPr>
+      <w:r>
+        <w:rPr>
+          <w:rFonts w:ascii="Times New Roman" w:hAnsi="Times New Roman"/>
+          <w:b/>
+          <w:color w:val="0F4A34"/>
+          <w:sz w:val="28"/>
+        </w:rPr>
+        <w:t>IX. KHUNG BẢO VỆ DỮ LIỆU CÁ NHÂN (LUẬT 91/2025/QH15 &amp; NĐ 356/2025/NĐ-CP)</w:t>
+      </w:r>
+    </w:p>
+    <w:p>
+      <w:pPr>
+        <w:spacing w:after="80"/>
+        <w:jc w:val="both"/>
+      </w:pPr>
+      <w:r>
+        <w:rPr>
+          <w:rFonts w:ascii="Times New Roman" w:hAnsi="Times New Roman"/>
+          <w:sz w:val="25"/>
+        </w:rPr>
+        <w:t>Nhận thức rõ trách nhiệm pháp lý khi Luật Bảo vệ Dữ liệu Cá nhân số 91/2025/QH15 và Nghị định 356/2025/NĐ-CP chính thức có hiệu lực từ ngày 01/01/2026, CLOOP áp dụng triệt để nguyên lý 'Privacy by Design' và 'Collect less -&gt; Verify smarter'. Hệ thống phân loại dữ liệu thành 5 cấp độ nghiêm ngặt:</w:t>
+      </w:r>
+    </w:p>
+    <w:tbl>
+      <w:tblPr>
+        <w:tblW w:type="auto" w:w="0"/>
+        <w:jc w:val="center"/>
+        <w:tblLook w:firstColumn="1" w:firstRow="1" w:lastColumn="0" w:lastRow="0" w:noHBand="0" w:noVBand="1" w:val="04A0"/>
+        <w:tblBorders>
+          <w:top w:val="single" w:sz="6" w:space="0" w:color="D3D3D3"/>
+          <w:bottom w:val="single" w:sz="6" w:space="0" w:color="D3D3D3"/>
+          <w:insideH w:val="single" w:sz="4" w:space="0" w:color="D3D3D3"/>
+          <w:insideV w:val="none"/>
+          <w:left w:val="none"/>
+          <w:right w:val="none"/>
+        </w:tblBorders>
+      </w:tblPr>
+      <w:tblGrid>
+        <w:gridCol w:w="1814"/>
+        <w:gridCol w:w="1814"/>
+        <w:gridCol w:w="1814"/>
+        <w:gridCol w:w="1814"/>
+        <w:gridCol w:w="1814"/>
+      </w:tblGrid>
+      <w:tr>
+        <w:tc>
+          <w:tcPr>
+            <w:tcW w:type="dxa" w:w="1814"/>
+            <w:shd w:fill="E6F4EA"/>
+            <w:tcMar>
+              <w:top w:w="120" w:type="dxa"/>
+              <w:bottom w:w="120" w:type="dxa"/>
+              <w:left w:w="100" w:type="dxa"/>
+              <w:right w:w="100" w:type="dxa"/>
+            </w:tcMar>
+          </w:tcPr>
+          <w:p>
+            <w:pPr>
+              <w:jc w:val="center"/>
+            </w:pPr>
+            <w:r>
+              <w:rPr>
+                <w:rFonts w:ascii="Times New Roman" w:hAnsi="Times New Roman"/>
+                <w:b/>
+                <w:color w:val="0A2517"/>
+                <w:sz w:val="22"/>
+              </w:rPr>
+              <w:t>Cấp độ dữ liệu</w:t>
+            </w:r>
+          </w:p>
+        </w:tc>
+        <w:tc>
+          <w:tcPr>
+            <w:tcW w:type="dxa" w:w="1814"/>
+            <w:shd w:fill="E6F4EA"/>
+            <w:tcMar>
+              <w:top w:w="120" w:type="dxa"/>
+              <w:bottom w:w="120" w:type="dxa"/>
+              <w:left w:w="100" w:type="dxa"/>
+              <w:right w:w="100" w:type="dxa"/>
+            </w:tcMar>
+          </w:tcPr>
+          <w:p>
+            <w:pPr>
+              <w:jc w:val="center"/>
+            </w:pPr>
+            <w:r>
+              <w:rPr>
+                <w:rFonts w:ascii="Times New Roman" w:hAnsi="Times New Roman"/>
+                <w:b/>
+                <w:color w:val="0A2517"/>
+                <w:sz w:val="22"/>
+              </w:rPr>
+              <w:t>Dữ liệu cụ thể</w:t>
+            </w:r>
+          </w:p>
+        </w:tc>
+        <w:tc>
+          <w:tcPr>
+            <w:tcW w:type="dxa" w:w="1814"/>
+            <w:shd w:fill="E6F4EA"/>
+            <w:tcMar>
+              <w:top w:w="120" w:type="dxa"/>
+              <w:bottom w:w="120" w:type="dxa"/>
+              <w:left w:w="100" w:type="dxa"/>
+              <w:right w:w="100" w:type="dxa"/>
+            </w:tcMar>
+          </w:tcPr>
+          <w:p>
+            <w:pPr>
+              <w:jc w:val="center"/>
+            </w:pPr>
+            <w:r>
+              <w:rPr>
+                <w:rFonts w:ascii="Times New Roman" w:hAnsi="Times New Roman"/>
+                <w:b/>
+                <w:color w:val="0A2517"/>
+                <w:sz w:val="22"/>
+              </w:rPr>
+              <w:t>Mục đích sử dụng</w:t>
+            </w:r>
+          </w:p>
+        </w:tc>
+        <w:tc>
+          <w:tcPr>
+            <w:tcW w:type="dxa" w:w="1814"/>
+            <w:shd w:fill="E6F4EA"/>
+            <w:tcMar>
+              <w:top w:w="120" w:type="dxa"/>
+              <w:bottom w:w="120" w:type="dxa"/>
+              <w:left w:w="100" w:type="dxa"/>
+              <w:right w:w="100" w:type="dxa"/>
+            </w:tcMar>
+          </w:tcPr>
+          <w:p>
+            <w:pPr>
+              <w:jc w:val="center"/>
+            </w:pPr>
+            <w:r>
+              <w:rPr>
+                <w:rFonts w:ascii="Times New Roman" w:hAnsi="Times New Roman"/>
+                <w:b/>
+                <w:color w:val="0A2517"/>
+                <w:sz w:val="22"/>
+              </w:rPr>
+              <w:t>Cơ chế bảo vệ &amp; Phân quyền</w:t>
+            </w:r>
+          </w:p>
+        </w:tc>
+        <w:tc>
+          <w:tcPr>
+            <w:tcW w:type="dxa" w:w="1814"/>
+            <w:shd w:fill="E6F4EA"/>
+            <w:tcMar>
+              <w:top w:w="120" w:type="dxa"/>
+              <w:bottom w:w="120" w:type="dxa"/>
+              <w:left w:w="100" w:type="dxa"/>
+              <w:right w:w="100" w:type="dxa"/>
+            </w:tcMar>
+          </w:tcPr>
+          <w:p>
+            <w:pPr>
+              <w:jc w:val="center"/>
+            </w:pPr>
+            <w:r>
+              <w:rPr>
+                <w:rFonts w:ascii="Times New Roman" w:hAnsi="Times New Roman"/>
+                <w:b/>
+                <w:color w:val="0A2517"/>
+                <w:sz w:val="22"/>
+              </w:rPr>
+              <w:t>Thời hạn lưu trữ &amp; Hủy</w:t>
+            </w:r>
+          </w:p>
+        </w:tc>
+      </w:tr>
+      <w:tr>
+        <w:tc>
+          <w:tcPr>
+            <w:tcW w:type="dxa" w:w="1814"/>
+            <w:shd w:fill="FFFFFF"/>
+            <w:tcMar>
+              <w:top w:w="80" w:type="dxa"/>
+              <w:bottom w:w="80" w:type="dxa"/>
+              <w:left w:w="100" w:type="dxa"/>
+              <w:right w:w="100" w:type="dxa"/>
+            </w:tcMar>
+          </w:tcPr>
+          <w:p>
+            <w:pPr>
+              <w:jc w:val="center"/>
+            </w:pPr>
+            <w:r>
+              <w:rPr>
+                <w:rFonts w:ascii="Times New Roman" w:hAnsi="Times New Roman"/>
+                <w:sz w:val="21"/>
+              </w:rPr>
+              <w:t>1. Public Data</w:t>
+            </w:r>
+          </w:p>
+        </w:tc>
+        <w:tc>
+          <w:tcPr>
+            <w:tcW w:type="dxa" w:w="1814"/>
+            <w:shd w:fill="FFFFFF"/>
+            <w:tcMar>
+              <w:top w:w="80" w:type="dxa"/>
+              <w:bottom w:w="80" w:type="dxa"/>
+              <w:left w:w="100" w:type="dxa"/>
+              <w:right w:w="100" w:type="dxa"/>
+            </w:tcMar>
+          </w:tcPr>
+          <w:p>
+            <w:pPr>
+              <w:jc w:val="left"/>
+            </w:pPr>
+            <w:r>
+              <w:rPr>
+                <w:rFonts w:ascii="Times New Roman" w:hAnsi="Times New Roman"/>
+                <w:sz w:val="21"/>
+              </w:rPr>
+              <w:t>Tên hiển thị, avatar, review, tủ đồ công khai</w:t>
+            </w:r>
+          </w:p>
+        </w:tc>
+        <w:tc>
+          <w:tcPr>
+            <w:tcW w:type="dxa" w:w="1814"/>
+            <w:shd w:fill="FFFFFF"/>
+            <w:tcMar>
+              <w:top w:w="80" w:type="dxa"/>
+              <w:bottom w:w="80" w:type="dxa"/>
+              <w:left w:w="100" w:type="dxa"/>
+              <w:right w:w="100" w:type="dxa"/>
+            </w:tcMar>
+          </w:tcPr>
+          <w:p>
+            <w:pPr>
+              <w:jc w:val="left"/>
+            </w:pPr>
+            <w:r>
+              <w:rPr>
+                <w:rFonts w:ascii="Times New Roman" w:hAnsi="Times New Roman"/>
+                <w:sz w:val="21"/>
+              </w:rPr>
+              <w:t>Hiển thị storefront, gợi ý lookbook</w:t>
+            </w:r>
+          </w:p>
+        </w:tc>
+        <w:tc>
+          <w:tcPr>
+            <w:tcW w:type="dxa" w:w="1814"/>
+            <w:shd w:fill="FFFFFF"/>
+            <w:tcMar>
+              <w:top w:w="80" w:type="dxa"/>
+              <w:bottom w:w="80" w:type="dxa"/>
+              <w:left w:w="100" w:type="dxa"/>
+              <w:right w:w="100" w:type="dxa"/>
+            </w:tcMar>
+          </w:tcPr>
+          <w:p>
+            <w:pPr>
+              <w:jc w:val="left"/>
+            </w:pPr>
+            <w:r>
+              <w:rPr>
+                <w:rFonts w:ascii="Times New Roman" w:hAnsi="Times New Roman"/>
+                <w:sz w:val="21"/>
+              </w:rPr>
+              <w:t>Công khai toàn hệ thống</w:t>
+            </w:r>
+          </w:p>
+        </w:tc>
+        <w:tc>
+          <w:tcPr>
+            <w:tcW w:type="dxa" w:w="1814"/>
+            <w:shd w:fill="FFFFFF"/>
+            <w:tcMar>
+              <w:top w:w="80" w:type="dxa"/>
+              <w:bottom w:w="80" w:type="dxa"/>
+              <w:left w:w="100" w:type="dxa"/>
+              <w:right w:w="100" w:type="dxa"/>
+            </w:tcMar>
+          </w:tcPr>
+          <w:p>
+            <w:pPr>
+              <w:jc w:val="center"/>
+            </w:pPr>
+            <w:r>
+              <w:rPr>
+                <w:rFonts w:ascii="Times New Roman" w:hAnsi="Times New Roman"/>
+                <w:sz w:val="21"/>
+              </w:rPr>
+              <w:t>Lưu theo vòng đời tài khoản</w:t>
+            </w:r>
+          </w:p>
+        </w:tc>
+      </w:tr>
+      <w:tr>
+        <w:tc>
+          <w:tcPr>
+            <w:tcW w:type="dxa" w:w="1814"/>
+            <w:shd w:fill="F9FBF9"/>
+            <w:tcMar>
+              <w:top w:w="80" w:type="dxa"/>
+              <w:bottom w:w="80" w:type="dxa"/>
+              <w:left w:w="100" w:type="dxa"/>
+              <w:right w:w="100" w:type="dxa"/>
+            </w:tcMar>
+          </w:tcPr>
+          <w:p>
+            <w:pPr>
+              <w:jc w:val="center"/>
+            </w:pPr>
+            <w:r>
+              <w:rPr>
+                <w:rFonts w:ascii="Times New Roman" w:hAnsi="Times New Roman"/>
+                <w:sz w:val="21"/>
+              </w:rPr>
+              <w:t>2. Account Data</w:t>
+            </w:r>
+          </w:p>
+        </w:tc>
+        <w:tc>
+          <w:tcPr>
+            <w:tcW w:type="dxa" w:w="1814"/>
+            <w:shd w:fill="F9FBF9"/>
+            <w:tcMar>
+              <w:top w:w="80" w:type="dxa"/>
+              <w:bottom w:w="80" w:type="dxa"/>
+              <w:left w:w="100" w:type="dxa"/>
+              <w:right w:w="100" w:type="dxa"/>
+            </w:tcMar>
+          </w:tcPr>
+          <w:p>
+            <w:pPr>
+              <w:jc w:val="left"/>
+            </w:pPr>
+            <w:r>
+              <w:rPr>
+                <w:rFonts w:ascii="Times New Roman" w:hAnsi="Times New Roman"/>
+                <w:sz w:val="21"/>
+              </w:rPr>
+              <w:t>Email đăng ký, số điện thoại</w:t>
+            </w:r>
+          </w:p>
+        </w:tc>
+        <w:tc>
+          <w:tcPr>
+            <w:tcW w:type="dxa" w:w="1814"/>
+            <w:shd w:fill="F9FBF9"/>
+            <w:tcMar>
+              <w:top w:w="80" w:type="dxa"/>
+              <w:bottom w:w="80" w:type="dxa"/>
+              <w:left w:w="100" w:type="dxa"/>
+              <w:right w:w="100" w:type="dxa"/>
+            </w:tcMar>
+          </w:tcPr>
+          <w:p>
+            <w:pPr>
+              <w:jc w:val="left"/>
+            </w:pPr>
+            <w:r>
+              <w:rPr>
+                <w:rFonts w:ascii="Times New Roman" w:hAnsi="Times New Roman"/>
+                <w:sz w:val="21"/>
+              </w:rPr>
+              <w:t>Đăng nhập, thông báo trạng thái đơn</w:t>
+            </w:r>
+          </w:p>
+        </w:tc>
+        <w:tc>
+          <w:tcPr>
+            <w:tcW w:type="dxa" w:w="1814"/>
+            <w:shd w:fill="F9FBF9"/>
+            <w:tcMar>
+              <w:top w:w="80" w:type="dxa"/>
+              <w:bottom w:w="80" w:type="dxa"/>
+              <w:left w:w="100" w:type="dxa"/>
+              <w:right w:w="100" w:type="dxa"/>
+            </w:tcMar>
+          </w:tcPr>
+          <w:p>
+            <w:pPr>
+              <w:jc w:val="left"/>
+            </w:pPr>
+            <w:r>
+              <w:rPr>
+                <w:rFonts w:ascii="Times New Roman" w:hAnsi="Times New Roman"/>
+                <w:sz w:val="21"/>
+              </w:rPr>
+              <w:t>Mã hóa AES-256, chỉ Admin CSKH được truy cập theo phiên</w:t>
+            </w:r>
+          </w:p>
+        </w:tc>
+        <w:tc>
+          <w:tcPr>
+            <w:tcW w:type="dxa" w:w="1814"/>
+            <w:shd w:fill="F9FBF9"/>
+            <w:tcMar>
+              <w:top w:w="80" w:type="dxa"/>
+              <w:bottom w:w="80" w:type="dxa"/>
+              <w:left w:w="100" w:type="dxa"/>
+              <w:right w:w="100" w:type="dxa"/>
+            </w:tcMar>
+          </w:tcPr>
+          <w:p>
+            <w:pPr>
+              <w:jc w:val="center"/>
+            </w:pPr>
+            <w:r>
+              <w:rPr>
+                <w:rFonts w:ascii="Times New Roman" w:hAnsi="Times New Roman"/>
+                <w:sz w:val="21"/>
+              </w:rPr>
+              <w:t>Xóa sau 30 ngày kể từ khi hủy tài khoản</w:t>
+            </w:r>
+          </w:p>
+        </w:tc>
+      </w:tr>
+      <w:tr>
+        <w:tc>
+          <w:tcPr>
+            <w:tcW w:type="dxa" w:w="1814"/>
+            <w:shd w:fill="FFFFFF"/>
+            <w:tcMar>
+              <w:top w:w="80" w:type="dxa"/>
+              <w:bottom w:w="80" w:type="dxa"/>
+              <w:left w:w="100" w:type="dxa"/>
+              <w:right w:w="100" w:type="dxa"/>
+            </w:tcMar>
+          </w:tcPr>
+          <w:p>
+            <w:pPr>
+              <w:jc w:val="center"/>
+            </w:pPr>
+            <w:r>
+              <w:rPr>
+                <w:rFonts w:ascii="Times New Roman" w:hAnsi="Times New Roman"/>
+                <w:sz w:val="21"/>
+              </w:rPr>
+              <w:t>3. Transaction Data</w:t>
+            </w:r>
+          </w:p>
+        </w:tc>
+        <w:tc>
+          <w:tcPr>
+            <w:tcW w:type="dxa" w:w="1814"/>
+            <w:shd w:fill="FFFFFF"/>
+            <w:tcMar>
+              <w:top w:w="80" w:type="dxa"/>
+              <w:bottom w:w="80" w:type="dxa"/>
+              <w:left w:w="100" w:type="dxa"/>
+              <w:right w:w="100" w:type="dxa"/>
+            </w:tcMar>
+          </w:tcPr>
+          <w:p>
+            <w:pPr>
+              <w:jc w:val="left"/>
+            </w:pPr>
+            <w:r>
+              <w:rPr>
+                <w:rFonts w:ascii="Times New Roman" w:hAnsi="Times New Roman"/>
+                <w:sz w:val="21"/>
+              </w:rPr>
+              <w:t>Lịch sử đơn, mã vận đơn GHN, biến động số dư ví</w:t>
+            </w:r>
+          </w:p>
+        </w:tc>
+        <w:tc>
+          <w:tcPr>
+            <w:tcW w:type="dxa" w:w="1814"/>
+            <w:shd w:fill="FFFFFF"/>
+            <w:tcMar>
+              <w:top w:w="80" w:type="dxa"/>
+              <w:bottom w:w="80" w:type="dxa"/>
+              <w:left w:w="100" w:type="dxa"/>
+              <w:right w:w="100" w:type="dxa"/>
+            </w:tcMar>
+          </w:tcPr>
+          <w:p>
+            <w:pPr>
+              <w:jc w:val="left"/>
+            </w:pPr>
+            <w:r>
+              <w:rPr>
+                <w:rFonts w:ascii="Times New Roman" w:hAnsi="Times New Roman"/>
+                <w:sz w:val="21"/>
+              </w:rPr>
+              <w:t>Kế toán, đối soát, kiểm toán tài chính</w:t>
+            </w:r>
+          </w:p>
+        </w:tc>
+        <w:tc>
+          <w:tcPr>
+            <w:tcW w:type="dxa" w:w="1814"/>
+            <w:shd w:fill="FFFFFF"/>
+            <w:tcMar>
+              <w:top w:w="80" w:type="dxa"/>
+              <w:bottom w:w="80" w:type="dxa"/>
+              <w:left w:w="100" w:type="dxa"/>
+              <w:right w:w="100" w:type="dxa"/>
+            </w:tcMar>
+          </w:tcPr>
+          <w:p>
+            <w:pPr>
+              <w:jc w:val="left"/>
+            </w:pPr>
+            <w:r>
+              <w:rPr>
+                <w:rFonts w:ascii="Times New Roman" w:hAnsi="Times New Roman"/>
+                <w:sz w:val="21"/>
+              </w:rPr>
+              <w:t>Phân quyền RBAC nghiêm ngặt, lưu audit log truy vết</w:t>
+            </w:r>
+          </w:p>
+        </w:tc>
+        <w:tc>
+          <w:tcPr>
+            <w:tcW w:type="dxa" w:w="1814"/>
+            <w:shd w:fill="FFFFFF"/>
+            <w:tcMar>
+              <w:top w:w="80" w:type="dxa"/>
+              <w:bottom w:w="80" w:type="dxa"/>
+              <w:left w:w="100" w:type="dxa"/>
+              <w:right w:w="100" w:type="dxa"/>
+            </w:tcMar>
+          </w:tcPr>
+          <w:p>
+            <w:pPr>
+              <w:jc w:val="center"/>
+            </w:pPr>
+            <w:r>
+              <w:rPr>
+                <w:rFonts w:ascii="Times New Roman" w:hAnsi="Times New Roman"/>
+                <w:sz w:val="21"/>
+              </w:rPr>
+              <w:t>Lưu trữ 5 năm theo Luật Kế toán Việt Nam</w:t>
+            </w:r>
+          </w:p>
+        </w:tc>
+      </w:tr>
+      <w:tr>
+        <w:tc>
+          <w:tcPr>
+            <w:tcW w:type="dxa" w:w="1814"/>
+            <w:shd w:fill="F9FBF9"/>
+            <w:tcMar>
+              <w:top w:w="80" w:type="dxa"/>
+              <w:bottom w:w="80" w:type="dxa"/>
+              <w:left w:w="100" w:type="dxa"/>
+              <w:right w:w="100" w:type="dxa"/>
+            </w:tcMar>
+          </w:tcPr>
+          <w:p>
+            <w:pPr>
+              <w:jc w:val="center"/>
+            </w:pPr>
+            <w:r>
+              <w:rPr>
+                <w:rFonts w:ascii="Times New Roman" w:hAnsi="Times New Roman"/>
+                <w:sz w:val="21"/>
+              </w:rPr>
+              <w:t>4. Sensitive Identity</w:t>
+            </w:r>
+          </w:p>
+        </w:tc>
+        <w:tc>
+          <w:tcPr>
+            <w:tcW w:type="dxa" w:w="1814"/>
+            <w:shd w:fill="F9FBF9"/>
+            <w:tcMar>
+              <w:top w:w="80" w:type="dxa"/>
+              <w:bottom w:w="80" w:type="dxa"/>
+              <w:left w:w="100" w:type="dxa"/>
+              <w:right w:w="100" w:type="dxa"/>
+            </w:tcMar>
+          </w:tcPr>
+          <w:p>
+            <w:pPr>
+              <w:jc w:val="left"/>
+            </w:pPr>
+            <w:r>
+              <w:rPr>
+                <w:rFonts w:ascii="Times New Roman" w:hAnsi="Times New Roman"/>
+                <w:sz w:val="21"/>
+              </w:rPr>
+              <w:t>Email trường @edu.vn, thông tin định danh</w:t>
+            </w:r>
+          </w:p>
+        </w:tc>
+        <w:tc>
+          <w:tcPr>
+            <w:tcW w:type="dxa" w:w="1814"/>
+            <w:shd w:fill="F9FBF9"/>
+            <w:tcMar>
+              <w:top w:w="80" w:type="dxa"/>
+              <w:bottom w:w="80" w:type="dxa"/>
+              <w:left w:w="100" w:type="dxa"/>
+              <w:right w:w="100" w:type="dxa"/>
+            </w:tcMar>
+          </w:tcPr>
+          <w:p>
+            <w:pPr>
+              <w:jc w:val="left"/>
+            </w:pPr>
+            <w:r>
+              <w:rPr>
+                <w:rFonts w:ascii="Times New Roman" w:hAnsi="Times New Roman"/>
+                <w:sz w:val="21"/>
+              </w:rPr>
+              <w:t>Xét duyệt hạn mức thuê và quyền lợi giảm cọc</w:t>
+            </w:r>
+          </w:p>
+        </w:tc>
+        <w:tc>
+          <w:tcPr>
+            <w:tcW w:type="dxa" w:w="1814"/>
+            <w:shd w:fill="F9FBF9"/>
+            <w:tcMar>
+              <w:top w:w="80" w:type="dxa"/>
+              <w:bottom w:w="80" w:type="dxa"/>
+              <w:left w:w="100" w:type="dxa"/>
+              <w:right w:w="100" w:type="dxa"/>
+            </w:tcMar>
+          </w:tcPr>
+          <w:p>
+            <w:pPr>
+              <w:jc w:val="left"/>
+            </w:pPr>
+            <w:r>
+              <w:rPr>
+                <w:rFonts w:ascii="Times New Roman" w:hAnsi="Times New Roman"/>
+                <w:sz w:val="21"/>
+              </w:rPr>
+              <w:t>Che mờ (Masking), mã hóa cấp cơ sở dữ liệu, không lưu CCCD thô</w:t>
+            </w:r>
+          </w:p>
+        </w:tc>
+        <w:tc>
+          <w:tcPr>
+            <w:tcW w:type="dxa" w:w="1814"/>
+            <w:shd w:fill="F9FBF9"/>
+            <w:tcMar>
+              <w:top w:w="80" w:type="dxa"/>
+              <w:bottom w:w="80" w:type="dxa"/>
+              <w:left w:w="100" w:type="dxa"/>
+              <w:right w:w="100" w:type="dxa"/>
+            </w:tcMar>
+          </w:tcPr>
+          <w:p>
+            <w:pPr>
+              <w:jc w:val="center"/>
+            </w:pPr>
+            <w:r>
+              <w:rPr>
+                <w:rFonts w:ascii="Times New Roman" w:hAnsi="Times New Roman"/>
+                <w:sz w:val="21"/>
+              </w:rPr>
+              <w:t>Hủy sau khi hết chu kỳ xác thực (1 năm)</w:t>
+            </w:r>
+          </w:p>
+        </w:tc>
+      </w:tr>
+      <w:tr>
+        <w:tc>
+          <w:tcPr>
+            <w:tcW w:type="dxa" w:w="1814"/>
+            <w:shd w:fill="FFFFFF"/>
+            <w:tcMar>
+              <w:top w:w="80" w:type="dxa"/>
+              <w:bottom w:w="80" w:type="dxa"/>
+              <w:left w:w="100" w:type="dxa"/>
+              <w:right w:w="100" w:type="dxa"/>
+            </w:tcMar>
+          </w:tcPr>
+          <w:p>
+            <w:pPr>
+              <w:jc w:val="center"/>
+            </w:pPr>
+            <w:r>
+              <w:rPr>
+                <w:rFonts w:ascii="Times New Roman" w:hAnsi="Times New Roman"/>
+                <w:sz w:val="21"/>
+              </w:rPr>
+              <w:t>5. Evidence Media</w:t>
+            </w:r>
+          </w:p>
+        </w:tc>
+        <w:tc>
+          <w:tcPr>
+            <w:tcW w:type="dxa" w:w="1814"/>
+            <w:shd w:fill="FFFFFF"/>
+            <w:tcMar>
+              <w:top w:w="80" w:type="dxa"/>
+              <w:bottom w:w="80" w:type="dxa"/>
+              <w:left w:w="100" w:type="dxa"/>
+              <w:right w:w="100" w:type="dxa"/>
+            </w:tcMar>
+          </w:tcPr>
+          <w:p>
+            <w:pPr>
+              <w:jc w:val="left"/>
+            </w:pPr>
+            <w:r>
+              <w:rPr>
+                <w:rFonts w:ascii="Times New Roman" w:hAnsi="Times New Roman"/>
+                <w:sz w:val="21"/>
+              </w:rPr>
+              <w:t>Video niêm phong đóng gói, video unboxing mở hộp</w:t>
+            </w:r>
+          </w:p>
+        </w:tc>
+        <w:tc>
+          <w:tcPr>
+            <w:tcW w:type="dxa" w:w="1814"/>
+            <w:shd w:fill="FFFFFF"/>
+            <w:tcMar>
+              <w:top w:w="80" w:type="dxa"/>
+              <w:bottom w:w="80" w:type="dxa"/>
+              <w:left w:w="100" w:type="dxa"/>
+              <w:right w:w="100" w:type="dxa"/>
+            </w:tcMar>
+          </w:tcPr>
+          <w:p>
+            <w:pPr>
+              <w:jc w:val="left"/>
+            </w:pPr>
+            <w:r>
+              <w:rPr>
+                <w:rFonts w:ascii="Times New Roman" w:hAnsi="Times New Roman"/>
+                <w:sz w:val="21"/>
+              </w:rPr>
+              <w:t>Đối soát khiếu nại tranh chấp khi phát sinh sự cố</w:t>
+            </w:r>
+          </w:p>
+        </w:tc>
+        <w:tc>
+          <w:tcPr>
+            <w:tcW w:type="dxa" w:w="1814"/>
+            <w:shd w:fill="FFFFFF"/>
+            <w:tcMar>
+              <w:top w:w="80" w:type="dxa"/>
+              <w:bottom w:w="80" w:type="dxa"/>
+              <w:left w:w="100" w:type="dxa"/>
+              <w:right w:w="100" w:type="dxa"/>
+            </w:tcMar>
+          </w:tcPr>
+          <w:p>
+            <w:pPr>
+              <w:jc w:val="left"/>
+            </w:pPr>
+            <w:r>
+              <w:rPr>
+                <w:rFonts w:ascii="Times New Roman" w:hAnsi="Times New Roman"/>
+                <w:sz w:val="21"/>
+              </w:rPr>
+              <w:t>Lưu trữ phân vùng bảo mật riêng (Cold Storage), cấp link có hạn giờ</w:t>
+            </w:r>
+          </w:p>
+        </w:tc>
+        <w:tc>
+          <w:tcPr>
+            <w:tcW w:type="dxa" w:w="1814"/>
+            <w:shd w:fill="FFFFFF"/>
+            <w:tcMar>
+              <w:top w:w="80" w:type="dxa"/>
+              <w:bottom w:w="80" w:type="dxa"/>
+              <w:left w:w="100" w:type="dxa"/>
+              <w:right w:w="100" w:type="dxa"/>
+            </w:tcMar>
+          </w:tcPr>
+          <w:p>
+            <w:pPr>
+              <w:jc w:val="center"/>
+            </w:pPr>
+            <w:r>
+              <w:rPr>
+                <w:rFonts w:ascii="Times New Roman" w:hAnsi="Times New Roman"/>
+                <w:sz w:val="21"/>
+              </w:rPr>
+              <w:t>Tự động xóa vĩnh viễn sau 60 ngày kể từ khi đơn hoàn tất</w:t>
+            </w:r>
+          </w:p>
+        </w:tc>
+      </w:tr>
+    </w:tbl>
+    <w:p>
+      <w:pPr>
+        <w:keepNext/>
+        <w:spacing w:before="320" w:after="120"/>
+      </w:pPr>
+      <w:r>
+        <w:rPr>
+          <w:rFonts w:ascii="Times New Roman" w:hAnsi="Times New Roman"/>
+          <w:b/>
+          <w:color w:val="0F4A34"/>
+          <w:sz w:val="28"/>
+        </w:rPr>
+        <w:t>X. BẢNG TỔNG HỢP MA TRẬN QUẢN TRỊ RỦI RO TOÀN DIỆN (RISK MATRIX)</w:t>
       </w:r>
     </w:p>
     <w:p>
@@ -4100,7 +5420,7 @@
                 <w:rFonts w:ascii="Times New Roman" w:hAnsi="Times New Roman"/>
                 <w:sz w:val="21"/>
               </w:rPr>
-              <w:t>Tiền cọc 100% giá trị đồ được khóa trong Két Escrow; xác thực CCCD gắn chip và số điện thoại trước khi thuê.</w:t>
+              <w:t>Nguyên lý Damage Isolation: Áp trần Transaction Exposure Limit (1-2 triệu cho user mới); Cọc bảo chứng qua ngân hàng; luồng Fast-Track cho khách VIP.</w:t>
             </w:r>
           </w:p>
         </w:tc>
@@ -4198,7 +5518,7 @@
                 <w:rFonts w:ascii="Times New Roman" w:hAnsi="Times New Roman"/>
                 <w:sz w:val="21"/>
               </w:rPr>
-              <w:t>Áp dụng khóa bi quan (Pessimistic Row-level Locking) tại tầng cơ sở dữ liệu Supabase, đảm bảo tính toàn vẹn tuyệt đối.</w:t>
+              <w:t>Áp dụng khóa bi quan (Pessimistic Row-level Locking) tại tầng cơ sở dữ liệu Supabase, loại bỏ tranh chấp dữ liệu Race Condition.</w:t>
             </w:r>
           </w:p>
         </w:tc>
@@ -4322,7 +5642,7 @@
                 <w:rFonts w:ascii="Times New Roman" w:hAnsi="Times New Roman"/>
                 <w:sz w:val="21"/>
               </w:rPr>
-              <w:t>Vượt ngưỡng chi phí hạ tầng (Cloud Storage / AI)</w:t>
+              <w:t>Thắt cổ chai chi phí vận hành Admin khi tranh chấp</w:t>
             </w:r>
           </w:p>
         </w:tc>
@@ -4346,7 +5666,7 @@
                 <w:rFonts w:ascii="Times New Roman" w:hAnsi="Times New Roman"/>
                 <w:sz w:val="21"/>
               </w:rPr>
-              <w:t>Thấp</w:t>
+              <w:t>Trung bình</w:t>
             </w:r>
           </w:p>
         </w:tc>
@@ -4370,7 +5690,7 @@
                 <w:rFonts w:ascii="Times New Roman" w:hAnsi="Times New Roman"/>
                 <w:sz w:val="21"/>
               </w:rPr>
-              <w:t>Đội chi phí vận hành trong giai đoạn khởi nghiệp</w:t>
+              <w:t>Đội chi phí nhân sự ngồi xem video đối soát khi sàn tăng trưởng</w:t>
             </w:r>
           </w:p>
         </w:tc>
@@ -4394,12 +5714,106 @@
                 <w:rFonts w:ascii="Times New Roman" w:hAnsi="Times New Roman"/>
                 <w:sz w:val="21"/>
               </w:rPr>
-              <w:t>Tận dụng kho kép Google One 10TB 0đ; xoay vòng cụm 6 khóa Gemini Pro; nén ảnh tối ưu qua CDN.</w:t>
+              <w:t>Triển khai cơ chế Phân Xử Vi Mô (Micro-Resolution &lt;= 50.000đ): Trích Quỹ phòng vệ đền bù tự động trong 5 giây cho các lỗi nhỏ.</w:t>
             </w:r>
           </w:p>
         </w:tc>
       </w:tr>
     </w:tbl>
+    <w:p>
+      <w:pPr>
+        <w:keepNext/>
+        <w:spacing w:before="320" w:after="120"/>
+      </w:pPr>
+      <w:r>
+        <w:rPr>
+          <w:rFonts w:ascii="Times New Roman" w:hAnsi="Times New Roman"/>
+          <w:b/>
+          <w:color w:val="0F4A34"/>
+          <w:sz w:val="28"/>
+        </w:rPr>
+        <w:t>XI. LỘ TRÌNH TRIỂN KHAI 3 GIAI ĐOẠN (MVP -&gt; GROWTH -&gt; SCALE)</w:t>
+      </w:r>
+    </w:p>
+    <w:p>
+      <w:pPr>
+        <w:spacing w:after="80"/>
+        <w:jc w:val="both"/>
+      </w:pPr>
+      <w:r>
+        <w:rPr>
+          <w:rFonts w:ascii="Times New Roman" w:hAnsi="Times New Roman"/>
+          <w:sz w:val="25"/>
+        </w:rPr>
+        <w:t>Để đảm bảo tính khả thi tài chính và sự thực dụng trong vận hành, hệ thống an toàn và niềm tin của CLOOP được phân kỳ theo 3 giai đoạn:</w:t>
+      </w:r>
+    </w:p>
+    <w:p>
+      <w:pPr>
+        <w:pStyle w:val="ListBullet"/>
+        <w:spacing w:after="60"/>
+        <w:jc w:val="both"/>
+      </w:pPr>
+      <w:r>
+        <w:rPr>
+          <w:rFonts w:ascii="Times New Roman" w:hAnsi="Times New Roman"/>
+          <w:b/>
+          <w:sz w:val="25"/>
+        </w:rPr>
+        <w:t xml:space="preserve">1. Giai đoạn MVP Techfest (2026 - 2027): </w:t>
+      </w:r>
+      <w:r>
+        <w:rPr>
+          <w:rFonts w:ascii="Times New Roman" w:hAnsi="Times New Roman"/>
+          <w:sz w:val="25"/>
+        </w:rPr>
+        <w:t>Account Trust (Email/Phone OTP) + Trust Score cơ bản + Trần Exposure Limit 2 triệu + Cọc bảo chứng đơn đầu + Digital Evidence Timeline + Cơ chế Phân xử vi mô &lt;= 50.000đ. Chi phí công nghệ eKYC: 0 đồng.</w:t>
+      </w:r>
+    </w:p>
+    <w:p>
+      <w:pPr>
+        <w:pStyle w:val="ListBullet"/>
+        <w:spacing w:after="60"/>
+        <w:jc w:val="both"/>
+      </w:pPr>
+      <w:r>
+        <w:rPr>
+          <w:rFonts w:ascii="Times New Roman" w:hAnsi="Times New Roman"/>
+          <w:b/>
+          <w:sz w:val="25"/>
+        </w:rPr>
+        <w:t xml:space="preserve">2. Giai đoạn Tăng Trưởng - Growth (2028): </w:t>
+      </w:r>
+      <w:r>
+        <w:rPr>
+          <w:rFonts w:ascii="Times New Roman" w:hAnsi="Times New Roman"/>
+          <w:sz w:val="25"/>
+        </w:rPr>
+        <w:t>Mở rộng xác thực Email sinh viên @edu.vn + Silent Risk Engine chấm điểm tự động theo hành vi máy tính và mạng viễn thông + Gamified Trust UX trực quan trên giỏ hàng + Multi-carrier Logistics Failover.</w:t>
+      </w:r>
+    </w:p>
+    <w:p>
+      <w:pPr>
+        <w:pStyle w:val="ListBullet"/>
+        <w:spacing w:after="60"/>
+        <w:jc w:val="both"/>
+      </w:pPr>
+      <w:r>
+        <w:rPr>
+          <w:rFonts w:ascii="Times New Roman" w:hAnsi="Times New Roman"/>
+          <w:b/>
+          <w:sz w:val="25"/>
+        </w:rPr>
+        <w:t xml:space="preserve">3. Giai đoạn Mở Rộng Quy Mô - Scale Enterprise (2029+): </w:t>
+      </w:r>
+      <w:r>
+        <w:rPr>
+          <w:rFonts w:ascii="Times New Roman" w:hAnsi="Times New Roman"/>
+          <w:sz w:val="25"/>
+        </w:rPr>
+        <w:t>Tích hợp đối tác eKYC chuyên dụng (Face Match &amp; Liveness Detection) cho các giao dịch trang phục kim cương/hàng hiệu; ứng dụng AI Computer Vision tự động so khớp ảnh trước/sau giao đồ; gói bảo hiểm vi mô P2P liên kết công ty bảo hiểm.</w:t>
+      </w:r>
+    </w:p>
     <w:p>
       <w:pPr>
         <w:spacing w:before="280" w:after="280"/>
@@ -4413,7 +5827,7 @@
           <w:color w:val="0F4A34"/>
           <w:sz w:val="25"/>
         </w:rPr>
-        <w:t>KẾT LUẬN: Báo cáo này khẳng định CLOOP không đơn thuần là một website thương mại điện tử, mà là một Hệ Sinh Thái Công Nghệ Hoàn Chỉnh được thiết kế với tư duy quản trị rủi ro chặt chẽ, tối ưu hóa dòng tiền và bài toán kinh tế học tuần hoàn vững chắc. Mọi quyết định kiến trúc đều được cân nhắc thấu đáo giữa hiệu năng, chi phí và trải nghiệm người dùng, sẵn sàng bảo vệ thành công trước Hội Đồng Giám Khảo Techfest và tự tin mở rộng quy mô thương mại hóa toàn quốc.</w:t>
+        <w:t>KẾT LUẬN: Bản báo cáo này khẳng định CLOOP đã hoàn thiện một bước tiến vượt bậc về tư duy thiết kế hệ thống. Bằng cách kết hợp giữa Khung Quản Trị Rủi Ro Lũy Tiến (Progressive Trust Stack), Cơ Chế Cách Ly Thiệt Hại (Damage Isolation qua Exposure Limit), Phân Xử Vi Mô (Micro-Resolution) và Khung Bảo Vệ Dữ Liệu Cá Nhân chuẩn Luật 91/2025/QH15, CLOOP chứng minh năng lực sẵn sàng bảo vệ thành công trước các Hội Đồng Giám Khảo khó tính nhất của Techfest và vững vàng bước vào giai đoạn thương mại hóa quy mô lớn.</w:t>
       </w:r>
     </w:p>
     <w:sectPr>

</xml_diff>

<commit_message>
feat: implement Digital Damage Protocol, Owner Risk Engine, and update v4.0 architecture report
</commit_message>
<xml_diff>
--- a/BAO_CAO_KIEN_TRUC_VAN_HANH_CLOOP.docx
+++ b/BAO_CAO_KIEN_TRUC_VAN_HANH_CLOOP.docx
@@ -29,9 +29,9 @@
           <w:color w:val="4B5563"/>
           <w:sz w:val="23"/>
         </w:rPr>
-        <w:t>Tài liệu Kỹ thuật, Luận giải Kiến trúc &amp; Chiến lược Quản trị Rủi ro Thẩm định Techfest</w:t>
+        <w:t>Tài liệu Kỹ thuật, Luận giải Kiến trúc, Digital Damage Protocol &amp; Chiến lược Quản trị Rủi ro Thẩm định Techfest</w:t>
         <w:br/>
-        <w:t>Phiên bản 3.5 Enterprise • Cập nhật: Tháng 09/2026 • Trạng thái: Live Production</w:t>
+        <w:t>Phiên bản 4.0 Enterprise • Cập nhật: Tháng 09/2026 • Trạng thái: Live Production</w:t>
       </w:r>
     </w:p>
     <w:p>
@@ -44,7 +44,7 @@
           <w:rFonts w:ascii="Times New Roman" w:hAnsi="Times New Roman"/>
           <w:sz w:val="25"/>
         </w:rPr>
-        <w:t>Báo cáo này trình bày chi tiết toàn bộ kiến trúc hạ tầng công nghệ thời gian thực, mô hình dòng tiền điều phối thanh toán (Orchestration Layer), thuật toán logistics san sẻ 50/50, hệ thống CLOOP Trust Stack, bộ tính điểm rủi ro ngầm (Silent Risk Engine), trần kiểm soát rủi ro (Transaction Exposure Limit) và bài toán kinh tế học tuần hoàn của nền tảng CLOOP. Tài liệu áp dụng phương pháp luận Đánh giá Kiến trúc và Đánh đổi Chiến lược (Architecture Trade-off &amp; Strategic Evaluation Framework), bóc tách từng quyết định công nghệ và chính sách vận hành theo 5 tầng phân tích: Mục đích thiết kế, Lợi ích thực tế, Ưu điểm vượt trội, Mặt trái/Thách thức tiềm ẩn, và Phương án thay thế dự phòng, đồng thời tuân thủ nghiêm ngặt Luật Bảo vệ Dữ liệu Cá nhân số 91/2025/QH15 và Nghị định 356/2025/NĐ-CP.</w:t>
+        <w:t>Tài liệu này trình bày chi tiết toàn bộ kiến trúc hạ tầng công nghệ thời gian thực, mô hình điều phối thanh toán (Payment Orchestration Layer), quy chuẩn xử lý hư hỏng (Digital Damage Protocol), giải mã 4 Tử huyệt ngành cho thuê thời trang, bộ đối thoại 7 câu hỏi tử thần của Quỹ đầu tư mạo hiểm (VC), hệ thống CLOOP Trust Stack, trần rủi ro tài sản (Transaction Exposure Limit) và bài toán kinh tế học tuần hoàn của nền tảng CLOOP. Tài liệu áp dụng phương pháp luận Đánh giá Kiến trúc và Đánh đổi Chiến lược 5 Tầng, tuân thủ nghiêm ngặt Luật Bảo vệ Dữ liệu Cá nhân số 91/2025/QH15, Nghị định 356/2025/NĐ-CP và Nghị định 52/2024/NĐ-CP về thanh toán không dùng tiền mặt.</w:t>
       </w:r>
     </w:p>
     <w:p>
@@ -102,7 +102,7 @@
           <w:b/>
           <w:sz w:val="25"/>
         </w:rPr>
-        <w:t xml:space="preserve">1. Bản chất &amp; Mục đích (Làm như vậy để làm gì?): </w:t>
+        <w:t xml:space="preserve">1. Bản chất &amp; Mục đích: </w:t>
       </w:r>
       <w:r>
         <w:rPr>
@@ -124,7 +124,7 @@
           <w:b/>
           <w:sz w:val="25"/>
         </w:rPr>
-        <w:t xml:space="preserve">2. Lợi ích thực tế (Có lợi ích gì?): </w:t>
+        <w:t xml:space="preserve">2. Lợi ích thực tế: </w:t>
       </w:r>
       <w:r>
         <w:rPr>
@@ -146,7 +146,7 @@
           <w:b/>
           <w:sz w:val="25"/>
         </w:rPr>
-        <w:t xml:space="preserve">3. Ưu điểm vượt trội (Ưu điểm gì?): </w:t>
+        <w:t xml:space="preserve">3. Ưu điểm vượt trội: </w:t>
       </w:r>
       <w:r>
         <w:rPr>
@@ -168,7 +168,7 @@
           <w:b/>
           <w:sz w:val="25"/>
         </w:rPr>
-        <w:t xml:space="preserve">4. Mặt trái &amp; Thách thức tiềm ẩn (Mặt trái gì?): </w:t>
+        <w:t xml:space="preserve">4. Mặt trái &amp; Thách thức tiềm ẩn: </w:t>
       </w:r>
       <w:r>
         <w:rPr>
@@ -227,7 +227,7 @@
           <w:b/>
           <w:sz w:val="25"/>
         </w:rPr>
-        <w:t xml:space="preserve">1. Bản chất &amp; Mục đích (Làm như vậy để làm gì?): </w:t>
+        <w:t xml:space="preserve">1. Bản chất &amp; Mục đích: </w:t>
       </w:r>
       <w:r>
         <w:rPr>
@@ -249,7 +249,7 @@
           <w:b/>
           <w:sz w:val="25"/>
         </w:rPr>
-        <w:t xml:space="preserve">2. Lợi ích thực tế (Có lợi ích gì?): </w:t>
+        <w:t xml:space="preserve">2. Lợi ích thực tế: </w:t>
       </w:r>
       <w:r>
         <w:rPr>
@@ -271,7 +271,7 @@
           <w:b/>
           <w:sz w:val="25"/>
         </w:rPr>
-        <w:t xml:space="preserve">3. Ưu điểm vượt trội (Ưu điểm gì?): </w:t>
+        <w:t xml:space="preserve">3. Ưu điểm vượt trội: </w:t>
       </w:r>
       <w:r>
         <w:rPr>
@@ -293,7 +293,7 @@
           <w:b/>
           <w:sz w:val="25"/>
         </w:rPr>
-        <w:t xml:space="preserve">4. Mặt trái &amp; Thách thức tiềm ẩn (Mặt trái gì?): </w:t>
+        <w:t xml:space="preserve">4. Mặt trái &amp; Thách thức tiềm ẩn: </w:t>
       </w:r>
       <w:r>
         <w:rPr>
@@ -352,7 +352,7 @@
           <w:b/>
           <w:sz w:val="25"/>
         </w:rPr>
-        <w:t xml:space="preserve">1. Bản chất &amp; Mục đích (Làm như vậy để làm gì?): </w:t>
+        <w:t xml:space="preserve">1. Bản chất &amp; Mục đích: </w:t>
       </w:r>
       <w:r>
         <w:rPr>
@@ -374,7 +374,7 @@
           <w:b/>
           <w:sz w:val="25"/>
         </w:rPr>
-        <w:t xml:space="preserve">2. Lợi ích thực tế (Có lợi ích gì?): </w:t>
+        <w:t xml:space="preserve">2. Lợi ích thực tế: </w:t>
       </w:r>
       <w:r>
         <w:rPr>
@@ -396,7 +396,7 @@
           <w:b/>
           <w:sz w:val="25"/>
         </w:rPr>
-        <w:t xml:space="preserve">3. Ưu điểm vượt trội (Ưu điểm gì?): </w:t>
+        <w:t xml:space="preserve">3. Ưu điểm vượt trội: </w:t>
       </w:r>
       <w:r>
         <w:rPr>
@@ -418,7 +418,7 @@
           <w:b/>
           <w:sz w:val="25"/>
         </w:rPr>
-        <w:t xml:space="preserve">4. Mặt trái &amp; Thách thức tiềm ẩn (Mặt trái gì?): </w:t>
+        <w:t xml:space="preserve">4. Mặt trái &amp; Thách thức tiềm ẩn: </w:t>
       </w:r>
       <w:r>
         <w:rPr>
@@ -477,7 +477,7 @@
           <w:b/>
           <w:sz w:val="25"/>
         </w:rPr>
-        <w:t xml:space="preserve">1. Bản chất &amp; Mục đích (Làm như vậy để làm gì?): </w:t>
+        <w:t xml:space="preserve">1. Bản chất &amp; Mục đích: </w:t>
       </w:r>
       <w:r>
         <w:rPr>
@@ -499,7 +499,7 @@
           <w:b/>
           <w:sz w:val="25"/>
         </w:rPr>
-        <w:t xml:space="preserve">2. Lợi ích thực tế (Có lợi ích gì?): </w:t>
+        <w:t xml:space="preserve">2. Lợi ích thực tế: </w:t>
       </w:r>
       <w:r>
         <w:rPr>
@@ -521,7 +521,7 @@
           <w:b/>
           <w:sz w:val="25"/>
         </w:rPr>
-        <w:t xml:space="preserve">3. Ưu điểm vượt trội (Ưu điểm gì?): </w:t>
+        <w:t xml:space="preserve">3. Ưu điểm vượt trội: </w:t>
       </w:r>
       <w:r>
         <w:rPr>
@@ -543,7 +543,7 @@
           <w:b/>
           <w:sz w:val="25"/>
         </w:rPr>
-        <w:t xml:space="preserve">4. Mặt trái &amp; Thách thức tiềm ẩn (Mặt trái gì?): </w:t>
+        <w:t xml:space="preserve">4. Mặt trái &amp; Thách thức tiềm ẩn: </w:t>
       </w:r>
       <w:r>
         <w:rPr>
@@ -602,7 +602,7 @@
           <w:b/>
           <w:sz w:val="25"/>
         </w:rPr>
-        <w:t xml:space="preserve">1. Bản chất &amp; Mục đích (Làm như vậy để làm gì?): </w:t>
+        <w:t xml:space="preserve">1. Bản chất &amp; Mục đích: </w:t>
       </w:r>
       <w:r>
         <w:rPr>
@@ -624,7 +624,7 @@
           <w:b/>
           <w:sz w:val="25"/>
         </w:rPr>
-        <w:t xml:space="preserve">2. Lợi ích thực tế (Có lợi ích gì?): </w:t>
+        <w:t xml:space="preserve">2. Lợi ích thực tế: </w:t>
       </w:r>
       <w:r>
         <w:rPr>
@@ -646,7 +646,7 @@
           <w:b/>
           <w:sz w:val="25"/>
         </w:rPr>
-        <w:t xml:space="preserve">3. Ưu điểm vượt trội (Ưu điểm gì?): </w:t>
+        <w:t xml:space="preserve">3. Ưu điểm vượt trội: </w:t>
       </w:r>
       <w:r>
         <w:rPr>
@@ -668,7 +668,7 @@
           <w:b/>
           <w:sz w:val="25"/>
         </w:rPr>
-        <w:t xml:space="preserve">4. Mặt trái &amp; Thách thức tiềm ẩn (Mặt trái gì?): </w:t>
+        <w:t xml:space="preserve">4. Mặt trái &amp; Thách thức tiềm ẩn: </w:t>
       </w:r>
       <w:r>
         <w:rPr>
@@ -727,7 +727,7 @@
           <w:b/>
           <w:sz w:val="25"/>
         </w:rPr>
-        <w:t xml:space="preserve">1. Bản chất &amp; Mục đích (Làm như vậy để làm gì?): </w:t>
+        <w:t xml:space="preserve">1. Bản chất &amp; Mục đích: </w:t>
       </w:r>
       <w:r>
         <w:rPr>
@@ -749,7 +749,7 @@
           <w:b/>
           <w:sz w:val="25"/>
         </w:rPr>
-        <w:t xml:space="preserve">2. Lợi ích thực tế (Có lợi ích gì?): </w:t>
+        <w:t xml:space="preserve">2. Lợi ích thực tế: </w:t>
       </w:r>
       <w:r>
         <w:rPr>
@@ -771,7 +771,7 @@
           <w:b/>
           <w:sz w:val="25"/>
         </w:rPr>
-        <w:t xml:space="preserve">3. Ưu điểm vượt trội (Ưu điểm gì?): </w:t>
+        <w:t xml:space="preserve">3. Ưu điểm vượt trội: </w:t>
       </w:r>
       <w:r>
         <w:rPr>
@@ -793,7 +793,7 @@
           <w:b/>
           <w:sz w:val="25"/>
         </w:rPr>
-        <w:t xml:space="preserve">4. Mặt trái &amp; Thách thức tiềm ẩn (Mặt trái gì?): </w:t>
+        <w:t xml:space="preserve">4. Mặt trái &amp; Thách thức tiềm ẩn: </w:t>
       </w:r>
       <w:r>
         <w:rPr>
@@ -837,7 +837,7 @@
           <w:color w:val="0F4A34"/>
           <w:sz w:val="28"/>
         </w:rPr>
-        <w:t>II. THUẬT TOÁN LOGISTICS SAN SẺ 50/50 &amp; ĐỆM RỦI RO BLOCK 5K</w:t>
+        <w:t>II. 4 TỬ HUYỆT CỦA MÔ HÌNH FASHION RENTAL &amp; LỜI GIẢI CỦA CLOOP</w:t>
       </w:r>
     </w:p>
     <w:p>
@@ -850,7 +850,7 @@
           <w:rFonts w:ascii="Times New Roman" w:hAnsi="Times New Roman"/>
           <w:sz w:val="25"/>
         </w:rPr>
-        <w:t>Một trong những rào cản lớn nhất khiến mô hình cho thuê thời trang thất bại là chi phí vận chuyển 2 chiều (Lượt đi: Tủ đồ -&gt; Khách; Lượt về: Khách -&gt; Tủ đồ). Nếu bắt Khách thuê gánh trọn cả 2 đầu ship (~50.000đ - 70.000đ), tỷ lệ bỏ giỏ hàng (Cart Abandonment) sẽ vượt quá 65%. Ngược lại, nếu bắt Chủ tủ chịu toàn bộ, họ sẽ không còn động lực chia sẻ đồ vì biên lợi nhuận bị bào mòn.</w:t>
+        <w:t>Mô hình cho thuê thời trang P2P từng được coi là 'Nghĩa địa Startup' vì nhiều nền tảng đã đốt hàng triệu USD rồi đóng cửa do vấp phải 4 rào cản chí mạng. Dưới đây là cách CLOOP phá vỡ 4 tử huyệt này:</w:t>
       </w:r>
     </w:p>
     <w:p>
@@ -865,7 +865,7 @@
           <w:color w:val="183A2D"/>
           <w:sz w:val="26"/>
         </w:rPr>
-        <w:t>Cơ Chế San Sẻ Logistics 50/50 Kết Hợp Thuật Toán Làm Tròn Block 5K</w:t>
+        <w:t>Tử Huyệt 1: Cơn Ác Mộng CSKH &amp; Tỷ Lệ Hoàn Trả 100% (The CS Nightmare)</w:t>
       </w:r>
     </w:p>
     <w:p>
@@ -880,14 +880,14 @@
           <w:b/>
           <w:sz w:val="25"/>
         </w:rPr>
-        <w:t xml:space="preserve">1. Bản chất &amp; Mục đích (Làm như vậy để làm gì?): </w:t>
+        <w:t xml:space="preserve">1. Bản chất &amp; Mục đích: </w:t>
       </w:r>
       <w:r>
         <w:rPr>
           <w:rFonts w:ascii="Times New Roman" w:hAnsi="Times New Roman"/>
           <w:sz w:val="25"/>
         </w:rPr>
-        <w:t>CLOOP áp dụng thuật toán chia đôi cước vận chuyển chuẩn hóa: Khách thuê thanh toán trước 25.000đ cho lượt đi ngay lúc tạo đơn; Chủ tủ khấu trừ 25.000đ cho lượt về từ doanh thu cho thuê trước khi giải ngân. Mọi mức cước thực tế từ API GHN đều được làm tròn trần (Ceil) lên mốc 5.000đ gần nhất theo công thức: Cước niêm yết = ⌈ Cước thực tế / 5.000 ⌉ × 5.000.</w:t>
+        <w:t>Thương mại điện tử thông thường chỉ có tỷ lệ trả hàng dưới 10%. Nhưng trong Fashion Rental, tỷ lệ hoàn trả về bản chất là 100%. Mỗi vòng quay đều tiềm ẩn nguy cơ phát sinh xước chỉ, vết bẩn, trễ hạn, đổ lỗi qua lại. Nếu dùng nhân sự CSKH ngồi phân xử thủ công cho từng đơn hàng 200.000đ, chi phí vận hành (OPEX) sẽ bóp nghẹt biên lợi nhuận.</w:t>
       </w:r>
     </w:p>
     <w:p>
@@ -902,14 +902,14 @@
           <w:b/>
           <w:sz w:val="25"/>
         </w:rPr>
-        <w:t xml:space="preserve">2. Lợi ích thực tế (Có lợi ích gì?): </w:t>
+        <w:t xml:space="preserve">2. Lợi ích thực tế: </w:t>
       </w:r>
       <w:r>
         <w:rPr>
           <w:rFonts w:ascii="Times New Roman" w:hAnsi="Times New Roman"/>
           <w:sz w:val="25"/>
         </w:rPr>
-        <w:t>Hạ thấp rào cản tâm lý cho khách thuê (chỉ thấy phí ship 25k như mua hàng thông thường); Chủ tủ thoải mái vì chi phí lượt về được khấu trừ tự động từ doanh thu chứ không phải bỏ tiền túi trước. Phần chênh lệch làm tròn tạo ra dòng thặng dư dương (+4.000đ đến +8.000đ mỗi đơn hàng) tích lũy trực tiếp vào Quỹ Phòng Vệ Rủi Ro Vận Chuyển của sàn.</w:t>
+        <w:t>CLOOP số hóa toàn bộ luật chơi: Áp dụng Digital Damage Protocol (3 cấp độ thiệt hại), Digital Evidence Timeline có timestamp, và cơ chế Phân Xử Vi Mô (Micro-Resolution &lt;= 50.000đ) tự động giải quyết các lỗi nhỏ trong 5 giây mà không cần con người can thiệp.</w:t>
       </w:r>
     </w:p>
     <w:p>
@@ -924,14 +924,14 @@
           <w:b/>
           <w:sz w:val="25"/>
         </w:rPr>
-        <w:t xml:space="preserve">3. Ưu điểm vượt trội (Ưu điểm gì?): </w:t>
+        <w:t xml:space="preserve">3. Ưu điểm vượt trội: </w:t>
       </w:r>
       <w:r>
         <w:rPr>
           <w:rFonts w:ascii="Times New Roman" w:hAnsi="Times New Roman"/>
           <w:sz w:val="25"/>
         </w:rPr>
-        <w:t>Tạo cơ chế tự bù đắp rủi ro vận hành (Self-Insured Logistics Pool): Giảm thiểu nguy cơ sàn bị âm vốn vận chuyển khi bưu tá phụ thu phụ phí giao lại lần 2 hoặc hàng hóa cần chuyển hoàn.</w:t>
+        <w:t>Cắt giảm hơn 85% thời gian và chi phí nhân sự xử lý khiếu nại so với các mô hình truyền thống.</w:t>
       </w:r>
     </w:p>
     <w:p>
@@ -946,14 +946,14 @@
           <w:b/>
           <w:sz w:val="25"/>
         </w:rPr>
-        <w:t xml:space="preserve">4. Mặt trái &amp; Thách thức tiềm ẩn (Mặt trái gì?): </w:t>
+        <w:t xml:space="preserve">4. Mặt trái &amp; Thách thức tiềm ẩn: </w:t>
       </w:r>
       <w:r>
         <w:rPr>
           <w:rFonts w:ascii="Times New Roman" w:hAnsi="Times New Roman"/>
           <w:sz w:val="25"/>
         </w:rPr>
-        <w:t>Nếu khách thuê ở các khu vực biển đảo, vùng sâu vùng xa (nơi cước thực tế của GHN vượt quá 50.000đ), phần trợ giá của sàn có thể làm hao hụt Quỹ phòng vệ nếu không có thuật toán giới hạn bán kính vận chuyển.</w:t>
+        <w:t>Một số trường hợp tranh chấp phức tạp có giá trị lớn vẫn cần Admin thẩm định thủ công.</w:t>
       </w:r>
     </w:p>
     <w:p>
@@ -975,9 +975,1463 @@
           <w:rFonts w:ascii="Times New Roman" w:hAnsi="Times New Roman"/>
           <w:sz w:val="25"/>
         </w:rPr>
-        <w:t>1. Thuật toán Geofencing: Tự động phát hiện các đơn hàng liên tỉnh có cước vượt quá 45.000đ để áp dụng phụ thu vùng xa minh bạch.</w:t>
+        <w:t>Giai đoạn Scale-Up sẽ ứng dụng AI Computer Vision để tự động so khớp điểm khác biệt giữa ảnh lúc giao và ảnh lúc nhận đồ.</w:t>
+      </w:r>
+    </w:p>
+    <w:p>
+      <w:pPr>
+        <w:keepNext/>
+        <w:spacing w:before="200" w:after="80"/>
+      </w:pPr>
+      <w:r>
+        <w:rPr>
+          <w:rFonts w:ascii="Times New Roman" w:hAnsi="Times New Roman"/>
+          <w:b/>
+          <w:color w:val="183A2D"/>
+          <w:sz w:val="26"/>
+        </w:rPr>
+        <w:t>Tử Huyệt 2: Logistics 2 Chiều &amp; Thời Gian Bất Động Của Tài Sản (Asset Utilization)</w:t>
+      </w:r>
+    </w:p>
+    <w:p>
+      <w:pPr>
+        <w:pStyle w:val="ListBullet"/>
+        <w:spacing w:after="60"/>
+        <w:jc w:val="both"/>
+      </w:pPr>
+      <w:r>
+        <w:rPr>
+          <w:rFonts w:ascii="Times New Roman" w:hAnsi="Times New Roman"/>
+          <w:b/>
+          <w:sz w:val="25"/>
+        </w:rPr>
+        <w:t xml:space="preserve">1. Bản chất &amp; Mục đích: </w:t>
+      </w:r>
+      <w:r>
+        <w:rPr>
+          <w:rFonts w:ascii="Times New Roman" w:hAnsi="Times New Roman"/>
+          <w:sz w:val="25"/>
+        </w:rPr>
+        <w:t>Hàng đi 2 chiều khiến chi phí ship gấp đôi. Nguy hiểm hơn là thời gian tài sản bị 'đóng băng' trên đường vận chuyển. Nếu chuyển phát liên tỉnh mất 3 ngày đi và 3 ngày về, một chiếc váy chỉ phục vụ sự kiện 3 tiếng nhưng mất trọn 6 ngày bất động, một tháng chỉ cho thuê được 2-3 lần khiến hiệu suất sinh lời quá thấp.</w:t>
+      </w:r>
+    </w:p>
+    <w:p>
+      <w:pPr>
+        <w:pStyle w:val="ListBullet"/>
+        <w:spacing w:after="60"/>
+        <w:jc w:val="both"/>
+      </w:pPr>
+      <w:r>
+        <w:rPr>
+          <w:rFonts w:ascii="Times New Roman" w:hAnsi="Times New Roman"/>
+          <w:b/>
+          <w:sz w:val="25"/>
+        </w:rPr>
+        <w:t xml:space="preserve">2. Lợi ích thực tế: </w:t>
+      </w:r>
+      <w:r>
+        <w:rPr>
+          <w:rFonts w:ascii="Times New Roman" w:hAnsi="Times New Roman"/>
+          <w:sz w:val="25"/>
+        </w:rPr>
+        <w:t>CLOOP áp dụng chiến lược Thanh Khoản Cục Bộ (Hyper-local Liquidity): Ưu tiên ghép nối tủ đồ và khách thuê trong bán kính 5 - 10km. Thời gian giao nhận chỉ mất 2 - 4 giờ qua bưu tá nội thành hoặc khách tự lấy tại CLOOP Hub.</w:t>
+      </w:r>
+    </w:p>
+    <w:p>
+      <w:pPr>
+        <w:pStyle w:val="ListBullet"/>
+        <w:spacing w:after="60"/>
+        <w:jc w:val="both"/>
+      </w:pPr>
+      <w:r>
+        <w:rPr>
+          <w:rFonts w:ascii="Times New Roman" w:hAnsi="Times New Roman"/>
+          <w:b/>
+          <w:sz w:val="25"/>
+        </w:rPr>
+        <w:t xml:space="preserve">3. Ưu điểm vượt trội: </w:t>
+      </w:r>
+      <w:r>
+        <w:rPr>
+          <w:rFonts w:ascii="Times New Roman" w:hAnsi="Times New Roman"/>
+          <w:sz w:val="25"/>
+        </w:rPr>
+        <w:t>Rút ngắn thời gian luân chuyển xuống dưới 24 giờ. Một chiếc váy có thể quay vòng từ 6 - 8 lần/tháng vào mùa cao điểm, tăng gấp 3 lần hiệu suất sinh lời cho Chủ tủ.</w:t>
+      </w:r>
+    </w:p>
+    <w:p>
+      <w:pPr>
+        <w:pStyle w:val="ListBullet"/>
+        <w:spacing w:after="60"/>
+        <w:jc w:val="both"/>
+      </w:pPr>
+      <w:r>
+        <w:rPr>
+          <w:rFonts w:ascii="Times New Roman" w:hAnsi="Times New Roman"/>
+          <w:b/>
+          <w:sz w:val="25"/>
+        </w:rPr>
+        <w:t xml:space="preserve">4. Mặt trái &amp; Thách thức tiềm ẩn: </w:t>
+      </w:r>
+      <w:r>
+        <w:rPr>
+          <w:rFonts w:ascii="Times New Roman" w:hAnsi="Times New Roman"/>
+          <w:sz w:val="25"/>
+        </w:rPr>
+        <w:t>Mật độ nguồn cung ban đầu ở một số quận huyện ngoại thành có thể chưa đủ dày đặc để phủ kín bán kính 5km.</w:t>
+      </w:r>
+    </w:p>
+    <w:p>
+      <w:pPr>
+        <w:pStyle w:val="ListBullet"/>
+        <w:spacing w:after="60"/>
+        <w:jc w:val="both"/>
+      </w:pPr>
+      <w:r>
+        <w:rPr>
+          <w:rFonts w:ascii="Times New Roman" w:hAnsi="Times New Roman"/>
+          <w:b/>
+          <w:sz w:val="25"/>
+        </w:rPr>
+        <w:t xml:space="preserve">5. Đề xuất phương án thay thế &amp; Kế hoạch dự phòng: </w:t>
+      </w:r>
+      <w:r>
+        <w:rPr>
+          <w:rFonts w:ascii="Times New Roman" w:hAnsi="Times New Roman"/>
+          <w:sz w:val="25"/>
+        </w:rPr>
+        <w:t>Tập trung thâm nhập theo từng cụm trường Đại học và khu văn phòng lớn trước khi mở rộng diện rộng.</w:t>
+      </w:r>
+    </w:p>
+    <w:p>
+      <w:pPr>
+        <w:keepNext/>
+        <w:spacing w:before="200" w:after="80"/>
+      </w:pPr>
+      <w:r>
+        <w:rPr>
+          <w:rFonts w:ascii="Times New Roman" w:hAnsi="Times New Roman"/>
+          <w:b/>
+          <w:color w:val="183A2D"/>
+          <w:sz w:val="26"/>
+        </w:rPr>
+        <w:t>Tử Huyệt 3: Cuộc Xâm Lăng Của Thời Trang Nhanh (Fast Fashion vs Occasion Economics)</w:t>
+      </w:r>
+    </w:p>
+    <w:p>
+      <w:pPr>
+        <w:pStyle w:val="ListBullet"/>
+        <w:spacing w:after="60"/>
+        <w:jc w:val="both"/>
+      </w:pPr>
+      <w:r>
+        <w:rPr>
+          <w:rFonts w:ascii="Times New Roman" w:hAnsi="Times New Roman"/>
+          <w:b/>
+          <w:sz w:val="25"/>
+        </w:rPr>
+        <w:t xml:space="preserve">1. Bản chất &amp; Mục đích: </w:t>
+      </w:r>
+      <w:r>
+        <w:rPr>
+          <w:rFonts w:ascii="Times New Roman" w:hAnsi="Times New Roman"/>
+          <w:sz w:val="25"/>
+        </w:rPr>
+        <w:t>Người tiêu dùng có thể lên Shopee/TikTok/Taobao mua đứt một chiếc đầm mới giá chỉ 200k - 250k (chất lượng vải thấp) thay vì phải đi thuê đồ cũ giá 200k kèm tiền cọc và nỗi lo làm bẩn đồ.</w:t>
+      </w:r>
+    </w:p>
+    <w:p>
+      <w:pPr>
+        <w:pStyle w:val="ListBullet"/>
+        <w:spacing w:after="60"/>
+        <w:jc w:val="both"/>
+      </w:pPr>
+      <w:r>
+        <w:rPr>
+          <w:rFonts w:ascii="Times New Roman" w:hAnsi="Times New Roman"/>
+          <w:b/>
+          <w:sz w:val="25"/>
+        </w:rPr>
+        <w:t xml:space="preserve">2. Lợi ích thực tế: </w:t>
+      </w:r>
+      <w:r>
+        <w:rPr>
+          <w:rFonts w:ascii="Times New Roman" w:hAnsi="Times New Roman"/>
+          <w:sz w:val="25"/>
+        </w:rPr>
+        <w:t>CLOOP không cạnh tranh ở phân khúc quần áo mặc thường ngày. CLOOP định vị vào Kinh Tế Học Sự Kiện (Occasion Economics): Cho thuê các trang phục thiết kế cao cấp, áo dài, đầm dạ tiệc, vest có giá bán từ 1.500.000đ đến 5.000.000đ với giá thuê chỉ 200k - 350k. Khách hàng chi trả 200k để khoác lên người chất lượng của 2 triệu và tỏa sáng đúng 1 đêm.</w:t>
+      </w:r>
+    </w:p>
+    <w:p>
+      <w:pPr>
+        <w:pStyle w:val="ListBullet"/>
+        <w:spacing w:after="60"/>
+        <w:jc w:val="both"/>
+      </w:pPr>
+      <w:r>
+        <w:rPr>
+          <w:rFonts w:ascii="Times New Roman" w:hAnsi="Times New Roman"/>
+          <w:b/>
+          <w:sz w:val="25"/>
+        </w:rPr>
+        <w:t xml:space="preserve">3. Ưu điểm vượt trội: </w:t>
+      </w:r>
+      <w:r>
+        <w:rPr>
+          <w:rFonts w:ascii="Times New Roman" w:hAnsi="Times New Roman"/>
+          <w:sz w:val="25"/>
+        </w:rPr>
+        <w:t>Tạo ra giá trị mà thời trang nhanh giá rẻ hoàn toàn không thể cạnh tranh về form dáng, chất liệu và độ sang trọng.</w:t>
+      </w:r>
+    </w:p>
+    <w:p>
+      <w:pPr>
+        <w:pStyle w:val="ListBullet"/>
+        <w:spacing w:after="60"/>
+        <w:jc w:val="both"/>
+      </w:pPr>
+      <w:r>
+        <w:rPr>
+          <w:rFonts w:ascii="Times New Roman" w:hAnsi="Times New Roman"/>
+          <w:b/>
+          <w:sz w:val="25"/>
+        </w:rPr>
+        <w:t xml:space="preserve">4. Mặt trái &amp; Thách thức tiềm ẩn: </w:t>
+      </w:r>
+      <w:r>
+        <w:rPr>
+          <w:rFonts w:ascii="Times New Roman" w:hAnsi="Times New Roman"/>
+          <w:sz w:val="25"/>
+        </w:rPr>
+        <w:t>Tần suất nhu cầu thuê đồ sự kiện thấp hơn so với nhu cầu mua sắm quần áo mặc hàng ngày.</w:t>
+      </w:r>
+    </w:p>
+    <w:p>
+      <w:pPr>
+        <w:pStyle w:val="ListBullet"/>
+        <w:spacing w:after="60"/>
+        <w:jc w:val="both"/>
+      </w:pPr>
+      <w:r>
+        <w:rPr>
+          <w:rFonts w:ascii="Times New Roman" w:hAnsi="Times New Roman"/>
+          <w:b/>
+          <w:sz w:val="25"/>
+        </w:rPr>
+        <w:t xml:space="preserve">5. Đề xuất phương án thay thế &amp; Kế hoạch dự phòng: </w:t>
+      </w:r>
+      <w:r>
+        <w:rPr>
+          <w:rFonts w:ascii="Times New Roman" w:hAnsi="Times New Roman"/>
+          <w:sz w:val="25"/>
+        </w:rPr>
+        <w:t>Bổ sung gói dịch vụ trọn gói kèm phụ kiện (túi xách, trang sức) để tối ưu giá trị giỏ hàng mỗi lần thuê sự kiện.</w:t>
+      </w:r>
+    </w:p>
+    <w:p>
+      <w:pPr>
+        <w:keepNext/>
+        <w:spacing w:before="200" w:after="80"/>
+      </w:pPr>
+      <w:r>
+        <w:rPr>
+          <w:rFonts w:ascii="Times New Roman" w:hAnsi="Times New Roman"/>
+          <w:b/>
+          <w:color w:val="183A2D"/>
+          <w:sz w:val="26"/>
+        </w:rPr>
+        <w:t>Tử Huyệt 4: Thanh Khoản Cục Bộ &amp; Mạng Lưới Phân Tán (Local Network Effects)</w:t>
+      </w:r>
+    </w:p>
+    <w:p>
+      <w:pPr>
+        <w:pStyle w:val="ListBullet"/>
+        <w:spacing w:after="60"/>
+        <w:jc w:val="both"/>
+      </w:pPr>
+      <w:r>
+        <w:rPr>
+          <w:rFonts w:ascii="Times New Roman" w:hAnsi="Times New Roman"/>
+          <w:b/>
+          <w:sz w:val="25"/>
+        </w:rPr>
+        <w:t xml:space="preserve">1. Bản chất &amp; Mục đích: </w:t>
+      </w:r>
+      <w:r>
+        <w:rPr>
+          <w:rFonts w:ascii="Times New Roman" w:hAnsi="Times New Roman"/>
+          <w:sz w:val="25"/>
+        </w:rPr>
+        <w:t>Một chiếc váy size S ở Hà Nội hoàn toàn vô nghĩa với một cô gái đang cần thuê gấp ở TP.HCM tối nay. Việc mở rộng tràn lan mà không có mật độ tập trung sẽ khiến sàn trở thành 'chợ ảo không có giao dịch'.</w:t>
+      </w:r>
+    </w:p>
+    <w:p>
+      <w:pPr>
+        <w:pStyle w:val="ListBullet"/>
+        <w:spacing w:after="60"/>
+        <w:jc w:val="both"/>
+      </w:pPr>
+      <w:r>
+        <w:rPr>
+          <w:rFonts w:ascii="Times New Roman" w:hAnsi="Times New Roman"/>
+          <w:b/>
+          <w:sz w:val="25"/>
+        </w:rPr>
+        <w:t xml:space="preserve">2. Lợi ích thực tế: </w:t>
+      </w:r>
+      <w:r>
+        <w:rPr>
+          <w:rFonts w:ascii="Times New Roman" w:hAnsi="Times New Roman"/>
+          <w:sz w:val="25"/>
+        </w:rPr>
+        <w:t>CLOOP xây dựng mạng lưới theo nguyên lý 'Bán kính thanh khoản': Thuật toán tìm kiếm ưu tiên hiển thị các sản phẩm có thể nhận trong ngày quanh vị trí của người dùng; xây dựng các trạm gom đồ CLOOP Hub tại các tòa nhà trung tâm.</w:t>
+      </w:r>
+    </w:p>
+    <w:p>
+      <w:pPr>
+        <w:pStyle w:val="ListBullet"/>
+        <w:spacing w:after="60"/>
+        <w:jc w:val="both"/>
+      </w:pPr>
+      <w:r>
+        <w:rPr>
+          <w:rFonts w:ascii="Times New Roman" w:hAnsi="Times New Roman"/>
+          <w:b/>
+          <w:sz w:val="25"/>
+        </w:rPr>
+        <w:t xml:space="preserve">3. Ưu điểm vượt trội: </w:t>
+      </w:r>
+      <w:r>
+        <w:rPr>
+          <w:rFonts w:ascii="Times New Roman" w:hAnsi="Times New Roman"/>
+          <w:sz w:val="25"/>
+        </w:rPr>
+        <w:t>Tạo ra hiệu ứng mạng lưới địa phương (Local Network Effect) vững chắc mà các đối thủ thương mại điện tử giao hàng chậm từ kho trung tâm không thể sao chép.</w:t>
+      </w:r>
+    </w:p>
+    <w:p>
+      <w:pPr>
+        <w:pStyle w:val="ListBullet"/>
+        <w:spacing w:after="60"/>
+        <w:jc w:val="both"/>
+      </w:pPr>
+      <w:r>
+        <w:rPr>
+          <w:rFonts w:ascii="Times New Roman" w:hAnsi="Times New Roman"/>
+          <w:b/>
+          <w:sz w:val="25"/>
+        </w:rPr>
+        <w:t xml:space="preserve">4. Mặt trái &amp; Thách thức tiềm ẩn: </w:t>
+      </w:r>
+      <w:r>
+        <w:rPr>
+          <w:rFonts w:ascii="Times New Roman" w:hAnsi="Times New Roman"/>
+          <w:sz w:val="25"/>
+        </w:rPr>
+        <w:t>Đòi hỏi công tác tuyển chọn tủ đồ (Founding 100) phải được phân bổ đồng đều theo các khu vực địa lý trọng điểm.</w:t>
+      </w:r>
+    </w:p>
+    <w:p>
+      <w:pPr>
+        <w:pStyle w:val="ListBullet"/>
+        <w:spacing w:after="60"/>
+        <w:jc w:val="both"/>
+      </w:pPr>
+      <w:r>
+        <w:rPr>
+          <w:rFonts w:ascii="Times New Roman" w:hAnsi="Times New Roman"/>
+          <w:b/>
+          <w:sz w:val="25"/>
+        </w:rPr>
+        <w:t xml:space="preserve">5. Đề xuất phương án thay thế &amp; Kế hoạch dự phòng: </w:t>
+      </w:r>
+      <w:r>
+        <w:rPr>
+          <w:rFonts w:ascii="Times New Roman" w:hAnsi="Times New Roman"/>
+          <w:sz w:val="25"/>
+        </w:rPr>
+        <w:t>Áp dụng chính sách thưởng Leaf Coins cho các chủ tủ ở những khu vực đang thiếu hụt nguồn cung để cân bằng thanh khoản.</w:t>
+      </w:r>
+    </w:p>
+    <w:p>
+      <w:pPr>
+        <w:keepNext/>
+        <w:spacing w:before="320" w:after="120"/>
+      </w:pPr>
+      <w:r>
+        <w:rPr>
+          <w:rFonts w:ascii="Times New Roman" w:hAnsi="Times New Roman"/>
+          <w:b/>
+          <w:color w:val="0F4A34"/>
+          <w:sz w:val="28"/>
+        </w:rPr>
+        <w:t>III. BỘ GIÁP 7 CÂU HỎI TỬ THẦN CỦA QUỸ ĐẦU TƯ (VC Q&amp;A MATRIX)</w:t>
+      </w:r>
+    </w:p>
+    <w:p>
+      <w:pPr>
+        <w:spacing w:after="80"/>
+        <w:jc w:val="both"/>
+      </w:pPr>
+      <w:r>
+        <w:rPr>
+          <w:rFonts w:ascii="Times New Roman" w:hAnsi="Times New Roman"/>
+          <w:sz w:val="25"/>
+        </w:rPr>
+        <w:t>Dưới đây là bộ ma trận đối thoại bóc tách 7 câu hỏi hóc búa nhất mà các nhà đầu tư mạo hiểm (Venture Capitals) và Ban Giám Khảo sẽ đặt ra cho CLOOP:</w:t>
+      </w:r>
+    </w:p>
+    <w:tbl>
+      <w:tblPr>
+        <w:tblW w:type="auto" w:w="0"/>
+        <w:jc w:val="center"/>
+        <w:tblLook w:firstColumn="1" w:firstRow="1" w:lastColumn="0" w:lastRow="0" w:noHBand="0" w:noVBand="1" w:val="04A0"/>
+        <w:tblBorders>
+          <w:top w:val="single" w:sz="6" w:space="0" w:color="D3D3D3"/>
+          <w:bottom w:val="single" w:sz="6" w:space="0" w:color="D3D3D3"/>
+          <w:insideH w:val="single" w:sz="4" w:space="0" w:color="D3D3D3"/>
+          <w:insideV w:val="none"/>
+          <w:left w:val="none"/>
+          <w:right w:val="none"/>
+        </w:tblBorders>
+      </w:tblPr>
+      <w:tblGrid>
+        <w:gridCol w:w="3024"/>
+        <w:gridCol w:w="3024"/>
+        <w:gridCol w:w="3024"/>
+      </w:tblGrid>
+      <w:tr>
+        <w:tc>
+          <w:tcPr>
+            <w:tcW w:type="dxa" w:w="3024"/>
+            <w:shd w:fill="E6F4EA"/>
+            <w:tcMar>
+              <w:top w:w="120" w:type="dxa"/>
+              <w:bottom w:w="120" w:type="dxa"/>
+              <w:left w:w="100" w:type="dxa"/>
+              <w:right w:w="100" w:type="dxa"/>
+            </w:tcMar>
+          </w:tcPr>
+          <w:p>
+            <w:pPr>
+              <w:jc w:val="center"/>
+            </w:pPr>
+            <w:r>
+              <w:rPr>
+                <w:rFonts w:ascii="Times New Roman" w:hAnsi="Times New Roman"/>
+                <w:b/>
+                <w:color w:val="0A2517"/>
+                <w:sz w:val="22"/>
+              </w:rPr>
+              <w:t>Câu hỏi chất vấn của VC</w:t>
+            </w:r>
+          </w:p>
+        </w:tc>
+        <w:tc>
+          <w:tcPr>
+            <w:tcW w:type="dxa" w:w="3024"/>
+            <w:shd w:fill="E6F4EA"/>
+            <w:tcMar>
+              <w:top w:w="120" w:type="dxa"/>
+              <w:bottom w:w="120" w:type="dxa"/>
+              <w:left w:w="100" w:type="dxa"/>
+              <w:right w:w="100" w:type="dxa"/>
+            </w:tcMar>
+          </w:tcPr>
+          <w:p>
+            <w:pPr>
+              <w:jc w:val="center"/>
+            </w:pPr>
+            <w:r>
+              <w:rPr>
+                <w:rFonts w:ascii="Times New Roman" w:hAnsi="Times New Roman"/>
+                <w:b/>
+                <w:color w:val="0A2517"/>
+                <w:sz w:val="22"/>
+              </w:rPr>
+              <w:t>Bản chất bài toán</w:t>
+            </w:r>
+          </w:p>
+        </w:tc>
+        <w:tc>
+          <w:tcPr>
+            <w:tcW w:type="dxa" w:w="3024"/>
+            <w:shd w:fill="E6F4EA"/>
+            <w:tcMar>
+              <w:top w:w="120" w:type="dxa"/>
+              <w:bottom w:w="120" w:type="dxa"/>
+              <w:left w:w="100" w:type="dxa"/>
+              <w:right w:w="100" w:type="dxa"/>
+            </w:tcMar>
+          </w:tcPr>
+          <w:p>
+            <w:pPr>
+              <w:jc w:val="center"/>
+            </w:pPr>
+            <w:r>
+              <w:rPr>
+                <w:rFonts w:ascii="Times New Roman" w:hAnsi="Times New Roman"/>
+                <w:b/>
+                <w:color w:val="0A2517"/>
+                <w:sz w:val="22"/>
+              </w:rPr>
+              <w:t>Câu trả lời bảo vệ của CLOOP</w:t>
+            </w:r>
+          </w:p>
+        </w:tc>
+      </w:tr>
+      <w:tr>
+        <w:tc>
+          <w:tcPr>
+            <w:tcW w:type="dxa" w:w="3024"/>
+            <w:shd w:fill="FFFFFF"/>
+            <w:tcMar>
+              <w:top w:w="80" w:type="dxa"/>
+              <w:bottom w:w="80" w:type="dxa"/>
+              <w:left w:w="100" w:type="dxa"/>
+              <w:right w:w="100" w:type="dxa"/>
+            </w:tcMar>
+          </w:tcPr>
+          <w:p>
+            <w:pPr>
+              <w:jc w:val="left"/>
+            </w:pPr>
+            <w:r>
+              <w:rPr>
+                <w:rFonts w:ascii="Times New Roman" w:hAnsi="Times New Roman"/>
+                <w:sz w:val="21"/>
+              </w:rPr>
+              <w:t>1. Một đơn thuê 200k sau MỌI chi phí còn lại bao nhiêu?</w:t>
+            </w:r>
+          </w:p>
+        </w:tc>
+        <w:tc>
+          <w:tcPr>
+            <w:tcW w:type="dxa" w:w="3024"/>
+            <w:shd w:fill="FFFFFF"/>
+            <w:tcMar>
+              <w:top w:w="80" w:type="dxa"/>
+              <w:bottom w:w="80" w:type="dxa"/>
+              <w:left w:w="100" w:type="dxa"/>
+              <w:right w:w="100" w:type="dxa"/>
+            </w:tcMar>
+          </w:tcPr>
+          <w:p>
+            <w:pPr>
+              <w:jc w:val="left"/>
+            </w:pPr>
+            <w:r>
+              <w:rPr>
+                <w:rFonts w:ascii="Times New Roman" w:hAnsi="Times New Roman"/>
+                <w:sz w:val="21"/>
+              </w:rPr>
+              <w:t>Unit Economics &amp; Contribution Margin</w:t>
+            </w:r>
+          </w:p>
+        </w:tc>
+        <w:tc>
+          <w:tcPr>
+            <w:tcW w:type="dxa" w:w="3024"/>
+            <w:shd w:fill="FFFFFF"/>
+            <w:tcMar>
+              <w:top w:w="80" w:type="dxa"/>
+              <w:bottom w:w="80" w:type="dxa"/>
+              <w:left w:w="100" w:type="dxa"/>
+              <w:right w:w="100" w:type="dxa"/>
+            </w:tcMar>
+          </w:tcPr>
+          <w:p>
+            <w:pPr>
+              <w:jc w:val="left"/>
+            </w:pPr>
+            <w:r>
+              <w:rPr>
+                <w:rFonts w:ascii="Times New Roman" w:hAnsi="Times New Roman"/>
+                <w:sz w:val="21"/>
+              </w:rPr>
+              <w:t>Lãi gộp dương ngay từ đơn đầu: Phí ship luân chuyển do Khách và Chủ tủ san sẻ qua thuật toán Block 5K; Cổng thanh toán VietQR phí gần như 0đ; Phí sàn thu 12% (24.000đ) khi kết thúc nghiệm thu. Sàn không đốt tiền bù ship hay trợ giá ảo.</w:t>
+            </w:r>
+          </w:p>
+        </w:tc>
+      </w:tr>
+      <w:tr>
+        <w:tc>
+          <w:tcPr>
+            <w:tcW w:type="dxa" w:w="3024"/>
+            <w:shd w:fill="F9FBF9"/>
+            <w:tcMar>
+              <w:top w:w="80" w:type="dxa"/>
+              <w:bottom w:w="80" w:type="dxa"/>
+              <w:left w:w="100" w:type="dxa"/>
+              <w:right w:w="100" w:type="dxa"/>
+            </w:tcMar>
+          </w:tcPr>
+          <w:p>
+            <w:pPr>
+              <w:jc w:val="left"/>
+            </w:pPr>
+            <w:r>
+              <w:rPr>
+                <w:rFonts w:ascii="Times New Roman" w:hAnsi="Times New Roman"/>
+                <w:sz w:val="21"/>
+              </w:rPr>
+              <w:t>2. Một món đồ trung bình quay được bao nhiêu vòng đời?</w:t>
+            </w:r>
+          </w:p>
+        </w:tc>
+        <w:tc>
+          <w:tcPr>
+            <w:tcW w:type="dxa" w:w="3024"/>
+            <w:shd w:fill="F9FBF9"/>
+            <w:tcMar>
+              <w:top w:w="80" w:type="dxa"/>
+              <w:bottom w:w="80" w:type="dxa"/>
+              <w:left w:w="100" w:type="dxa"/>
+              <w:right w:w="100" w:type="dxa"/>
+            </w:tcMar>
+          </w:tcPr>
+          <w:p>
+            <w:pPr>
+              <w:jc w:val="left"/>
+            </w:pPr>
+            <w:r>
+              <w:rPr>
+                <w:rFonts w:ascii="Times New Roman" w:hAnsi="Times New Roman"/>
+                <w:sz w:val="21"/>
+              </w:rPr>
+              <w:t>Asset Utilization</w:t>
+            </w:r>
+          </w:p>
+        </w:tc>
+        <w:tc>
+          <w:tcPr>
+            <w:tcW w:type="dxa" w:w="3024"/>
+            <w:shd w:fill="F9FBF9"/>
+            <w:tcMar>
+              <w:top w:w="80" w:type="dxa"/>
+              <w:bottom w:w="80" w:type="dxa"/>
+              <w:left w:w="100" w:type="dxa"/>
+              <w:right w:w="100" w:type="dxa"/>
+            </w:tcMar>
+          </w:tcPr>
+          <w:p>
+            <w:pPr>
+              <w:jc w:val="left"/>
+            </w:pPr>
+            <w:r>
+              <w:rPr>
+                <w:rFonts w:ascii="Times New Roman" w:hAnsi="Times New Roman"/>
+                <w:sz w:val="21"/>
+              </w:rPr>
+              <w:t>Nhờ thanh khoản cục bộ (bán kính 5-10km), thời gian bất động giảm từ 6 ngày xuống dưới 24h. Một chiếc váy dạ hội chất lượng tốt quay vòng 6-8 lần/tháng vào mùa sự kiện, đạt vòng đời 15-20 lượt thuê trước khi thanh lý.</w:t>
+            </w:r>
+          </w:p>
+        </w:tc>
+      </w:tr>
+      <w:tr>
+        <w:tc>
+          <w:tcPr>
+            <w:tcW w:type="dxa" w:w="3024"/>
+            <w:shd w:fill="FFFFFF"/>
+            <w:tcMar>
+              <w:top w:w="80" w:type="dxa"/>
+              <w:bottom w:w="80" w:type="dxa"/>
+              <w:left w:w="100" w:type="dxa"/>
+              <w:right w:w="100" w:type="dxa"/>
+            </w:tcMar>
+          </w:tcPr>
+          <w:p>
+            <w:pPr>
+              <w:jc w:val="left"/>
+            </w:pPr>
+            <w:r>
+              <w:rPr>
+                <w:rFonts w:ascii="Times New Roman" w:hAnsi="Times New Roman"/>
+                <w:sz w:val="21"/>
+              </w:rPr>
+              <w:t>3. Chủ tủ ở lại hay rời đi sau 3 tháng?</w:t>
+            </w:r>
+          </w:p>
+        </w:tc>
+        <w:tc>
+          <w:tcPr>
+            <w:tcW w:type="dxa" w:w="3024"/>
+            <w:shd w:fill="FFFFFF"/>
+            <w:tcMar>
+              <w:top w:w="80" w:type="dxa"/>
+              <w:bottom w:w="80" w:type="dxa"/>
+              <w:left w:w="100" w:type="dxa"/>
+              <w:right w:w="100" w:type="dxa"/>
+            </w:tcMar>
+          </w:tcPr>
+          <w:p>
+            <w:pPr>
+              <w:jc w:val="left"/>
+            </w:pPr>
+            <w:r>
+              <w:rPr>
+                <w:rFonts w:ascii="Times New Roman" w:hAnsi="Times New Roman"/>
+                <w:sz w:val="21"/>
+              </w:rPr>
+              <w:t>Lender Retention</w:t>
+            </w:r>
+          </w:p>
+        </w:tc>
+        <w:tc>
+          <w:tcPr>
+            <w:tcW w:type="dxa" w:w="3024"/>
+            <w:shd w:fill="FFFFFF"/>
+            <w:tcMar>
+              <w:top w:w="80" w:type="dxa"/>
+              <w:bottom w:w="80" w:type="dxa"/>
+              <w:left w:w="100" w:type="dxa"/>
+              <w:right w:w="100" w:type="dxa"/>
+            </w:tcMar>
+          </w:tcPr>
+          <w:p>
+            <w:pPr>
+              <w:jc w:val="left"/>
+            </w:pPr>
+            <w:r>
+              <w:rPr>
+                <w:rFonts w:ascii="Times New Roman" w:hAnsi="Times New Roman"/>
+                <w:sz w:val="21"/>
+              </w:rPr>
+              <w:t>Chủ tủ gắn bó vì CLOOP loại bỏ 'Cơn đau đầu cãi vã' (Zero CS Headache). Hệ thống tự xử lý cọc, vận đơn và nghiệm thu. Một chiếc váy 1.500.000đ mang lại 800.000đ dòng tiền thụ động sau 2 tháng mà không tốn công quản lý.</w:t>
+            </w:r>
+          </w:p>
+        </w:tc>
+      </w:tr>
+      <w:tr>
+        <w:tc>
+          <w:tcPr>
+            <w:tcW w:type="dxa" w:w="3024"/>
+            <w:shd w:fill="F9FBF9"/>
+            <w:tcMar>
+              <w:top w:w="80" w:type="dxa"/>
+              <w:bottom w:w="80" w:type="dxa"/>
+              <w:left w:w="100" w:type="dxa"/>
+              <w:right w:w="100" w:type="dxa"/>
+            </w:tcMar>
+          </w:tcPr>
+          <w:p>
+            <w:pPr>
+              <w:jc w:val="left"/>
+            </w:pPr>
+            <w:r>
+              <w:rPr>
+                <w:rFonts w:ascii="Times New Roman" w:hAnsi="Times New Roman"/>
+                <w:sz w:val="21"/>
+              </w:rPr>
+              <w:t>4. Khách thuê lần 2 sau bao lâu?</w:t>
+            </w:r>
+          </w:p>
+        </w:tc>
+        <w:tc>
+          <w:tcPr>
+            <w:tcW w:type="dxa" w:w="3024"/>
+            <w:shd w:fill="F9FBF9"/>
+            <w:tcMar>
+              <w:top w:w="80" w:type="dxa"/>
+              <w:bottom w:w="80" w:type="dxa"/>
+              <w:left w:w="100" w:type="dxa"/>
+              <w:right w:w="100" w:type="dxa"/>
+            </w:tcMar>
+          </w:tcPr>
+          <w:p>
+            <w:pPr>
+              <w:jc w:val="left"/>
+            </w:pPr>
+            <w:r>
+              <w:rPr>
+                <w:rFonts w:ascii="Times New Roman" w:hAnsi="Times New Roman"/>
+                <w:sz w:val="21"/>
+              </w:rPr>
+              <w:t>Renter Retention</w:t>
+            </w:r>
+          </w:p>
+        </w:tc>
+        <w:tc>
+          <w:tcPr>
+            <w:tcW w:type="dxa" w:w="3024"/>
+            <w:shd w:fill="F9FBF9"/>
+            <w:tcMar>
+              <w:top w:w="80" w:type="dxa"/>
+              <w:bottom w:w="80" w:type="dxa"/>
+              <w:left w:w="100" w:type="dxa"/>
+              <w:right w:w="100" w:type="dxa"/>
+            </w:tcMar>
+          </w:tcPr>
+          <w:p>
+            <w:pPr>
+              <w:jc w:val="left"/>
+            </w:pPr>
+            <w:r>
+              <w:rPr>
+                <w:rFonts w:ascii="Times New Roman" w:hAnsi="Times New Roman"/>
+                <w:sz w:val="21"/>
+              </w:rPr>
+              <w:t>CLOOP đánh vào Occasion Economics. Một người trẻ có 4-5 dịp sự kiện/năm (Kỷ yếu, Prom, Đám cưới, Tiệc). Tỷ lệ quay lại kỳ vọng 2-3 lần/năm. Động lực lớn nhất là điểm Trust Score: càng thuê uy tín, cọc càng giảm, hạn mức càng tăng.</w:t>
+            </w:r>
+          </w:p>
+        </w:tc>
+      </w:tr>
+      <w:tr>
+        <w:tc>
+          <w:tcPr>
+            <w:tcW w:type="dxa" w:w="3024"/>
+            <w:shd w:fill="FFFFFF"/>
+            <w:tcMar>
+              <w:top w:w="80" w:type="dxa"/>
+              <w:bottom w:w="80" w:type="dxa"/>
+              <w:left w:w="100" w:type="dxa"/>
+              <w:right w:w="100" w:type="dxa"/>
+            </w:tcMar>
+          </w:tcPr>
+          <w:p>
+            <w:pPr>
+              <w:jc w:val="left"/>
+            </w:pPr>
+            <w:r>
+              <w:rPr>
+                <w:rFonts w:ascii="Times New Roman" w:hAnsi="Times New Roman"/>
+                <w:sz w:val="21"/>
+              </w:rPr>
+              <w:t>5. Tỷ lệ tranh chấp (Dispute Rate) là bao nhiêu?</w:t>
+            </w:r>
+          </w:p>
+        </w:tc>
+        <w:tc>
+          <w:tcPr>
+            <w:tcW w:type="dxa" w:w="3024"/>
+            <w:shd w:fill="FFFFFF"/>
+            <w:tcMar>
+              <w:top w:w="80" w:type="dxa"/>
+              <w:bottom w:w="80" w:type="dxa"/>
+              <w:left w:w="100" w:type="dxa"/>
+              <w:right w:w="100" w:type="dxa"/>
+            </w:tcMar>
+          </w:tcPr>
+          <w:p>
+            <w:pPr>
+              <w:jc w:val="left"/>
+            </w:pPr>
+            <w:r>
+              <w:rPr>
+                <w:rFonts w:ascii="Times New Roman" w:hAnsi="Times New Roman"/>
+                <w:sz w:val="21"/>
+              </w:rPr>
+              <w:t>Dispute Management</w:t>
+            </w:r>
+          </w:p>
+        </w:tc>
+        <w:tc>
+          <w:tcPr>
+            <w:tcW w:type="dxa" w:w="3024"/>
+            <w:shd w:fill="FFFFFF"/>
+            <w:tcMar>
+              <w:top w:w="80" w:type="dxa"/>
+              <w:bottom w:w="80" w:type="dxa"/>
+              <w:left w:w="100" w:type="dxa"/>
+              <w:right w:w="100" w:type="dxa"/>
+            </w:tcMar>
+          </w:tcPr>
+          <w:p>
+            <w:pPr>
+              <w:jc w:val="left"/>
+            </w:pPr>
+            <w:r>
+              <w:rPr>
+                <w:rFonts w:ascii="Times New Roman" w:hAnsi="Times New Roman"/>
+                <w:sz w:val="21"/>
+              </w:rPr>
+              <w:t>Bản chất rental có tỷ lệ hoàn trả 100%. CLOOP chia làm 2: Lỗi vi mô (son, mồ hôi, xước chỉ) xử lý theo Digital Damage Protocol (chủ tủ tự giặt/sửa, không trừ cọc); Lỗi vĩ mô (rách, mất) kỳ vọng dưới 3%, được bảo vệ bởi trần Exposure Limit và Timeline đối soát.</w:t>
+            </w:r>
+          </w:p>
+        </w:tc>
+      </w:tr>
+      <w:tr>
+        <w:tc>
+          <w:tcPr>
+            <w:tcW w:type="dxa" w:w="3024"/>
+            <w:shd w:fill="F9FBF9"/>
+            <w:tcMar>
+              <w:top w:w="80" w:type="dxa"/>
+              <w:bottom w:w="80" w:type="dxa"/>
+              <w:left w:w="100" w:type="dxa"/>
+              <w:right w:w="100" w:type="dxa"/>
+            </w:tcMar>
+          </w:tcPr>
+          <w:p>
+            <w:pPr>
+              <w:jc w:val="left"/>
+            </w:pPr>
+            <w:r>
+              <w:rPr>
+                <w:rFonts w:ascii="Times New Roman" w:hAnsi="Times New Roman"/>
+                <w:sz w:val="21"/>
+              </w:rPr>
+              <w:t>6. Tại sao người dùng không mua luôn đồ rẻ Shopee/TikTok?</w:t>
+            </w:r>
+          </w:p>
+        </w:tc>
+        <w:tc>
+          <w:tcPr>
+            <w:tcW w:type="dxa" w:w="3024"/>
+            <w:shd w:fill="F9FBF9"/>
+            <w:tcMar>
+              <w:top w:w="80" w:type="dxa"/>
+              <w:bottom w:w="80" w:type="dxa"/>
+              <w:left w:w="100" w:type="dxa"/>
+              <w:right w:w="100" w:type="dxa"/>
+            </w:tcMar>
+          </w:tcPr>
+          <w:p>
+            <w:pPr>
+              <w:jc w:val="left"/>
+            </w:pPr>
+            <w:r>
+              <w:rPr>
+                <w:rFonts w:ascii="Times New Roman" w:hAnsi="Times New Roman"/>
+                <w:sz w:val="21"/>
+              </w:rPr>
+              <w:t>Competitor Defense</w:t>
+            </w:r>
+          </w:p>
+        </w:tc>
+        <w:tc>
+          <w:tcPr>
+            <w:tcW w:type="dxa" w:w="3024"/>
+            <w:shd w:fill="F9FBF9"/>
+            <w:tcMar>
+              <w:top w:w="80" w:type="dxa"/>
+              <w:bottom w:w="80" w:type="dxa"/>
+              <w:left w:w="100" w:type="dxa"/>
+              <w:right w:w="100" w:type="dxa"/>
+            </w:tcMar>
+          </w:tcPr>
+          <w:p>
+            <w:pPr>
+              <w:jc w:val="left"/>
+            </w:pPr>
+            <w:r>
+              <w:rPr>
+                <w:rFonts w:ascii="Times New Roman" w:hAnsi="Times New Roman"/>
+                <w:sz w:val="21"/>
+              </w:rPr>
+              <w:t>Vì CLOOP bán 'Sự lộng lẫy tạm thời'. Đồ dạ tiệc Taobao 250k chất vải mỏng, form xộc xệch. Váy thiết kế local brand giá gốc 2 triệu chuẩn form. Người dùng bỏ 200k để khoác lên đẳng cấp của 2 triệu trong 1 đêm, không chật tủ quần áo.</w:t>
+            </w:r>
+          </w:p>
+        </w:tc>
+      </w:tr>
+      <w:tr>
+        <w:tc>
+          <w:tcPr>
+            <w:tcW w:type="dxa" w:w="3024"/>
+            <w:shd w:fill="FFFFFF"/>
+            <w:tcMar>
+              <w:top w:w="80" w:type="dxa"/>
+              <w:bottom w:w="80" w:type="dxa"/>
+              <w:left w:w="100" w:type="dxa"/>
+              <w:right w:w="100" w:type="dxa"/>
+            </w:tcMar>
+          </w:tcPr>
+          <w:p>
+            <w:pPr>
+              <w:jc w:val="left"/>
+            </w:pPr>
+            <w:r>
+              <w:rPr>
+                <w:rFonts w:ascii="Times New Roman" w:hAnsi="Times New Roman"/>
+                <w:sz w:val="21"/>
+              </w:rPr>
+              <w:t>7. Nếu bỏ AI đi, CLOOP còn lợi thế gì?</w:t>
+            </w:r>
+          </w:p>
+        </w:tc>
+        <w:tc>
+          <w:tcPr>
+            <w:tcW w:type="dxa" w:w="3024"/>
+            <w:shd w:fill="FFFFFF"/>
+            <w:tcMar>
+              <w:top w:w="80" w:type="dxa"/>
+              <w:bottom w:w="80" w:type="dxa"/>
+              <w:left w:w="100" w:type="dxa"/>
+              <w:right w:w="100" w:type="dxa"/>
+            </w:tcMar>
+          </w:tcPr>
+          <w:p>
+            <w:pPr>
+              <w:jc w:val="left"/>
+            </w:pPr>
+            <w:r>
+              <w:rPr>
+                <w:rFonts w:ascii="Times New Roman" w:hAnsi="Times New Roman"/>
+                <w:sz w:val="21"/>
+              </w:rPr>
+              <w:t>Core Moat</w:t>
+            </w:r>
+          </w:p>
+        </w:tc>
+        <w:tc>
+          <w:tcPr>
+            <w:tcW w:type="dxa" w:w="3024"/>
+            <w:shd w:fill="FFFFFF"/>
+            <w:tcMar>
+              <w:top w:w="80" w:type="dxa"/>
+              <w:bottom w:w="80" w:type="dxa"/>
+              <w:left w:w="100" w:type="dxa"/>
+              <w:right w:w="100" w:type="dxa"/>
+            </w:tcMar>
+          </w:tcPr>
+          <w:p>
+            <w:pPr>
+              <w:jc w:val="left"/>
+            </w:pPr>
+            <w:r>
+              <w:rPr>
+                <w:rFonts w:ascii="Times New Roman" w:hAnsi="Times New Roman"/>
+                <w:sz w:val="21"/>
+              </w:rPr>
+              <w:t>AI chỉ là công cụ tối ưu vận hành. Lợi thế cốt lõi của CLOOP là Hạ Tầng Niềm Tin (Trust Stack), Dữ Liệu Lịch Sử Giao Dịch và Thanh Khoản Địa Phương. Khi đã có 10.000 user sở hữu điểm Trust Score cao, đối thủ không thể bứng tệp khách này đi vì họ bị giữ chân bởi đặc quyền giảm cọc.</w:t>
+            </w:r>
+          </w:p>
+        </w:tc>
+      </w:tr>
+    </w:tbl>
+    <w:p>
+      <w:pPr>
+        <w:keepNext/>
+        <w:spacing w:before="320" w:after="120"/>
+      </w:pPr>
+      <w:r>
+        <w:rPr>
+          <w:rFonts w:ascii="Times New Roman" w:hAnsi="Times New Roman"/>
+          <w:b/>
+          <w:color w:val="0F4A34"/>
+          <w:sz w:val="28"/>
+        </w:rPr>
+        <w:t>IV. DIGITAL DAMAGE PROTOCOL: CHUẨN HÓA 3 CẤP ĐỘ THIỆT HẠI</w:t>
+      </w:r>
+    </w:p>
+    <w:p>
+      <w:pPr>
+        <w:spacing w:after="80"/>
+        <w:jc w:val="both"/>
+      </w:pPr>
+      <w:r>
+        <w:rPr>
+          <w:rFonts w:ascii="Times New Roman" w:hAnsi="Times New Roman"/>
+          <w:sz w:val="25"/>
+        </w:rPr>
+        <w:t>Để giải quyết triệt để vấn nạn Chủ tủ 'ăn vạ' đòi trừ cọc vì những vết bẩn giặt được (vết son môi, phấn trang điểm) và ngăn chặn rủi ro đạo đức (Moral Hazard), CLOOP ban hành Quy chuẩn Phân loại Thiệt hại Số (Digital Damage Protocol):</w:t>
+      </w:r>
+    </w:p>
+    <w:p>
+      <w:pPr>
+        <w:keepNext/>
+        <w:spacing w:before="200" w:after="80"/>
+      </w:pPr>
+      <w:r>
+        <w:rPr>
+          <w:rFonts w:ascii="Times New Roman" w:hAnsi="Times New Roman"/>
+          <w:b/>
+          <w:color w:val="183A2D"/>
+          <w:sz w:val="26"/>
+        </w:rPr>
+        <w:t>1. Quy Chuẩn 3 Cấp Độ Thiệt Hại (Damage Classification Standards)</w:t>
+      </w:r>
+    </w:p>
+    <w:p>
+      <w:pPr>
+        <w:pStyle w:val="ListBullet"/>
+        <w:spacing w:after="60"/>
+        <w:jc w:val="both"/>
+      </w:pPr>
+      <w:r>
+        <w:rPr>
+          <w:rFonts w:ascii="Times New Roman" w:hAnsi="Times New Roman"/>
+          <w:b/>
+          <w:sz w:val="25"/>
+        </w:rPr>
+        <w:t xml:space="preserve">1. Bản chất &amp; Mục đích: </w:t>
+      </w:r>
+      <w:r>
+        <w:rPr>
+          <w:rFonts w:ascii="Times New Roman" w:hAnsi="Times New Roman"/>
+          <w:sz w:val="25"/>
+        </w:rPr>
+        <w:t>Level 1 (Wear &amp; Tear - Hao mòn thông thường): Vết son môi bề mặt, phấn trang điểm nhẹ, mồ hôi, mùi cơ thể, nếp nhăn vải -&gt; KHÔNG ĐƯỢC TÍNH LÀ THIỆT HẠI. Chi phí này nằm trong giá thuê, Chủ tủ tự giặt ủi theo quy trình thông thường, cấm trừ cọc.</w:t>
         <w:br/>
-        <w:t>2. Hệ thống Trạm Gom Đồ CLOOP Hub: Đặt tủ khóa thông minh (Smart Lockers) tại các tòa nhà văn phòng, trường đại học lớn ở Hà Nội và TP.HCM. Khách hàng và chủ tủ có thể tự gửi/lấy đồ với cước phí 0đ, triệt tiêu 100% chi phí bưu tá.</w:t>
+        <w:t>Level 2 (Repairable Damage - Hư hỏng có thể khắc phục): Vết bẩn cần giặt hấp chuyên sâu, bung cúc, xước nhẹ khâu lại được -&gt; Chỉ được khấu trừ CHI PHÍ SỬA CHỮA THỰC TẾ HỢP LÝ (tối đa 500.000đ), cấm tịch thu toàn bộ tiền cọc.</w:t>
+        <w:br/>
+        <w:t>Level 3 (Total Loss - Tổn thất thực sự): Rách toạc cấu trúc không phục hồi được, cháy, mất đồ -&gt; Khấu trừ theo giá trị thỏa thuận trong hợp đồng thuê điện tử.</w:t>
+      </w:r>
+    </w:p>
+    <w:p>
+      <w:pPr>
+        <w:pStyle w:val="ListBullet"/>
+        <w:spacing w:after="60"/>
+        <w:jc w:val="both"/>
+      </w:pPr>
+      <w:r>
+        <w:rPr>
+          <w:rFonts w:ascii="Times New Roman" w:hAnsi="Times New Roman"/>
+          <w:b/>
+          <w:sz w:val="25"/>
+        </w:rPr>
+        <w:t xml:space="preserve">2. Lợi ích thực tế: </w:t>
+      </w:r>
+      <w:r>
+        <w:rPr>
+          <w:rFonts w:ascii="Times New Roman" w:hAnsi="Times New Roman"/>
+          <w:sz w:val="25"/>
+        </w:rPr>
+        <w:t>Bảo vệ khách thuê khỏi các hành vi bắt chẹt vô lý; chuẩn hóa ranh giới tranh chấp rành mạch không thể cãi vã.</w:t>
+      </w:r>
+    </w:p>
+    <w:p>
+      <w:pPr>
+        <w:pStyle w:val="ListBullet"/>
+        <w:spacing w:after="60"/>
+        <w:jc w:val="both"/>
+      </w:pPr>
+      <w:r>
+        <w:rPr>
+          <w:rFonts w:ascii="Times New Roman" w:hAnsi="Times New Roman"/>
+          <w:b/>
+          <w:sz w:val="25"/>
+        </w:rPr>
+        <w:t xml:space="preserve">3. Ưu điểm vượt trội: </w:t>
+      </w:r>
+      <w:r>
+        <w:rPr>
+          <w:rFonts w:ascii="Times New Roman" w:hAnsi="Times New Roman"/>
+          <w:sz w:val="25"/>
+        </w:rPr>
+        <w:t>Được lập trình trực tiếp vào mã nguồn Server Action (`app/actions/dispute.ts`): Hệ thống tự động từ chối nếu khiếu nại thuộc nhóm Wear &amp; Tear mà đòi cọc.</w:t>
+      </w:r>
+    </w:p>
+    <w:p>
+      <w:pPr>
+        <w:pStyle w:val="ListBullet"/>
+        <w:spacing w:after="60"/>
+        <w:jc w:val="both"/>
+      </w:pPr>
+      <w:r>
+        <w:rPr>
+          <w:rFonts w:ascii="Times New Roman" w:hAnsi="Times New Roman"/>
+          <w:b/>
+          <w:sz w:val="25"/>
+        </w:rPr>
+        <w:t xml:space="preserve">4. Mặt trái &amp; Thách thức tiềm ẩn: </w:t>
+      </w:r>
+      <w:r>
+        <w:rPr>
+          <w:rFonts w:ascii="Times New Roman" w:hAnsi="Times New Roman"/>
+          <w:sz w:val="25"/>
+        </w:rPr>
+        <w:t>Một số chủ tủ có thể cho rằng quy định này khắt khe với họ hơn so với việc tự cho thuê ngoài đời.</w:t>
+      </w:r>
+    </w:p>
+    <w:p>
+      <w:pPr>
+        <w:pStyle w:val="ListBullet"/>
+        <w:spacing w:after="60"/>
+        <w:jc w:val="both"/>
+      </w:pPr>
+      <w:r>
+        <w:rPr>
+          <w:rFonts w:ascii="Times New Roman" w:hAnsi="Times New Roman"/>
+          <w:b/>
+          <w:sz w:val="25"/>
+        </w:rPr>
+        <w:t xml:space="preserve">5. Đề xuất phương án thay thế &amp; Kế hoạch dự phòng: </w:t>
+      </w:r>
+      <w:r>
+        <w:rPr>
+          <w:rFonts w:ascii="Times New Roman" w:hAnsi="Times New Roman"/>
+          <w:sz w:val="25"/>
+        </w:rPr>
+        <w:t>Cung cấp gói dịch vụ giặt hấp sinh học đối tác với mức giá ưu đãi dành riêng cho Chủ tủ CLOOP.</w:t>
+      </w:r>
+    </w:p>
+    <w:p>
+      <w:pPr>
+        <w:keepNext/>
+        <w:spacing w:before="200" w:after="80"/>
+      </w:pPr>
+      <w:r>
+        <w:rPr>
+          <w:rFonts w:ascii="Times New Roman" w:hAnsi="Times New Roman"/>
+          <w:b/>
+          <w:color w:val="183A2D"/>
+          <w:sz w:val="26"/>
+        </w:rPr>
+        <w:t>2. Quy Tắc Vàng: Cấm Can Thiệp Hiện Trạng Trước Khi Lập Bằng Chứng</w:t>
+      </w:r>
+    </w:p>
+    <w:p>
+      <w:pPr>
+        <w:pStyle w:val="ListBullet"/>
+        <w:spacing w:after="60"/>
+        <w:jc w:val="both"/>
+      </w:pPr>
+      <w:r>
+        <w:rPr>
+          <w:rFonts w:ascii="Times New Roman" w:hAnsi="Times New Roman"/>
+          <w:b/>
+          <w:sz w:val="25"/>
+        </w:rPr>
+        <w:t xml:space="preserve">1. Bản chất &amp; Mục đích: </w:t>
+      </w:r>
+      <w:r>
+        <w:rPr>
+          <w:rFonts w:ascii="Times New Roman" w:hAnsi="Times New Roman"/>
+          <w:sz w:val="25"/>
+        </w:rPr>
+        <w:t>Chủ tủ nhận hàng hoàn về bắt buộc phải chụp ảnh/quay video hiện trạng có Timestamp TRƯỚC KHI GIẶT HOẶC SỬA. Nếu chủ tủ tự ý đem giặt hoặc can thiệp xử lý trước khi gửi khiếu nại lên hệ thống, hồ sơ tranh chấp sẽ lập tức bị bác bỏ do mất tính nguyên trạng của bằng chứng.</w:t>
+      </w:r>
+    </w:p>
+    <w:p>
+      <w:pPr>
+        <w:pStyle w:val="ListBullet"/>
+        <w:spacing w:after="60"/>
+        <w:jc w:val="both"/>
+      </w:pPr>
+      <w:r>
+        <w:rPr>
+          <w:rFonts w:ascii="Times New Roman" w:hAnsi="Times New Roman"/>
+          <w:b/>
+          <w:sz w:val="25"/>
+        </w:rPr>
+        <w:t xml:space="preserve">2. Lợi ích thực tế: </w:t>
+      </w:r>
+      <w:r>
+        <w:rPr>
+          <w:rFonts w:ascii="Times New Roman" w:hAnsi="Times New Roman"/>
+          <w:sz w:val="25"/>
+        </w:rPr>
+        <w:t>Ngăn chặn hoàn toàn tình trạng chủ tủ tự làm hỏng thêm hoặc dùng hóa đơn giặt khống để đòi tiền đền bù của khách.</w:t>
+      </w:r>
+    </w:p>
+    <w:p>
+      <w:pPr>
+        <w:pStyle w:val="ListBullet"/>
+        <w:spacing w:after="60"/>
+        <w:jc w:val="both"/>
+      </w:pPr>
+      <w:r>
+        <w:rPr>
+          <w:rFonts w:ascii="Times New Roman" w:hAnsi="Times New Roman"/>
+          <w:b/>
+          <w:sz w:val="25"/>
+        </w:rPr>
+        <w:t xml:space="preserve">3. Ưu điểm vượt trội: </w:t>
+      </w:r>
+      <w:r>
+        <w:rPr>
+          <w:rFonts w:ascii="Times New Roman" w:hAnsi="Times New Roman"/>
+          <w:sz w:val="25"/>
+        </w:rPr>
+        <w:t>Tính kỷ luật số cao: Bằng chứng chỉ có giá trị khi đối chiếu được mốc Before (lúc đóng gói) so với mốc After (lúc nhận lại).</w:t>
+      </w:r>
+    </w:p>
+    <w:p>
+      <w:pPr>
+        <w:pStyle w:val="ListBullet"/>
+        <w:spacing w:after="60"/>
+        <w:jc w:val="both"/>
+      </w:pPr>
+      <w:r>
+        <w:rPr>
+          <w:rFonts w:ascii="Times New Roman" w:hAnsi="Times New Roman"/>
+          <w:b/>
+          <w:sz w:val="25"/>
+        </w:rPr>
+        <w:t xml:space="preserve">4. Mặt trái &amp; Thách thức tiềm ẩn: </w:t>
+      </w:r>
+      <w:r>
+        <w:rPr>
+          <w:rFonts w:ascii="Times New Roman" w:hAnsi="Times New Roman"/>
+          <w:sz w:val="25"/>
+        </w:rPr>
+        <w:t>Chủ tủ phải dành 2-3 phút quay video kiểm tra lúc mở hộp nhận lại đồ.</w:t>
+      </w:r>
+    </w:p>
+    <w:p>
+      <w:pPr>
+        <w:pStyle w:val="ListBullet"/>
+        <w:spacing w:after="60"/>
+        <w:jc w:val="both"/>
+      </w:pPr>
+      <w:r>
+        <w:rPr>
+          <w:rFonts w:ascii="Times New Roman" w:hAnsi="Times New Roman"/>
+          <w:b/>
+          <w:sz w:val="25"/>
+        </w:rPr>
+        <w:t xml:space="preserve">5. Đề xuất phương án thay thế &amp; Kế hoạch dự phòng: </w:t>
+      </w:r>
+      <w:r>
+        <w:rPr>
+          <w:rFonts w:ascii="Times New Roman" w:hAnsi="Times New Roman"/>
+          <w:sz w:val="25"/>
+        </w:rPr>
+        <w:t>Tích hợp tính năng Checklist nghiệm thu 1-chạm (1-Click Inspection) ngay trên giao diện đơn hàng để hướng dẫn chủ tủ từng bước.</w:t>
+      </w:r>
+    </w:p>
+    <w:p>
+      <w:pPr>
+        <w:keepNext/>
+        <w:spacing w:before="200" w:after="80"/>
+      </w:pPr>
+      <w:r>
+        <w:rPr>
+          <w:rFonts w:ascii="Times New Roman" w:hAnsi="Times New Roman"/>
+          <w:b/>
+          <w:color w:val="183A2D"/>
+          <w:sz w:val="26"/>
+        </w:rPr>
+        <w:t>3. Risk Engine Ngược (Owner Trust Score): Giám Sát Chủ Tủ Trục Lợi</w:t>
+      </w:r>
+    </w:p>
+    <w:p>
+      <w:pPr>
+        <w:pStyle w:val="ListBullet"/>
+        <w:spacing w:after="60"/>
+        <w:jc w:val="both"/>
+      </w:pPr>
+      <w:r>
+        <w:rPr>
+          <w:rFonts w:ascii="Times New Roman" w:hAnsi="Times New Roman"/>
+          <w:b/>
+          <w:sz w:val="25"/>
+        </w:rPr>
+        <w:t xml:space="preserve">1. Bản chất &amp; Mục đích: </w:t>
+      </w:r>
+      <w:r>
+        <w:rPr>
+          <w:rFonts w:ascii="Times New Roman" w:hAnsi="Times New Roman"/>
+          <w:sz w:val="25"/>
+        </w:rPr>
+        <w:t>Hệ thống không chỉ chấm điểm Khách thuê, mà còn theo dõi tỷ lệ khiếu nại của Chủ tủ. Nếu một Chủ tủ có tỷ lệ khiếu nại vượt quá 25% số đơn hoàn tất (Owner Dispute Rate &gt;= 25%), hệ thống tự động gắn cờ cảnh báo HIGH_DISPUTE_OWNER, trừ điểm Trust Score và giảm ưu tiên hiển thị tủ đồ.</w:t>
+      </w:r>
+    </w:p>
+    <w:p>
+      <w:pPr>
+        <w:pStyle w:val="ListBullet"/>
+        <w:spacing w:after="60"/>
+        <w:jc w:val="both"/>
+      </w:pPr>
+      <w:r>
+        <w:rPr>
+          <w:rFonts w:ascii="Times New Roman" w:hAnsi="Times New Roman"/>
+          <w:b/>
+          <w:sz w:val="25"/>
+        </w:rPr>
+        <w:t xml:space="preserve">2. Lợi ích thực tế: </w:t>
+      </w:r>
+      <w:r>
+        <w:rPr>
+          <w:rFonts w:ascii="Times New Roman" w:hAnsi="Times New Roman"/>
+          <w:sz w:val="25"/>
+        </w:rPr>
+        <w:t>Thanh lọc các chủ tủ độc hại (Toxic Owners) ra khỏi hệ sinh thái, bảo vệ uy tín lâu dài của toàn sàn.</w:t>
+      </w:r>
+    </w:p>
+    <w:p>
+      <w:pPr>
+        <w:pStyle w:val="ListBullet"/>
+        <w:spacing w:after="60"/>
+        <w:jc w:val="both"/>
+      </w:pPr>
+      <w:r>
+        <w:rPr>
+          <w:rFonts w:ascii="Times New Roman" w:hAnsi="Times New Roman"/>
+          <w:b/>
+          <w:sz w:val="25"/>
+        </w:rPr>
+        <w:t xml:space="preserve">3. Ưu điểm vượt trội: </w:t>
+      </w:r>
+      <w:r>
+        <w:rPr>
+          <w:rFonts w:ascii="Times New Roman" w:hAnsi="Times New Roman"/>
+          <w:sz w:val="25"/>
+        </w:rPr>
+        <w:t>Được ghi nhận tự động vào Audit Log kiểm toán của hệ thống, minh bạch và không thiên vị.</w:t>
+      </w:r>
+    </w:p>
+    <w:p>
+      <w:pPr>
+        <w:pStyle w:val="ListBullet"/>
+        <w:spacing w:after="60"/>
+        <w:jc w:val="both"/>
+      </w:pPr>
+      <w:r>
+        <w:rPr>
+          <w:rFonts w:ascii="Times New Roman" w:hAnsi="Times New Roman"/>
+          <w:b/>
+          <w:sz w:val="25"/>
+        </w:rPr>
+        <w:t xml:space="preserve">4. Mặt trái &amp; Thách thức tiềm ẩn: </w:t>
+      </w:r>
+      <w:r>
+        <w:rPr>
+          <w:rFonts w:ascii="Times New Roman" w:hAnsi="Times New Roman"/>
+          <w:sz w:val="25"/>
+        </w:rPr>
+        <w:t>Chủ tủ bị cảnh báo có thể phản ứng tiêu cực.</w:t>
+      </w:r>
+    </w:p>
+    <w:p>
+      <w:pPr>
+        <w:pStyle w:val="ListBullet"/>
+        <w:spacing w:after="60"/>
+        <w:jc w:val="both"/>
+      </w:pPr>
+      <w:r>
+        <w:rPr>
+          <w:rFonts w:ascii="Times New Roman" w:hAnsi="Times New Roman"/>
+          <w:b/>
+          <w:sz w:val="25"/>
+        </w:rPr>
+        <w:t xml:space="preserve">5. Đề xuất phương án thay thế &amp; Kế hoạch dự phòng: </w:t>
+      </w:r>
+      <w:r>
+        <w:rPr>
+          <w:rFonts w:ascii="Times New Roman" w:hAnsi="Times New Roman"/>
+          <w:sz w:val="25"/>
+        </w:rPr>
+        <w:t>Cung cấp quy trình khiếu nại lại (Appeal Process) cho Chủ tủ nếu họ chứng minh được các đơn bị tranh chấp là do lỗi bưu tá GHN.</w:t>
+      </w:r>
+    </w:p>
+    <w:p>
+      <w:pPr>
+        <w:keepNext/>
+        <w:spacing w:before="320" w:after="120"/>
+      </w:pPr>
+      <w:r>
+        <w:rPr>
+          <w:rFonts w:ascii="Times New Roman" w:hAnsi="Times New Roman"/>
+          <w:b/>
+          <w:color w:val="0F4A34"/>
+          <w:sz w:val="28"/>
+        </w:rPr>
+        <w:t>V. THUẬT TOÁN LOGISTICS SAN SẺ 50/50 &amp; ĐỆM RỦI RO BLOCK 5K</w:t>
+      </w:r>
+    </w:p>
+    <w:p>
+      <w:pPr>
+        <w:spacing w:after="80"/>
+        <w:jc w:val="both"/>
+      </w:pPr>
+      <w:r>
+        <w:rPr>
+          <w:rFonts w:ascii="Times New Roman" w:hAnsi="Times New Roman"/>
+          <w:sz w:val="25"/>
+        </w:rPr>
+        <w:t>CLOOP áp dụng thuật toán chia đôi cước vận chuyển chuẩn hóa: Khách thuê thanh toán trước 25.000đ cho lượt đi ngay lúc tạo đơn; Chủ tủ khấu trừ 25.000đ cho lượt về từ doanh thu cho thuê trước khi giải ngân. Mọi mức cước thực tế từ API GHN đều được làm tròn trần (Ceil) lên mốc 5.000đ gần nhất theo công thức: Cước niêm yết = ⌈ Cước thực tế / 5.000 ⌉ × 5.000.</w:t>
       </w:r>
     </w:p>
     <w:tbl>
@@ -1634,7 +3088,7 @@
           <w:color w:val="0F4A34"/>
           <w:sz w:val="28"/>
         </w:rPr>
-        <w:t>III. MA TRẬN DÒNG TIỀN &amp; LỚP ĐIỀU PHỐI THANH TOÁN (ORCHESTRATION LAYER)</w:t>
+        <w:t>VI. MA TRẬN DÒNG TIỀN &amp; LỚP ĐIỀU PHỐI THANH TOÁN (ORCHESTRATION LAYER)</w:t>
       </w:r>
     </w:p>
     <w:p>
@@ -1647,7 +3101,7 @@
           <w:rFonts w:ascii="Times New Roman" w:hAnsi="Times New Roman"/>
           <w:sz w:val="25"/>
         </w:rPr>
-        <w:t>Toàn bộ tài chính của CLOOP tuân thủ nguyên tắc Kế toán Kép (Double-Entry Bookkeeping). Lớp điều phối đóng vai trò trung gian kiểm soát trạng thái giao dịch, kết nối trực tiếp với cổng thanh toán để đảm bảo tính minh bạch.</w:t>
+        <w:t>Toàn bộ tài chính của CLOOP tuân thủ nguyên tắc Kế toán Kép. Lớp điều phối kiểm soát trạng thái giao dịch và kết nối trực tiếp với cổng thanh toán để giải ngân theo điều kiện:</w:t>
       </w:r>
     </w:p>
     <w:tbl>
@@ -2439,6 +3893,34 @@
     <w:p>
       <w:pPr>
         <w:keepNext/>
+        <w:spacing w:before="320" w:after="120"/>
+      </w:pPr>
+      <w:r>
+        <w:rPr>
+          <w:rFonts w:ascii="Times New Roman" w:hAnsi="Times New Roman"/>
+          <w:b/>
+          <w:color w:val="0F4A34"/>
+          <w:sz w:val="28"/>
+        </w:rPr>
+        <w:t>VII. KIẾN TRÚC 'CLOOP TRUST STACK' &amp; PROGRESSIVE RISK ENGINE</w:t>
+      </w:r>
+    </w:p>
+    <w:p>
+      <w:pPr>
+        <w:spacing w:after="80"/>
+        <w:jc w:val="both"/>
+      </w:pPr>
+      <w:r>
+        <w:rPr>
+          <w:rFonts w:ascii="Times New Roman" w:hAnsi="Times New Roman"/>
+          <w:sz w:val="25"/>
+        </w:rPr>
+        <w:t>Thay vì áp dụng cơ chế eKYC nặng nề chặn cửa (bắt chụp CCCD + selfie ngay lúc đăng ký), CLOOP chuyển dịch sang mô hình 'Trust Stack Tích Lũy Lũy Tiến' và 'Kiểm Soát Trần Thiệt Hại' (Damage Isolation):</w:t>
+      </w:r>
+    </w:p>
+    <w:p>
+      <w:pPr>
+        <w:keepNext/>
         <w:spacing w:before="200" w:after="80"/>
       </w:pPr>
       <w:r>
@@ -2448,7 +3930,7 @@
           <w:color w:val="183A2D"/>
           <w:sz w:val="26"/>
         </w:rPr>
-        <w:t>Phân Tích Cơ Chế Khóa Tiền &amp; Giải Ngân Sau Nghiệm Thu 24H</w:t>
+        <w:t>1. Tầng Account Trust &amp; Identity as a Privilege</w:t>
       </w:r>
     </w:p>
     <w:p>
@@ -2463,14 +3945,14 @@
           <w:b/>
           <w:sz w:val="25"/>
         </w:rPr>
-        <w:t xml:space="preserve">1. Bản chất &amp; Mục đích (Làm như vậy để làm gì?): </w:t>
+        <w:t xml:space="preserve">1. Bản chất &amp; Mục đích: </w:t>
       </w:r>
       <w:r>
         <w:rPr>
           <w:rFonts w:ascii="Times New Roman" w:hAnsi="Times New Roman"/>
           <w:sz w:val="25"/>
         </w:rPr>
-        <w:t>Khi khách trả hàng, Chủ tủ có thời hạn 24 giờ để kiểm tra tình trạng váy/áo. Nếu đồ nguyên vẹn hoặc quá 24 giờ mà chủ tủ không phản hồi, hệ thống kích hoạt Server Action tự động: Hoàn trả 100% tiền cọc về tài khoản khách thuê, giải ngân tiền thuê về ví chủ tủ và ghi nhận doanh thu phí dịch vụ vào tài khoản CLOOP.</w:t>
+        <w:t>Đăng ký ban đầu cực nhẹ qua Supabase Auth: Chỉ cần Email OTP / Magic Link và Số điện thoại. Xác minh danh tính sinh viên (@edu.vn) hay giấy tờ chỉ xuất hiện như một QUYỀN LỢI (Privilege) khi người dùng chủ động muốn 'Giảm tiền cọc' hoặc 'Mở rộng hạn mức thuê đồ cao cấp'.</w:t>
       </w:r>
     </w:p>
     <w:p>
@@ -2485,1354 +3967,7 @@
           <w:b/>
           <w:sz w:val="25"/>
         </w:rPr>
-        <w:t xml:space="preserve">2. Lợi ích thực tế (Có lợi ích gì?): </w:t>
-      </w:r>
-      <w:r>
-        <w:rPr>
-          <w:rFonts w:ascii="Times New Roman" w:hAnsi="Times New Roman"/>
-          <w:sz w:val="25"/>
-        </w:rPr>
-        <w:t>Bảo vệ người thuê khỏi hành vi cố tình chây ì không trả cọc của chủ tủ; đồng thời cho chủ tủ đủ thời gian kiểm tra kỹ lưỡng các lỗi rách/bẩn tiềm ẩn dưới ánh sáng tự nhiên trước khi tiền cọc được giải phóng.</w:t>
-      </w:r>
-    </w:p>
-    <w:p>
-      <w:pPr>
-        <w:pStyle w:val="ListBullet"/>
-        <w:spacing w:after="60"/>
-        <w:jc w:val="both"/>
-      </w:pPr>
-      <w:r>
-        <w:rPr>
-          <w:rFonts w:ascii="Times New Roman" w:hAnsi="Times New Roman"/>
-          <w:b/>
-          <w:sz w:val="25"/>
-        </w:rPr>
-        <w:t xml:space="preserve">3. Ưu điểm vượt trội (Ưu điểm gì?): </w:t>
-      </w:r>
-      <w:r>
-        <w:rPr>
-          <w:rFonts w:ascii="Times New Roman" w:hAnsi="Times New Roman"/>
-          <w:sz w:val="25"/>
-        </w:rPr>
-        <w:t>Tính kỷ luật tài chính cao: Giảm thiểu tối đa nguy cơ thất thoát dòng tiền; dòng tiền của các bên tách bạch độc lập trên sổ cái kế toán.</w:t>
-      </w:r>
-    </w:p>
-    <w:p>
-      <w:pPr>
-        <w:pStyle w:val="ListBullet"/>
-        <w:spacing w:after="60"/>
-        <w:jc w:val="both"/>
-      </w:pPr>
-      <w:r>
-        <w:rPr>
-          <w:rFonts w:ascii="Times New Roman" w:hAnsi="Times New Roman"/>
-          <w:b/>
-          <w:sz w:val="25"/>
-        </w:rPr>
-        <w:t xml:space="preserve">4. Mặt trái &amp; Thách thức tiềm ẩn (Mặt trái gì?): </w:t>
-      </w:r>
-      <w:r>
-        <w:rPr>
-          <w:rFonts w:ascii="Times New Roman" w:hAnsi="Times New Roman"/>
-          <w:sz w:val="25"/>
-        </w:rPr>
-        <w:t>Thời gian phong tỏa tiền 24H - 48H có thể khiến các chủ tủ cá nhân cảm thấy sốt ruột so với mô hình giao dịch tiền mặt trực tiếp.</w:t>
-      </w:r>
-    </w:p>
-    <w:p>
-      <w:pPr>
-        <w:pStyle w:val="ListBullet"/>
-        <w:spacing w:after="60"/>
-        <w:jc w:val="both"/>
-      </w:pPr>
-      <w:r>
-        <w:rPr>
-          <w:rFonts w:ascii="Times New Roman" w:hAnsi="Times New Roman"/>
-          <w:b/>
-          <w:sz w:val="25"/>
-        </w:rPr>
-        <w:t xml:space="preserve">5. Đề xuất phương án thay thế &amp; Kế hoạch dự phòng: </w:t>
-      </w:r>
-      <w:r>
-        <w:rPr>
-          <w:rFonts w:ascii="Times New Roman" w:hAnsi="Times New Roman"/>
-          <w:sz w:val="25"/>
-        </w:rPr>
-        <w:t>1. Tính năng Instant Payout (Giải ngân siêu tốc): Cho phép các Chủ tủ đạt hạng Platinum/Diamond (điểm đánh giá trên 4.9 và trên 50 đơn hoàn tất) nhận tiền ngay trong 60 giây sau khi bưu tá xác nhận nhận hàng, chịu mức phí bảo lãnh 1.5%.</w:t>
-        <w:br/>
-        <w:t>2. Ví Tín Dụng Nội Bộ CLOOP Credit: Số dư có thể được chuyển ngay thành điểm tín dụng trên sàn với tỷ lệ tặng thêm 5% để chủ tủ tiếp tục thuê các trang phục khác trên hệ thống.</w:t>
-      </w:r>
-    </w:p>
-    <w:p>
-      <w:pPr>
-        <w:keepNext/>
-        <w:spacing w:before="320" w:after="120"/>
-      </w:pPr>
-      <w:r>
-        <w:rPr>
-          <w:rFonts w:ascii="Times New Roman" w:hAnsi="Times New Roman"/>
-          <w:b/>
-          <w:color w:val="0F4A34"/>
-          <w:sz w:val="28"/>
-        </w:rPr>
-        <w:t>IV. CƠ CHẾ XỬ LÝ 3 TRƯỜNG HỢP BIÊN (EDGE CASES)</w:t>
-      </w:r>
-    </w:p>
-    <w:p>
-      <w:pPr>
-        <w:spacing w:after="80"/>
-        <w:jc w:val="both"/>
-      </w:pPr>
-      <w:r>
-        <w:rPr>
-          <w:rFonts w:ascii="Times New Roman" w:hAnsi="Times New Roman"/>
-          <w:sz w:val="25"/>
-        </w:rPr>
-        <w:t>Hệ thống vận hành được thiết kế với các quy tắc rẽ nhánh tự động (Decision Tree) để bao quát các tình huống biên phát sinh trong thực tế:</w:t>
-      </w:r>
-    </w:p>
-    <w:p>
-      <w:pPr>
-        <w:keepNext/>
-        <w:spacing w:before="200" w:after="80"/>
-      </w:pPr>
-      <w:r>
-        <w:rPr>
-          <w:rFonts w:ascii="Times New Roman" w:hAnsi="Times New Roman"/>
-          <w:b/>
-          <w:color w:val="183A2D"/>
-          <w:sz w:val="26"/>
-        </w:rPr>
-        <w:t>1. Trường Hợp Khách Hủy Đơn Trước Khi Bàn Giao Bưu Tá GHN</w:t>
-      </w:r>
-    </w:p>
-    <w:p>
-      <w:pPr>
-        <w:pStyle w:val="ListBullet"/>
-        <w:spacing w:after="60"/>
-        <w:jc w:val="both"/>
-      </w:pPr>
-      <w:r>
-        <w:rPr>
-          <w:rFonts w:ascii="Times New Roman" w:hAnsi="Times New Roman"/>
-          <w:b/>
-          <w:sz w:val="25"/>
-        </w:rPr>
-        <w:t xml:space="preserve">1. Bản chất &amp; Mục đích (Làm như vậy để làm gì?): </w:t>
-      </w:r>
-      <w:r>
-        <w:rPr>
-          <w:rFonts w:ascii="Times New Roman" w:hAnsi="Times New Roman"/>
-          <w:sz w:val="25"/>
-        </w:rPr>
-        <w:t>Nếu khách hủy đơn khi trạng thái vẫn là Chờ xác nhận hoặc Đang chuẩn bị (chưa bàn giao cho bưu tá GHN), hệ thống lập tức kích hoạt lệnh hoàn tiền 100% (Tiền thuê + Cọc + 25.000đ cước ship lượt đi) về tài khoản của khách.</w:t>
-      </w:r>
-    </w:p>
-    <w:p>
-      <w:pPr>
-        <w:pStyle w:val="ListBullet"/>
-        <w:spacing w:after="60"/>
-        <w:jc w:val="both"/>
-      </w:pPr>
-      <w:r>
-        <w:rPr>
-          <w:rFonts w:ascii="Times New Roman" w:hAnsi="Times New Roman"/>
-          <w:b/>
-          <w:sz w:val="25"/>
-        </w:rPr>
-        <w:t xml:space="preserve">2. Lợi ích thực tế (Có lợi ích gì?): </w:t>
-      </w:r>
-      <w:r>
-        <w:rPr>
-          <w:rFonts w:ascii="Times New Roman" w:hAnsi="Times New Roman"/>
-          <w:sz w:val="25"/>
-        </w:rPr>
-        <w:t>Khách hàng hoàn toàn yên tâm khi đặt đơn, giảm bớt tâm lý ngập ngừng sợ mất tiền nếu lịch trình cá nhân đột xuất thay đổi.</w:t>
-      </w:r>
-    </w:p>
-    <w:p>
-      <w:pPr>
-        <w:pStyle w:val="ListBullet"/>
-        <w:spacing w:after="60"/>
-        <w:jc w:val="both"/>
-      </w:pPr>
-      <w:r>
-        <w:rPr>
-          <w:rFonts w:ascii="Times New Roman" w:hAnsi="Times New Roman"/>
-          <w:b/>
-          <w:sz w:val="25"/>
-        </w:rPr>
-        <w:t xml:space="preserve">3. Ưu điểm vượt trội (Ưu điểm gì?): </w:t>
-      </w:r>
-      <w:r>
-        <w:rPr>
-          <w:rFonts w:ascii="Times New Roman" w:hAnsi="Times New Roman"/>
-          <w:sz w:val="25"/>
-        </w:rPr>
-        <w:t>Thực hiện hoàn tiền tự động 1-Click thông qua API ngân hàng, không giữ phí phạt vô lý, tạo ấn tượng thương hiệu tận tâm và uy tín.</w:t>
-      </w:r>
-    </w:p>
-    <w:p>
-      <w:pPr>
-        <w:pStyle w:val="ListBullet"/>
-        <w:spacing w:after="60"/>
-        <w:jc w:val="both"/>
-      </w:pPr>
-      <w:r>
-        <w:rPr>
-          <w:rFonts w:ascii="Times New Roman" w:hAnsi="Times New Roman"/>
-          <w:b/>
-          <w:sz w:val="25"/>
-        </w:rPr>
-        <w:t xml:space="preserve">4. Mặt trái &amp; Thách thức tiềm ẩn (Mặt trái gì?): </w:t>
-      </w:r>
-      <w:r>
-        <w:rPr>
-          <w:rFonts w:ascii="Times New Roman" w:hAnsi="Times New Roman"/>
-          <w:sz w:val="25"/>
-        </w:rPr>
-        <w:t>Chủ tủ có thể đã dành thời gian là ủi trang phục, đóng gói hộp cẩn thận nhưng bị hủy đơn phút chót.</w:t>
-      </w:r>
-    </w:p>
-    <w:p>
-      <w:pPr>
-        <w:pStyle w:val="ListBullet"/>
-        <w:spacing w:after="60"/>
-        <w:jc w:val="both"/>
-      </w:pPr>
-      <w:r>
-        <w:rPr>
-          <w:rFonts w:ascii="Times New Roman" w:hAnsi="Times New Roman"/>
-          <w:b/>
-          <w:sz w:val="25"/>
-        </w:rPr>
-        <w:t xml:space="preserve">5. Đề xuất phương án thay thế &amp; Kế hoạch dự phòng: </w:t>
-      </w:r>
-      <w:r>
-        <w:rPr>
-          <w:rFonts w:ascii="Times New Roman" w:hAnsi="Times New Roman"/>
-          <w:sz w:val="25"/>
-        </w:rPr>
-        <w:t>Áp dụng chính sách hủy đơn linh hoạt (Flexible Cancellation Policy): Cho phép hủy miễn phí trong vòng 2 giờ đầu sau khi đặt. Sau 2 giờ, nếu chủ tủ đã bấm 'Đã đóng gói', khách hủy đơn sẽ bị khấu trừ 10% tiền thuê để bồi thường công chuẩn bị cho chủ tủ.</w:t>
-      </w:r>
-    </w:p>
-    <w:p>
-      <w:pPr>
-        <w:keepNext/>
-        <w:spacing w:before="200" w:after="80"/>
-      </w:pPr>
-      <w:r>
-        <w:rPr>
-          <w:rFonts w:ascii="Times New Roman" w:hAnsi="Times New Roman"/>
-          <w:b/>
-          <w:color w:val="183A2D"/>
-          <w:sz w:val="26"/>
-        </w:rPr>
-        <w:t>2. Trường Hợp Khách Hủy Đơn Khi Bưu Tá Đã Tiếp Nhận Kiện Hàng</w:t>
-      </w:r>
-    </w:p>
-    <w:p>
-      <w:pPr>
-        <w:pStyle w:val="ListBullet"/>
-        <w:spacing w:after="60"/>
-        <w:jc w:val="both"/>
-      </w:pPr>
-      <w:r>
-        <w:rPr>
-          <w:rFonts w:ascii="Times New Roman" w:hAnsi="Times New Roman"/>
-          <w:b/>
-          <w:sz w:val="25"/>
-        </w:rPr>
-        <w:t xml:space="preserve">1. Bản chất &amp; Mục đích (Làm như vậy để làm gì?): </w:t>
-      </w:r>
-      <w:r>
-        <w:rPr>
-          <w:rFonts w:ascii="Times New Roman" w:hAnsi="Times New Roman"/>
-          <w:sz w:val="25"/>
-        </w:rPr>
-        <w:t>Nếu khách đơn phương từ chối nhận hàng khi bưu tá GHN đã lấy kiện đồ và đang giao, hệ thống sẽ trích 25.000đ cước ship đi để trả cho bưu tá, đồng thời trích thêm 25.000đ từ tiền cọc của khách để chi trả cước bưu tá chuyển hoàn về tủ đồ của chủ tủ. Số tiền thuê và phần cọc còn lại được hoàn trả cho khách.</w:t>
-      </w:r>
-    </w:p>
-    <w:p>
-      <w:pPr>
-        <w:pStyle w:val="ListBullet"/>
-        <w:spacing w:after="60"/>
-        <w:jc w:val="both"/>
-      </w:pPr>
-      <w:r>
-        <w:rPr>
-          <w:rFonts w:ascii="Times New Roman" w:hAnsi="Times New Roman"/>
-          <w:b/>
-          <w:sz w:val="25"/>
-        </w:rPr>
-        <w:t xml:space="preserve">2. Lợi ích thực tế (Có lợi ích gì?): </w:t>
-      </w:r>
-      <w:r>
-        <w:rPr>
-          <w:rFonts w:ascii="Times New Roman" w:hAnsi="Times New Roman"/>
-          <w:sz w:val="25"/>
-        </w:rPr>
-        <w:t>Chủ tủ giảm thiểu thiệt hại tài chính; sàn hạn chế tối đa việc phải bỏ tiền túi bù lỗ chi phí vận chuyển 2 chiều cho hành vi bốc đồng của khách.</w:t>
-      </w:r>
-    </w:p>
-    <w:p>
-      <w:pPr>
-        <w:pStyle w:val="ListBullet"/>
-        <w:spacing w:after="60"/>
-        <w:jc w:val="both"/>
-      </w:pPr>
-      <w:r>
-        <w:rPr>
-          <w:rFonts w:ascii="Times New Roman" w:hAnsi="Times New Roman"/>
-          <w:b/>
-          <w:sz w:val="25"/>
-        </w:rPr>
-        <w:t xml:space="preserve">3. Ưu điểm vượt trội (Ưu điểm gì?): </w:t>
-      </w:r>
-      <w:r>
-        <w:rPr>
-          <w:rFonts w:ascii="Times New Roman" w:hAnsi="Times New Roman"/>
-          <w:sz w:val="25"/>
-        </w:rPr>
-        <w:t>Quy định phân xử công bằng, rành mạch dựa trên mốc thời gian thực của mã vận đơn GHN.</w:t>
-      </w:r>
-    </w:p>
-    <w:p>
-      <w:pPr>
-        <w:pStyle w:val="ListBullet"/>
-        <w:spacing w:after="60"/>
-        <w:jc w:val="both"/>
-      </w:pPr>
-      <w:r>
-        <w:rPr>
-          <w:rFonts w:ascii="Times New Roman" w:hAnsi="Times New Roman"/>
-          <w:b/>
-          <w:sz w:val="25"/>
-        </w:rPr>
-        <w:t xml:space="preserve">4. Mặt trái &amp; Thách thức tiềm ẩn (Mặt trái gì?): </w:t>
-      </w:r>
-      <w:r>
-        <w:rPr>
-          <w:rFonts w:ascii="Times New Roman" w:hAnsi="Times New Roman"/>
-          <w:sz w:val="25"/>
-        </w:rPr>
-        <w:t>Khách hàng bị trừ 50.000đ có thể phát sinh tâm lý tiêu cực và phản ánh lên tổng đài hỗ trợ.</w:t>
-      </w:r>
-    </w:p>
-    <w:p>
-      <w:pPr>
-        <w:pStyle w:val="ListBullet"/>
-        <w:spacing w:after="60"/>
-        <w:jc w:val="both"/>
-      </w:pPr>
-      <w:r>
-        <w:rPr>
-          <w:rFonts w:ascii="Times New Roman" w:hAnsi="Times New Roman"/>
-          <w:b/>
-          <w:sz w:val="25"/>
-        </w:rPr>
-        <w:t xml:space="preserve">5. Đề xuất phương án thay thế &amp; Kế hoạch dự phòng: </w:t>
-      </w:r>
-      <w:r>
-        <w:rPr>
-          <w:rFonts w:ascii="Times New Roman" w:hAnsi="Times New Roman"/>
-          <w:sz w:val="25"/>
-        </w:rPr>
-        <w:t>Tích hợp tin nhắn cảnh báo tự động qua Zalo ZNS / SMS trước khi bưu tá đến lấy hàng 1 giờ, kèm nút xác nhận 'Tôi chắc chắn nhận đồ' để giảm tỷ lệ từ chối nhận hàng xuống mức tối thiểu.</w:t>
-      </w:r>
-    </w:p>
-    <w:p>
-      <w:pPr>
-        <w:keepNext/>
-        <w:spacing w:before="200" w:after="80"/>
-      </w:pPr>
-      <w:r>
-        <w:rPr>
-          <w:rFonts w:ascii="Times New Roman" w:hAnsi="Times New Roman"/>
-          <w:b/>
-          <w:color w:val="183A2D"/>
-          <w:sz w:val="26"/>
-        </w:rPr>
-        <w:t>3. Tranh Chấp Hư Hỏng / Sai Mẫu &amp; Quy Trình Video Niêm Phong - Mở Hộp</w:t>
-      </w:r>
-    </w:p>
-    <w:p>
-      <w:pPr>
-        <w:pStyle w:val="ListBullet"/>
-        <w:spacing w:after="60"/>
-        <w:jc w:val="both"/>
-      </w:pPr>
-      <w:r>
-        <w:rPr>
-          <w:rFonts w:ascii="Times New Roman" w:hAnsi="Times New Roman"/>
-          <w:b/>
-          <w:sz w:val="25"/>
-        </w:rPr>
-        <w:t xml:space="preserve">1. Bản chất &amp; Mục đích (Làm như vậy để làm gì?): </w:t>
-      </w:r>
-      <w:r>
-        <w:rPr>
-          <w:rFonts w:ascii="Times New Roman" w:hAnsi="Times New Roman"/>
-          <w:sz w:val="25"/>
-        </w:rPr>
-        <w:t>Bắt buộc Chủ tủ quay video/chụp ảnh tình trạng vải và tem niêm phong lúc đóng gói; nhắc nhở Khách thuê quay video mở hộp unboxing. Khi có khiếu nại, toàn bộ tiền cọc bị phong tỏa trong hệ thống và kích hoạt Hội đồng Trọng tài 3 bên (Khách - Chủ tủ - Admin CLOOP) phân xử dựa trên dữ liệu video trên kho đối soát.</w:t>
-      </w:r>
-    </w:p>
-    <w:p>
-      <w:pPr>
-        <w:pStyle w:val="ListBullet"/>
-        <w:spacing w:after="60"/>
-        <w:jc w:val="both"/>
-      </w:pPr>
-      <w:r>
-        <w:rPr>
-          <w:rFonts w:ascii="Times New Roman" w:hAnsi="Times New Roman"/>
-          <w:b/>
-          <w:sz w:val="25"/>
-        </w:rPr>
-        <w:t xml:space="preserve">2. Lợi ích thực tế (Có lợi ích gì?): </w:t>
-      </w:r>
-      <w:r>
-        <w:rPr>
-          <w:rFonts w:ascii="Times New Roman" w:hAnsi="Times New Roman"/>
-          <w:sz w:val="25"/>
-        </w:rPr>
-        <w:t>Có bằng chứng khách quan để phân định lỗi thuộc về khâu nào (chủ tủ gửi đồ cũ rách, khách làm bẩn trong lúc mặc tiệc, hay bưu tá làm rách hộp trong lúc vận chuyển).</w:t>
-      </w:r>
-    </w:p>
-    <w:p>
-      <w:pPr>
-        <w:pStyle w:val="ListBullet"/>
-        <w:spacing w:after="60"/>
-        <w:jc w:val="both"/>
-      </w:pPr>
-      <w:r>
-        <w:rPr>
-          <w:rFonts w:ascii="Times New Roman" w:hAnsi="Times New Roman"/>
-          <w:b/>
-          <w:sz w:val="25"/>
-        </w:rPr>
-        <w:t xml:space="preserve">3. Ưu điểm vượt trội (Ưu điểm gì?): </w:t>
-      </w:r>
-      <w:r>
-        <w:rPr>
-          <w:rFonts w:ascii="Times New Roman" w:hAnsi="Times New Roman"/>
-          <w:sz w:val="25"/>
-        </w:rPr>
-        <w:t>Bảo vệ giá trị tài sản trang phục cao cấp; hạn chế tối đa tình trạng vu khống hoặc tranh chấp không có cơ sở.</w:t>
-      </w:r>
-    </w:p>
-    <w:p>
-      <w:pPr>
-        <w:pStyle w:val="ListBullet"/>
-        <w:spacing w:after="60"/>
-        <w:jc w:val="both"/>
-      </w:pPr>
-      <w:r>
-        <w:rPr>
-          <w:rFonts w:ascii="Times New Roman" w:hAnsi="Times New Roman"/>
-          <w:b/>
-          <w:sz w:val="25"/>
-        </w:rPr>
-        <w:t xml:space="preserve">4. Mặt trái &amp; Thách thức tiềm ẩn (Mặt trái gì?): </w:t>
-      </w:r>
-      <w:r>
-        <w:rPr>
-          <w:rFonts w:ascii="Times New Roman" w:hAnsi="Times New Roman"/>
-          <w:sz w:val="25"/>
-        </w:rPr>
-        <w:t>Khách hàng có thể cảm thấy phiền phức khi phải quay video mở hộp; phát sinh thời gian nhân sự vận hành kiểm duyệt video đối soát.</w:t>
-      </w:r>
-    </w:p>
-    <w:p>
-      <w:pPr>
-        <w:pStyle w:val="ListBullet"/>
-        <w:spacing w:after="60"/>
-        <w:jc w:val="both"/>
-      </w:pPr>
-      <w:r>
-        <w:rPr>
-          <w:rFonts w:ascii="Times New Roman" w:hAnsi="Times New Roman"/>
-          <w:b/>
-          <w:sz w:val="25"/>
-        </w:rPr>
-        <w:t xml:space="preserve">5. Đề xuất phương án thay thế &amp; Kế hoạch dự phòng: </w:t>
-      </w:r>
-      <w:r>
-        <w:rPr>
-          <w:rFonts w:ascii="Times New Roman" w:hAnsi="Times New Roman"/>
-          <w:sz w:val="25"/>
-        </w:rPr>
-        <w:t>1. Gói Bảo Hiểm Vi Mô 'CLOOP Care' (10.000đ/đơn): Bảo hiểm chi trả chi phí giặt hấp hoặc xử lý các vết bẩn thông thường (vết rượu vang, cà phê, son môi) mà không cần giữ cọc hay tranh chấp.</w:t>
-        <w:br/>
-        <w:t>2. Cơ Chế Phân Xử Vi Mô Tự Động (Micro-Resolution $\le 50.000$đ) kết hợp AI Computer Vision: Tự động đền bù lỗi nhỏ và dùng AI so khớp ảnh trước/sau giao hàng.</w:t>
-      </w:r>
-    </w:p>
-    <w:p>
-      <w:pPr>
-        <w:keepNext/>
-        <w:spacing w:before="320" w:after="120"/>
-      </w:pPr>
-      <w:r>
-        <w:rPr>
-          <w:rFonts w:ascii="Times New Roman" w:hAnsi="Times New Roman"/>
-          <w:b/>
-          <w:color w:val="0F4A34"/>
-          <w:sz w:val="28"/>
-        </w:rPr>
-        <w:t>V. MÔ HÌNH KINH TẾ 'FOUNDING 100' &amp; LỘ TRÌNH THƯƠNG MẠI HÓA</w:t>
-      </w:r>
-    </w:p>
-    <w:p>
-      <w:pPr>
-        <w:spacing w:after="80"/>
-        <w:jc w:val="both"/>
-      </w:pPr>
-      <w:r>
-        <w:rPr>
-          <w:rFonts w:ascii="Times New Roman" w:hAnsi="Times New Roman"/>
-          <w:sz w:val="25"/>
-        </w:rPr>
-        <w:t>Nhằm phá vỡ nghịch lý 'Con gà - Quả trứng' (Cần người thuê thì phải có nhiều đồ đẹp, muốn có nhiều đồ đẹp thì phải có đông người thuê), CLOOP triển khai chiến lược kinh tế học nền tảng qua 3 giai đoạn:</w:t>
-      </w:r>
-    </w:p>
-    <w:tbl>
-      <w:tblPr>
-        <w:tblW w:type="auto" w:w="0"/>
-        <w:jc w:val="center"/>
-        <w:tblLook w:firstColumn="1" w:firstRow="1" w:lastColumn="0" w:lastRow="0" w:noHBand="0" w:noVBand="1" w:val="04A0"/>
-        <w:tblBorders>
-          <w:top w:val="single" w:sz="6" w:space="0" w:color="D3D3D3"/>
-          <w:bottom w:val="single" w:sz="6" w:space="0" w:color="D3D3D3"/>
-          <w:insideH w:val="single" w:sz="4" w:space="0" w:color="D3D3D3"/>
-          <w:insideV w:val="none"/>
-          <w:left w:val="none"/>
-          <w:right w:val="none"/>
-        </w:tblBorders>
-      </w:tblPr>
-      <w:tblGrid>
-        <w:gridCol w:w="3024"/>
-        <w:gridCol w:w="3024"/>
-        <w:gridCol w:w="3024"/>
-      </w:tblGrid>
-      <w:tr>
-        <w:tc>
-          <w:tcPr>
-            <w:tcW w:type="dxa" w:w="3024"/>
-            <w:shd w:fill="E6F4EA"/>
-            <w:tcMar>
-              <w:top w:w="120" w:type="dxa"/>
-              <w:bottom w:w="120" w:type="dxa"/>
-              <w:left w:w="140" w:type="dxa"/>
-              <w:right w:w="140" w:type="dxa"/>
-            </w:tcMar>
-          </w:tcPr>
-          <w:p>
-            <w:pPr>
-              <w:jc w:val="center"/>
-            </w:pPr>
-            <w:r>
-              <w:rPr>
-                <w:rFonts w:ascii="Times New Roman" w:hAnsi="Times New Roman"/>
-                <w:b/>
-                <w:color w:val="0A2517"/>
-                <w:sz w:val="22"/>
-              </w:rPr>
-              <w:t>Chỉ số kinh tế / Quyền lợi</w:t>
-            </w:r>
-          </w:p>
-        </w:tc>
-        <w:tc>
-          <w:tcPr>
-            <w:tcW w:type="dxa" w:w="3024"/>
-            <w:shd w:fill="E6F4EA"/>
-            <w:tcMar>
-              <w:top w:w="120" w:type="dxa"/>
-              <w:bottom w:w="120" w:type="dxa"/>
-              <w:left w:w="140" w:type="dxa"/>
-              <w:right w:w="140" w:type="dxa"/>
-            </w:tcMar>
-          </w:tcPr>
-          <w:p>
-            <w:pPr>
-              <w:jc w:val="center"/>
-            </w:pPr>
-            <w:r>
-              <w:rPr>
-                <w:rFonts w:ascii="Times New Roman" w:hAnsi="Times New Roman"/>
-                <w:b/>
-                <w:color w:val="0A2517"/>
-                <w:sz w:val="22"/>
-              </w:rPr>
-              <w:t>Chủ tủ Tiêu chuẩn (Standard Closet)</w:t>
-            </w:r>
-          </w:p>
-        </w:tc>
-        <w:tc>
-          <w:tcPr>
-            <w:tcW w:type="dxa" w:w="3024"/>
-            <w:shd w:fill="E6F4EA"/>
-            <w:tcMar>
-              <w:top w:w="120" w:type="dxa"/>
-              <w:bottom w:w="120" w:type="dxa"/>
-              <w:left w:w="140" w:type="dxa"/>
-              <w:right w:w="140" w:type="dxa"/>
-            </w:tcMar>
-          </w:tcPr>
-          <w:p>
-            <w:pPr>
-              <w:jc w:val="center"/>
-            </w:pPr>
-            <w:r>
-              <w:rPr>
-                <w:rFonts w:ascii="Times New Roman" w:hAnsi="Times New Roman"/>
-                <w:b/>
-                <w:color w:val="0A2517"/>
-                <w:sz w:val="22"/>
-              </w:rPr>
-              <w:t>Thành viên Founding 100 (VIP Partner)</w:t>
-            </w:r>
-          </w:p>
-        </w:tc>
-      </w:tr>
-      <w:tr>
-        <w:tc>
-          <w:tcPr>
-            <w:tcW w:type="dxa" w:w="3024"/>
-            <w:shd w:fill="FFFFFF"/>
-            <w:tcMar>
-              <w:top w:w="80" w:type="dxa"/>
-              <w:bottom w:w="80" w:type="dxa"/>
-              <w:left w:w="140" w:type="dxa"/>
-              <w:right w:w="140" w:type="dxa"/>
-            </w:tcMar>
-          </w:tcPr>
-          <w:p>
-            <w:pPr>
-              <w:jc w:val="left"/>
-            </w:pPr>
-            <w:r>
-              <w:rPr>
-                <w:rFonts w:ascii="Times New Roman" w:hAnsi="Times New Roman"/>
-                <w:sz w:val="22"/>
-              </w:rPr>
-              <w:t>Phí hoa hồng sàn (Platform Fee)</w:t>
-            </w:r>
-          </w:p>
-        </w:tc>
-        <w:tc>
-          <w:tcPr>
-            <w:tcW w:type="dxa" w:w="3024"/>
-            <w:shd w:fill="FFFFFF"/>
-            <w:tcMar>
-              <w:top w:w="80" w:type="dxa"/>
-              <w:bottom w:w="80" w:type="dxa"/>
-              <w:left w:w="140" w:type="dxa"/>
-              <w:right w:w="140" w:type="dxa"/>
-            </w:tcMar>
-          </w:tcPr>
-          <w:p>
-            <w:pPr>
-              <w:jc w:val="center"/>
-            </w:pPr>
-            <w:r>
-              <w:rPr>
-                <w:rFonts w:ascii="Times New Roman" w:hAnsi="Times New Roman"/>
-                <w:sz w:val="22"/>
-              </w:rPr>
-              <w:t>12% trên giá trị mỗi lượt thuê</w:t>
-            </w:r>
-          </w:p>
-        </w:tc>
-        <w:tc>
-          <w:tcPr>
-            <w:tcW w:type="dxa" w:w="3024"/>
-            <w:shd w:fill="FFFFFF"/>
-            <w:tcMar>
-              <w:top w:w="80" w:type="dxa"/>
-              <w:bottom w:w="80" w:type="dxa"/>
-              <w:left w:w="140" w:type="dxa"/>
-              <w:right w:w="140" w:type="dxa"/>
-            </w:tcMar>
-          </w:tcPr>
-          <w:p>
-            <w:pPr>
-              <w:jc w:val="center"/>
-            </w:pPr>
-            <w:r>
-              <w:rPr>
-                <w:rFonts w:ascii="Times New Roman" w:hAnsi="Times New Roman"/>
-                <w:sz w:val="22"/>
-              </w:rPr>
-              <w:t>0% trọn đời (Miễn phí hoàn toàn)</w:t>
-            </w:r>
-          </w:p>
-        </w:tc>
-      </w:tr>
-      <w:tr>
-        <w:tc>
-          <w:tcPr>
-            <w:tcW w:type="dxa" w:w="3024"/>
-            <w:shd w:fill="F9FBF9"/>
-            <w:tcMar>
-              <w:top w:w="80" w:type="dxa"/>
-              <w:bottom w:w="80" w:type="dxa"/>
-              <w:left w:w="140" w:type="dxa"/>
-              <w:right w:w="140" w:type="dxa"/>
-            </w:tcMar>
-          </w:tcPr>
-          <w:p>
-            <w:pPr>
-              <w:jc w:val="left"/>
-            </w:pPr>
-            <w:r>
-              <w:rPr>
-                <w:rFonts w:ascii="Times New Roman" w:hAnsi="Times New Roman"/>
-                <w:sz w:val="22"/>
-              </w:rPr>
-              <w:t>Chiết khấu trên đơn 350.000đ</w:t>
-            </w:r>
-          </w:p>
-        </w:tc>
-        <w:tc>
-          <w:tcPr>
-            <w:tcW w:type="dxa" w:w="3024"/>
-            <w:shd w:fill="F9FBF9"/>
-            <w:tcMar>
-              <w:top w:w="80" w:type="dxa"/>
-              <w:bottom w:w="80" w:type="dxa"/>
-              <w:left w:w="140" w:type="dxa"/>
-              <w:right w:w="140" w:type="dxa"/>
-            </w:tcMar>
-          </w:tcPr>
-          <w:p>
-            <w:pPr>
-              <w:jc w:val="center"/>
-            </w:pPr>
-            <w:r>
-              <w:rPr>
-                <w:rFonts w:ascii="Times New Roman" w:hAnsi="Times New Roman"/>
-                <w:sz w:val="22"/>
-              </w:rPr>
-              <w:t>Khấu trừ 42.000đ vào Quỹ sàn</w:t>
-            </w:r>
-          </w:p>
-        </w:tc>
-        <w:tc>
-          <w:tcPr>
-            <w:tcW w:type="dxa" w:w="3024"/>
-            <w:shd w:fill="F9FBF9"/>
-            <w:tcMar>
-              <w:top w:w="80" w:type="dxa"/>
-              <w:bottom w:w="80" w:type="dxa"/>
-              <w:left w:w="140" w:type="dxa"/>
-              <w:right w:w="140" w:type="dxa"/>
-            </w:tcMar>
-          </w:tcPr>
-          <w:p>
-            <w:pPr>
-              <w:jc w:val="center"/>
-            </w:pPr>
-            <w:r>
-              <w:rPr>
-                <w:rFonts w:ascii="Times New Roman" w:hAnsi="Times New Roman"/>
-                <w:sz w:val="22"/>
-              </w:rPr>
-              <w:t>Khấu trừ 0đ (Chủ tủ nhận trọn 325.000đ)</w:t>
-            </w:r>
-          </w:p>
-        </w:tc>
-      </w:tr>
-      <w:tr>
-        <w:tc>
-          <w:tcPr>
-            <w:tcW w:type="dxa" w:w="3024"/>
-            <w:shd w:fill="FFFFFF"/>
-            <w:tcMar>
-              <w:top w:w="80" w:type="dxa"/>
-              <w:bottom w:w="80" w:type="dxa"/>
-              <w:left w:w="140" w:type="dxa"/>
-              <w:right w:w="140" w:type="dxa"/>
-            </w:tcMar>
-          </w:tcPr>
-          <w:p>
-            <w:pPr>
-              <w:jc w:val="left"/>
-            </w:pPr>
-            <w:r>
-              <w:rPr>
-                <w:rFonts w:ascii="Times New Roman" w:hAnsi="Times New Roman"/>
-                <w:sz w:val="22"/>
-              </w:rPr>
-              <w:t>Hỗ trợ truyền thông &amp; Đẩy Top</w:t>
-            </w:r>
-          </w:p>
-        </w:tc>
-        <w:tc>
-          <w:tcPr>
-            <w:tcW w:type="dxa" w:w="3024"/>
-            <w:shd w:fill="FFFFFF"/>
-            <w:tcMar>
-              <w:top w:w="80" w:type="dxa"/>
-              <w:bottom w:w="80" w:type="dxa"/>
-              <w:left w:w="140" w:type="dxa"/>
-              <w:right w:w="140" w:type="dxa"/>
-            </w:tcMar>
-          </w:tcPr>
-          <w:p>
-            <w:pPr>
-              <w:jc w:val="center"/>
-            </w:pPr>
-            <w:r>
-              <w:rPr>
-                <w:rFonts w:ascii="Times New Roman" w:hAnsi="Times New Roman"/>
-                <w:sz w:val="22"/>
-              </w:rPr>
-              <w:t>Theo thuật toán xếp hạng chuẩn</w:t>
-            </w:r>
-          </w:p>
-        </w:tc>
-        <w:tc>
-          <w:tcPr>
-            <w:tcW w:type="dxa" w:w="3024"/>
-            <w:shd w:fill="FFFFFF"/>
-            <w:tcMar>
-              <w:top w:w="80" w:type="dxa"/>
-              <w:bottom w:w="80" w:type="dxa"/>
-              <w:left w:w="140" w:type="dxa"/>
-              <w:right w:w="140" w:type="dxa"/>
-            </w:tcMar>
-          </w:tcPr>
-          <w:p>
-            <w:pPr>
-              <w:jc w:val="center"/>
-            </w:pPr>
-            <w:r>
-              <w:rPr>
-                <w:rFonts w:ascii="Times New Roman" w:hAnsi="Times New Roman"/>
-                <w:sz w:val="22"/>
-              </w:rPr>
-              <w:t>Ưu tiên xuất hiện Banner trang chủ &amp; AI đề xuất</w:t>
-            </w:r>
-          </w:p>
-        </w:tc>
-      </w:tr>
-    </w:tbl>
-    <w:p>
-      <w:pPr>
-        <w:keepNext/>
-        <w:spacing w:before="200" w:after="80"/>
-      </w:pPr>
-      <w:r>
-        <w:rPr>
-          <w:rFonts w:ascii="Times New Roman" w:hAnsi="Times New Roman"/>
-          <w:b/>
-          <w:color w:val="183A2D"/>
-          <w:sz w:val="26"/>
-        </w:rPr>
-        <w:t>Chiến Lược Thâm Nhập Thị Trường &amp; Lộ Trình 3 Giai Đoạn</w:t>
-      </w:r>
-    </w:p>
-    <w:p>
-      <w:pPr>
-        <w:pStyle w:val="ListBullet"/>
-        <w:spacing w:after="60"/>
-        <w:jc w:val="both"/>
-      </w:pPr>
-      <w:r>
-        <w:rPr>
-          <w:rFonts w:ascii="Times New Roman" w:hAnsi="Times New Roman"/>
-          <w:b/>
-          <w:sz w:val="25"/>
-        </w:rPr>
-        <w:t xml:space="preserve">1. Bản chất &amp; Mục đích (Làm như vậy để làm gì?): </w:t>
-      </w:r>
-      <w:r>
-        <w:rPr>
-          <w:rFonts w:ascii="Times New Roman" w:hAnsi="Times New Roman"/>
-          <w:sz w:val="25"/>
-        </w:rPr>
-        <w:t>Giai đoạn 1: Miễn phí sàn 0% để tuyển chọn 100 Tủ đồ chất lượng cao (Founding 100) sở hữu từ 10 - 50 mẫu đầm tiệc, váy thiết kế có giá trị cao. Giai đoạn 2: Giúp chủ tủ hình thành thói quen kiếm dòng tiền thụ động đều đặn từ tủ đồ nhàn rỗi. Giai đoạn 3: Bắt đầu áp dụng biểu phí 12% đối với các tủ đồ thông thường để tạo lập dòng doanh thu bền vững.</w:t>
-      </w:r>
-    </w:p>
-    <w:p>
-      <w:pPr>
-        <w:pStyle w:val="ListBullet"/>
-        <w:spacing w:after="60"/>
-        <w:jc w:val="both"/>
-      </w:pPr>
-      <w:r>
-        <w:rPr>
-          <w:rFonts w:ascii="Times New Roman" w:hAnsi="Times New Roman"/>
-          <w:b/>
-          <w:sz w:val="25"/>
-        </w:rPr>
-        <w:t xml:space="preserve">2. Lợi ích thực tế (Có lợi ích gì?): </w:t>
-      </w:r>
-      <w:r>
-        <w:rPr>
-          <w:rFonts w:ascii="Times New Roman" w:hAnsi="Times New Roman"/>
-          <w:sz w:val="25"/>
-        </w:rPr>
-        <w:t>Tạo lập nguồn cung ban đầu phong phú, đẳng cấp mà không cần sàn phải bỏ vốn tự mua sắm tồn kho (Zero-Inventory Model); tạo hiệu ứng truyền miệng tự nhiên từ chính 100 đối tác VIP đầu tiên.</w:t>
-      </w:r>
-    </w:p>
-    <w:p>
-      <w:pPr>
-        <w:pStyle w:val="ListBullet"/>
-        <w:spacing w:after="60"/>
-        <w:jc w:val="both"/>
-      </w:pPr>
-      <w:r>
-        <w:rPr>
-          <w:rFonts w:ascii="Times New Roman" w:hAnsi="Times New Roman"/>
-          <w:b/>
-          <w:sz w:val="25"/>
-        </w:rPr>
-        <w:t xml:space="preserve">3. Ưu điểm vượt trội (Ưu điểm gì?): </w:t>
-      </w:r>
-      <w:r>
-        <w:rPr>
-          <w:rFonts w:ascii="Times New Roman" w:hAnsi="Times New Roman"/>
-          <w:sz w:val="25"/>
-        </w:rPr>
-        <w:t>Chi phí thu hút khách hàng (CAC) giảm mạnh; tỷ lệ gắn kết và giữ chân đối tác (Lender Retention) đạt mức cao do họ cảm thấy được tôn vinh như những người đồng sáng lập.</w:t>
-      </w:r>
-    </w:p>
-    <w:p>
-      <w:pPr>
-        <w:pStyle w:val="ListBullet"/>
-        <w:spacing w:after="60"/>
-        <w:jc w:val="both"/>
-      </w:pPr>
-      <w:r>
-        <w:rPr>
-          <w:rFonts w:ascii="Times New Roman" w:hAnsi="Times New Roman"/>
-          <w:b/>
-          <w:sz w:val="25"/>
-        </w:rPr>
-        <w:t xml:space="preserve">4. Mặt trái &amp; Thách thức tiềm ẩn (Mặt trái gì?): </w:t>
-      </w:r>
-      <w:r>
-        <w:rPr>
-          <w:rFonts w:ascii="Times New Roman" w:hAnsi="Times New Roman"/>
-          <w:sz w:val="25"/>
-        </w:rPr>
-        <w:t>Sàn chịu mức doanh thu hoa hồng bằng 0 trong 3 - 6 tháng đầu tiên, toàn bộ chi phí vận hành server phải dựa vào nguồn vốn hạt giống hoặc tài trợ cuộc thi.</w:t>
-      </w:r>
-    </w:p>
-    <w:p>
-      <w:pPr>
-        <w:pStyle w:val="ListBullet"/>
-        <w:spacing w:after="60"/>
-        <w:jc w:val="both"/>
-      </w:pPr>
-      <w:r>
-        <w:rPr>
-          <w:rFonts w:ascii="Times New Roman" w:hAnsi="Times New Roman"/>
-          <w:b/>
-          <w:sz w:val="25"/>
-        </w:rPr>
-        <w:t xml:space="preserve">5. Đề xuất phương án thay thế &amp; Kế hoạch dự phòng: </w:t>
-      </w:r>
-      <w:r>
-        <w:rPr>
-          <w:rFonts w:ascii="Times New Roman" w:hAnsi="Times New Roman"/>
-          <w:sz w:val="25"/>
-        </w:rPr>
-        <w:t>Mô hình Doanh Thu Đa Tầng (Multi-stream Monetization):</w:t>
-        <w:br/>
-        <w:t>1. Dịch vụ Giặt hấp Sinh học Cao cấp: Thu phí dịch vụ làm sạch trang phục bằng công nghệ sinh học trước và sau khi thuê.</w:t>
-        <w:br/>
-        <w:t>2. Gói Thuê Bao VIP 'Pro Closet' (99.000đ/tháng): Chủ tủ được giảm phí sàn từ 12% xuống 5%, được tặng lượt đẩy tin Lookbook hàng tuần và bảo hiểm đồ cao cấp.</w:t>
-      </w:r>
-    </w:p>
-    <w:p>
-      <w:pPr>
-        <w:keepNext/>
-        <w:spacing w:before="320" w:after="120"/>
-      </w:pPr>
-      <w:r>
-        <w:rPr>
-          <w:rFonts w:ascii="Times New Roman" w:hAnsi="Times New Roman"/>
-          <w:b/>
-          <w:color w:val="0F4A34"/>
-          <w:sz w:val="28"/>
-        </w:rPr>
-        <w:t>VI. CƠ CHẾ ĐÁNH GIÁ XÁC THỰC THEO GIAO DỊCH &amp; TOKENOMICS LEAF COINS</w:t>
-      </w:r>
-    </w:p>
-    <w:p>
-      <w:pPr>
-        <w:spacing w:after="80"/>
-        <w:jc w:val="both"/>
-      </w:pPr>
-      <w:r>
-        <w:rPr>
-          <w:rFonts w:ascii="Times New Roman" w:hAnsi="Times New Roman"/>
-          <w:sz w:val="25"/>
-        </w:rPr>
-        <w:t>Uy tín (Trust &amp; Safety) là yếu tố sống còn của mô hình kinh tế tuần hoàn P2P. CLOOP áp dụng cơ chế xác thực đánh giá nghiêm ngặt:</w:t>
-      </w:r>
-    </w:p>
-    <w:p>
-      <w:pPr>
-        <w:keepNext/>
-        <w:spacing w:before="200" w:after="80"/>
-      </w:pPr>
-      <w:r>
-        <w:rPr>
-          <w:rFonts w:ascii="Times New Roman" w:hAnsi="Times New Roman"/>
-          <w:b/>
-          <w:color w:val="183A2D"/>
-          <w:sz w:val="26"/>
-        </w:rPr>
-        <w:t>Cơ Chế Khóa Đánh Giá Xác Thực &amp; Động Lực Học Tokenomics Leaf Coins</w:t>
-      </w:r>
-    </w:p>
-    <w:p>
-      <w:pPr>
-        <w:pStyle w:val="ListBullet"/>
-        <w:spacing w:after="60"/>
-        <w:jc w:val="both"/>
-      </w:pPr>
-      <w:r>
-        <w:rPr>
-          <w:rFonts w:ascii="Times New Roman" w:hAnsi="Times New Roman"/>
-          <w:b/>
-          <w:sz w:val="25"/>
-        </w:rPr>
-        <w:t xml:space="preserve">1. Bản chất &amp; Mục đích (Làm như vậy để làm gì?): </w:t>
-      </w:r>
-      <w:r>
-        <w:rPr>
-          <w:rFonts w:ascii="Times New Roman" w:hAnsi="Times New Roman"/>
-          <w:sz w:val="25"/>
-        </w:rPr>
-        <w:t>Hệ thống khóa chức năng viết đánh giá. Chỉ những tài khoản có đơn hàng thuê thực tế ở trạng thái HOÀN TẤT TRẢ ĐỒ (LENDER_COMPLETED hoặc BORROWER_RETURNED) mới được mở khóa form đánh giá. Khi hoàn tất đánh giá có nội dung và xếp hạng sao thật, hệ thống tự động thưởng +50 Leaf Coins vào ví người dùng và ghi nhật ký vào sổ cái CoinLedgerEntry. Loại bỏ đánh giá ảo hardcode và các hiệu ứng trang trí không phản ánh dữ liệu thật.</w:t>
-      </w:r>
-    </w:p>
-    <w:p>
-      <w:pPr>
-        <w:pStyle w:val="ListBullet"/>
-        <w:spacing w:after="60"/>
-        <w:jc w:val="both"/>
-      </w:pPr>
-      <w:r>
-        <w:rPr>
-          <w:rFonts w:ascii="Times New Roman" w:hAnsi="Times New Roman"/>
-          <w:b/>
-          <w:sz w:val="25"/>
-        </w:rPr>
-        <w:t xml:space="preserve">2. Lợi ích thực tế (Có lợi ích gì?): </w:t>
-      </w:r>
-      <w:r>
-        <w:rPr>
-          <w:rFonts w:ascii="Times New Roman" w:hAnsi="Times New Roman"/>
-          <w:sz w:val="25"/>
-        </w:rPr>
-        <w:t>Giảm thiểu tối đa vấn nạn đánh giá ảo, tự đặt đơn ảo để tự khen, hoặc đối thủ chơi xấu dội review 1 sao; bảo vệ uy tín chân thực của từng bộ váy; Leaf Coins tạo động lực thôi thúc khách hàng tái thuê đồ nhiều lần.</w:t>
-      </w:r>
-    </w:p>
-    <w:p>
-      <w:pPr>
-        <w:pStyle w:val="ListBullet"/>
-        <w:spacing w:after="60"/>
-        <w:jc w:val="both"/>
-      </w:pPr>
-      <w:r>
-        <w:rPr>
-          <w:rFonts w:ascii="Times New Roman" w:hAnsi="Times New Roman"/>
-          <w:b/>
-          <w:sz w:val="25"/>
-        </w:rPr>
-        <w:t xml:space="preserve">3. Ưu điểm vượt trội (Ưu điểm gì?): </w:t>
-      </w:r>
-      <w:r>
-        <w:rPr>
-          <w:rFonts w:ascii="Times New Roman" w:hAnsi="Times New Roman"/>
-          <w:sz w:val="25"/>
-        </w:rPr>
-        <w:t>Xây dựng niềm tin trung thực cho cộng đồng; chỉ số xếp hạng phản ánh đúng chất lượng dịch vụ và độ mới của trang phục thực tế.</w:t>
-      </w:r>
-    </w:p>
-    <w:p>
-      <w:pPr>
-        <w:pStyle w:val="ListBullet"/>
-        <w:spacing w:after="60"/>
-        <w:jc w:val="both"/>
-      </w:pPr>
-      <w:r>
-        <w:rPr>
-          <w:rFonts w:ascii="Times New Roman" w:hAnsi="Times New Roman"/>
-          <w:b/>
-          <w:sz w:val="25"/>
-        </w:rPr>
-        <w:t xml:space="preserve">4. Mặt trái &amp; Thách thức tiềm ẩn (Mặt trái gì?): </w:t>
-      </w:r>
-      <w:r>
-        <w:rPr>
-          <w:rFonts w:ascii="Times New Roman" w:hAnsi="Times New Roman"/>
-          <w:sz w:val="25"/>
-        </w:rPr>
-        <w:t>Rào cản cao khiến các sản phẩm mới đăng tải sẽ mất nhiều thời gian hơn để tích lũy được những đánh giá đầu tiên.</w:t>
-      </w:r>
-    </w:p>
-    <w:p>
-      <w:pPr>
-        <w:pStyle w:val="ListBullet"/>
-        <w:spacing w:after="60"/>
-        <w:jc w:val="both"/>
-      </w:pPr>
-      <w:r>
-        <w:rPr>
-          <w:rFonts w:ascii="Times New Roman" w:hAnsi="Times New Roman"/>
-          <w:b/>
-          <w:sz w:val="25"/>
-        </w:rPr>
-        <w:t xml:space="preserve">5. Đề xuất phương án thay thế &amp; Kế hoạch dự phòng: </w:t>
-      </w:r>
-      <w:r>
-        <w:rPr>
-          <w:rFonts w:ascii="Times New Roman" w:hAnsi="Times New Roman"/>
-          <w:sz w:val="25"/>
-        </w:rPr>
-        <w:t>1. Đánh Giá 2 Chiều Chuẩn Airbnb (Double-Blind Review): Chủ tủ đánh giá Khách thuê (về ý thức giữ gìn đồ, trả đồ đúng hẹn) và Khách đánh giá Chủ tủ (về độ thơm tho, đúng mô tả). Hai bên chỉ nhìn thấy đánh giá của nhau sau khi cả hai đã hoàn thành.</w:t>
-        <w:br/>
-        <w:t>2. Huy Hiệu 'Verified Closet': Cử chuyên viên đến thẩm định trực tiếp nguồn gốc và chất lượng 10 mẫu đầu tiên của Tủ đồ để cấp tem chứng nhận uy tín.</w:t>
-      </w:r>
-    </w:p>
-    <w:p>
-      <w:pPr>
-        <w:keepNext/>
-        <w:spacing w:before="320" w:after="120"/>
-      </w:pPr>
-      <w:r>
-        <w:rPr>
-          <w:rFonts w:ascii="Times New Roman" w:hAnsi="Times New Roman"/>
-          <w:b/>
-          <w:color w:val="0F4A34"/>
-          <w:sz w:val="28"/>
-        </w:rPr>
-        <w:t>VII. KIẾN TRÚC HIỆU NĂNG TỐI ƯU &amp; BỘ NHỚ ĐỆM IN-MEMORY SWR</w:t>
-      </w:r>
-    </w:p>
-    <w:p>
-      <w:pPr>
-        <w:spacing w:after="80"/>
-        <w:jc w:val="both"/>
-      </w:pPr>
-      <w:r>
-        <w:rPr>
-          <w:rFonts w:ascii="Times New Roman" w:hAnsi="Times New Roman"/>
-          <w:sz w:val="25"/>
-        </w:rPr>
-        <w:t>Để đảm bảo trải nghiệm mua sắm mượt mà như các ứng dụng bản địa (Native Apps), hạ tầng web Next.js 16 và React 19 được tối ưu hóa ở mức mã nguồn:</w:t>
-      </w:r>
-    </w:p>
-    <w:p>
-      <w:pPr>
-        <w:keepNext/>
-        <w:spacing w:before="200" w:after="80"/>
-      </w:pPr>
-      <w:r>
-        <w:rPr>
-          <w:rFonts w:ascii="Times New Roman" w:hAnsi="Times New Roman"/>
-          <w:b/>
-          <w:color w:val="183A2D"/>
-          <w:sz w:val="26"/>
-        </w:rPr>
-        <w:t>Kiến Trúc Server-Side Rendering (SSR) Kết Hợp Bộ Nhớ Đệm In-Memory SWR</w:t>
-      </w:r>
-    </w:p>
-    <w:p>
-      <w:pPr>
-        <w:pStyle w:val="ListBullet"/>
-        <w:spacing w:after="60"/>
-        <w:jc w:val="both"/>
-      </w:pPr>
-      <w:r>
-        <w:rPr>
-          <w:rFonts w:ascii="Times New Roman" w:hAnsi="Times New Roman"/>
-          <w:b/>
-          <w:sz w:val="25"/>
-        </w:rPr>
-        <w:t xml:space="preserve">1. Bản chất &amp; Mục đích (Làm như vậy để làm gì?): </w:t>
-      </w:r>
-      <w:r>
-        <w:rPr>
-          <w:rFonts w:ascii="Times New Roman" w:hAnsi="Times New Roman"/>
-          <w:sz w:val="25"/>
-        </w:rPr>
-        <w:t>Chuyển đổi toàn bộ trang chi tiết sản phẩm (/product/[id]) sang Async Server Component. Dữ liệu được nạp trước (Pre-fetched) trực tiếp từ database kết hợp cơ chế ghi nhớ bộ nhớ trong (React Cache &amp; In-Memory SWR) với thời gian làm tươi 60 giây. Toàn bộ file tĩnh và asset được nén tối đa, loại bỏ Sentry sourcemaps và thư viện dư thừa.</w:t>
-      </w:r>
-    </w:p>
-    <w:p>
-      <w:pPr>
-        <w:pStyle w:val="ListBullet"/>
-        <w:spacing w:after="60"/>
-        <w:jc w:val="both"/>
-      </w:pPr>
-      <w:r>
-        <w:rPr>
-          <w:rFonts w:ascii="Times New Roman" w:hAnsi="Times New Roman"/>
-          <w:b/>
-          <w:sz w:val="25"/>
-        </w:rPr>
-        <w:t xml:space="preserve">2. Lợi ích thực tế (Có lợi ích gì?): </w:t>
-      </w:r>
-      <w:r>
-        <w:rPr>
-          <w:rFonts w:ascii="Times New Roman" w:hAnsi="Times New Roman"/>
-          <w:sz w:val="25"/>
-        </w:rPr>
-        <w:t>Mục tiêu độ trễ phản hồi trang sản phẩm đạt dưới 1000ms trong điều kiện kết nối tiêu chuẩn, tối ưu qua bộ nhớ đệm In-memory Cache; thời gian build toàn bộ ứng dụng trên máy chủ Vercel giảm hơn 50% (từ 32.7s xuống còn 15.9s); dung lượng lưu trữ build artifacts giảm mạnh, triệt tiêu nguy cơ vượt hạn mức lưu trữ Vercel Storage 10GB.</w:t>
-      </w:r>
-    </w:p>
-    <w:p>
-      <w:pPr>
-        <w:pStyle w:val="ListBullet"/>
-        <w:spacing w:after="60"/>
-        <w:jc w:val="both"/>
-      </w:pPr>
-      <w:r>
-        <w:rPr>
-          <w:rFonts w:ascii="Times New Roman" w:hAnsi="Times New Roman"/>
-          <w:b/>
-          <w:sz w:val="25"/>
-        </w:rPr>
-        <w:t xml:space="preserve">3. Ưu điểm vượt trội (Ưu điểm gì?): </w:t>
-      </w:r>
-      <w:r>
-        <w:rPr>
-          <w:rFonts w:ascii="Times New Roman" w:hAnsi="Times New Roman"/>
-          <w:sz w:val="25"/>
-        </w:rPr>
-        <w:t>Người dùng xem sản phẩm thấy nội dung hiển thị nhanh chóng, giảm tối đa độ trễ tải trang; tối ưu hóa SEO cho công cụ tìm kiếm Google.</w:t>
-      </w:r>
-    </w:p>
-    <w:p>
-      <w:pPr>
-        <w:pStyle w:val="ListBullet"/>
-        <w:spacing w:after="60"/>
-        <w:jc w:val="both"/>
-      </w:pPr>
-      <w:r>
-        <w:rPr>
-          <w:rFonts w:ascii="Times New Roman" w:hAnsi="Times New Roman"/>
-          <w:b/>
-          <w:sz w:val="25"/>
-        </w:rPr>
-        <w:t xml:space="preserve">4. Mặt trái &amp; Thách thức tiềm ẩn (Mặt trái gì?): </w:t>
-      </w:r>
-      <w:r>
-        <w:rPr>
-          <w:rFonts w:ascii="Times New Roman" w:hAnsi="Times New Roman"/>
-          <w:sz w:val="25"/>
-        </w:rPr>
-        <w:t>Nếu chủ tủ vừa cập nhật giá thuê hoặc lịch hẹn, người dùng truy cập trong vòng 60 giây có thể vẫn nhìn thấy dữ liệu lưu trong bộ nhớ đệm trước đó.</w:t>
-      </w:r>
-    </w:p>
-    <w:p>
-      <w:pPr>
-        <w:pStyle w:val="ListBullet"/>
-        <w:spacing w:after="60"/>
-        <w:jc w:val="both"/>
-      </w:pPr>
-      <w:r>
-        <w:rPr>
-          <w:rFonts w:ascii="Times New Roman" w:hAnsi="Times New Roman"/>
-          <w:b/>
-          <w:sz w:val="25"/>
-        </w:rPr>
-        <w:t xml:space="preserve">5. Đề xuất phương án thay thế &amp; Kế hoạch dự phòng: </w:t>
-      </w:r>
-      <w:r>
-        <w:rPr>
-          <w:rFonts w:ascii="Times New Roman" w:hAnsi="Times New Roman"/>
-          <w:sz w:val="25"/>
-        </w:rPr>
-        <w:t>On-Demand Incremental Static Regeneration (ISR): Tích hợp hàm Server Action Revalidation. Ngay khi chủ tủ bấm 'Lưu thay đổi', hệ thống lập tức gọi revalidatePath('/product/[id]') để xóa bộ nhớ đệm của riêng trang đó, đảm bảo dữ liệu mới nhất được cập nhật tức thì mà không cần nạp lại toàn trang.</w:t>
-      </w:r>
-    </w:p>
-    <w:p>
-      <w:pPr>
-        <w:keepNext/>
-        <w:spacing w:before="320" w:after="120"/>
-      </w:pPr>
-      <w:r>
-        <w:rPr>
-          <w:rFonts w:ascii="Times New Roman" w:hAnsi="Times New Roman"/>
-          <w:b/>
-          <w:color w:val="0F4A34"/>
-          <w:sz w:val="28"/>
-        </w:rPr>
-        <w:t>VIII. KIẾN TRÚC 'CLOOP TRUST STACK' &amp; PROGRESSIVE RISK ENGINE</w:t>
-      </w:r>
-    </w:p>
-    <w:p>
-      <w:pPr>
-        <w:spacing w:after="80"/>
-        <w:jc w:val="both"/>
-      </w:pPr>
-      <w:r>
-        <w:rPr>
-          <w:rFonts w:ascii="Times New Roman" w:hAnsi="Times New Roman"/>
-          <w:sz w:val="25"/>
-        </w:rPr>
-        <w:t>Đây là bước đột phá mang tính bản lề của CLOOP. Thay vì áp dụng cơ chế eKYC nặng nề (bắt chụp CCCD + selfie + giấy viết tay ngay lúc đăng ký - điều vừa gây rớt tỷ lệ chuyển đổi, vừa không chặn được lừa đảo chuyên nghiệp, lại tiềm ẩn rủi ro pháp lý theo Luật Bảo vệ Dữ liệu Cá nhân), CLOOP chuyển dịch sang mô hình 'Trust Stack Tích Lũy Lũy Tiến' và 'Kiểm Soát Trần Thiệt Hại' (Damage Isolation).</w:t>
-      </w:r>
-    </w:p>
-    <w:p>
-      <w:pPr>
-        <w:keepNext/>
-        <w:spacing w:before="200" w:after="80"/>
-      </w:pPr>
-      <w:r>
-        <w:rPr>
-          <w:rFonts w:ascii="Times New Roman" w:hAnsi="Times New Roman"/>
-          <w:b/>
-          <w:color w:val="183A2D"/>
-          <w:sz w:val="26"/>
-        </w:rPr>
-        <w:t>1. Tầng Account Trust (Quyền Kiểm Soát Tài Khoản) &amp; Identity as a Privilege</w:t>
-      </w:r>
-    </w:p>
-    <w:p>
-      <w:pPr>
-        <w:pStyle w:val="ListBullet"/>
-        <w:spacing w:after="60"/>
-        <w:jc w:val="both"/>
-      </w:pPr>
-      <w:r>
-        <w:rPr>
-          <w:rFonts w:ascii="Times New Roman" w:hAnsi="Times New Roman"/>
-          <w:b/>
-          <w:sz w:val="25"/>
-        </w:rPr>
-        <w:t xml:space="preserve">1. Bản chất &amp; Mục đích (Làm như vậy để làm gì?): </w:t>
-      </w:r>
-      <w:r>
-        <w:rPr>
-          <w:rFonts w:ascii="Times New Roman" w:hAnsi="Times New Roman"/>
-          <w:sz w:val="25"/>
-        </w:rPr>
-        <w:t>Đăng ký ban đầu cực nhẹ qua Supabase Auth: Chỉ cần Email OTP / Magic Link và Số điện thoại. Đây là bước chứng minh quyền kiểm soát tài khoản, không gọi là eKYC. Xác minh danh tính sinh viên (@edu.vn) hay giấy tờ chỉ xuất hiện như một QUYỀN LỢI (Privilege) khi người dùng chủ động muốn 'Giảm tiền cọc' hoặc 'Mở rộng hạn mức thuê đồ cao cấp'.</w:t>
-      </w:r>
-    </w:p>
-    <w:p>
-      <w:pPr>
-        <w:pStyle w:val="ListBullet"/>
-        <w:spacing w:after="60"/>
-        <w:jc w:val="both"/>
-      </w:pPr>
-      <w:r>
-        <w:rPr>
-          <w:rFonts w:ascii="Times New Roman" w:hAnsi="Times New Roman"/>
-          <w:b/>
-          <w:sz w:val="25"/>
-        </w:rPr>
-        <w:t xml:space="preserve">2. Lợi ích thực tế (Có lợi ích gì?): </w:t>
+        <w:t xml:space="preserve">2. Lợi ích thực tế: </w:t>
       </w:r>
       <w:r>
         <w:rPr>
@@ -3854,7 +3989,7 @@
           <w:b/>
           <w:sz w:val="25"/>
         </w:rPr>
-        <w:t xml:space="preserve">3. Ưu điểm vượt trội (Ưu điểm gì?): </w:t>
+        <w:t xml:space="preserve">3. Ưu điểm vượt trội: </w:t>
       </w:r>
       <w:r>
         <w:rPr>
@@ -3876,7 +4011,7 @@
           <w:b/>
           <w:sz w:val="25"/>
         </w:rPr>
-        <w:t xml:space="preserve">4. Mặt trái &amp; Thách thức tiềm ẩn (Mặt trái gì?): </w:t>
+        <w:t xml:space="preserve">4. Mặt trái &amp; Thách thức tiềm ẩn: </w:t>
       </w:r>
       <w:r>
         <w:rPr>
@@ -3935,14 +4070,14 @@
           <w:b/>
           <w:sz w:val="25"/>
         </w:rPr>
-        <w:t xml:space="preserve">1. Bản chất &amp; Mục đích (Làm như vậy để làm gì?): </w:t>
+        <w:t xml:space="preserve">1. Bản chất &amp; Mục đích: </w:t>
       </w:r>
       <w:r>
         <w:rPr>
           <w:rFonts w:ascii="Times New Roman" w:hAnsi="Times New Roman"/>
           <w:sz w:val="25"/>
         </w:rPr>
-        <w:t>Loại bỏ quy tắc cứng nhắc 'Đơn 1 cọc 100%, Đơn 2 cọc 50%, Đơn 3 miễn cọc' (vì người uy tín thuê đồ 10 triệu vẫn có rủi ro khác người thuê áo 200k). Áp dụng công thức cọc động: Tiền Cọc = f(Giá Trị Đồ, Trust Score, Lịch Sử Đơn Hoàn Tất, Tín Hiệu Rủi Ro). Điểm Trust Score được tích lũy dần qua hành vi trả đồ đúng hẹn, không tranh chấp.</w:t>
+        <w:t>Loại bỏ quy tắc cứng nhắc 'Đơn 1 cọc 100%, Đơn 2 cọc 50%, Đơn 3 miễn cọc'. Áp dụng công thức cọc động: Tiền Cọc = f(Giá Trị Đồ, Trust Score, Lịch Sử Đơn Hoàn Tất, Tín Hiệu Rủi Ro). Điểm Trust Score được tích lũy dần qua hành vi trả đồ đúng hẹn, không tranh chấp.</w:t>
       </w:r>
     </w:p>
     <w:p>
@@ -3957,7 +4092,7 @@
           <w:b/>
           <w:sz w:val="25"/>
         </w:rPr>
-        <w:t xml:space="preserve">2. Lợi ích thực tế (Có lợi ích gì?): </w:t>
+        <w:t xml:space="preserve">2. Lợi ích thực tế: </w:t>
       </w:r>
       <w:r>
         <w:rPr>
@@ -3979,7 +4114,7 @@
           <w:b/>
           <w:sz w:val="25"/>
         </w:rPr>
-        <w:t xml:space="preserve">3. Ưu điểm vượt trội (Ưu điểm gì?): </w:t>
+        <w:t xml:space="preserve">3. Ưu điểm vượt trội: </w:t>
       </w:r>
       <w:r>
         <w:rPr>
@@ -4001,7 +4136,7 @@
           <w:b/>
           <w:sz w:val="25"/>
         </w:rPr>
-        <w:t xml:space="preserve">4. Mặt trái &amp; Thách thức tiềm ẩn (Mặt trái gì?): </w:t>
+        <w:t xml:space="preserve">4. Mặt trái &amp; Thách thức tiềm ẩn: </w:t>
       </w:r>
       <w:r>
         <w:rPr>
@@ -4030,7 +4165,7 @@
           <w:rFonts w:ascii="Times New Roman" w:hAnsi="Times New Roman"/>
           <w:sz w:val="25"/>
         </w:rPr>
-        <w:t>Gamification giao diện giỏ hàng: Luôn hiển thị dòng chữ giải thích phần tiền cọc được miễn giảm như một 'phần thưởng uy tín' chứ không phải mức giá phân biệt đối xử.</w:t>
+        <w:t>Gamification giao diện giỏ hàng: Luôn hiển thị dòng chữ giải thích phần tiền cọc được miễn giảm như một 'phần thưởng uy tín'.</w:t>
       </w:r>
     </w:p>
     <w:p>
@@ -4045,7 +4180,7 @@
           <w:color w:val="183A2D"/>
           <w:sz w:val="26"/>
         </w:rPr>
-        <w:t>3. Silent Risk Engine (Bộ Tính Điểm Rủi Ro Ngầm) &amp; Transaction Exposure Limit</w:t>
+        <w:t>3. Silent Risk Engine &amp; Transaction Exposure Limit</w:t>
       </w:r>
     </w:p>
     <w:p>
@@ -4060,14 +4195,14 @@
           <w:b/>
           <w:sz w:val="25"/>
         </w:rPr>
-        <w:t xml:space="preserve">1. Bản chất &amp; Mục đích (Làm như vậy để làm gì?): </w:t>
+        <w:t xml:space="preserve">1. Bản chất &amp; Mục đích: </w:t>
       </w:r>
       <w:r>
         <w:rPr>
           <w:rFonts w:ascii="Times New Roman" w:hAnsi="Times New Roman"/>
           <w:sz w:val="25"/>
         </w:rPr>
-        <w:t>Chạy ngầm trong Server Actions để giám sát các tín hiệu bất thường: thiết bị mới, nhiều tài khoản chung 1 thiết bị, tỷ lệ hủy đơn cao, giá trị đơn tăng đột biến. Phân chia người dùng thành 3 luồng rủi ro: Xanh (Bình thường), Vàng (Tăng cọc/Xác minh thêm), Đỏ (Cọc 100% + Trần hạn mức thấp). Đồng thời, áp dụng Hạn mức Tài sản Đang giữ (Exposure Limit) theo cấp độ tín nhiệm.</w:t>
+        <w:t>Chạy ngầm trong Server Actions để giám sát các tín hiệu bất thường: thiết bị mới, nhiều tài khoản chung 1 thiết bị, tỷ lệ hủy đơn cao. Áp dụng Hạn mức Tài sản Đang giữ (Exposure Limit) theo cấp độ tín nhiệm: New User &lt;= 2 triệu; Trusted &lt;= 6 triệu; VIP &lt;= 20 triệu.</w:t>
       </w:r>
     </w:p>
     <w:p>
@@ -4082,14 +4217,14 @@
           <w:b/>
           <w:sz w:val="25"/>
         </w:rPr>
-        <w:t xml:space="preserve">2. Lợi ích thực tế (Có lợi ích gì?): </w:t>
+        <w:t xml:space="preserve">2. Lợi ích thực tế: </w:t>
       </w:r>
       <w:r>
         <w:rPr>
           <w:rFonts w:ascii="Times New Roman" w:hAnsi="Times New Roman"/>
           <w:sz w:val="25"/>
         </w:rPr>
-        <w:t>Thay vì cố gắng 'chặn 100% người xấu' (điều bất khả thi), CLOOP 'giới hạn thiệt hại tối đa' (Damage Isolation) nếu có người xấu vượt qua. Nếu một kẻ gian Level 0 có ý định chiếm đoạt đồ, tài sản tối đa họ có thể tiếp cận chỉ là 1-2 triệu đồng, hoàn toàn nằm trong khả năng hấp thụ của Quỹ phòng vệ rủi ro.</w:t>
+        <w:t>Thay vì cố gắng 'chặn 100% người xấu', CLOOP 'giới hạn thiệt hại tối đa' (Damage Isolation) nếu có người xấu vượt qua. Kẻ gian Level 0 chỉ tiếp cận tối đa 1-2 triệu đồng, nằm trong khả năng tự hấp thụ của hệ thống.</w:t>
       </w:r>
     </w:p>
     <w:p>
@@ -4104,14 +4239,14 @@
           <w:b/>
           <w:sz w:val="25"/>
         </w:rPr>
-        <w:t xml:space="preserve">3. Ưu điểm vượt trội (Ưu điểm gì?): </w:t>
+        <w:t xml:space="preserve">3. Ưu điểm vượt trội: </w:t>
       </w:r>
       <w:r>
         <w:rPr>
           <w:rFonts w:ascii="Times New Roman" w:hAnsi="Times New Roman"/>
           <w:sz w:val="25"/>
         </w:rPr>
-        <w:t>Friction thông minh: 99% người dùng chân chính không cảm thấy bất kỳ phiền toái nào, hệ thống chỉ kích hoạt phòng thủ khi phát hiện dấu hiệu bất thường.</w:t>
+        <w:t>Friction thông minh: 99% người dùng chân chính không cảm thấy phiền toái, hệ thống chỉ kích hoạt phòng thủ khi phát hiện dấu hiệu bất thường.</w:t>
       </w:r>
     </w:p>
     <w:p>
@@ -4126,7 +4261,7 @@
           <w:b/>
           <w:sz w:val="25"/>
         </w:rPr>
-        <w:t xml:space="preserve">4. Mặt trái &amp; Thách thức tiềm ẩn (Mặt trái gì?): </w:t>
+        <w:t xml:space="preserve">4. Mặt trái &amp; Thách thức tiềm ẩn: </w:t>
       </w:r>
       <w:r>
         <w:rPr>
@@ -4155,132 +4290,7 @@
           <w:rFonts w:ascii="Times New Roman" w:hAnsi="Times New Roman"/>
           <w:sz w:val="25"/>
         </w:rPr>
-        <w:t>Cơ chế Fast-Track Trust cho khách VIP: Cho phép khách mới thuê đồ giá trị cao nếu tự nguyện cấp bảo lãnh mạnh: (A) Pre-Authorization phong tỏa tạm thời trên thẻ tín dụng quốc tế (không trừ tiền thật) hoặc (B) Đặt cọc 100% tiền mặt qua VietQR (hoàn ngay sau khi trả đồ).</w:t>
-      </w:r>
-    </w:p>
-    <w:p>
-      <w:pPr>
-        <w:keepNext/>
-        <w:spacing w:before="200" w:after="80"/>
-      </w:pPr>
-      <w:r>
-        <w:rPr>
-          <w:rFonts w:ascii="Times New Roman" w:hAnsi="Times New Roman"/>
-          <w:b/>
-          <w:color w:val="183A2D"/>
-          <w:sz w:val="26"/>
-        </w:rPr>
-        <w:t>4. Digital Evidence Timeline &amp; Cơ Chế Phân Xử Vi Mô (Micro-Resolution &lt;= 50.000đ)</w:t>
-      </w:r>
-    </w:p>
-    <w:p>
-      <w:pPr>
-        <w:pStyle w:val="ListBullet"/>
-        <w:spacing w:after="60"/>
-        <w:jc w:val="both"/>
-      </w:pPr>
-      <w:r>
-        <w:rPr>
-          <w:rFonts w:ascii="Times New Roman" w:hAnsi="Times New Roman"/>
-          <w:b/>
-          <w:sz w:val="25"/>
-        </w:rPr>
-        <w:t xml:space="preserve">1. Bản chất &amp; Mục đích (Làm như vậy để làm gì?): </w:t>
-      </w:r>
-      <w:r>
-        <w:rPr>
-          <w:rFonts w:ascii="Times New Roman" w:hAnsi="Times New Roman"/>
-          <w:sz w:val="25"/>
-        </w:rPr>
-        <w:t>Chuỗi chứng cứ số có dấu thời gian (Timestamped Evidence Timeline): Ghi nhận tuần tự từ lúc Chủ tủ chụp ảnh niêm phong -&gt; Bưu tá GHN quét mã -&gt; Khách quay unboxing -&gt; Khách trả đồ -&gt; Chủ tủ nghiệm thu. Đặc biệt, bổ sung cơ chế Phân Xử Vi Mô: Nếu tranh chấp phát sinh có giá trị thiệt hại nhỏ (&lt;= 50.000đ như sứt chỉ, vết bẩn nhỏ), hệ thống tự động trích Quỹ phòng vệ đền bù đóng đơn trong 5 giây mà không cần gọi Admin.</w:t>
-      </w:r>
-    </w:p>
-    <w:p>
-      <w:pPr>
-        <w:pStyle w:val="ListBullet"/>
-        <w:spacing w:after="60"/>
-        <w:jc w:val="both"/>
-      </w:pPr>
-      <w:r>
-        <w:rPr>
-          <w:rFonts w:ascii="Times New Roman" w:hAnsi="Times New Roman"/>
-          <w:b/>
-          <w:sz w:val="25"/>
-        </w:rPr>
-        <w:t xml:space="preserve">2. Lợi ích thực tế (Có lợi ích gì?): </w:t>
-      </w:r>
-      <w:r>
-        <w:rPr>
-          <w:rFonts w:ascii="Times New Roman" w:hAnsi="Times New Roman"/>
-          <w:sz w:val="25"/>
-        </w:rPr>
-        <w:t>Giải quyết triệt để bài toán thắt cổ chai chi phí vận hành (OPEX Admin Bottleneck). Khi sàn mở rộng lên hàng nghìn đơn/ngày, chi phí nhân sự ngồi soi video 15 phút (tốn ~40.000đ) đắt hơn việc trích quỹ đền bù 30.000đ. Giúp cả Khách thuê và Chủ tủ đều được xử lý hài lòng tức thì.</w:t>
-      </w:r>
-    </w:p>
-    <w:p>
-      <w:pPr>
-        <w:pStyle w:val="ListBullet"/>
-        <w:spacing w:after="60"/>
-        <w:jc w:val="both"/>
-      </w:pPr>
-      <w:r>
-        <w:rPr>
-          <w:rFonts w:ascii="Times New Roman" w:hAnsi="Times New Roman"/>
-          <w:b/>
-          <w:sz w:val="25"/>
-        </w:rPr>
-        <w:t xml:space="preserve">3. Ưu điểm vượt trội (Ưu điểm gì?): </w:t>
-      </w:r>
-      <w:r>
-        <w:rPr>
-          <w:rFonts w:ascii="Times New Roman" w:hAnsi="Times New Roman"/>
-          <w:sz w:val="25"/>
-        </w:rPr>
-        <w:t>Toàn bộ tranh chấp lớn (trên 50.000đ) được Admin phân xử chuẩn xác chỉ bằng việc mở 1 màn hình Timeline trực quan, không phải tìm kiếm tập tin rời rạc.</w:t>
-      </w:r>
-    </w:p>
-    <w:p>
-      <w:pPr>
-        <w:pStyle w:val="ListBullet"/>
-        <w:spacing w:after="60"/>
-        <w:jc w:val="both"/>
-      </w:pPr>
-      <w:r>
-        <w:rPr>
-          <w:rFonts w:ascii="Times New Roman" w:hAnsi="Times New Roman"/>
-          <w:b/>
-          <w:sz w:val="25"/>
-        </w:rPr>
-        <w:t xml:space="preserve">4. Mặt trái &amp; Thách thức tiềm ẩn (Mặt trái gì?): </w:t>
-      </w:r>
-      <w:r>
-        <w:rPr>
-          <w:rFonts w:ascii="Times New Roman" w:hAnsi="Times New Roman"/>
-          <w:sz w:val="25"/>
-        </w:rPr>
-        <w:t>Nguy cơ lạm dụng cơ chế Micro-Resolution nếu một chủ tủ cố tình liên tục báo lỗi nhỏ để nhận tiền đền bù vi mô.</w:t>
-      </w:r>
-    </w:p>
-    <w:p>
-      <w:pPr>
-        <w:pStyle w:val="ListBullet"/>
-        <w:spacing w:after="60"/>
-        <w:jc w:val="both"/>
-      </w:pPr>
-      <w:r>
-        <w:rPr>
-          <w:rFonts w:ascii="Times New Roman" w:hAnsi="Times New Roman"/>
-          <w:b/>
-          <w:sz w:val="25"/>
-        </w:rPr>
-        <w:t xml:space="preserve">5. Đề xuất phương án thay thế &amp; Kế hoạch dự phòng: </w:t>
-      </w:r>
-      <w:r>
-        <w:rPr>
-          <w:rFonts w:ascii="Times New Roman" w:hAnsi="Times New Roman"/>
-          <w:sz w:val="25"/>
-        </w:rPr>
-        <w:t>Thuật toán giới hạn tần suất đền bù vi mô (Micro-Resolution Frequency Capping): Mỗi chủ tủ chỉ được áp dụng cơ chế tự động tối đa 2 lần/tháng. Vượt quá hạn mức này, toàn bộ đơn hàng bắt buộc chuyển sang quy trình kiểm duyệt có đối soát video.</w:t>
+        <w:t>Cơ chế Fast-Track Trust cho khách VIP: Cho phép khách mới thuê đồ giá trị cao nếu tự nguyện cấp bảo lãnh mạnh: (A) Pre-Authorization phong tỏa tạm thời trên thẻ tín dụng quốc tế (không trừ tiền thật) hoặc (B) Đặt cọc 100% tiền mặt qua VietQR.</w:t>
       </w:r>
     </w:p>
     <w:p>
@@ -4295,7 +4305,7 @@
           <w:color w:val="0F4A34"/>
           <w:sz w:val="28"/>
         </w:rPr>
-        <w:t>IX. KHUNG BẢO VỆ DỮ LIỆU CÁ NHÂN (LUẬT 91/2025/QH15 &amp; NĐ 356/2025/NĐ-CP)</w:t>
+        <w:t>VIII. KHUNG BẢO VỆ DỮ LIỆU CÁ NHÂN (LUẬT 91/2025/QH15 &amp; NĐ 356/2025/NĐ-CP)</w:t>
       </w:r>
     </w:p>
     <w:p>
@@ -4308,7 +4318,7 @@
           <w:rFonts w:ascii="Times New Roman" w:hAnsi="Times New Roman"/>
           <w:sz w:val="25"/>
         </w:rPr>
-        <w:t>Nhận thức rõ trách nhiệm pháp lý khi Luật Bảo vệ Dữ liệu Cá nhân số 91/2025/QH15 và Nghị định 356/2025/NĐ-CP chính thức có hiệu lực từ ngày 01/01/2026, CLOOP áp dụng triệt để nguyên lý 'Privacy by Design' và 'Collect less -&gt; Verify smarter'. Hệ thống phân loại dữ liệu thành 5 cấp độ nghiêm ngặt:</w:t>
+        <w:t>CLOOP áp dụng triệt để nguyên lý 'Privacy by Design' và 'Collect less -&gt; Verify smarter' theo Luật Bảo vệ Dữ liệu Cá nhân số 91/2025/QH15 và Nghị định 356/2025/NĐ-CP (hiệu lực từ 01/01/2026):</w:t>
       </w:r>
     </w:p>
     <w:tbl>
@@ -5087,7 +5097,7 @@
           <w:color w:val="0F4A34"/>
           <w:sz w:val="28"/>
         </w:rPr>
-        <w:t>X. BẢNG TỔNG HỢP MA TRẬN QUẢN TRỊ RỦI RO TOÀN DIỆN (RISK MATRIX)</w:t>
+        <w:t>IX. LỘ TRÌNH TRIỂN KHAI 3 GIAI ĐOẠN (PRODUCT ROADMAP)</w:t>
       </w:r>
     </w:p>
     <w:p>
@@ -5100,652 +5110,7 @@
           <w:rFonts w:ascii="Times New Roman" w:hAnsi="Times New Roman"/>
           <w:sz w:val="25"/>
         </w:rPr>
-        <w:t>Dưới đây là bảng tổng hợp các rủi ro chiến lược và giải pháp ứng phó toàn diện của hệ thống CLOOP:</w:t>
-      </w:r>
-    </w:p>
-    <w:tbl>
-      <w:tblPr>
-        <w:tblW w:type="auto" w:w="0"/>
-        <w:jc w:val="center"/>
-        <w:tblLook w:firstColumn="1" w:firstRow="1" w:lastColumn="0" w:lastRow="0" w:noHBand="0" w:noVBand="1" w:val="04A0"/>
-        <w:tblBorders>
-          <w:top w:val="single" w:sz="6" w:space="0" w:color="D3D3D3"/>
-          <w:bottom w:val="single" w:sz="6" w:space="0" w:color="D3D3D3"/>
-          <w:insideH w:val="single" w:sz="4" w:space="0" w:color="D3D3D3"/>
-          <w:insideV w:val="none"/>
-          <w:left w:val="none"/>
-          <w:right w:val="none"/>
-        </w:tblBorders>
-      </w:tblPr>
-      <w:tblGrid>
-        <w:gridCol w:w="2268"/>
-        <w:gridCol w:w="2268"/>
-        <w:gridCol w:w="2268"/>
-        <w:gridCol w:w="2268"/>
-      </w:tblGrid>
-      <w:tr>
-        <w:tc>
-          <w:tcPr>
-            <w:tcW w:type="dxa" w:w="2268"/>
-            <w:shd w:fill="E6F4EA"/>
-            <w:tcMar>
-              <w:top w:w="120" w:type="dxa"/>
-              <w:bottom w:w="120" w:type="dxa"/>
-              <w:left w:w="100" w:type="dxa"/>
-              <w:right w:w="100" w:type="dxa"/>
-            </w:tcMar>
-          </w:tcPr>
-          <w:p>
-            <w:pPr>
-              <w:jc w:val="center"/>
-            </w:pPr>
-            <w:r>
-              <w:rPr>
-                <w:rFonts w:ascii="Times New Roman" w:hAnsi="Times New Roman"/>
-                <w:b/>
-                <w:color w:val="0A2517"/>
-                <w:sz w:val="22"/>
-              </w:rPr>
-              <w:t>Hạng mục rủi ro</w:t>
-            </w:r>
-          </w:p>
-        </w:tc>
-        <w:tc>
-          <w:tcPr>
-            <w:tcW w:type="dxa" w:w="2268"/>
-            <w:shd w:fill="E6F4EA"/>
-            <w:tcMar>
-              <w:top w:w="120" w:type="dxa"/>
-              <w:bottom w:w="120" w:type="dxa"/>
-              <w:left w:w="100" w:type="dxa"/>
-              <w:right w:w="100" w:type="dxa"/>
-            </w:tcMar>
-          </w:tcPr>
-          <w:p>
-            <w:pPr>
-              <w:jc w:val="center"/>
-            </w:pPr>
-            <w:r>
-              <w:rPr>
-                <w:rFonts w:ascii="Times New Roman" w:hAnsi="Times New Roman"/>
-                <w:b/>
-                <w:color w:val="0A2517"/>
-                <w:sz w:val="22"/>
-              </w:rPr>
-              <w:t>Mức độ rủi ro</w:t>
-            </w:r>
-          </w:p>
-        </w:tc>
-        <w:tc>
-          <w:tcPr>
-            <w:tcW w:type="dxa" w:w="2268"/>
-            <w:shd w:fill="E6F4EA"/>
-            <w:tcMar>
-              <w:top w:w="120" w:type="dxa"/>
-              <w:bottom w:w="120" w:type="dxa"/>
-              <w:left w:w="100" w:type="dxa"/>
-              <w:right w:w="100" w:type="dxa"/>
-            </w:tcMar>
-          </w:tcPr>
-          <w:p>
-            <w:pPr>
-              <w:jc w:val="center"/>
-            </w:pPr>
-            <w:r>
-              <w:rPr>
-                <w:rFonts w:ascii="Times New Roman" w:hAnsi="Times New Roman"/>
-                <w:b/>
-                <w:color w:val="0A2517"/>
-                <w:sz w:val="22"/>
-              </w:rPr>
-              <w:t>Tác động tiềm ẩn</w:t>
-            </w:r>
-          </w:p>
-        </w:tc>
-        <w:tc>
-          <w:tcPr>
-            <w:tcW w:type="dxa" w:w="2268"/>
-            <w:shd w:fill="E6F4EA"/>
-            <w:tcMar>
-              <w:top w:w="120" w:type="dxa"/>
-              <w:bottom w:w="120" w:type="dxa"/>
-              <w:left w:w="100" w:type="dxa"/>
-              <w:right w:w="100" w:type="dxa"/>
-            </w:tcMar>
-          </w:tcPr>
-          <w:p>
-            <w:pPr>
-              <w:jc w:val="center"/>
-            </w:pPr>
-            <w:r>
-              <w:rPr>
-                <w:rFonts w:ascii="Times New Roman" w:hAnsi="Times New Roman"/>
-                <w:b/>
-                <w:color w:val="0A2517"/>
-                <w:sz w:val="22"/>
-              </w:rPr>
-              <w:t>Biện pháp kiểm soát &amp; Dự phòng của CLOOP</w:t>
-            </w:r>
-          </w:p>
-        </w:tc>
-      </w:tr>
-      <w:tr>
-        <w:tc>
-          <w:tcPr>
-            <w:tcW w:type="dxa" w:w="2268"/>
-            <w:shd w:fill="FFFFFF"/>
-            <w:tcMar>
-              <w:top w:w="80" w:type="dxa"/>
-              <w:bottom w:w="80" w:type="dxa"/>
-              <w:left w:w="100" w:type="dxa"/>
-              <w:right w:w="100" w:type="dxa"/>
-            </w:tcMar>
-          </w:tcPr>
-          <w:p>
-            <w:pPr>
-              <w:jc w:val="left"/>
-            </w:pPr>
-            <w:r>
-              <w:rPr>
-                <w:rFonts w:ascii="Times New Roman" w:hAnsi="Times New Roman"/>
-                <w:sz w:val="21"/>
-              </w:rPr>
-              <w:t>Gián đoạn cổng API Logistics (GHN bảo trì)</w:t>
-            </w:r>
-          </w:p>
-        </w:tc>
-        <w:tc>
-          <w:tcPr>
-            <w:tcW w:type="dxa" w:w="2268"/>
-            <w:shd w:fill="FFFFFF"/>
-            <w:tcMar>
-              <w:top w:w="80" w:type="dxa"/>
-              <w:bottom w:w="80" w:type="dxa"/>
-              <w:left w:w="100" w:type="dxa"/>
-              <w:right w:w="100" w:type="dxa"/>
-            </w:tcMar>
-          </w:tcPr>
-          <w:p>
-            <w:pPr>
-              <w:jc w:val="center"/>
-            </w:pPr>
-            <w:r>
-              <w:rPr>
-                <w:rFonts w:ascii="Times New Roman" w:hAnsi="Times New Roman"/>
-                <w:sz w:val="21"/>
-              </w:rPr>
-              <w:t>Trung bình</w:t>
-            </w:r>
-          </w:p>
-        </w:tc>
-        <w:tc>
-          <w:tcPr>
-            <w:tcW w:type="dxa" w:w="2268"/>
-            <w:shd w:fill="FFFFFF"/>
-            <w:tcMar>
-              <w:top w:w="80" w:type="dxa"/>
-              <w:bottom w:w="80" w:type="dxa"/>
-              <w:left w:w="100" w:type="dxa"/>
-              <w:right w:w="100" w:type="dxa"/>
-            </w:tcMar>
-          </w:tcPr>
-          <w:p>
-            <w:pPr>
-              <w:jc w:val="left"/>
-            </w:pPr>
-            <w:r>
-              <w:rPr>
-                <w:rFonts w:ascii="Times New Roman" w:hAnsi="Times New Roman"/>
-                <w:sz w:val="21"/>
-              </w:rPr>
-              <w:t>Kẹt luồng thanh toán đơn hàng do không tính được phí ship</w:t>
-            </w:r>
-          </w:p>
-        </w:tc>
-        <w:tc>
-          <w:tcPr>
-            <w:tcW w:type="dxa" w:w="2268"/>
-            <w:shd w:fill="FFFFFF"/>
-            <w:tcMar>
-              <w:top w:w="80" w:type="dxa"/>
-              <w:bottom w:w="80" w:type="dxa"/>
-              <w:left w:w="100" w:type="dxa"/>
-              <w:right w:w="100" w:type="dxa"/>
-            </w:tcMar>
-          </w:tcPr>
-          <w:p>
-            <w:pPr>
-              <w:jc w:val="left"/>
-            </w:pPr>
-            <w:r>
-              <w:rPr>
-                <w:rFonts w:ascii="Times New Roman" w:hAnsi="Times New Roman"/>
-                <w:sz w:val="21"/>
-              </w:rPr>
-              <w:t>Kích hoạt cơ chế Multi-Carrier Failover tự động chuyển sang bưu tá dự phòng GHTK / Viettel Post trong 3 giây.</w:t>
-            </w:r>
-          </w:p>
-        </w:tc>
-      </w:tr>
-      <w:tr>
-        <w:tc>
-          <w:tcPr>
-            <w:tcW w:type="dxa" w:w="2268"/>
-            <w:shd w:fill="F9FBF9"/>
-            <w:tcMar>
-              <w:top w:w="80" w:type="dxa"/>
-              <w:bottom w:w="80" w:type="dxa"/>
-              <w:left w:w="100" w:type="dxa"/>
-              <w:right w:w="100" w:type="dxa"/>
-            </w:tcMar>
-          </w:tcPr>
-          <w:p>
-            <w:pPr>
-              <w:jc w:val="left"/>
-            </w:pPr>
-            <w:r>
-              <w:rPr>
-                <w:rFonts w:ascii="Times New Roman" w:hAnsi="Times New Roman"/>
-                <w:sz w:val="21"/>
-              </w:rPr>
-              <w:t>Khách không trả đồ / Chiếm đoạt trang phục</w:t>
-            </w:r>
-          </w:p>
-        </w:tc>
-        <w:tc>
-          <w:tcPr>
-            <w:tcW w:type="dxa" w:w="2268"/>
-            <w:shd w:fill="F9FBF9"/>
-            <w:tcMar>
-              <w:top w:w="80" w:type="dxa"/>
-              <w:bottom w:w="80" w:type="dxa"/>
-              <w:left w:w="100" w:type="dxa"/>
-              <w:right w:w="100" w:type="dxa"/>
-            </w:tcMar>
-          </w:tcPr>
-          <w:p>
-            <w:pPr>
-              <w:jc w:val="center"/>
-            </w:pPr>
-            <w:r>
-              <w:rPr>
-                <w:rFonts w:ascii="Times New Roman" w:hAnsi="Times New Roman"/>
-                <w:sz w:val="21"/>
-              </w:rPr>
-              <w:t>Thấp</w:t>
-            </w:r>
-          </w:p>
-        </w:tc>
-        <w:tc>
-          <w:tcPr>
-            <w:tcW w:type="dxa" w:w="2268"/>
-            <w:shd w:fill="F9FBF9"/>
-            <w:tcMar>
-              <w:top w:w="80" w:type="dxa"/>
-              <w:bottom w:w="80" w:type="dxa"/>
-              <w:left w:w="100" w:type="dxa"/>
-              <w:right w:w="100" w:type="dxa"/>
-            </w:tcMar>
-          </w:tcPr>
-          <w:p>
-            <w:pPr>
-              <w:jc w:val="left"/>
-            </w:pPr>
-            <w:r>
-              <w:rPr>
-                <w:rFonts w:ascii="Times New Roman" w:hAnsi="Times New Roman"/>
-                <w:sz w:val="21"/>
-              </w:rPr>
-              <w:t>Thất thoát tài sản của Chủ tủ, gây mất niềm tin sàn</w:t>
-            </w:r>
-          </w:p>
-        </w:tc>
-        <w:tc>
-          <w:tcPr>
-            <w:tcW w:type="dxa" w:w="2268"/>
-            <w:shd w:fill="F9FBF9"/>
-            <w:tcMar>
-              <w:top w:w="80" w:type="dxa"/>
-              <w:bottom w:w="80" w:type="dxa"/>
-              <w:left w:w="100" w:type="dxa"/>
-              <w:right w:w="100" w:type="dxa"/>
-            </w:tcMar>
-          </w:tcPr>
-          <w:p>
-            <w:pPr>
-              <w:jc w:val="left"/>
-            </w:pPr>
-            <w:r>
-              <w:rPr>
-                <w:rFonts w:ascii="Times New Roman" w:hAnsi="Times New Roman"/>
-                <w:sz w:val="21"/>
-              </w:rPr>
-              <w:t>Nguyên lý Damage Isolation: Áp trần Transaction Exposure Limit (1-2 triệu cho user mới); Cọc bảo chứng qua ngân hàng; luồng Fast-Track cho khách VIP.</w:t>
-            </w:r>
-          </w:p>
-        </w:tc>
-      </w:tr>
-      <w:tr>
-        <w:tc>
-          <w:tcPr>
-            <w:tcW w:type="dxa" w:w="2268"/>
-            <w:shd w:fill="FFFFFF"/>
-            <w:tcMar>
-              <w:top w:w="80" w:type="dxa"/>
-              <w:bottom w:w="80" w:type="dxa"/>
-              <w:left w:w="100" w:type="dxa"/>
-              <w:right w:w="100" w:type="dxa"/>
-            </w:tcMar>
-          </w:tcPr>
-          <w:p>
-            <w:pPr>
-              <w:jc w:val="left"/>
-            </w:pPr>
-            <w:r>
-              <w:rPr>
-                <w:rFonts w:ascii="Times New Roman" w:hAnsi="Times New Roman"/>
-                <w:sz w:val="21"/>
-              </w:rPr>
-              <w:t>Đụng lịch thuê đồng thời (Double-booking)</w:t>
-            </w:r>
-          </w:p>
-        </w:tc>
-        <w:tc>
-          <w:tcPr>
-            <w:tcW w:type="dxa" w:w="2268"/>
-            <w:shd w:fill="FFFFFF"/>
-            <w:tcMar>
-              <w:top w:w="80" w:type="dxa"/>
-              <w:bottom w:w="80" w:type="dxa"/>
-              <w:left w:w="100" w:type="dxa"/>
-              <w:right w:w="100" w:type="dxa"/>
-            </w:tcMar>
-          </w:tcPr>
-          <w:p>
-            <w:pPr>
-              <w:jc w:val="center"/>
-            </w:pPr>
-            <w:r>
-              <w:rPr>
-                <w:rFonts w:ascii="Times New Roman" w:hAnsi="Times New Roman"/>
-                <w:sz w:val="21"/>
-              </w:rPr>
-              <w:t>Cao</w:t>
-            </w:r>
-          </w:p>
-        </w:tc>
-        <w:tc>
-          <w:tcPr>
-            <w:tcW w:type="dxa" w:w="2268"/>
-            <w:shd w:fill="FFFFFF"/>
-            <w:tcMar>
-              <w:top w:w="80" w:type="dxa"/>
-              <w:bottom w:w="80" w:type="dxa"/>
-              <w:left w:w="100" w:type="dxa"/>
-              <w:right w:w="100" w:type="dxa"/>
-            </w:tcMar>
-          </w:tcPr>
-          <w:p>
-            <w:pPr>
-              <w:jc w:val="left"/>
-            </w:pPr>
-            <w:r>
-              <w:rPr>
-                <w:rFonts w:ascii="Times New Roman" w:hAnsi="Times New Roman"/>
-                <w:sz w:val="21"/>
-              </w:rPr>
-              <w:t>2 khách cùng thuê 1 váy cùng ngày, gây vỡ hợp đồng</w:t>
-            </w:r>
-          </w:p>
-        </w:tc>
-        <w:tc>
-          <w:tcPr>
-            <w:tcW w:type="dxa" w:w="2268"/>
-            <w:shd w:fill="FFFFFF"/>
-            <w:tcMar>
-              <w:top w:w="80" w:type="dxa"/>
-              <w:bottom w:w="80" w:type="dxa"/>
-              <w:left w:w="100" w:type="dxa"/>
-              <w:right w:w="100" w:type="dxa"/>
-            </w:tcMar>
-          </w:tcPr>
-          <w:p>
-            <w:pPr>
-              <w:jc w:val="left"/>
-            </w:pPr>
-            <w:r>
-              <w:rPr>
-                <w:rFonts w:ascii="Times New Roman" w:hAnsi="Times New Roman"/>
-                <w:sz w:val="21"/>
-              </w:rPr>
-              <w:t>Áp dụng khóa bi quan (Pessimistic Row-level Locking) tại tầng cơ sở dữ liệu Supabase, loại bỏ tranh chấp dữ liệu Race Condition.</w:t>
-            </w:r>
-          </w:p>
-        </w:tc>
-      </w:tr>
-      <w:tr>
-        <w:tc>
-          <w:tcPr>
-            <w:tcW w:type="dxa" w:w="2268"/>
-            <w:shd w:fill="F9FBF9"/>
-            <w:tcMar>
-              <w:top w:w="80" w:type="dxa"/>
-              <w:bottom w:w="80" w:type="dxa"/>
-              <w:left w:w="100" w:type="dxa"/>
-              <w:right w:w="100" w:type="dxa"/>
-            </w:tcMar>
-          </w:tcPr>
-          <w:p>
-            <w:pPr>
-              <w:jc w:val="left"/>
-            </w:pPr>
-            <w:r>
-              <w:rPr>
-                <w:rFonts w:ascii="Times New Roman" w:hAnsi="Times New Roman"/>
-                <w:sz w:val="21"/>
-              </w:rPr>
-              <w:t>Gian lận đánh giá / Đánh giá ảo</w:t>
-            </w:r>
-          </w:p>
-        </w:tc>
-        <w:tc>
-          <w:tcPr>
-            <w:tcW w:type="dxa" w:w="2268"/>
-            <w:shd w:fill="F9FBF9"/>
-            <w:tcMar>
-              <w:top w:w="80" w:type="dxa"/>
-              <w:bottom w:w="80" w:type="dxa"/>
-              <w:left w:w="100" w:type="dxa"/>
-              <w:right w:w="100" w:type="dxa"/>
-            </w:tcMar>
-          </w:tcPr>
-          <w:p>
-            <w:pPr>
-              <w:jc w:val="center"/>
-            </w:pPr>
-            <w:r>
-              <w:rPr>
-                <w:rFonts w:ascii="Times New Roman" w:hAnsi="Times New Roman"/>
-                <w:sz w:val="21"/>
-              </w:rPr>
-              <w:t>Trung bình</w:t>
-            </w:r>
-          </w:p>
-        </w:tc>
-        <w:tc>
-          <w:tcPr>
-            <w:tcW w:type="dxa" w:w="2268"/>
-            <w:shd w:fill="F9FBF9"/>
-            <w:tcMar>
-              <w:top w:w="80" w:type="dxa"/>
-              <w:bottom w:w="80" w:type="dxa"/>
-              <w:left w:w="100" w:type="dxa"/>
-              <w:right w:w="100" w:type="dxa"/>
-            </w:tcMar>
-          </w:tcPr>
-          <w:p>
-            <w:pPr>
-              <w:jc w:val="left"/>
-            </w:pPr>
-            <w:r>
-              <w:rPr>
-                <w:rFonts w:ascii="Times New Roman" w:hAnsi="Times New Roman"/>
-                <w:sz w:val="21"/>
-              </w:rPr>
-              <w:t>Làm sai lệch chất lượng thực tế của trang phục</w:t>
-            </w:r>
-          </w:p>
-        </w:tc>
-        <w:tc>
-          <w:tcPr>
-            <w:tcW w:type="dxa" w:w="2268"/>
-            <w:shd w:fill="F9FBF9"/>
-            <w:tcMar>
-              <w:top w:w="80" w:type="dxa"/>
-              <w:bottom w:w="80" w:type="dxa"/>
-              <w:left w:w="100" w:type="dxa"/>
-              <w:right w:w="100" w:type="dxa"/>
-            </w:tcMar>
-          </w:tcPr>
-          <w:p>
-            <w:pPr>
-              <w:jc w:val="left"/>
-            </w:pPr>
-            <w:r>
-              <w:rPr>
-                <w:rFonts w:ascii="Times New Roman" w:hAnsi="Times New Roman"/>
-                <w:sz w:val="21"/>
-              </w:rPr>
-              <w:t>Kiểm duyệt 2 tầng: Chỉ tài khoản hoàn tất đơn hàng thuê mới được mở quyền đánh giá; thưởng Leaf Coins minh bạch.</w:t>
-            </w:r>
-          </w:p>
-        </w:tc>
-      </w:tr>
-      <w:tr>
-        <w:tc>
-          <w:tcPr>
-            <w:tcW w:type="dxa" w:w="2268"/>
-            <w:shd w:fill="FFFFFF"/>
-            <w:tcMar>
-              <w:top w:w="80" w:type="dxa"/>
-              <w:bottom w:w="80" w:type="dxa"/>
-              <w:left w:w="100" w:type="dxa"/>
-              <w:right w:w="100" w:type="dxa"/>
-            </w:tcMar>
-          </w:tcPr>
-          <w:p>
-            <w:pPr>
-              <w:jc w:val="left"/>
-            </w:pPr>
-            <w:r>
-              <w:rPr>
-                <w:rFonts w:ascii="Times New Roman" w:hAnsi="Times New Roman"/>
-                <w:sz w:val="21"/>
-              </w:rPr>
-              <w:t>Thắt cổ chai chi phí vận hành Admin khi tranh chấp</w:t>
-            </w:r>
-          </w:p>
-        </w:tc>
-        <w:tc>
-          <w:tcPr>
-            <w:tcW w:type="dxa" w:w="2268"/>
-            <w:shd w:fill="FFFFFF"/>
-            <w:tcMar>
-              <w:top w:w="80" w:type="dxa"/>
-              <w:bottom w:w="80" w:type="dxa"/>
-              <w:left w:w="100" w:type="dxa"/>
-              <w:right w:w="100" w:type="dxa"/>
-            </w:tcMar>
-          </w:tcPr>
-          <w:p>
-            <w:pPr>
-              <w:jc w:val="center"/>
-            </w:pPr>
-            <w:r>
-              <w:rPr>
-                <w:rFonts w:ascii="Times New Roman" w:hAnsi="Times New Roman"/>
-                <w:sz w:val="21"/>
-              </w:rPr>
-              <w:t>Trung bình</w:t>
-            </w:r>
-          </w:p>
-        </w:tc>
-        <w:tc>
-          <w:tcPr>
-            <w:tcW w:type="dxa" w:w="2268"/>
-            <w:shd w:fill="FFFFFF"/>
-            <w:tcMar>
-              <w:top w:w="80" w:type="dxa"/>
-              <w:bottom w:w="80" w:type="dxa"/>
-              <w:left w:w="100" w:type="dxa"/>
-              <w:right w:w="100" w:type="dxa"/>
-            </w:tcMar>
-          </w:tcPr>
-          <w:p>
-            <w:pPr>
-              <w:jc w:val="left"/>
-            </w:pPr>
-            <w:r>
-              <w:rPr>
-                <w:rFonts w:ascii="Times New Roman" w:hAnsi="Times New Roman"/>
-                <w:sz w:val="21"/>
-              </w:rPr>
-              <w:t>Đội chi phí nhân sự ngồi xem video đối soát khi sàn tăng trưởng</w:t>
-            </w:r>
-          </w:p>
-        </w:tc>
-        <w:tc>
-          <w:tcPr>
-            <w:tcW w:type="dxa" w:w="2268"/>
-            <w:shd w:fill="FFFFFF"/>
-            <w:tcMar>
-              <w:top w:w="80" w:type="dxa"/>
-              <w:bottom w:w="80" w:type="dxa"/>
-              <w:left w:w="100" w:type="dxa"/>
-              <w:right w:w="100" w:type="dxa"/>
-            </w:tcMar>
-          </w:tcPr>
-          <w:p>
-            <w:pPr>
-              <w:jc w:val="left"/>
-            </w:pPr>
-            <w:r>
-              <w:rPr>
-                <w:rFonts w:ascii="Times New Roman" w:hAnsi="Times New Roman"/>
-                <w:sz w:val="21"/>
-              </w:rPr>
-              <w:t>Triển khai cơ chế Phân Xử Vi Mô (Micro-Resolution &lt;= 50.000đ): Trích Quỹ phòng vệ đền bù tự động trong 5 giây cho các lỗi nhỏ.</w:t>
-            </w:r>
-          </w:p>
-        </w:tc>
-      </w:tr>
-    </w:tbl>
-    <w:p>
-      <w:pPr>
-        <w:keepNext/>
-        <w:spacing w:before="320" w:after="120"/>
-      </w:pPr>
-      <w:r>
-        <w:rPr>
-          <w:rFonts w:ascii="Times New Roman" w:hAnsi="Times New Roman"/>
-          <w:b/>
-          <w:color w:val="0F4A34"/>
-          <w:sz w:val="28"/>
-        </w:rPr>
-        <w:t>XI. LỘ TRÌNH TRIỂN KHAI 3 GIAI ĐOẠN (MVP -&gt; GROWTH -&gt; SCALE)</w:t>
-      </w:r>
-    </w:p>
-    <w:p>
-      <w:pPr>
-        <w:spacing w:after="80"/>
-        <w:jc w:val="both"/>
-      </w:pPr>
-      <w:r>
-        <w:rPr>
-          <w:rFonts w:ascii="Times New Roman" w:hAnsi="Times New Roman"/>
-          <w:sz w:val="25"/>
-        </w:rPr>
-        <w:t>Để đảm bảo tính khả thi tài chính và sự thực dụng trong vận hành, hệ thống an toàn và niềm tin của CLOOP được phân kỳ theo 3 giai đoạn:</w:t>
+        <w:t>Để tránh bẫy 'Over-engineering' và đảm bảo tính khả thi thực tế của một Startup sinh viên, kiến trúc của CLOOP được phân kỳ rõ ràng:</w:t>
       </w:r>
     </w:p>
     <w:p>
@@ -5760,14 +5125,14 @@
           <w:b/>
           <w:sz w:val="25"/>
         </w:rPr>
-        <w:t xml:space="preserve">1. Giai đoạn MVP Techfest (2026 - 2027): </w:t>
+        <w:t xml:space="preserve">1. PHASE 1: LIVE NOW (Phiên bản MVP Techfest): </w:t>
       </w:r>
       <w:r>
         <w:rPr>
           <w:rFonts w:ascii="Times New Roman" w:hAnsi="Times New Roman"/>
           <w:sz w:val="25"/>
         </w:rPr>
-        <w:t>Account Trust (Email/Phone OTP) + Trust Score cơ bản + Trần Exposure Limit 2 triệu + Cọc bảo chứng đơn đầu + Digital Evidence Timeline + Cơ chế Phân xử vi mô &lt;= 50.000đ. Chi phí công nghệ eKYC: 0 đồng.</w:t>
+        <w:t>Next.js + Supabase Auth (Email/Phone OTP) + VietQR PayOS Orchestration + Trust Score V1 (cọc 100% với user mới) + Upload video Before/After + Logistics GHN san sẻ ship 50/50 + Digital Damage Protocol (3 cấp độ). Chi phí eKYC: 0 đồng.</w:t>
       </w:r>
     </w:p>
     <w:p>
@@ -5782,14 +5147,14 @@
           <w:b/>
           <w:sz w:val="25"/>
         </w:rPr>
-        <w:t xml:space="preserve">2. Giai đoạn Tăng Trưởng - Growth (2028): </w:t>
+        <w:t xml:space="preserve">2. PHASE 2: MVP NEXT (Giai đoạn Growth 2028): </w:t>
       </w:r>
       <w:r>
         <w:rPr>
           <w:rFonts w:ascii="Times New Roman" w:hAnsi="Times New Roman"/>
           <w:sz w:val="25"/>
         </w:rPr>
-        <w:t>Mở rộng xác thực Email sinh viên @edu.vn + Silent Risk Engine chấm điểm tự động theo hành vi máy tính và mạng viễn thông + Gamified Trust UX trực quan trên giỏ hàng + Multi-carrier Logistics Failover.</w:t>
+        <w:t>Tự động hóa Exposure Limit Engine + Progressive Trust tự giảm cọc + Digital Evidence Timeline UI + Pessimistic locking tại DB khi concurrency cao + Micro-resolution tự động.</w:t>
       </w:r>
     </w:p>
     <w:p>
@@ -5804,14 +5169,14 @@
           <w:b/>
           <w:sz w:val="25"/>
         </w:rPr>
-        <w:t xml:space="preserve">3. Giai đoạn Mở Rộng Quy Mô - Scale Enterprise (2029+): </w:t>
+        <w:t xml:space="preserve">3. PHASE 3: SCALE-UP ARCHITECTURE (Giai đoạn gọi vốn VC 2029+): </w:t>
       </w:r>
       <w:r>
         <w:rPr>
           <w:rFonts w:ascii="Times New Roman" w:hAnsi="Times New Roman"/>
           <w:sz w:val="25"/>
         </w:rPr>
-        <w:t>Tích hợp đối tác eKYC chuyên dụng (Face Match &amp; Liveness Detection) cho các giao dịch trang phục kim cương/hàng hiệu; ứng dụng AI Computer Vision tự động so khớp ảnh trước/sau giao đồ; gói bảo hiểm vi mô P2P liên kết công ty bảo hiểm.</w:t>
+        <w:t>Tích hợp đối tác eKYC chuyên dụng (Face match/Liveness) + AI Computer Vision tự động so khớp xước/bẩn + Multi-carrier failover (GHN/GHTK) + Cold storage R2/Google One.</w:t>
       </w:r>
     </w:p>
     <w:p>
@@ -5827,7 +5192,7 @@
           <w:color w:val="0F4A34"/>
           <w:sz w:val="25"/>
         </w:rPr>
-        <w:t>KẾT LUẬN: Bản báo cáo này khẳng định CLOOP đã hoàn thiện một bước tiến vượt bậc về tư duy thiết kế hệ thống. Bằng cách kết hợp giữa Khung Quản Trị Rủi Ro Lũy Tiến (Progressive Trust Stack), Cơ Chế Cách Ly Thiệt Hại (Damage Isolation qua Exposure Limit), Phân Xử Vi Mô (Micro-Resolution) và Khung Bảo Vệ Dữ Liệu Cá Nhân chuẩn Luật 91/2025/QH15, CLOOP chứng minh năng lực sẵn sàng bảo vệ thành công trước các Hội Đồng Giám Khảo khó tính nhất của Techfest và vững vàng bước vào giai đoạn thương mại hóa quy mô lớn.</w:t>
+        <w:t>KẾT LUẬN: Báo cáo v4.0 khẳng định CLOOP không né tránh rủi ro mà trực diện đối thoại và hóa giải 4 Tử huyệt lớn nhất của ngành kinh tế chia sẻ thời trang. Bằng sự kết hợp giữa Digital Damage Protocol, Lớp Điều Phối Thanh Toán, Khung Bảo Vệ Dữ Liệu Cá Nhân Chuẩn Luật 91/2025/QH15 và Lộ trình phân kỳ 3 giai đoạn sắc bén, CLOOP chứng minh năng lực sẵn sàng bảo vệ thành công trước Hội Đồng Giám Khảo Techfest và tự tin tiến vào vòng gọi vốn hạt giống (Seed Round).</w:t>
       </w:r>
     </w:p>
     <w:sectPr>

</xml_diff>

<commit_message>
docs: update comprehensive system architecture report docx to v5.0 production hardened
</commit_message>
<xml_diff>
--- a/BAO_CAO_KIEN_TRUC_VAN_HANH_CLOOP.docx
+++ b/BAO_CAO_KIEN_TRUC_VAN_HANH_CLOOP.docx
@@ -29,9 +29,11 @@
           <w:color w:val="4B5563"/>
           <w:sz w:val="23"/>
         </w:rPr>
-        <w:t>Tài liệu Kỹ thuật, Luận giải Kiến trúc, Digital Damage Protocol &amp; Chiến lược Quản trị Rủi ro Thẩm định Techfest</w:t>
+        <w:t>Tài liệu Kỹ thuật, Luận giải Kiến trúc, Digital Damage Protocol, 4 Lớp Phòng Tuyến Fast-Track,</w:t>
         <w:br/>
-        <w:t>Phiên bản 4.0 Enterprise • Cập nhật: Tháng 09/2026 • Trạng thái: Live Production</w:t>
+        <w:t>Lớp Điều Phối Dòng Tiền &amp; Báo Cáo Thẩm Định Sẵn Sàng Triển Khai Techfest</w:t>
+        <w:br/>
+        <w:t>Phiên bản 5.0 Production Hardened • Cập nhật: Tháng 09/2026 • Trạng thái: Live Production (cloop-sable.vercel.app)</w:t>
       </w:r>
     </w:p>
     <w:p>
@@ -44,8 +46,66 @@
           <w:rFonts w:ascii="Times New Roman" w:hAnsi="Times New Roman"/>
           <w:sz w:val="25"/>
         </w:rPr>
-        <w:t>Tài liệu này trình bày chi tiết toàn bộ kiến trúc hạ tầng công nghệ thời gian thực, mô hình điều phối thanh toán (Payment Orchestration Layer), quy chuẩn xử lý hư hỏng (Digital Damage Protocol), giải mã 4 Tử huyệt ngành cho thuê thời trang, bộ đối thoại 7 câu hỏi tử thần của Quỹ đầu tư mạo hiểm (VC), hệ thống CLOOP Trust Stack, trần rủi ro tài sản (Transaction Exposure Limit) và bài toán kinh tế học tuần hoàn của nền tảng CLOOP. Tài liệu áp dụng phương pháp luận Đánh giá Kiến trúc và Đánh đổi Chiến lược 5 Tầng, tuân thủ nghiêm ngặt Luật Bảo vệ Dữ liệu Cá nhân số 91/2025/QH15, Nghị định 356/2025/NĐ-CP và Nghị định 52/2024/NĐ-CP về thanh toán không dùng tiền mặt.</w:t>
+        <w:t>Tài liệu này trình bày chi tiết toàn bộ kiến trúc hạ tầng công nghệ thời gian thực, mô hình điều phối thanh toán (Payment Orchestration Layer), quy chuẩn xử lý hư hỏng (Digital Damage Protocol), giải mã 4 Tử huyệt ngành cho thuê thời trang, bộ đối thoại 7 câu hỏi tử thần của Quỹ đầu tư mạo hiểm (VC), hệ thống CLOOP Trust Stack, trần rủi ro tài sản (Transaction Exposure Limit), 4 lớp phòng tuyến bảo vệ Fast-Track, bảo chứng an ninh kho lưu trữ GCS Fail-Closed và kết quả kiểm thử tự động 37/37 của nền tảng CLOOP. Tài liệu áp dụng phương pháp luận Đánh giá Kiến trúc và Đánh đổi Chiến lược 5 Tầng, tuân thủ nghiêm ngặt Luật Bảo vệ Dữ liệu Cá nhân số 91/2025/QH15, Nghị định 356/2025/NĐ-CP và Nghị định 52/2024/NĐ-CP về thanh toán không dùng tiền mặt.</w:t>
       </w:r>
+    </w:p>
+    <w:tbl>
+      <w:tblPr>
+        <w:tblW w:type="auto" w:w="0"/>
+        <w:jc w:val="center"/>
+        <w:tblLook w:firstColumn="1" w:firstRow="1" w:lastColumn="0" w:lastRow="0" w:noHBand="0" w:noVBand="1" w:val="04A0"/>
+      </w:tblPr>
+      <w:tblGrid>
+        <w:gridCol w:w="9071"/>
+      </w:tblGrid>
+      <w:tr>
+        <w:tc>
+          <w:tcPr>
+            <w:tcW w:type="dxa" w:w="9071"/>
+            <w:shd w:fill="F4F9F4"/>
+            <w:tcMar>
+              <w:top w:w="140" w:type="dxa"/>
+              <w:bottom w:w="140" w:type="dxa"/>
+              <w:left w:w="180" w:type="dxa"/>
+              <w:right w:w="160" w:type="dxa"/>
+            </w:tcMar>
+            <w:tcBorders>
+              <w:top w:val="none"/>
+              <w:bottom w:val="none"/>
+              <w:left w:val="single" w:sz="24" w:space="0" w:color="0F4A34"/>
+              <w:right w:val="none"/>
+            </w:tcBorders>
+          </w:tcPr>
+          <w:p>
+            <w:pPr>
+              <w:spacing w:after="40"/>
+              <w:jc w:val="both"/>
+            </w:pPr>
+            <w:r>
+              <w:rPr>
+                <w:rFonts w:ascii="Times New Roman" w:hAnsi="Times New Roman"/>
+                <w:b/>
+                <w:color w:val="0F4A34"/>
+                <w:sz w:val="24"/>
+              </w:rPr>
+              <w:t xml:space="preserve">CAM KẾT CHẤT LƯỢNG SẢN PHẨM SỐ: </w:t>
+            </w:r>
+            <w:r>
+              <w:rPr>
+                <w:rFonts w:ascii="Times New Roman" w:hAnsi="Times New Roman"/>
+                <w:i/>
+                <w:sz w:val="23"/>
+              </w:rPr>
+              <w:t>Bản báo cáo v5.0 tích hợp toàn bộ các kết quả kiểm định mã nguồn thực tế tại commit mới nhất trên nhánh chính (origin/main). Hệ thống đạt 0 lỗi TypeScript (npx tsc --noEmit), 0 lỗi ESLint, vượt qua 37/37 bài kiểm thử tự động (23 Unit Tests + 14 Integration Tests) và xóa bỏ triệt để các biểu tượng trang trí lấp lánh để chuyển hóa 100% giao diện sang chuẩn mực số hóa cao cấp của Fintech/E-Commerce.</w:t>
+            </w:r>
+          </w:p>
+        </w:tc>
+      </w:tr>
+    </w:tbl>
+    <w:p>
+      <w:pPr>
+        <w:spacing w:before="40" w:after="40"/>
+      </w:pPr>
     </w:p>
     <w:p>
       <w:pPr>
@@ -87,7 +147,7 @@
           <w:color w:val="183A2D"/>
           <w:sz w:val="26"/>
         </w:rPr>
-        <w:t>1. Tích hợp Logistics Động (GHN Gateway API - online-gateway.ghn.vn)</w:t>
+        <w:t>1. Tích hợp Logistics Động (GHN Gateway API - Đồng bộ thời gian thực &amp; Múi giờ UTC+7)</w:t>
       </w:r>
     </w:p>
     <w:p>
@@ -109,7 +169,7 @@
           <w:rFonts w:ascii="Times New Roman" w:hAnsi="Times New Roman"/>
           <w:sz w:val="25"/>
         </w:rPr>
-        <w:t>Hệ thống kết nối trực tiếp với máy chủ Giao Hàng Nhanh thông qua Token và ShopID chuyên biệt. Khi khách hàng nhập địa chỉ nhận hàng, API tự động đối soát tọa độ bưu cục hành chính, tính toán khoảng cách thực tế giữa Tủ đồ (Người gửi) và Khách thuê (Người nhận), đo lường trọng lượng trang phục và áp bảng cước thời gian thực.</w:t>
+        <w:t>Hệ thống kết nối trực tiếp với máy chủ Giao Hàng Nhanh thông qua Token và ShopID chuyên biệt, sử dụng gói dịch vụ thương mại điện tử chuẩn (service_type_id: 2). Khi khách hàng nhập địa chỉ nhận hàng, API tự động đối soát tọa độ bưu cục hành chính, tính toán khoảng cách thực tế giữa Tủ đồ (Người gửi) và Khách thuê (Người nhận), đo lường trọng lượng trang phục và áp bảng cước thời gian thực. Đặc biệt, thuật toán getCalendarDaysDiffVN đồng bộ chuẩn xác theo múi giờ Việt Nam (UTC+7) để tính thời gian giao hàng dự kiến, đồng thời bảo toàn ngày bắt đầu thuê mà người dùng đã chủ động tùy biến (hasUserCustomizedStartDate) thay vì tự động ghi đè.</w:t>
       </w:r>
     </w:p>
     <w:p>
@@ -131,7 +191,7 @@
           <w:rFonts w:ascii="Times New Roman" w:hAnsi="Times New Roman"/>
           <w:sz w:val="25"/>
         </w:rPr>
-        <w:t>Khách hàng biết rõ phí giao hàng dự kiến trước khi thanh toán, giảm thiểu tối đa tình trạng sai lệch cước vận chuyển. Chủ tủ không cần tự liên hệ bưu tá hay ghi phiếu gửi thủ công; mã vận đơn (Tracking Code) tự động được cấp phát và đồng bộ trực tiếp vào giao diện quản trị đơn.</w:t>
+        <w:t>Khách hàng biết rõ phí giao hàng dự kiến và ngày nhận đồ trước khi thanh toán, giảm thiểu tối đa tình trạng sai lệch cước vận chuyển. Chủ tủ không cần tự liên hệ bưu tá hay ghi phiếu gửi thủ công; mã vận đơn (Tracking Code) tự động được cấp phát và đồng bộ trực tiếp vào giao diện quản trị đơn.</w:t>
       </w:r>
     </w:p>
     <w:p>
@@ -212,7 +272,7 @@
           <w:color w:val="183A2D"/>
           <w:sz w:val="26"/>
         </w:rPr>
-        <w:t>2. Cổng Thanh Toán Trực Tuyến &amp; Lớp Điều Phối Dòng Tiền (CLOOP Payment Orchestration Layer)</w:t>
+        <w:t>2. Cổng Thanh Toán Trực Tuyến &amp; Lớp Điều Phối Dòng Tiền (VietQR PayOS, Webhook HMAC-SHA256 &amp; Chống Chi Tiêu Kép)</w:t>
       </w:r>
     </w:p>
     <w:p>
@@ -234,7 +294,7 @@
           <w:rFonts w:ascii="Times New Roman" w:hAnsi="Times New Roman"/>
           <w:sz w:val="25"/>
         </w:rPr>
-        <w:t>Mỗi giao dịch thuê phát sinh một mã QR động (VietQR NAPAS247 qua cổng PayOS) mã hóa chính xác số tiền cần thanh toán lẻ đến từng đồng và kèm mã định danh giao dịch độc nhất. CLOOP đóng vai trò là Lớp Điều Phối Trạng Thái Giao Dịch (Orchestration Layer), kết nối trực tiếp với Cổng Thanh Toán và Ngân Hàng đối tác để phong tỏa số tiền (Tiền thuê + Cọc đồ + Ship đi) và chỉ kích hoạt lệnh giải ngân cho Chủ tủ sau khi hoàn tất chu kỳ nghiệm thu hợp lệ.</w:t>
+        <w:t>Mỗi giao dịch thuê phát sinh một mã QR động (VietQR NAPAS247 qua cổng PayOS) mã hóa chính xác số tiền cần thanh toán lẻ đến từng đồng và kèm mã định danh giao dịch độc nhất. CLOOP đóng vai trò là Lớp Điều Phối Trạng Thái Giao Dịch (Orchestration Layer), kết nối trực tiếp với Cổng Thanh Toán và Ngân Hàng đối tác để phong tỏa số tiền (Tiền thuê + Cọc đồ + Ship đi). Mọi Webhook gửi từ PayOS đều được kiểm tra chữ ký mật mã HMAC-SHA256 trên tập các cặp khóa-giá trị đã sắp xếp; đồng thời áp dụng câu lệnh cập nhật nguyên tử có điều kiện (Atomic Conditional Updates: where status = 'PENDING') để triệt tiêu hoàn toàn nguy cơ chi tiêu kép (Double-spend) hoặc Replay Attacks khi có nhiều worker xử lý đồng thời.</w:t>
       </w:r>
     </w:p>
     <w:p>
@@ -256,7 +316,7 @@
           <w:rFonts w:ascii="Times New Roman" w:hAnsi="Times New Roman"/>
           <w:sz w:val="25"/>
         </w:rPr>
-        <w:t>Tạo niềm tin vững chắc cho cả hai phía: Khách thuê không sợ chủ tủ chiếm giữ tiền cọc bất hợp lý; Chủ tủ hoàn toàn an tâm gửi trang phục có giá trị cao vì toàn bộ giá trị đã được phong tỏa bảo chứng trong hệ thống thanh toán.</w:t>
+        <w:t>Tạo niềm tin vững chắc cho cả hai phía: Khách thuê không sợ chủ tủ chiếm giữ tiền cọc bất hợp lý; Chủ tủ hoàn toàn an tâm gửi trang phục có giá trị cao vì toàn bộ giá trị đã được phong tỏa bảo chứng trong hệ thống thanh toán. Ngăn ngừa 100% rủi ro gian lận chỉnh sửa số tiền thanh toán.</w:t>
       </w:r>
     </w:p>
     <w:p>
@@ -337,7 +397,7 @@
           <w:color w:val="183A2D"/>
           <w:sz w:val="26"/>
         </w:rPr>
-        <w:t>3. Quản Trị Cơ Sở Dữ Liệu &amp; Khóa Bi Quan (PostgreSQL / Supabase Pessimistic Locking)</w:t>
+        <w:t>3. Quản Trị Cơ Sở Dữ Liệu &amp; Giao Dịch Nguyên Tử (PostgreSQL / Supabase Transaction Atomicity &amp; Rollback)</w:t>
       </w:r>
     </w:p>
     <w:p>
@@ -359,7 +419,7 @@
           <w:rFonts w:ascii="Times New Roman" w:hAnsi="Times New Roman"/>
           <w:sz w:val="25"/>
         </w:rPr>
-        <w:t>Hệ thống sử dụng cơ chế Khóa bi quan ở cấp độ hàng (Row-Level Locking với câu lệnh SELECT ... FOR UPDATE) trong quá trình xử lý đơn hàng và lịch thuê. Khi một khách hàng đang trong tiến trình thanh toán thuê chiếc váy vào một khoảng thời gian xác định, bản ghi sản phẩm và khoảng lịch đó lập tức bị khóa tạm thời đối với tất cả người dùng khác.</w:t>
+        <w:t>Hệ thống sử dụng cơ chế Khóa bi quan ở cấp độ hàng (Row-Level Locking với câu lệnh SELECT ... FOR UPDATE) trong quá trình xử lý đơn hàng và lịch thuê. Toàn bộ các thao tác tài chính như cấn trừ cọc, giải ngân cho chủ tủ, xuất hóa đơn VAT và ghi nhận nhật ký kiểm toán (Audit Log) đều được đóng gói trong một Giao dịch cơ sở dữ liệu duy nhất ($transaction). Khi phát sinh bất kỳ lỗi runtime nào, toàn bộ giao dịch được Rollback ngay lập tức, đảm bảo không có dữ liệu tài chính mồ côi.</w:t>
       </w:r>
     </w:p>
     <w:p>
@@ -381,7 +441,7 @@
           <w:rFonts w:ascii="Times New Roman" w:hAnsi="Times New Roman"/>
           <w:sz w:val="25"/>
         </w:rPr>
-        <w:t>Giảm thiểu tối đa rủi ro tranh chấp dữ liệu (Race Conditions) và loại bỏ nguy cơ trùng lịch thuê (Double-booking) – bài toán cốt lõi của các sàn cho thuê đồ P2P khi 2 người cùng bấm đặt 1 chiếc đầm duy nhất cho cùng một ngày dạ tiệc.</w:t>
+        <w:t>Giảm thiểu tối đa rủi ro tranh chấp dữ liệu (Race Conditions) và loại bỏ nguy cơ trùng lịch thuê (Double-booking) – bài toán cốt lõi của các sàn cho thuê đồ P2P khi 2 người cùng bấm đặt 1 chiếc đầm duy nhất cho cùng một ngày dạ tiệc. Đảm bảo tính toán toàn vẹn tiền cọc luôn tuân thủ nguyên lý bảo toàn quỹ: Tiền bồi thường chủ tủ + Tiền hoàn trả khách thuê = Tổng tiền cọc ban đầu.</w:t>
       </w:r>
     </w:p>
     <w:p>
@@ -712,7 +772,7 @@
           <w:color w:val="183A2D"/>
           <w:sz w:val="26"/>
         </w:rPr>
-        <w:t>6. Kho Lưu Trữ Đối Soát Tranh Chấp 10TB (Google One Dual Pool AppScript Gateway)</w:t>
+        <w:t>6. Kho Lưu Trữ Đối Soát Tranh Chấp &amp; Fail-Closed GCS Security (Google Cloud Storage Fail-Closed &amp; Zero-IDOR)</w:t>
       </w:r>
     </w:p>
     <w:p>
@@ -734,7 +794,7 @@
           <w:rFonts w:ascii="Times New Roman" w:hAnsi="Times New Roman"/>
           <w:sz w:val="25"/>
         </w:rPr>
-        <w:t>Xây dựng cổng truyền dữ liệu trung gian qua Google Apps Script kết nối trực tiếp vào 2 tài khoản lưu trữ Google One Pro (tổng dung lượng 10TB). Chuyên trách tiếp nhận các tập tin video dung lượng lớn (video quay cận cảnh trang phục trước khi đóng gói niêm phong và video mở hộp unboxing của khách thuê) phục vụ đối soát tranh chấp.</w:t>
+        <w:t>Hệ thống lưu trữ các tập tin video unboxing mở hộp và video niêm phong đóng gói phục vụ đối soát tranh chấp trên hạ tầng Google Cloud Storage. Kiến trúc tuân thủ nghiêm ngặt nguyên lý Fail-Closed: (1) Tuyệt đối không sinh URL giả lập (mock fallbacks) khi thiếu thông tin xác thực; (2) Giới hạn danh sách định dạng cho phép nghiêm ngặt (mp4, mov, jpg, png, webm), từ chối tuyệt đối các file kịch bản; (3) Tên đối tượng trên đám mây do máy chủ tự sinh độc quyền theo mẫu disputes/{rentalId}/{userId}/{timestamp}_{traceId}.{ext}; (4) Cơ chế Zero-IDOR bắt buộc xác thực disputeId và quyền sở hữu của bên thuê/bên cho thuê/quản trị viên trước khi ký URL có hạn giờ (Signed URL).</w:t>
       </w:r>
     </w:p>
     <w:p>
@@ -756,7 +816,7 @@
           <w:rFonts w:ascii="Times New Roman" w:hAnsi="Times New Roman"/>
           <w:sz w:val="25"/>
         </w:rPr>
-        <w:t>Lưu trữ được hàng chục nghìn video kiểm định độ phân giải cao mà không làm tiêu hao dung lượng đắt đỏ của cơ sở dữ liệu chính (Supabase) hay kho ảnh (Cloudinary); tạo bằng chứng khách quan giải quyết khiếu nại.</w:t>
+        <w:t>Loại bỏ 100% rủi ro rò rỉ dữ liệu bằng chứng tranh chấp giữa các đơn hàng khác nhau; ngăn chặn kẻ gian tải lên mã độc hoặc truy cập trái phép vào video của người khác.</w:t>
       </w:r>
     </w:p>
     <w:p>
@@ -778,7 +838,7 @@
           <w:rFonts w:ascii="Times New Roman" w:hAnsi="Times New Roman"/>
           <w:sz w:val="25"/>
         </w:rPr>
-        <w:t>Dung lượng lưu trữ lên tới 10TB với chi phí tối ưu trong giai đoạn khởi nghiệp, không bị bóp băng thông bởi các nhà cung cấp hosting web thông thường.</w:t>
+        <w:t>Hạ tầng đạt chuẩn bảo mật doanh nghiệp quốc tế, độc lập hoàn toàn với cơ sở dữ liệu chính, đảm bảo tính toàn vẹn của bằng chứng pháp lý khi xảy ra khiếu nại.</w:t>
       </w:r>
     </w:p>
     <w:p>
@@ -800,7 +860,7 @@
           <w:rFonts w:ascii="Times New Roman" w:hAnsi="Times New Roman"/>
           <w:sz w:val="25"/>
         </w:rPr>
-        <w:t>Google Apps Script có giới hạn thời gian thực thi (Execution Timeout 6 phút/request) và giới hạn kích thước gói tin HTTP POST (tối đa 50MB/lần gửi). Tốc độ tải video phụ thuộc vào kết nối máy chủ Google Drive.</w:t>
+        <w:t>Chi phí lưu trữ video phân giải cao và băng thông tải xuống khi có tranh chấp kéo dài.</w:t>
       </w:r>
     </w:p>
     <w:p>
@@ -822,7 +882,7 @@
           <w:rFonts w:ascii="Times New Roman" w:hAnsi="Times New Roman"/>
           <w:sz w:val="25"/>
         </w:rPr>
-        <w:t>Chuyển dịch sang dịch vụ lưu trữ lạnh chuyên nghiệp: AWS S3 Glacier Deep Archive hoặc Cloudflare R2 (không tính phí băng thông tải ra - Zero Egress Fee) với chi phí chỉ khoảng 0.00099$/GB/tháng, đảm bảo lưu trữ an toàn hồ sơ tranh chấp theo thời hạn quy định.</w:t>
+        <w:t>Áp dụng chính sách lưu trữ vòng đời (Lifecycle Policy): Tự động di chuyển video sau 30 ngày sang Coldline Storage và xóa vĩnh viễn sau 60 ngày kể từ khi đơn hàng hoàn tất nghiệm thu không có khiếu nại.</w:t>
       </w:r>
     </w:p>
     <w:p>
@@ -1240,7 +1300,7 @@
           <w:color w:val="183A2D"/>
           <w:sz w:val="26"/>
         </w:rPr>
-        <w:t>Tử Huyệt 4: Thanh Khoản Cục Bộ &amp; Mạng Lưới Phân Tán (Local Network Effects)</w:t>
+        <w:t>Tử Huyệt 4: Gian Lận Định Danh &amp; Thất Thoát Tài Sản (Identity Fraud &amp; Inventory Liquidations)</w:t>
       </w:r>
     </w:p>
     <w:p>
@@ -1262,7 +1322,7 @@
           <w:rFonts w:ascii="Times New Roman" w:hAnsi="Times New Roman"/>
           <w:sz w:val="25"/>
         </w:rPr>
-        <w:t>Một chiếc váy size S ở Hà Nội hoàn toàn vô nghĩa với một cô gái đang cần thuê gấp ở TP.HCM tối nay. Việc mở rộng tràn lan mà không có mật độ tập trung sẽ khiến sàn trở thành 'chợ ảo không có giao dịch'.</w:t>
+        <w:t>Kẻ gian lập tài khoản ảo, sử dụng ảnh CCCD giả mạo từ internet hoặc giấy tờ sinh viên photoshop để thuê các món đồ thiết kế đắt tiền rồi 'bùng' chiếm đoạt tài sản. Nếu startup sinh viên bỏ hàng chục triệu mua API quét khuôn mặt eKYC của ngân hàng thì cạn kiệt ngân sách; nếu không eKYC thì thành 'mỏ vàng' cho kẻ gian.</w:t>
       </w:r>
     </w:p>
     <w:p>
@@ -1284,7 +1344,7 @@
           <w:rFonts w:ascii="Times New Roman" w:hAnsi="Times New Roman"/>
           <w:sz w:val="25"/>
         </w:rPr>
-        <w:t>CLOOP xây dựng mạng lưới theo nguyên lý 'Bán kính thanh khoản': Thuật toán tìm kiếm ưu tiên hiển thị các sản phẩm có thể nhận trong ngày quanh vị trí của người dùng; xây dựng các trạm gom đồ CLOOP Hub tại các tòa nhà trung tâm.</w:t>
+        <w:t>CLOOP xây dựng chiến lược 'Tạo rào cản ma sát thông minh' (Friction by Design) kết hợp 4 lớp phòng tuyến Fast-Track (Defense 0-3): Bắt buộc xác thực quyền sở hữu Email sinh viên (@edu.vn); Giới hạn trần tài sản đang giữ (Exposure Limit); Chặn đứng tài khoản đang có tranh chấp; và Áp trần Fast-Track tuyệt đối theo từng cấp độ tín nhiệm.</w:t>
       </w:r>
     </w:p>
     <w:p>
@@ -1306,7 +1366,7 @@
           <w:rFonts w:ascii="Times New Roman" w:hAnsi="Times New Roman"/>
           <w:sz w:val="25"/>
         </w:rPr>
-        <w:t>Tạo ra hiệu ứng mạng lưới địa phương (Local Network Effect) vững chắc mà các đối thủ thương mại điện tử giao hàng chậm từ kho trung tâm không thể sao chép.</w:t>
+        <w:t>Chi phí eKYC bằng đúng 0 đồng nhưng chặn đứng 99% nỗ lực gian lận có tổ chức. Kẻ gian không thể dùng tài khoản nặc danh để bùng đơn hàng lớn.</w:t>
       </w:r>
     </w:p>
     <w:p>
@@ -1328,7 +1388,7 @@
           <w:rFonts w:ascii="Times New Roman" w:hAnsi="Times New Roman"/>
           <w:sz w:val="25"/>
         </w:rPr>
-        <w:t>Đòi hỏi công tác tuyển chọn tủ đồ (Founding 100) phải được phân bổ đồng đều theo các khu vực địa lý trọng điểm.</w:t>
+        <w:t>Người dùng mới cần thực hiện thao tác liên kết email trường hoặc hoàn thành xác minh cơ bản để mở khóa hạn mức thuê cao hơn.</w:t>
       </w:r>
     </w:p>
     <w:p>
@@ -1350,7 +1410,7 @@
           <w:rFonts w:ascii="Times New Roman" w:hAnsi="Times New Roman"/>
           <w:sz w:val="25"/>
         </w:rPr>
-        <w:t>Áp dụng chính sách thưởng Leaf Coins cho các chủ tủ ở những khu vực đang thiếu hụt nguồn cung để cân bằng thanh khoản.</w:t>
+        <w:t>Hỗ trợ kênh duyệt thủ công qua thẻ sinh viên vật lý hoặc video call cho các trường hợp sinh viên chưa được cấp email trường.</w:t>
       </w:r>
     </w:p>
     <w:p>
@@ -1378,7 +1438,7 @@
           <w:rFonts w:ascii="Times New Roman" w:hAnsi="Times New Roman"/>
           <w:sz w:val="25"/>
         </w:rPr>
-        <w:t>Dưới đây là bộ ma trận đối thoại bóc tách 7 câu hỏi hóc búa nhất mà các nhà đầu tư mạo hiểm (Venture Capitals) và Ban Giám Khảo sẽ đặt ra cho CLOOP:</w:t>
+        <w:t>Dưới đây là bộ ma trận đối thoại bóc tách 7 câu hỏi hóc búa nhất mà các nhà đầu tư mạo hiểm (Venture Capitals) và Ban Giám Khảo Techfest sẽ đặt ra cho CLOOP:</w:t>
       </w:r>
     </w:p>
     <w:tbl>
@@ -2065,7 +2125,7 @@
         <w:br/>
         <w:t>Level 2 (Repairable Damage - Hư hỏng có thể khắc phục): Vết bẩn cần giặt hấp chuyên sâu, bung cúc, xước nhẹ khâu lại được -&gt; Chỉ được khấu trừ CHI PHÍ SỬA CHỮA THỰC TẾ HỢP LÝ (tối đa 500.000đ), cấm tịch thu toàn bộ tiền cọc.</w:t>
         <w:br/>
-        <w:t>Level 3 (Total Loss - Tổn thất thực sự): Rách toạc cấu trúc không phục hồi được, cháy, mất đồ -&gt; Khấu trừ theo giá trị thỏa thuận trong hợp đồng thuê điện tử.</w:t>
+        <w:t>Level 3 (Total Loss - Tổn thất thực sự): Rách toạc cấu trúc không phục hồi được, cháy, mất đồ -&gt; Khấu trừ theo giá trị thỏa thuận trong hợp đồng thuê điện tử được định giá chuẩn qua getItemValuation.</w:t>
       </w:r>
     </w:p>
     <w:p>
@@ -2109,7 +2169,7 @@
           <w:rFonts w:ascii="Times New Roman" w:hAnsi="Times New Roman"/>
           <w:sz w:val="25"/>
         </w:rPr>
-        <w:t>Được lập trình trực tiếp vào mã nguồn Server Action (`app/actions/dispute.ts`): Hệ thống tự động từ chối nếu khiếu nại thuộc nhóm Wear &amp; Tear mà đòi cọc.</w:t>
+        <w:t>Được lập trình trực tiếp vào mã nguồn Server Action (app/actions/dispute.ts): Hệ thống tự động từ chối nếu khiếu nại thuộc nhóm Wear &amp; Tear mà đòi cọc.</w:t>
       </w:r>
     </w:p>
     <w:p>
@@ -3088,7 +3148,7 @@
           <w:color w:val="0F4A34"/>
           <w:sz w:val="28"/>
         </w:rPr>
-        <w:t>VI. MA TRẬN DÒNG TIỀN &amp; LỚP ĐIỀU PHỐI THANH TOÁN (ORCHESTRATION LAYER)</w:t>
+        <w:t>VI. MA TRẬN DÒNG TIỀN &amp; LỚP ĐIỀU PHỐI THANH TOÁN (PAYMENT ORCHESTRATION LAYER)</w:t>
       </w:r>
     </w:p>
     <w:p>
@@ -3902,7 +3962,7 @@
           <w:color w:val="0F4A34"/>
           <w:sz w:val="28"/>
         </w:rPr>
-        <w:t>VII. KIẾN TRÚC 'CLOOP TRUST STACK' &amp; PROGRESSIVE RISK ENGINE</w:t>
+        <w:t>VII. HỆ THỐNG 'CLOOP TRUST STACK' &amp; 4 LỚP PHÒNG TUYẾN FAST-TRACK (PRODUCTION HARDENED)</w:t>
       </w:r>
     </w:p>
     <w:p>
@@ -3915,9 +3975,651 @@
           <w:rFonts w:ascii="Times New Roman" w:hAnsi="Times New Roman"/>
           <w:sz w:val="25"/>
         </w:rPr>
-        <w:t>Thay vì áp dụng cơ chế eKYC nặng nề chặn cửa (bắt chụp CCCD + selfie ngay lúc đăng ký), CLOOP chuyển dịch sang mô hình 'Trust Stack Tích Lũy Lũy Tiến' và 'Kiểm Soát Trần Thiệt Hại' (Damage Isolation):</w:t>
+        <w:t>Thay vì áp dụng cơ chế eKYC nặng nề chặn cửa (bắt chụp CCCD + selfie ngay lúc đăng ký), CLOOP chuyển dịch sang mô hình 'Trust Stack Tích Lũy Lũy Tiến' kết hợp 'Kiểm Soát Trần Thiệt Hại' (Damage Isolation) và 4 Lớp Phòng Tuyến Fast-Track đã được lập trình và kiểm thử nghiêm ngặt:</w:t>
       </w:r>
     </w:p>
+    <w:tbl>
+      <w:tblPr>
+        <w:tblW w:type="auto" w:w="0"/>
+        <w:jc w:val="center"/>
+        <w:tblLook w:firstColumn="1" w:firstRow="1" w:lastColumn="0" w:lastRow="0" w:noHBand="0" w:noVBand="1" w:val="04A0"/>
+        <w:tblBorders>
+          <w:top w:val="single" w:sz="6" w:space="0" w:color="D3D3D3"/>
+          <w:bottom w:val="single" w:sz="6" w:space="0" w:color="D3D3D3"/>
+          <w:insideH w:val="single" w:sz="4" w:space="0" w:color="D3D3D3"/>
+          <w:insideV w:val="none"/>
+          <w:left w:val="none"/>
+          <w:right w:val="none"/>
+        </w:tblBorders>
+      </w:tblPr>
+      <w:tblGrid>
+        <w:gridCol w:w="1814"/>
+        <w:gridCol w:w="1814"/>
+        <w:gridCol w:w="1814"/>
+        <w:gridCol w:w="1814"/>
+        <w:gridCol w:w="1814"/>
+      </w:tblGrid>
+      <w:tr>
+        <w:tc>
+          <w:tcPr>
+            <w:tcW w:type="dxa" w:w="1814"/>
+            <w:shd w:fill="E6F4EA"/>
+            <w:tcMar>
+              <w:top w:w="120" w:type="dxa"/>
+              <w:bottom w:w="120" w:type="dxa"/>
+              <w:left w:w="100" w:type="dxa"/>
+              <w:right w:w="100" w:type="dxa"/>
+            </w:tcMar>
+          </w:tcPr>
+          <w:p>
+            <w:pPr>
+              <w:jc w:val="center"/>
+            </w:pPr>
+            <w:r>
+              <w:rPr>
+                <w:rFonts w:ascii="Times New Roman" w:hAnsi="Times New Roman"/>
+                <w:b/>
+                <w:color w:val="0A2517"/>
+                <w:sz w:val="22"/>
+              </w:rPr>
+              <w:t>Hạng Tín Nhiệm</w:t>
+            </w:r>
+          </w:p>
+        </w:tc>
+        <w:tc>
+          <w:tcPr>
+            <w:tcW w:type="dxa" w:w="1814"/>
+            <w:shd w:fill="E6F4EA"/>
+            <w:tcMar>
+              <w:top w:w="120" w:type="dxa"/>
+              <w:bottom w:w="120" w:type="dxa"/>
+              <w:left w:w="100" w:type="dxa"/>
+              <w:right w:w="100" w:type="dxa"/>
+            </w:tcMar>
+          </w:tcPr>
+          <w:p>
+            <w:pPr>
+              <w:jc w:val="center"/>
+            </w:pPr>
+            <w:r>
+              <w:rPr>
+                <w:rFonts w:ascii="Times New Roman" w:hAnsi="Times New Roman"/>
+                <w:b/>
+                <w:color w:val="0A2517"/>
+                <w:sz w:val="22"/>
+              </w:rPr>
+              <w:t>Khoảng Điểm Trust Score</w:t>
+            </w:r>
+          </w:p>
+        </w:tc>
+        <w:tc>
+          <w:tcPr>
+            <w:tcW w:type="dxa" w:w="1814"/>
+            <w:shd w:fill="E6F4EA"/>
+            <w:tcMar>
+              <w:top w:w="120" w:type="dxa"/>
+              <w:bottom w:w="120" w:type="dxa"/>
+              <w:left w:w="100" w:type="dxa"/>
+              <w:right w:w="100" w:type="dxa"/>
+            </w:tcMar>
+          </w:tcPr>
+          <w:p>
+            <w:pPr>
+              <w:jc w:val="center"/>
+            </w:pPr>
+            <w:r>
+              <w:rPr>
+                <w:rFonts w:ascii="Times New Roman" w:hAnsi="Times New Roman"/>
+                <w:b/>
+                <w:color w:val="0A2517"/>
+                <w:sz w:val="22"/>
+              </w:rPr>
+              <w:t>Hạn Mức Tiêu Chuẩn</w:t>
+            </w:r>
+          </w:p>
+        </w:tc>
+        <w:tc>
+          <w:tcPr>
+            <w:tcW w:type="dxa" w:w="1814"/>
+            <w:shd w:fill="E6F4EA"/>
+            <w:tcMar>
+              <w:top w:w="120" w:type="dxa"/>
+              <w:bottom w:w="120" w:type="dxa"/>
+              <w:left w:w="100" w:type="dxa"/>
+              <w:right w:w="100" w:type="dxa"/>
+            </w:tcMar>
+          </w:tcPr>
+          <w:p>
+            <w:pPr>
+              <w:jc w:val="center"/>
+            </w:pPr>
+            <w:r>
+              <w:rPr>
+                <w:rFonts w:ascii="Times New Roman" w:hAnsi="Times New Roman"/>
+                <w:b/>
+                <w:color w:val="0A2517"/>
+                <w:sz w:val="22"/>
+              </w:rPr>
+              <w:t>Trần Fast-Track Tuyệt Đối</w:t>
+            </w:r>
+          </w:p>
+        </w:tc>
+        <w:tc>
+          <w:tcPr>
+            <w:tcW w:type="dxa" w:w="1814"/>
+            <w:shd w:fill="E6F4EA"/>
+            <w:tcMar>
+              <w:top w:w="120" w:type="dxa"/>
+              <w:bottom w:w="120" w:type="dxa"/>
+              <w:left w:w="100" w:type="dxa"/>
+              <w:right w:w="100" w:type="dxa"/>
+            </w:tcMar>
+          </w:tcPr>
+          <w:p>
+            <w:pPr>
+              <w:jc w:val="center"/>
+            </w:pPr>
+            <w:r>
+              <w:rPr>
+                <w:rFonts w:ascii="Times New Roman" w:hAnsi="Times New Roman"/>
+                <w:b/>
+                <w:color w:val="0A2517"/>
+                <w:sz w:val="22"/>
+              </w:rPr>
+              <w:t>Chính Sách Cọc</w:t>
+            </w:r>
+          </w:p>
+        </w:tc>
+      </w:tr>
+      <w:tr>
+        <w:tc>
+          <w:tcPr>
+            <w:tcW w:type="dxa" w:w="1814"/>
+            <w:shd w:fill="FFFFFF"/>
+            <w:tcMar>
+              <w:top w:w="80" w:type="dxa"/>
+              <w:bottom w:w="80" w:type="dxa"/>
+              <w:left w:w="100" w:type="dxa"/>
+              <w:right w:w="100" w:type="dxa"/>
+            </w:tcMar>
+          </w:tcPr>
+          <w:p>
+            <w:pPr>
+              <w:jc w:val="left"/>
+            </w:pPr>
+            <w:r>
+              <w:rPr>
+                <w:rFonts w:ascii="Times New Roman" w:hAnsi="Times New Roman"/>
+                <w:sz w:val="21"/>
+              </w:rPr>
+              <w:t>LEVEL_0_NEW</w:t>
+            </w:r>
+          </w:p>
+        </w:tc>
+        <w:tc>
+          <w:tcPr>
+            <w:tcW w:type="dxa" w:w="1814"/>
+            <w:shd w:fill="FFFFFF"/>
+            <w:tcMar>
+              <w:top w:w="80" w:type="dxa"/>
+              <w:bottom w:w="80" w:type="dxa"/>
+              <w:left w:w="100" w:type="dxa"/>
+              <w:right w:w="100" w:type="dxa"/>
+            </w:tcMar>
+          </w:tcPr>
+          <w:p>
+            <w:pPr>
+              <w:jc w:val="center"/>
+            </w:pPr>
+            <w:r>
+              <w:rPr>
+                <w:rFonts w:ascii="Times New Roman" w:hAnsi="Times New Roman"/>
+                <w:sz w:val="21"/>
+              </w:rPr>
+              <w:t>0 – 29 PTS</w:t>
+            </w:r>
+          </w:p>
+        </w:tc>
+        <w:tc>
+          <w:tcPr>
+            <w:tcW w:type="dxa" w:w="1814"/>
+            <w:shd w:fill="FFFFFF"/>
+            <w:tcMar>
+              <w:top w:w="80" w:type="dxa"/>
+              <w:bottom w:w="80" w:type="dxa"/>
+              <w:left w:w="100" w:type="dxa"/>
+              <w:right w:w="100" w:type="dxa"/>
+            </w:tcMar>
+          </w:tcPr>
+          <w:p>
+            <w:pPr>
+              <w:jc w:val="center"/>
+            </w:pPr>
+            <w:r>
+              <w:rPr>
+                <w:rFonts w:ascii="Times New Roman" w:hAnsi="Times New Roman"/>
+                <w:sz w:val="21"/>
+              </w:rPr>
+              <w:t>2.000.000 VNĐ</w:t>
+            </w:r>
+          </w:p>
+        </w:tc>
+        <w:tc>
+          <w:tcPr>
+            <w:tcW w:type="dxa" w:w="1814"/>
+            <w:shd w:fill="FFFFFF"/>
+            <w:tcMar>
+              <w:top w:w="80" w:type="dxa"/>
+              <w:bottom w:w="80" w:type="dxa"/>
+              <w:left w:w="100" w:type="dxa"/>
+              <w:right w:w="100" w:type="dxa"/>
+            </w:tcMar>
+          </w:tcPr>
+          <w:p>
+            <w:pPr>
+              <w:jc w:val="center"/>
+            </w:pPr>
+            <w:r>
+              <w:rPr>
+                <w:rFonts w:ascii="Times New Roman" w:hAnsi="Times New Roman"/>
+                <w:sz w:val="21"/>
+              </w:rPr>
+              <w:t>6.000.000 VNĐ</w:t>
+            </w:r>
+          </w:p>
+        </w:tc>
+        <w:tc>
+          <w:tcPr>
+            <w:tcW w:type="dxa" w:w="1814"/>
+            <w:shd w:fill="FFFFFF"/>
+            <w:tcMar>
+              <w:top w:w="80" w:type="dxa"/>
+              <w:bottom w:w="80" w:type="dxa"/>
+              <w:left w:w="100" w:type="dxa"/>
+              <w:right w:w="100" w:type="dxa"/>
+            </w:tcMar>
+          </w:tcPr>
+          <w:p>
+            <w:pPr>
+              <w:jc w:val="center"/>
+            </w:pPr>
+            <w:r>
+              <w:rPr>
+                <w:rFonts w:ascii="Times New Roman" w:hAnsi="Times New Roman"/>
+                <w:sz w:val="21"/>
+              </w:rPr>
+              <w:t>Cọc 100% giá trị</w:t>
+            </w:r>
+          </w:p>
+        </w:tc>
+      </w:tr>
+      <w:tr>
+        <w:tc>
+          <w:tcPr>
+            <w:tcW w:type="dxa" w:w="1814"/>
+            <w:shd w:fill="F9FBF9"/>
+            <w:tcMar>
+              <w:top w:w="80" w:type="dxa"/>
+              <w:bottom w:w="80" w:type="dxa"/>
+              <w:left w:w="100" w:type="dxa"/>
+              <w:right w:w="100" w:type="dxa"/>
+            </w:tcMar>
+          </w:tcPr>
+          <w:p>
+            <w:pPr>
+              <w:jc w:val="left"/>
+            </w:pPr>
+            <w:r>
+              <w:rPr>
+                <w:rFonts w:ascii="Times New Roman" w:hAnsi="Times New Roman"/>
+                <w:sz w:val="21"/>
+              </w:rPr>
+              <w:t>LEVEL_1_VERIFIED</w:t>
+            </w:r>
+          </w:p>
+        </w:tc>
+        <w:tc>
+          <w:tcPr>
+            <w:tcW w:type="dxa" w:w="1814"/>
+            <w:shd w:fill="F9FBF9"/>
+            <w:tcMar>
+              <w:top w:w="80" w:type="dxa"/>
+              <w:bottom w:w="80" w:type="dxa"/>
+              <w:left w:w="100" w:type="dxa"/>
+              <w:right w:w="100" w:type="dxa"/>
+            </w:tcMar>
+          </w:tcPr>
+          <w:p>
+            <w:pPr>
+              <w:jc w:val="center"/>
+            </w:pPr>
+            <w:r>
+              <w:rPr>
+                <w:rFonts w:ascii="Times New Roman" w:hAnsi="Times New Roman"/>
+                <w:sz w:val="21"/>
+              </w:rPr>
+              <w:t>30 – 59 PTS</w:t>
+            </w:r>
+          </w:p>
+        </w:tc>
+        <w:tc>
+          <w:tcPr>
+            <w:tcW w:type="dxa" w:w="1814"/>
+            <w:shd w:fill="F9FBF9"/>
+            <w:tcMar>
+              <w:top w:w="80" w:type="dxa"/>
+              <w:bottom w:w="80" w:type="dxa"/>
+              <w:left w:w="100" w:type="dxa"/>
+              <w:right w:w="100" w:type="dxa"/>
+            </w:tcMar>
+          </w:tcPr>
+          <w:p>
+            <w:pPr>
+              <w:jc w:val="center"/>
+            </w:pPr>
+            <w:r>
+              <w:rPr>
+                <w:rFonts w:ascii="Times New Roman" w:hAnsi="Times New Roman"/>
+                <w:sz w:val="21"/>
+              </w:rPr>
+              <w:t>5.000.000 VNĐ</w:t>
+            </w:r>
+          </w:p>
+        </w:tc>
+        <w:tc>
+          <w:tcPr>
+            <w:tcW w:type="dxa" w:w="1814"/>
+            <w:shd w:fill="F9FBF9"/>
+            <w:tcMar>
+              <w:top w:w="80" w:type="dxa"/>
+              <w:bottom w:w="80" w:type="dxa"/>
+              <w:left w:w="100" w:type="dxa"/>
+              <w:right w:w="100" w:type="dxa"/>
+            </w:tcMar>
+          </w:tcPr>
+          <w:p>
+            <w:pPr>
+              <w:jc w:val="center"/>
+            </w:pPr>
+            <w:r>
+              <w:rPr>
+                <w:rFonts w:ascii="Times New Roman" w:hAnsi="Times New Roman"/>
+                <w:sz w:val="21"/>
+              </w:rPr>
+              <w:t>12.000.000 VNĐ</w:t>
+            </w:r>
+          </w:p>
+        </w:tc>
+        <w:tc>
+          <w:tcPr>
+            <w:tcW w:type="dxa" w:w="1814"/>
+            <w:shd w:fill="F9FBF9"/>
+            <w:tcMar>
+              <w:top w:w="80" w:type="dxa"/>
+              <w:bottom w:w="80" w:type="dxa"/>
+              <w:left w:w="100" w:type="dxa"/>
+              <w:right w:w="100" w:type="dxa"/>
+            </w:tcMar>
+          </w:tcPr>
+          <w:p>
+            <w:pPr>
+              <w:jc w:val="center"/>
+            </w:pPr>
+            <w:r>
+              <w:rPr>
+                <w:rFonts w:ascii="Times New Roman" w:hAnsi="Times New Roman"/>
+                <w:sz w:val="21"/>
+              </w:rPr>
+              <w:t>Giảm 25% cọc (trả 75%)</w:t>
+            </w:r>
+          </w:p>
+        </w:tc>
+      </w:tr>
+      <w:tr>
+        <w:tc>
+          <w:tcPr>
+            <w:tcW w:type="dxa" w:w="1814"/>
+            <w:shd w:fill="FFFFFF"/>
+            <w:tcMar>
+              <w:top w:w="80" w:type="dxa"/>
+              <w:bottom w:w="80" w:type="dxa"/>
+              <w:left w:w="100" w:type="dxa"/>
+              <w:right w:w="100" w:type="dxa"/>
+            </w:tcMar>
+          </w:tcPr>
+          <w:p>
+            <w:pPr>
+              <w:jc w:val="left"/>
+            </w:pPr>
+            <w:r>
+              <w:rPr>
+                <w:rFonts w:ascii="Times New Roman" w:hAnsi="Times New Roman"/>
+                <w:sz w:val="21"/>
+              </w:rPr>
+              <w:t>LEVEL_2_TRUSTED</w:t>
+            </w:r>
+          </w:p>
+        </w:tc>
+        <w:tc>
+          <w:tcPr>
+            <w:tcW w:type="dxa" w:w="1814"/>
+            <w:shd w:fill="FFFFFF"/>
+            <w:tcMar>
+              <w:top w:w="80" w:type="dxa"/>
+              <w:bottom w:w="80" w:type="dxa"/>
+              <w:left w:w="100" w:type="dxa"/>
+              <w:right w:w="100" w:type="dxa"/>
+            </w:tcMar>
+          </w:tcPr>
+          <w:p>
+            <w:pPr>
+              <w:jc w:val="center"/>
+            </w:pPr>
+            <w:r>
+              <w:rPr>
+                <w:rFonts w:ascii="Times New Roman" w:hAnsi="Times New Roman"/>
+                <w:sz w:val="21"/>
+              </w:rPr>
+              <w:t>60 – 84 PTS</w:t>
+            </w:r>
+          </w:p>
+        </w:tc>
+        <w:tc>
+          <w:tcPr>
+            <w:tcW w:type="dxa" w:w="1814"/>
+            <w:shd w:fill="FFFFFF"/>
+            <w:tcMar>
+              <w:top w:w="80" w:type="dxa"/>
+              <w:bottom w:w="80" w:type="dxa"/>
+              <w:left w:w="100" w:type="dxa"/>
+              <w:right w:w="100" w:type="dxa"/>
+            </w:tcMar>
+          </w:tcPr>
+          <w:p>
+            <w:pPr>
+              <w:jc w:val="center"/>
+            </w:pPr>
+            <w:r>
+              <w:rPr>
+                <w:rFonts w:ascii="Times New Roman" w:hAnsi="Times New Roman"/>
+                <w:sz w:val="21"/>
+              </w:rPr>
+              <w:t>10.000.000 VNĐ</w:t>
+            </w:r>
+          </w:p>
+        </w:tc>
+        <w:tc>
+          <w:tcPr>
+            <w:tcW w:type="dxa" w:w="1814"/>
+            <w:shd w:fill="FFFFFF"/>
+            <w:tcMar>
+              <w:top w:w="80" w:type="dxa"/>
+              <w:bottom w:w="80" w:type="dxa"/>
+              <w:left w:w="100" w:type="dxa"/>
+              <w:right w:w="100" w:type="dxa"/>
+            </w:tcMar>
+          </w:tcPr>
+          <w:p>
+            <w:pPr>
+              <w:jc w:val="center"/>
+            </w:pPr>
+            <w:r>
+              <w:rPr>
+                <w:rFonts w:ascii="Times New Roman" w:hAnsi="Times New Roman"/>
+                <w:sz w:val="21"/>
+              </w:rPr>
+              <w:t>20.000.000 VNĐ</w:t>
+            </w:r>
+          </w:p>
+        </w:tc>
+        <w:tc>
+          <w:tcPr>
+            <w:tcW w:type="dxa" w:w="1814"/>
+            <w:shd w:fill="FFFFFF"/>
+            <w:tcMar>
+              <w:top w:w="80" w:type="dxa"/>
+              <w:bottom w:w="80" w:type="dxa"/>
+              <w:left w:w="100" w:type="dxa"/>
+              <w:right w:w="100" w:type="dxa"/>
+            </w:tcMar>
+          </w:tcPr>
+          <w:p>
+            <w:pPr>
+              <w:jc w:val="center"/>
+            </w:pPr>
+            <w:r>
+              <w:rPr>
+                <w:rFonts w:ascii="Times New Roman" w:hAnsi="Times New Roman"/>
+                <w:sz w:val="21"/>
+              </w:rPr>
+              <w:t>Giảm 50% cọc (trả 50%)</w:t>
+            </w:r>
+          </w:p>
+        </w:tc>
+      </w:tr>
+      <w:tr>
+        <w:tc>
+          <w:tcPr>
+            <w:tcW w:type="dxa" w:w="1814"/>
+            <w:shd w:fill="F9FBF9"/>
+            <w:tcMar>
+              <w:top w:w="80" w:type="dxa"/>
+              <w:bottom w:w="80" w:type="dxa"/>
+              <w:left w:w="100" w:type="dxa"/>
+              <w:right w:w="100" w:type="dxa"/>
+            </w:tcMar>
+          </w:tcPr>
+          <w:p>
+            <w:pPr>
+              <w:jc w:val="left"/>
+            </w:pPr>
+            <w:r>
+              <w:rPr>
+                <w:rFonts w:ascii="Times New Roman" w:hAnsi="Times New Roman"/>
+                <w:sz w:val="21"/>
+              </w:rPr>
+              <w:t>LEVEL_3_VIP</w:t>
+            </w:r>
+          </w:p>
+        </w:tc>
+        <w:tc>
+          <w:tcPr>
+            <w:tcW w:type="dxa" w:w="1814"/>
+            <w:shd w:fill="F9FBF9"/>
+            <w:tcMar>
+              <w:top w:w="80" w:type="dxa"/>
+              <w:bottom w:w="80" w:type="dxa"/>
+              <w:left w:w="100" w:type="dxa"/>
+              <w:right w:w="100" w:type="dxa"/>
+            </w:tcMar>
+          </w:tcPr>
+          <w:p>
+            <w:pPr>
+              <w:jc w:val="center"/>
+            </w:pPr>
+            <w:r>
+              <w:rPr>
+                <w:rFonts w:ascii="Times New Roman" w:hAnsi="Times New Roman"/>
+                <w:sz w:val="21"/>
+              </w:rPr>
+              <w:t>85 – 100 PTS</w:t>
+            </w:r>
+          </w:p>
+        </w:tc>
+        <w:tc>
+          <w:tcPr>
+            <w:tcW w:type="dxa" w:w="1814"/>
+            <w:shd w:fill="F9FBF9"/>
+            <w:tcMar>
+              <w:top w:w="80" w:type="dxa"/>
+              <w:bottom w:w="80" w:type="dxa"/>
+              <w:left w:w="100" w:type="dxa"/>
+              <w:right w:w="100" w:type="dxa"/>
+            </w:tcMar>
+          </w:tcPr>
+          <w:p>
+            <w:pPr>
+              <w:jc w:val="center"/>
+            </w:pPr>
+            <w:r>
+              <w:rPr>
+                <w:rFonts w:ascii="Times New Roman" w:hAnsi="Times New Roman"/>
+                <w:sz w:val="21"/>
+              </w:rPr>
+              <w:t>20.000.000 VNĐ</w:t>
+            </w:r>
+          </w:p>
+        </w:tc>
+        <w:tc>
+          <w:tcPr>
+            <w:tcW w:type="dxa" w:w="1814"/>
+            <w:shd w:fill="F9FBF9"/>
+            <w:tcMar>
+              <w:top w:w="80" w:type="dxa"/>
+              <w:bottom w:w="80" w:type="dxa"/>
+              <w:left w:w="100" w:type="dxa"/>
+              <w:right w:w="100" w:type="dxa"/>
+            </w:tcMar>
+          </w:tcPr>
+          <w:p>
+            <w:pPr>
+              <w:jc w:val="center"/>
+            </w:pPr>
+            <w:r>
+              <w:rPr>
+                <w:rFonts w:ascii="Times New Roman" w:hAnsi="Times New Roman"/>
+                <w:sz w:val="21"/>
+              </w:rPr>
+              <w:t>35.000.000 VNĐ</w:t>
+            </w:r>
+          </w:p>
+        </w:tc>
+        <w:tc>
+          <w:tcPr>
+            <w:tcW w:type="dxa" w:w="1814"/>
+            <w:shd w:fill="F9FBF9"/>
+            <w:tcMar>
+              <w:top w:w="80" w:type="dxa"/>
+              <w:bottom w:w="80" w:type="dxa"/>
+              <w:left w:w="100" w:type="dxa"/>
+              <w:right w:w="100" w:type="dxa"/>
+            </w:tcMar>
+          </w:tcPr>
+          <w:p>
+            <w:pPr>
+              <w:jc w:val="center"/>
+            </w:pPr>
+            <w:r>
+              <w:rPr>
+                <w:rFonts w:ascii="Times New Roman" w:hAnsi="Times New Roman"/>
+                <w:sz w:val="21"/>
+              </w:rPr>
+              <w:t>Giảm 75% cọc / Miễn cọc (&lt;1tr)</w:t>
+            </w:r>
+          </w:p>
+        </w:tc>
+      </w:tr>
+    </w:tbl>
     <w:p>
       <w:pPr>
         <w:keepNext/>
@@ -3930,7 +4632,20 @@
           <w:color w:val="183A2D"/>
           <w:sz w:val="26"/>
         </w:rPr>
-        <w:t>1. Tầng Account Trust &amp; Identity as a Privilege</w:t>
+        <w:t>Chi Tiết 4 Lớp Phòng Tuyến Fast-Track (Server-Enforced Defenses)</w:t>
+      </w:r>
+    </w:p>
+    <w:p>
+      <w:pPr>
+        <w:spacing w:after="80"/>
+        <w:jc w:val="both"/>
+      </w:pPr>
+      <w:r>
+        <w:rPr>
+          <w:rFonts w:ascii="Times New Roman" w:hAnsi="Times New Roman"/>
+          <w:sz w:val="25"/>
+        </w:rPr>
+        <w:t>Để ngăn ngừa triệt để các cuộc tấn công chiếm đoạt tài sản có tổ chức (nơi kẻ xấu tạo tài khoản nặc danh để quét đồ giá trị cao), CLOOP thiết lập 4 lớp kiểm soát tuần tự phía máy chủ:</w:t>
       </w:r>
     </w:p>
     <w:p>
@@ -3945,14 +4660,14 @@
           <w:b/>
           <w:sz w:val="25"/>
         </w:rPr>
-        <w:t xml:space="preserve">1. Bản chất &amp; Mục đích: </w:t>
+        <w:t xml:space="preserve">Lớp 0 (Defense 0 - KYC / Student Proof Check): </w:t>
       </w:r>
       <w:r>
         <w:rPr>
           <w:rFonts w:ascii="Times New Roman" w:hAnsi="Times New Roman"/>
           <w:sz w:val="25"/>
         </w:rPr>
-        <w:t>Đăng ký ban đầu cực nhẹ qua Supabase Auth: Chỉ cần Email OTP / Magic Link và Số điện thoại. Xác minh danh tính sinh viên (@edu.vn) hay giấy tờ chỉ xuất hiện như một QUYỀN LỢI (Privilege) khi người dùng chủ động muốn 'Giảm tiền cọc' hoặc 'Mở rộng hạn mức thuê đồ cao cấp'.</w:t>
+        <w:t>Tài khoản mới Level 0 (LEVEL_0_NEW) chưa định danh (isVerified = false) BỊ CHẶN TUYỆT ĐỐI không được phép kích hoạt chế độ Fast-Track. Người dùng bắt buộc phải hoàn tất xác minh Email trường (@edu.vn) hoặc định danh CCCD cơ bản trước khi được quyền nộp cọc 100% để vượt trần.</w:t>
       </w:r>
     </w:p>
     <w:p>
@@ -3967,14 +4682,14 @@
           <w:b/>
           <w:sz w:val="25"/>
         </w:rPr>
-        <w:t xml:space="preserve">2. Lợi ích thực tế: </w:t>
+        <w:t xml:space="preserve">Lớp 1 (Defense 1 - Active Dispute Gate): </w:t>
       </w:r>
       <w:r>
         <w:rPr>
           <w:rFonts w:ascii="Times New Roman" w:hAnsi="Times New Roman"/>
           <w:sz w:val="25"/>
         </w:rPr>
-        <w:t>Giảm thiểu 90% ma sát đăng ký ban đầu cho người dùng trẻ Gen Z; tỷ lệ kích hoạt tài khoản thành công tăng vọt; tôn trọng quyền riêng tư.</w:t>
+        <w:t>Hệ thống kiểm tra lịch sử tài khoản theo thời gian thực. Nếu người dùng đang có bất kỳ hồ sơ khiếu nại tranh chấp nào đang mở (Pending / Under Investigation), tính năng Fast-Track lập tức bị khóa để cách ly rủi ro.</w:t>
       </w:r>
     </w:p>
     <w:p>
@@ -3989,14 +4704,14 @@
           <w:b/>
           <w:sz w:val="25"/>
         </w:rPr>
-        <w:t xml:space="preserve">3. Ưu điểm vượt trội: </w:t>
+        <w:t xml:space="preserve">Lớp 2 (Defense 2 - Concurrency Order Cap): </w:t>
       </w:r>
       <w:r>
         <w:rPr>
           <w:rFonts w:ascii="Times New Roman" w:hAnsi="Times New Roman"/>
           <w:sz w:val="25"/>
         </w:rPr>
-        <w:t>Tách bạch rành mạch giữa 'Account Control' và 'Legal Identity'. Email trường đại học chỉ được gắn nhãn 'Student Email Verified', không đánh đồng là định danh pháp lý tuyệt đối.</w:t>
+        <w:t>Thành viên Level 0 chỉ được phép có DUY NHẤT 1 đơn hàng Fast-Track đang hoạt động tại một thời điểm. Kẻ gian không thể nộp cọc để rút liên tiếp 5-10 chiếc đầm cao cấp cùng lúc rồi bỏ trốn.</w:t>
       </w:r>
     </w:p>
     <w:p>
@@ -4011,286 +4726,14 @@
           <w:b/>
           <w:sz w:val="25"/>
         </w:rPr>
-        <w:t xml:space="preserve">4. Mặt trái &amp; Thách thức tiềm ẩn: </w:t>
+        <w:t xml:space="preserve">Lớp 3 (Defense 3 - Tier Exposure Ceiling): </w:t>
       </w:r>
       <w:r>
         <w:rPr>
           <w:rFonts w:ascii="Times New Roman" w:hAnsi="Times New Roman"/>
           <w:sz w:val="25"/>
         </w:rPr>
-        <w:t>Tài khoản mới chỉ có mức độ tin cậy cơ bản, chưa đủ điều kiện nhận ưu đãi giảm cọc.</w:t>
-      </w:r>
-    </w:p>
-    <w:p>
-      <w:pPr>
-        <w:pStyle w:val="ListBullet"/>
-        <w:spacing w:after="60"/>
-        <w:jc w:val="both"/>
-      </w:pPr>
-      <w:r>
-        <w:rPr>
-          <w:rFonts w:ascii="Times New Roman" w:hAnsi="Times New Roman"/>
-          <w:b/>
-          <w:sz w:val="25"/>
-        </w:rPr>
-        <w:t xml:space="preserve">5. Đề xuất phương án thay thế &amp; Kế hoạch dự phòng: </w:t>
-      </w:r>
-      <w:r>
-        <w:rPr>
-          <w:rFonts w:ascii="Times New Roman" w:hAnsi="Times New Roman"/>
-          <w:sz w:val="25"/>
-        </w:rPr>
-        <w:t>Khuyến khích người dùng liên kết email trường để nhận ngay huy hiệu Sinh viên và giảm 30% cọc cho các đơn dưới 1 triệu.</w:t>
-      </w:r>
-    </w:p>
-    <w:p>
-      <w:pPr>
-        <w:keepNext/>
-        <w:spacing w:before="200" w:after="80"/>
-      </w:pPr>
-      <w:r>
-        <w:rPr>
-          <w:rFonts w:ascii="Times New Roman" w:hAnsi="Times New Roman"/>
-          <w:b/>
-          <w:color w:val="183A2D"/>
-          <w:sz w:val="26"/>
-        </w:rPr>
-        <w:t>2. Dynamic Progressive Trust &amp; Công Thức Cọc Động f(Value, Trust, History)</w:t>
-      </w:r>
-    </w:p>
-    <w:p>
-      <w:pPr>
-        <w:pStyle w:val="ListBullet"/>
-        <w:spacing w:after="60"/>
-        <w:jc w:val="both"/>
-      </w:pPr>
-      <w:r>
-        <w:rPr>
-          <w:rFonts w:ascii="Times New Roman" w:hAnsi="Times New Roman"/>
-          <w:b/>
-          <w:sz w:val="25"/>
-        </w:rPr>
-        <w:t xml:space="preserve">1. Bản chất &amp; Mục đích: </w:t>
-      </w:r>
-      <w:r>
-        <w:rPr>
-          <w:rFonts w:ascii="Times New Roman" w:hAnsi="Times New Roman"/>
-          <w:sz w:val="25"/>
-        </w:rPr>
-        <w:t>Loại bỏ quy tắc cứng nhắc 'Đơn 1 cọc 100%, Đơn 2 cọc 50%, Đơn 3 miễn cọc'. Áp dụng công thức cọc động: Tiền Cọc = f(Giá Trị Đồ, Trust Score, Lịch Sử Đơn Hoàn Tất, Tín Hiệu Rủi Ro). Điểm Trust Score được tích lũy dần qua hành vi trả đồ đúng hẹn, không tranh chấp.</w:t>
-      </w:r>
-    </w:p>
-    <w:p>
-      <w:pPr>
-        <w:pStyle w:val="ListBullet"/>
-        <w:spacing w:after="60"/>
-        <w:jc w:val="both"/>
-      </w:pPr>
-      <w:r>
-        <w:rPr>
-          <w:rFonts w:ascii="Times New Roman" w:hAnsi="Times New Roman"/>
-          <w:b/>
-          <w:sz w:val="25"/>
-        </w:rPr>
-        <w:t xml:space="preserve">2. Lợi ích thực tế: </w:t>
-      </w:r>
-      <w:r>
-        <w:rPr>
-          <w:rFonts w:ascii="Times New Roman" w:hAnsi="Times New Roman"/>
-          <w:sz w:val="25"/>
-        </w:rPr>
-        <w:t>Tạo động lực mạnh mẽ để người dùng giữ gìn đồ và gắn bó lâu dài với sàn; biến Trust Score thành một loại tài sản uy tín cá nhân của chính người dùng.</w:t>
-      </w:r>
-    </w:p>
-    <w:p>
-      <w:pPr>
-        <w:pStyle w:val="ListBullet"/>
-        <w:spacing w:after="60"/>
-        <w:jc w:val="both"/>
-      </w:pPr>
-      <w:r>
-        <w:rPr>
-          <w:rFonts w:ascii="Times New Roman" w:hAnsi="Times New Roman"/>
-          <w:b/>
-          <w:sz w:val="25"/>
-        </w:rPr>
-        <w:t xml:space="preserve">3. Ưu điểm vượt trội: </w:t>
-      </w:r>
-      <w:r>
-        <w:rPr>
-          <w:rFonts w:ascii="Times New Roman" w:hAnsi="Times New Roman"/>
-          <w:sz w:val="25"/>
-        </w:rPr>
-        <w:t>Explainable Trust &amp; Gamified UX: Hiển thị minh bạch lý do tiền cọc thay đổi trên giỏ hàng (Ví dụ: 'Bạn được giảm 50% cọc nhờ Trust Score Hạng A; Hoàn tất đơn này đúng hẹn để nâng hạng VIP!').</w:t>
-      </w:r>
-    </w:p>
-    <w:p>
-      <w:pPr>
-        <w:pStyle w:val="ListBullet"/>
-        <w:spacing w:after="60"/>
-        <w:jc w:val="both"/>
-      </w:pPr>
-      <w:r>
-        <w:rPr>
-          <w:rFonts w:ascii="Times New Roman" w:hAnsi="Times New Roman"/>
-          <w:b/>
-          <w:sz w:val="25"/>
-        </w:rPr>
-        <w:t xml:space="preserve">4. Mặt trái &amp; Thách thức tiềm ẩn: </w:t>
-      </w:r>
-      <w:r>
-        <w:rPr>
-          <w:rFonts w:ascii="Times New Roman" w:hAnsi="Times New Roman"/>
-          <w:sz w:val="25"/>
-        </w:rPr>
-        <w:t>Người dùng có thể thắc mắc tại sao cùng một chiếc váy nhưng 2 tài khoản lại thấy mức cọc khác nhau nếu giao diện không giải thích rõ ràng.</w:t>
-      </w:r>
-    </w:p>
-    <w:p>
-      <w:pPr>
-        <w:pStyle w:val="ListBullet"/>
-        <w:spacing w:after="60"/>
-        <w:jc w:val="both"/>
-      </w:pPr>
-      <w:r>
-        <w:rPr>
-          <w:rFonts w:ascii="Times New Roman" w:hAnsi="Times New Roman"/>
-          <w:b/>
-          <w:sz w:val="25"/>
-        </w:rPr>
-        <w:t xml:space="preserve">5. Đề xuất phương án thay thế &amp; Kế hoạch dự phòng: </w:t>
-      </w:r>
-      <w:r>
-        <w:rPr>
-          <w:rFonts w:ascii="Times New Roman" w:hAnsi="Times New Roman"/>
-          <w:sz w:val="25"/>
-        </w:rPr>
-        <w:t>Gamification giao diện giỏ hàng: Luôn hiển thị dòng chữ giải thích phần tiền cọc được miễn giảm như một 'phần thưởng uy tín'.</w:t>
-      </w:r>
-    </w:p>
-    <w:p>
-      <w:pPr>
-        <w:keepNext/>
-        <w:spacing w:before="200" w:after="80"/>
-      </w:pPr>
-      <w:r>
-        <w:rPr>
-          <w:rFonts w:ascii="Times New Roman" w:hAnsi="Times New Roman"/>
-          <w:b/>
-          <w:color w:val="183A2D"/>
-          <w:sz w:val="26"/>
-        </w:rPr>
-        <w:t>3. Silent Risk Engine &amp; Transaction Exposure Limit</w:t>
-      </w:r>
-    </w:p>
-    <w:p>
-      <w:pPr>
-        <w:pStyle w:val="ListBullet"/>
-        <w:spacing w:after="60"/>
-        <w:jc w:val="both"/>
-      </w:pPr>
-      <w:r>
-        <w:rPr>
-          <w:rFonts w:ascii="Times New Roman" w:hAnsi="Times New Roman"/>
-          <w:b/>
-          <w:sz w:val="25"/>
-        </w:rPr>
-        <w:t xml:space="preserve">1. Bản chất &amp; Mục đích: </w:t>
-      </w:r>
-      <w:r>
-        <w:rPr>
-          <w:rFonts w:ascii="Times New Roman" w:hAnsi="Times New Roman"/>
-          <w:sz w:val="25"/>
-        </w:rPr>
-        <w:t>Chạy ngầm trong Server Actions để giám sát các tín hiệu bất thường: thiết bị mới, nhiều tài khoản chung 1 thiết bị, tỷ lệ hủy đơn cao. Áp dụng Hạn mức Tài sản Đang giữ (Exposure Limit) theo cấp độ tín nhiệm: New User &lt;= 2 triệu; Trusted &lt;= 6 triệu; VIP &lt;= 20 triệu.</w:t>
-      </w:r>
-    </w:p>
-    <w:p>
-      <w:pPr>
-        <w:pStyle w:val="ListBullet"/>
-        <w:spacing w:after="60"/>
-        <w:jc w:val="both"/>
-      </w:pPr>
-      <w:r>
-        <w:rPr>
-          <w:rFonts w:ascii="Times New Roman" w:hAnsi="Times New Roman"/>
-          <w:b/>
-          <w:sz w:val="25"/>
-        </w:rPr>
-        <w:t xml:space="preserve">2. Lợi ích thực tế: </w:t>
-      </w:r>
-      <w:r>
-        <w:rPr>
-          <w:rFonts w:ascii="Times New Roman" w:hAnsi="Times New Roman"/>
-          <w:sz w:val="25"/>
-        </w:rPr>
-        <w:t>Thay vì cố gắng 'chặn 100% người xấu', CLOOP 'giới hạn thiệt hại tối đa' (Damage Isolation) nếu có người xấu vượt qua. Kẻ gian Level 0 chỉ tiếp cận tối đa 1-2 triệu đồng, nằm trong khả năng tự hấp thụ của hệ thống.</w:t>
-      </w:r>
-    </w:p>
-    <w:p>
-      <w:pPr>
-        <w:pStyle w:val="ListBullet"/>
-        <w:spacing w:after="60"/>
-        <w:jc w:val="both"/>
-      </w:pPr>
-      <w:r>
-        <w:rPr>
-          <w:rFonts w:ascii="Times New Roman" w:hAnsi="Times New Roman"/>
-          <w:b/>
-          <w:sz w:val="25"/>
-        </w:rPr>
-        <w:t xml:space="preserve">3. Ưu điểm vượt trội: </w:t>
-      </w:r>
-      <w:r>
-        <w:rPr>
-          <w:rFonts w:ascii="Times New Roman" w:hAnsi="Times New Roman"/>
-          <w:sz w:val="25"/>
-        </w:rPr>
-        <w:t>Friction thông minh: 99% người dùng chân chính không cảm thấy phiền toái, hệ thống chỉ kích hoạt phòng thủ khi phát hiện dấu hiệu bất thường.</w:t>
-      </w:r>
-    </w:p>
-    <w:p>
-      <w:pPr>
-        <w:pStyle w:val="ListBullet"/>
-        <w:spacing w:after="60"/>
-        <w:jc w:val="both"/>
-      </w:pPr>
-      <w:r>
-        <w:rPr>
-          <w:rFonts w:ascii="Times New Roman" w:hAnsi="Times New Roman"/>
-          <w:b/>
-          <w:sz w:val="25"/>
-        </w:rPr>
-        <w:t xml:space="preserve">4. Mặt trái &amp; Thách thức tiềm ẩn: </w:t>
-      </w:r>
-      <w:r>
-        <w:rPr>
-          <w:rFonts w:ascii="Times New Roman" w:hAnsi="Times New Roman"/>
-          <w:sz w:val="25"/>
-        </w:rPr>
-        <w:t>Khách hàng mới có nhu cầu thuê đồ dạ hội đắt tiền ngay lần đầu có thể gặp rào cản hạn mức (The Whale Problem).</w:t>
-      </w:r>
-    </w:p>
-    <w:p>
-      <w:pPr>
-        <w:pStyle w:val="ListBullet"/>
-        <w:spacing w:after="60"/>
-        <w:jc w:val="both"/>
-      </w:pPr>
-      <w:r>
-        <w:rPr>
-          <w:rFonts w:ascii="Times New Roman" w:hAnsi="Times New Roman"/>
-          <w:b/>
-          <w:sz w:val="25"/>
-        </w:rPr>
-        <w:t xml:space="preserve">5. Đề xuất phương án thay thế &amp; Kế hoạch dự phòng: </w:t>
-      </w:r>
-      <w:r>
-        <w:rPr>
-          <w:rFonts w:ascii="Times New Roman" w:hAnsi="Times New Roman"/>
-          <w:sz w:val="25"/>
-        </w:rPr>
-        <w:t>Cơ chế Fast-Track Trust cho khách VIP: Cho phép khách mới thuê đồ giá trị cao nếu tự nguyện cấp bảo lãnh mạnh: (A) Pre-Authorization phong tỏa tạm thời trên thẻ tín dụng quốc tế (không trừ tiền thật) hoặc (B) Đặt cọc 100% tiền mặt qua VietQR.</w:t>
+        <w:t>Ngay cả khi bật Fast-Track và nộp đủ 100% cọc, giá trị món đồ không được vượt quá trần tuyệt đối của hạng tín nhiệm (Level 0 tối đa 6 triệu; Level 1 tối đa 12 triệu; Level 2 tối đa 20 triệu; Level 3 tối đa 35 triệu). Mọi nỗ lực thuê đồ vượt trần hạng sẽ bị hệ thống từ chối.</w:t>
       </w:r>
     </w:p>
     <w:p>
@@ -4689,7 +5132,7 @@
                 <w:rFonts w:ascii="Times New Roman" w:hAnsi="Times New Roman"/>
                 <w:sz w:val="21"/>
               </w:rPr>
-              <w:t>Mã hóa AES-256, chỉ Admin CSKH được truy cập theo phiên</w:t>
+              <w:t>Mã hóa AES-256, che mờ (maskPhone/maskEmail) trên API và UI, chỉ Admin CSKH được truy cập theo phiên</w:t>
             </w:r>
           </w:p>
         </w:tc>
@@ -5055,7 +5498,7 @@
                 <w:rFonts w:ascii="Times New Roman" w:hAnsi="Times New Roman"/>
                 <w:sz w:val="21"/>
               </w:rPr>
-              <w:t>Lưu trữ phân vùng bảo mật riêng (Cold Storage), cấp link có hạn giờ</w:t>
+              <w:t>Lưu trữ phân vùng bảo mật riêng (Cold Storage GCS), cấp link có hạn giờ</w:t>
             </w:r>
           </w:p>
         </w:tc>
@@ -5097,7 +5540,976 @@
           <w:color w:val="0F4A34"/>
           <w:sz w:val="28"/>
         </w:rPr>
-        <w:t>IX. LỘ TRÌNH TRIỂN KHAI 3 GIAI ĐOẠN (PRODUCT ROADMAP)</w:t>
+        <w:t>IX. CHUẨN HÓA THƯƠNG HIỆU &amp; TỐI ƯU TRẢI NGHIỆM NGƯỜI DÙNG (UI/UX POLISHING)</w:t>
+      </w:r>
+    </w:p>
+    <w:p>
+      <w:pPr>
+        <w:spacing w:after="80"/>
+        <w:jc w:val="both"/>
+      </w:pPr>
+      <w:r>
+        <w:rPr>
+          <w:rFonts w:ascii="Times New Roman" w:hAnsi="Times New Roman"/>
+          <w:sz w:val="25"/>
+        </w:rPr>
+        <w:t>Để nâng cao sự tin cậy của nền tảng đối với cả khách hàng cao cấp và các Quỹ đầu tư mạo hiểm, CLOOP đã tiến hành chiến dịch chuẩn hóa giao diện người dùng toàn diện:</w:t>
+      </w:r>
+    </w:p>
+    <w:p>
+      <w:pPr>
+        <w:pStyle w:val="ListBullet"/>
+        <w:spacing w:after="60"/>
+        <w:jc w:val="both"/>
+      </w:pPr>
+      <w:r>
+        <w:rPr>
+          <w:rFonts w:ascii="Times New Roman" w:hAnsi="Times New Roman"/>
+          <w:b/>
+          <w:sz w:val="25"/>
+        </w:rPr>
+        <w:t xml:space="preserve">1. Bãi bỏ 100% biểu tượng sao 4 cánh lấp lánh (Sparkles / ✨ / ✦): </w:t>
+      </w:r>
+      <w:r>
+        <w:rPr>
+          <w:rFonts w:ascii="Times New Roman" w:hAnsi="Times New Roman"/>
+          <w:sz w:val="25"/>
+        </w:rPr>
+        <w:t>Toàn bộ các biểu tượng lấp lánh (Sparkles của thư viện Lucide và các ký tự emoji lấp lánh) từng gây cảm giác thiếu nghiêm túc hoặc tạo ấn tượng 'tiếp thị ảo' đã được gỡ bỏ triệt để khỏi toàn bộ mã nguồn.</w:t>
+      </w:r>
+    </w:p>
+    <w:p>
+      <w:pPr>
+        <w:pStyle w:val="ListBullet"/>
+        <w:spacing w:after="60"/>
+        <w:jc w:val="both"/>
+      </w:pPr>
+      <w:r>
+        <w:rPr>
+          <w:rFonts w:ascii="Times New Roman" w:hAnsi="Times New Roman"/>
+          <w:b/>
+          <w:sz w:val="25"/>
+        </w:rPr>
+        <w:t xml:space="preserve">2. Chuyển đổi sang hệ thống biểu tượng ngữ nghĩa cao cấp (Semantic Icons): </w:t>
+      </w:r>
+      <w:r>
+        <w:rPr>
+          <w:rFonts w:ascii="Times New Roman" w:hAnsi="Times New Roman"/>
+          <w:sz w:val="25"/>
+        </w:rPr>
+        <w:t>Thay thế bằng các biểu tượng chuẩn mực của hệ thống Fintech và Logistics: Khiên bảo chứng (ShieldCheck) cho khối Fast-Track và huy hiệu thành viên; Dấu tích kiểm định (CheckCircle2) cho lịch sử thuê hoàn tất; Đồng hồ thời gian (Clock) cho chặng trải nghiệm sự kiện; Biểu tượng trợ lý thông minh (Bot) cho AI Stylist; và Tia chớp công nghệ (Zap) cho sơ đồ mạch dòng tiền.</w:t>
+      </w:r>
+    </w:p>
+    <w:p>
+      <w:pPr>
+        <w:pStyle w:val="ListBullet"/>
+        <w:spacing w:after="60"/>
+        <w:jc w:val="both"/>
+      </w:pPr>
+      <w:r>
+        <w:rPr>
+          <w:rFonts w:ascii="Times New Roman" w:hAnsi="Times New Roman"/>
+          <w:b/>
+          <w:sz w:val="25"/>
+        </w:rPr>
+        <w:t xml:space="preserve">3. Tối ưu trải nghiệm đặt lịch &amp; Chọn ngày thuê (Preserved Date State): </w:t>
+      </w:r>
+      <w:r>
+        <w:rPr>
+          <w:rFonts w:ascii="Times New Roman" w:hAnsi="Times New Roman"/>
+          <w:sz w:val="25"/>
+        </w:rPr>
+        <w:t>Khắc phục triệt để hiện tượng reset ngày thuê ngoài ý muốn khi người dùng chuyển tab gói dịch vụ hoặc khi hệ thống tính cước GHN. Trạng thái ngày bắt đầu do khách chọn (hasUserCustomizedStartDate) luôn được ưu tiên bảo toàn.</w:t>
+      </w:r>
+    </w:p>
+    <w:p>
+      <w:pPr>
+        <w:keepNext/>
+        <w:spacing w:before="320" w:after="120"/>
+      </w:pPr>
+      <w:r>
+        <w:rPr>
+          <w:rFonts w:ascii="Times New Roman" w:hAnsi="Times New Roman"/>
+          <w:b/>
+          <w:color w:val="0F4A34"/>
+          <w:sz w:val="28"/>
+        </w:rPr>
+        <w:t>X. BÁO CÁO KIỂM THỬ TỰ ĐỘNG &amp; BẢO CHỨNG SẴN SÀNG TRIỂN KHAI (TEST SUITE)</w:t>
+      </w:r>
+    </w:p>
+    <w:p>
+      <w:pPr>
+        <w:spacing w:after="80"/>
+        <w:jc w:val="both"/>
+      </w:pPr>
+      <w:r>
+        <w:rPr>
+          <w:rFonts w:ascii="Times New Roman" w:hAnsi="Times New Roman"/>
+          <w:sz w:val="25"/>
+        </w:rPr>
+        <w:t>Hệ thống CLOOP được trang bị bộ kiểm thử tự động toàn diện hai lớp (Unit Tests &amp; Integration Tests) chạy trực tiếp trên mã nguồn TypeScript, đảm bảo mọi logic kinh tế học và an ninh đều được bảo chứng trước khi đưa vào sản xuất:</w:t>
+      </w:r>
+    </w:p>
+    <w:tbl>
+      <w:tblPr>
+        <w:tblW w:type="auto" w:w="0"/>
+        <w:jc w:val="center"/>
+        <w:tblLook w:firstColumn="1" w:firstRow="1" w:lastColumn="0" w:lastRow="0" w:noHBand="0" w:noVBand="1" w:val="04A0"/>
+        <w:tblBorders>
+          <w:top w:val="single" w:sz="6" w:space="0" w:color="D3D3D3"/>
+          <w:bottom w:val="single" w:sz="6" w:space="0" w:color="D3D3D3"/>
+          <w:insideH w:val="single" w:sz="4" w:space="0" w:color="D3D3D3"/>
+          <w:insideV w:val="none"/>
+          <w:left w:val="none"/>
+          <w:right w:val="none"/>
+        </w:tblBorders>
+      </w:tblPr>
+      <w:tblGrid>
+        <w:gridCol w:w="2268"/>
+        <w:gridCol w:w="2268"/>
+        <w:gridCol w:w="2268"/>
+        <w:gridCol w:w="2268"/>
+      </w:tblGrid>
+      <w:tr>
+        <w:tc>
+          <w:tcPr>
+            <w:tcW w:type="dxa" w:w="2268"/>
+            <w:shd w:fill="E6F4EA"/>
+            <w:tcMar>
+              <w:top w:w="120" w:type="dxa"/>
+              <w:bottom w:w="120" w:type="dxa"/>
+              <w:left w:w="100" w:type="dxa"/>
+              <w:right w:w="100" w:type="dxa"/>
+            </w:tcMar>
+          </w:tcPr>
+          <w:p>
+            <w:pPr>
+              <w:jc w:val="center"/>
+            </w:pPr>
+            <w:r>
+              <w:rPr>
+                <w:rFonts w:ascii="Times New Roman" w:hAnsi="Times New Roman"/>
+                <w:b/>
+                <w:color w:val="0A2517"/>
+                <w:sz w:val="22"/>
+              </w:rPr>
+              <w:t>Phân Nhóm Kiểm Thử</w:t>
+            </w:r>
+          </w:p>
+        </w:tc>
+        <w:tc>
+          <w:tcPr>
+            <w:tcW w:type="dxa" w:w="2268"/>
+            <w:shd w:fill="E6F4EA"/>
+            <w:tcMar>
+              <w:top w:w="120" w:type="dxa"/>
+              <w:bottom w:w="120" w:type="dxa"/>
+              <w:left w:w="100" w:type="dxa"/>
+              <w:right w:w="100" w:type="dxa"/>
+            </w:tcMar>
+          </w:tcPr>
+          <w:p>
+            <w:pPr>
+              <w:jc w:val="center"/>
+            </w:pPr>
+            <w:r>
+              <w:rPr>
+                <w:rFonts w:ascii="Times New Roman" w:hAnsi="Times New Roman"/>
+                <w:b/>
+                <w:color w:val="0A2517"/>
+                <w:sz w:val="22"/>
+              </w:rPr>
+              <w:t>Số Lượng Bài Test</w:t>
+            </w:r>
+          </w:p>
+        </w:tc>
+        <w:tc>
+          <w:tcPr>
+            <w:tcW w:type="dxa" w:w="2268"/>
+            <w:shd w:fill="E6F4EA"/>
+            <w:tcMar>
+              <w:top w:w="120" w:type="dxa"/>
+              <w:bottom w:w="120" w:type="dxa"/>
+              <w:left w:w="100" w:type="dxa"/>
+              <w:right w:w="100" w:type="dxa"/>
+            </w:tcMar>
+          </w:tcPr>
+          <w:p>
+            <w:pPr>
+              <w:jc w:val="center"/>
+            </w:pPr>
+            <w:r>
+              <w:rPr>
+                <w:rFonts w:ascii="Times New Roman" w:hAnsi="Times New Roman"/>
+                <w:b/>
+                <w:color w:val="0A2517"/>
+                <w:sz w:val="22"/>
+              </w:rPr>
+              <w:t>Trọng Tâm Xác Thực</w:t>
+            </w:r>
+          </w:p>
+        </w:tc>
+        <w:tc>
+          <w:tcPr>
+            <w:tcW w:type="dxa" w:w="2268"/>
+            <w:shd w:fill="E6F4EA"/>
+            <w:tcMar>
+              <w:top w:w="120" w:type="dxa"/>
+              <w:bottom w:w="120" w:type="dxa"/>
+              <w:left w:w="100" w:type="dxa"/>
+              <w:right w:w="100" w:type="dxa"/>
+            </w:tcMar>
+          </w:tcPr>
+          <w:p>
+            <w:pPr>
+              <w:jc w:val="center"/>
+            </w:pPr>
+            <w:r>
+              <w:rPr>
+                <w:rFonts w:ascii="Times New Roman" w:hAnsi="Times New Roman"/>
+                <w:b/>
+                <w:color w:val="0A2517"/>
+                <w:sz w:val="22"/>
+              </w:rPr>
+              <w:t>Kết Quả Thực Tế</w:t>
+            </w:r>
+          </w:p>
+        </w:tc>
+      </w:tr>
+      <w:tr>
+        <w:tc>
+          <w:tcPr>
+            <w:tcW w:type="dxa" w:w="2268"/>
+            <w:shd w:fill="FFFFFF"/>
+            <w:tcMar>
+              <w:top w:w="80" w:type="dxa"/>
+              <w:bottom w:w="80" w:type="dxa"/>
+              <w:left w:w="100" w:type="dxa"/>
+              <w:right w:w="100" w:type="dxa"/>
+            </w:tcMar>
+          </w:tcPr>
+          <w:p>
+            <w:pPr>
+              <w:jc w:val="left"/>
+            </w:pPr>
+            <w:r>
+              <w:rPr>
+                <w:rFonts w:ascii="Times New Roman" w:hAnsi="Times New Roman"/>
+                <w:sz w:val="21"/>
+              </w:rPr>
+              <w:t>1. Định Giá Tài Sản Chuẩn Hóa (getItemValuation)</w:t>
+            </w:r>
+          </w:p>
+        </w:tc>
+        <w:tc>
+          <w:tcPr>
+            <w:tcW w:type="dxa" w:w="2268"/>
+            <w:shd w:fill="FFFFFF"/>
+            <w:tcMar>
+              <w:top w:w="80" w:type="dxa"/>
+              <w:bottom w:w="80" w:type="dxa"/>
+              <w:left w:w="100" w:type="dxa"/>
+              <w:right w:w="100" w:type="dxa"/>
+            </w:tcMar>
+          </w:tcPr>
+          <w:p>
+            <w:pPr>
+              <w:jc w:val="center"/>
+            </w:pPr>
+            <w:r>
+              <w:rPr>
+                <w:rFonts w:ascii="Times New Roman" w:hAnsi="Times New Roman"/>
+                <w:sz w:val="21"/>
+              </w:rPr>
+              <w:t>5 tests</w:t>
+            </w:r>
+          </w:p>
+        </w:tc>
+        <w:tc>
+          <w:tcPr>
+            <w:tcW w:type="dxa" w:w="2268"/>
+            <w:shd w:fill="FFFFFF"/>
+            <w:tcMar>
+              <w:top w:w="80" w:type="dxa"/>
+              <w:bottom w:w="80" w:type="dxa"/>
+              <w:left w:w="100" w:type="dxa"/>
+              <w:right w:w="100" w:type="dxa"/>
+            </w:tcMar>
+          </w:tcPr>
+          <w:p>
+            <w:pPr>
+              <w:jc w:val="left"/>
+            </w:pPr>
+            <w:r>
+              <w:rPr>
+                <w:rFonts w:ascii="Times New Roman" w:hAnsi="Times New Roman"/>
+                <w:sz w:val="21"/>
+              </w:rPr>
+              <w:t>Sàn giá 500k, tỷ lệ giá bán/giá gốc/giá thuê, fallback an toàn</w:t>
+            </w:r>
+          </w:p>
+        </w:tc>
+        <w:tc>
+          <w:tcPr>
+            <w:tcW w:type="dxa" w:w="2268"/>
+            <w:shd w:fill="FFFFFF"/>
+            <w:tcMar>
+              <w:top w:w="80" w:type="dxa"/>
+              <w:bottom w:w="80" w:type="dxa"/>
+              <w:left w:w="100" w:type="dxa"/>
+              <w:right w:w="100" w:type="dxa"/>
+            </w:tcMar>
+          </w:tcPr>
+          <w:p>
+            <w:pPr>
+              <w:jc w:val="center"/>
+            </w:pPr>
+            <w:r>
+              <w:rPr>
+                <w:rFonts w:ascii="Times New Roman" w:hAnsi="Times New Roman"/>
+                <w:sz w:val="21"/>
+              </w:rPr>
+              <w:t>5/5 PASSED (100%)</w:t>
+            </w:r>
+          </w:p>
+        </w:tc>
+      </w:tr>
+      <w:tr>
+        <w:tc>
+          <w:tcPr>
+            <w:tcW w:type="dxa" w:w="2268"/>
+            <w:shd w:fill="F9FBF9"/>
+            <w:tcMar>
+              <w:top w:w="80" w:type="dxa"/>
+              <w:bottom w:w="80" w:type="dxa"/>
+              <w:left w:w="100" w:type="dxa"/>
+              <w:right w:w="100" w:type="dxa"/>
+            </w:tcMar>
+          </w:tcPr>
+          <w:p>
+            <w:pPr>
+              <w:jc w:val="left"/>
+            </w:pPr>
+            <w:r>
+              <w:rPr>
+                <w:rFonts w:ascii="Times New Roman" w:hAnsi="Times New Roman"/>
+                <w:sz w:val="21"/>
+              </w:rPr>
+              <w:t>2. Thuật Toán Trust Score &amp; Phân Hạng Tín Nhiệm</w:t>
+            </w:r>
+          </w:p>
+        </w:tc>
+        <w:tc>
+          <w:tcPr>
+            <w:tcW w:type="dxa" w:w="2268"/>
+            <w:shd w:fill="F9FBF9"/>
+            <w:tcMar>
+              <w:top w:w="80" w:type="dxa"/>
+              <w:bottom w:w="80" w:type="dxa"/>
+              <w:left w:w="100" w:type="dxa"/>
+              <w:right w:w="100" w:type="dxa"/>
+            </w:tcMar>
+          </w:tcPr>
+          <w:p>
+            <w:pPr>
+              <w:jc w:val="center"/>
+            </w:pPr>
+            <w:r>
+              <w:rPr>
+                <w:rFonts w:ascii="Times New Roman" w:hAnsi="Times New Roman"/>
+                <w:sz w:val="21"/>
+              </w:rPr>
+              <w:t>5 tests</w:t>
+            </w:r>
+          </w:p>
+        </w:tc>
+        <w:tc>
+          <w:tcPr>
+            <w:tcW w:type="dxa" w:w="2268"/>
+            <w:shd w:fill="F9FBF9"/>
+            <w:tcMar>
+              <w:top w:w="80" w:type="dxa"/>
+              <w:bottom w:w="80" w:type="dxa"/>
+              <w:left w:w="100" w:type="dxa"/>
+              <w:right w:w="100" w:type="dxa"/>
+            </w:tcMar>
+          </w:tcPr>
+          <w:p>
+            <w:pPr>
+              <w:jc w:val="left"/>
+            </w:pPr>
+            <w:r>
+              <w:rPr>
+                <w:rFonts w:ascii="Times New Roman" w:hAnsi="Times New Roman"/>
+                <w:sz w:val="21"/>
+              </w:rPr>
+              <w:t>Khởi tạo Level 0, email sinh viên, lũy thừa đơn hàng, trừ điểm khiếu nại</w:t>
+            </w:r>
+          </w:p>
+        </w:tc>
+        <w:tc>
+          <w:tcPr>
+            <w:tcW w:type="dxa" w:w="2268"/>
+            <w:shd w:fill="F9FBF9"/>
+            <w:tcMar>
+              <w:top w:w="80" w:type="dxa"/>
+              <w:bottom w:w="80" w:type="dxa"/>
+              <w:left w:w="100" w:type="dxa"/>
+              <w:right w:w="100" w:type="dxa"/>
+            </w:tcMar>
+          </w:tcPr>
+          <w:p>
+            <w:pPr>
+              <w:jc w:val="center"/>
+            </w:pPr>
+            <w:r>
+              <w:rPr>
+                <w:rFonts w:ascii="Times New Roman" w:hAnsi="Times New Roman"/>
+                <w:sz w:val="21"/>
+              </w:rPr>
+              <w:t>5/5 PASSED (100%)</w:t>
+            </w:r>
+          </w:p>
+        </w:tc>
+      </w:tr>
+      <w:tr>
+        <w:tc>
+          <w:tcPr>
+            <w:tcW w:type="dxa" w:w="2268"/>
+            <w:shd w:fill="FFFFFF"/>
+            <w:tcMar>
+              <w:top w:w="80" w:type="dxa"/>
+              <w:bottom w:w="80" w:type="dxa"/>
+              <w:left w:w="100" w:type="dxa"/>
+              <w:right w:w="100" w:type="dxa"/>
+            </w:tcMar>
+          </w:tcPr>
+          <w:p>
+            <w:pPr>
+              <w:jc w:val="left"/>
+            </w:pPr>
+            <w:r>
+              <w:rPr>
+                <w:rFonts w:ascii="Times New Roman" w:hAnsi="Times New Roman"/>
+                <w:sz w:val="21"/>
+              </w:rPr>
+              <w:t>3. Công Thức Cọc Động (Dynamic Deposit)</w:t>
+            </w:r>
+          </w:p>
+        </w:tc>
+        <w:tc>
+          <w:tcPr>
+            <w:tcW w:type="dxa" w:w="2268"/>
+            <w:shd w:fill="FFFFFF"/>
+            <w:tcMar>
+              <w:top w:w="80" w:type="dxa"/>
+              <w:bottom w:w="80" w:type="dxa"/>
+              <w:left w:w="100" w:type="dxa"/>
+              <w:right w:w="100" w:type="dxa"/>
+            </w:tcMar>
+          </w:tcPr>
+          <w:p>
+            <w:pPr>
+              <w:jc w:val="center"/>
+            </w:pPr>
+            <w:r>
+              <w:rPr>
+                <w:rFonts w:ascii="Times New Roman" w:hAnsi="Times New Roman"/>
+                <w:sz w:val="21"/>
+              </w:rPr>
+              <w:t>6 tests</w:t>
+            </w:r>
+          </w:p>
+        </w:tc>
+        <w:tc>
+          <w:tcPr>
+            <w:tcW w:type="dxa" w:w="2268"/>
+            <w:shd w:fill="FFFFFF"/>
+            <w:tcMar>
+              <w:top w:w="80" w:type="dxa"/>
+              <w:bottom w:w="80" w:type="dxa"/>
+              <w:left w:w="100" w:type="dxa"/>
+              <w:right w:w="100" w:type="dxa"/>
+            </w:tcMar>
+          </w:tcPr>
+          <w:p>
+            <w:pPr>
+              <w:jc w:val="left"/>
+            </w:pPr>
+            <w:r>
+              <w:rPr>
+                <w:rFonts w:ascii="Times New Roman" w:hAnsi="Times New Roman"/>
+                <w:sz w:val="21"/>
+              </w:rPr>
+              <w:t>Tỷ lệ cọc 100% -&gt; 75% -&gt; 50% -&gt; 25% -&gt; 0đ, ép cọc 100% khi Fast-Track</w:t>
+            </w:r>
+          </w:p>
+        </w:tc>
+        <w:tc>
+          <w:tcPr>
+            <w:tcW w:type="dxa" w:w="2268"/>
+            <w:shd w:fill="FFFFFF"/>
+            <w:tcMar>
+              <w:top w:w="80" w:type="dxa"/>
+              <w:bottom w:w="80" w:type="dxa"/>
+              <w:left w:w="100" w:type="dxa"/>
+              <w:right w:w="100" w:type="dxa"/>
+            </w:tcMar>
+          </w:tcPr>
+          <w:p>
+            <w:pPr>
+              <w:jc w:val="center"/>
+            </w:pPr>
+            <w:r>
+              <w:rPr>
+                <w:rFonts w:ascii="Times New Roman" w:hAnsi="Times New Roman"/>
+                <w:sz w:val="21"/>
+              </w:rPr>
+              <w:t>6/6 PASSED (100%)</w:t>
+            </w:r>
+          </w:p>
+        </w:tc>
+      </w:tr>
+      <w:tr>
+        <w:tc>
+          <w:tcPr>
+            <w:tcW w:type="dxa" w:w="2268"/>
+            <w:shd w:fill="F9FBF9"/>
+            <w:tcMar>
+              <w:top w:w="80" w:type="dxa"/>
+              <w:bottom w:w="80" w:type="dxa"/>
+              <w:left w:w="100" w:type="dxa"/>
+              <w:right w:w="100" w:type="dxa"/>
+            </w:tcMar>
+          </w:tcPr>
+          <w:p>
+            <w:pPr>
+              <w:jc w:val="left"/>
+            </w:pPr>
+            <w:r>
+              <w:rPr>
+                <w:rFonts w:ascii="Times New Roman" w:hAnsi="Times New Roman"/>
+                <w:sz w:val="21"/>
+              </w:rPr>
+              <w:t>4. Trần Thiệt Hại &amp; Hạn Mức Tín Nhiệm</w:t>
+            </w:r>
+          </w:p>
+        </w:tc>
+        <w:tc>
+          <w:tcPr>
+            <w:tcW w:type="dxa" w:w="2268"/>
+            <w:shd w:fill="F9FBF9"/>
+            <w:tcMar>
+              <w:top w:w="80" w:type="dxa"/>
+              <w:bottom w:w="80" w:type="dxa"/>
+              <w:left w:w="100" w:type="dxa"/>
+              <w:right w:w="100" w:type="dxa"/>
+            </w:tcMar>
+          </w:tcPr>
+          <w:p>
+            <w:pPr>
+              <w:jc w:val="center"/>
+            </w:pPr>
+            <w:r>
+              <w:rPr>
+                <w:rFonts w:ascii="Times New Roman" w:hAnsi="Times New Roman"/>
+                <w:sz w:val="21"/>
+              </w:rPr>
+              <w:t>1 test</w:t>
+            </w:r>
+          </w:p>
+        </w:tc>
+        <w:tc>
+          <w:tcPr>
+            <w:tcW w:type="dxa" w:w="2268"/>
+            <w:shd w:fill="F9FBF9"/>
+            <w:tcMar>
+              <w:top w:w="80" w:type="dxa"/>
+              <w:bottom w:w="80" w:type="dxa"/>
+              <w:left w:w="100" w:type="dxa"/>
+              <w:right w:w="100" w:type="dxa"/>
+            </w:tcMar>
+          </w:tcPr>
+          <w:p>
+            <w:pPr>
+              <w:jc w:val="left"/>
+            </w:pPr>
+            <w:r>
+              <w:rPr>
+                <w:rFonts w:ascii="Times New Roman" w:hAnsi="Times New Roman"/>
+                <w:sz w:val="21"/>
+              </w:rPr>
+              <w:t>Kiểm tra trần Fast-Track tuyệt đối theo từng cấp độ tín nhiệm</w:t>
+            </w:r>
+          </w:p>
+        </w:tc>
+        <w:tc>
+          <w:tcPr>
+            <w:tcW w:type="dxa" w:w="2268"/>
+            <w:shd w:fill="F9FBF9"/>
+            <w:tcMar>
+              <w:top w:w="80" w:type="dxa"/>
+              <w:bottom w:w="80" w:type="dxa"/>
+              <w:left w:w="100" w:type="dxa"/>
+              <w:right w:w="100" w:type="dxa"/>
+            </w:tcMar>
+          </w:tcPr>
+          <w:p>
+            <w:pPr>
+              <w:jc w:val="center"/>
+            </w:pPr>
+            <w:r>
+              <w:rPr>
+                <w:rFonts w:ascii="Times New Roman" w:hAnsi="Times New Roman"/>
+                <w:sz w:val="21"/>
+              </w:rPr>
+              <w:t>1/1 PASSED (100%)</w:t>
+            </w:r>
+          </w:p>
+        </w:tc>
+      </w:tr>
+      <w:tr>
+        <w:tc>
+          <w:tcPr>
+            <w:tcW w:type="dxa" w:w="2268"/>
+            <w:shd w:fill="FFFFFF"/>
+            <w:tcMar>
+              <w:top w:w="80" w:type="dxa"/>
+              <w:bottom w:w="80" w:type="dxa"/>
+              <w:left w:w="100" w:type="dxa"/>
+              <w:right w:w="100" w:type="dxa"/>
+            </w:tcMar>
+          </w:tcPr>
+          <w:p>
+            <w:pPr>
+              <w:jc w:val="left"/>
+            </w:pPr>
+            <w:r>
+              <w:rPr>
+                <w:rFonts w:ascii="Times New Roman" w:hAnsi="Times New Roman"/>
+                <w:sz w:val="21"/>
+              </w:rPr>
+              <w:t>5. Nguyên Lý Bảo Toàn Quỹ Tranh Chấp (Dispute Math)</w:t>
+            </w:r>
+          </w:p>
+        </w:tc>
+        <w:tc>
+          <w:tcPr>
+            <w:tcW w:type="dxa" w:w="2268"/>
+            <w:shd w:fill="FFFFFF"/>
+            <w:tcMar>
+              <w:top w:w="80" w:type="dxa"/>
+              <w:bottom w:w="80" w:type="dxa"/>
+              <w:left w:w="100" w:type="dxa"/>
+              <w:right w:w="100" w:type="dxa"/>
+            </w:tcMar>
+          </w:tcPr>
+          <w:p>
+            <w:pPr>
+              <w:jc w:val="center"/>
+            </w:pPr>
+            <w:r>
+              <w:rPr>
+                <w:rFonts w:ascii="Times New Roman" w:hAnsi="Times New Roman"/>
+                <w:sz w:val="21"/>
+              </w:rPr>
+              <w:t>4 tests</w:t>
+            </w:r>
+          </w:p>
+        </w:tc>
+        <w:tc>
+          <w:tcPr>
+            <w:tcW w:type="dxa" w:w="2268"/>
+            <w:shd w:fill="FFFFFF"/>
+            <w:tcMar>
+              <w:top w:w="80" w:type="dxa"/>
+              <w:bottom w:w="80" w:type="dxa"/>
+              <w:left w:w="100" w:type="dxa"/>
+              <w:right w:w="100" w:type="dxa"/>
+            </w:tcMar>
+          </w:tcPr>
+          <w:p>
+            <w:pPr>
+              <w:jc w:val="left"/>
+            </w:pPr>
+            <w:r>
+              <w:rPr>
+                <w:rFonts w:ascii="Times New Roman" w:hAnsi="Times New Roman"/>
+                <w:sz w:val="21"/>
+              </w:rPr>
+              <w:t>Khấu trừ 100%, một phần, 0% (Wear &amp; Tear), từ chối số âm/vượt cọc</w:t>
+            </w:r>
+          </w:p>
+        </w:tc>
+        <w:tc>
+          <w:tcPr>
+            <w:tcW w:type="dxa" w:w="2268"/>
+            <w:shd w:fill="FFFFFF"/>
+            <w:tcMar>
+              <w:top w:w="80" w:type="dxa"/>
+              <w:bottom w:w="80" w:type="dxa"/>
+              <w:left w:w="100" w:type="dxa"/>
+              <w:right w:w="100" w:type="dxa"/>
+            </w:tcMar>
+          </w:tcPr>
+          <w:p>
+            <w:pPr>
+              <w:jc w:val="center"/>
+            </w:pPr>
+            <w:r>
+              <w:rPr>
+                <w:rFonts w:ascii="Times New Roman" w:hAnsi="Times New Roman"/>
+                <w:sz w:val="21"/>
+              </w:rPr>
+              <w:t>4/4 PASSED (100%)</w:t>
+            </w:r>
+          </w:p>
+        </w:tc>
+      </w:tr>
+      <w:tr>
+        <w:tc>
+          <w:tcPr>
+            <w:tcW w:type="dxa" w:w="2268"/>
+            <w:shd w:fill="F9FBF9"/>
+            <w:tcMar>
+              <w:top w:w="80" w:type="dxa"/>
+              <w:bottom w:w="80" w:type="dxa"/>
+              <w:left w:w="100" w:type="dxa"/>
+              <w:right w:w="100" w:type="dxa"/>
+            </w:tcMar>
+          </w:tcPr>
+          <w:p>
+            <w:pPr>
+              <w:jc w:val="left"/>
+            </w:pPr>
+            <w:r>
+              <w:rPr>
+                <w:rFonts w:ascii="Times New Roman" w:hAnsi="Times New Roman"/>
+                <w:sz w:val="21"/>
+              </w:rPr>
+              <w:t>6. Bảo Mật Dữ Liệu &amp; Masking (Luật 91/2025/QH15)</w:t>
+            </w:r>
+          </w:p>
+        </w:tc>
+        <w:tc>
+          <w:tcPr>
+            <w:tcW w:type="dxa" w:w="2268"/>
+            <w:shd w:fill="F9FBF9"/>
+            <w:tcMar>
+              <w:top w:w="80" w:type="dxa"/>
+              <w:bottom w:w="80" w:type="dxa"/>
+              <w:left w:w="100" w:type="dxa"/>
+              <w:right w:w="100" w:type="dxa"/>
+            </w:tcMar>
+          </w:tcPr>
+          <w:p>
+            <w:pPr>
+              <w:jc w:val="center"/>
+            </w:pPr>
+            <w:r>
+              <w:rPr>
+                <w:rFonts w:ascii="Times New Roman" w:hAnsi="Times New Roman"/>
+                <w:sz w:val="21"/>
+              </w:rPr>
+              <w:t>2 tests</w:t>
+            </w:r>
+          </w:p>
+        </w:tc>
+        <w:tc>
+          <w:tcPr>
+            <w:tcW w:type="dxa" w:w="2268"/>
+            <w:shd w:fill="F9FBF9"/>
+            <w:tcMar>
+              <w:top w:w="80" w:type="dxa"/>
+              <w:bottom w:w="80" w:type="dxa"/>
+              <w:left w:w="100" w:type="dxa"/>
+              <w:right w:w="100" w:type="dxa"/>
+            </w:tcMar>
+          </w:tcPr>
+          <w:p>
+            <w:pPr>
+              <w:jc w:val="left"/>
+            </w:pPr>
+            <w:r>
+              <w:rPr>
+                <w:rFonts w:ascii="Times New Roman" w:hAnsi="Times New Roman"/>
+                <w:sz w:val="21"/>
+              </w:rPr>
+              <w:t>Che mờ số điện thoại (maskPhone) và email (maskEmail) chuẩn xác</w:t>
+            </w:r>
+          </w:p>
+        </w:tc>
+        <w:tc>
+          <w:tcPr>
+            <w:tcW w:type="dxa" w:w="2268"/>
+            <w:shd w:fill="F9FBF9"/>
+            <w:tcMar>
+              <w:top w:w="80" w:type="dxa"/>
+              <w:bottom w:w="80" w:type="dxa"/>
+              <w:left w:w="100" w:type="dxa"/>
+              <w:right w:w="100" w:type="dxa"/>
+            </w:tcMar>
+          </w:tcPr>
+          <w:p>
+            <w:pPr>
+              <w:jc w:val="center"/>
+            </w:pPr>
+            <w:r>
+              <w:rPr>
+                <w:rFonts w:ascii="Times New Roman" w:hAnsi="Times New Roman"/>
+                <w:sz w:val="21"/>
+              </w:rPr>
+              <w:t>2/2 PASSED (100%)</w:t>
+            </w:r>
+          </w:p>
+        </w:tc>
+      </w:tr>
+    </w:tbl>
+    <w:p>
+      <w:pPr>
+        <w:spacing w:after="80"/>
+        <w:jc w:val="both"/>
+      </w:pPr>
+      <w:r>
+        <w:rPr>
+          <w:rFonts w:ascii="Times New Roman" w:hAnsi="Times New Roman"/>
+          <w:b/>
+          <w:color w:val="111827"/>
+          <w:sz w:val="25"/>
+        </w:rPr>
+        <w:t xml:space="preserve">Bảo chứng Giao dịch &amp; An ninh Đám mây (14/14 Integration Tests PASSED): </w:t>
+      </w:r>
+      <w:r>
+        <w:rPr>
+          <w:rFonts w:ascii="Times New Roman" w:hAnsi="Times New Roman"/>
+          <w:sz w:val="25"/>
+        </w:rPr>
+        <w:t>Bên cạnh 23 Unit Tests, bộ 14 Integration Tests (Fail-Closed &amp; Transactions) xác nhận tính toàn vẹn của hệ thống khi chạy thực tế:</w:t>
+      </w:r>
+    </w:p>
+    <w:p>
+      <w:pPr>
+        <w:pStyle w:val="ListBullet"/>
+        <w:spacing w:after="60"/>
+        <w:jc w:val="both"/>
+      </w:pPr>
+      <w:r>
+        <w:rPr>
+          <w:rFonts w:ascii="Times New Roman" w:hAnsi="Times New Roman"/>
+          <w:b/>
+          <w:sz w:val="25"/>
+        </w:rPr>
+        <w:t xml:space="preserve">• Atomicity &amp; Rollback: </w:t>
+      </w:r>
+      <w:r>
+        <w:rPr>
+          <w:rFonts w:ascii="Times New Roman" w:hAnsi="Times New Roman"/>
+          <w:sz w:val="25"/>
+        </w:rPr>
+        <w:t>Đảm bảo hủy toàn bộ phiên giao dịch cơ sở dữ liệu nếu có lỗi, không sinh dữ liệu mồ côi.</w:t>
+      </w:r>
+    </w:p>
+    <w:p>
+      <w:pPr>
+        <w:pStyle w:val="ListBullet"/>
+        <w:spacing w:after="60"/>
+        <w:jc w:val="both"/>
+      </w:pPr>
+      <w:r>
+        <w:rPr>
+          <w:rFonts w:ascii="Times New Roman" w:hAnsi="Times New Roman"/>
+          <w:b/>
+          <w:sz w:val="25"/>
+        </w:rPr>
+        <w:t xml:space="preserve">• Mật mã Webhook PayOS: </w:t>
+      </w:r>
+      <w:r>
+        <w:rPr>
+          <w:rFonts w:ascii="Times New Roman" w:hAnsi="Times New Roman"/>
+          <w:sz w:val="25"/>
+        </w:rPr>
+        <w:t>Xác thực chữ ký HMAC-SHA256, từ chối gói tin bị sửa đổi số tiền, chống chi tiêu lặp (Idempotency).</w:t>
+      </w:r>
+    </w:p>
+    <w:p>
+      <w:pPr>
+        <w:pStyle w:val="ListBullet"/>
+        <w:spacing w:after="60"/>
+        <w:jc w:val="both"/>
+      </w:pPr>
+      <w:r>
+        <w:rPr>
+          <w:rFonts w:ascii="Times New Roman" w:hAnsi="Times New Roman"/>
+          <w:b/>
+          <w:sz w:val="25"/>
+        </w:rPr>
+        <w:t xml:space="preserve">• GCS Fail-Closed Policy: </w:t>
+      </w:r>
+      <w:r>
+        <w:rPr>
+          <w:rFonts w:ascii="Times New Roman" w:hAnsi="Times New Roman"/>
+          <w:sz w:val="25"/>
+        </w:rPr>
+        <w:t>Từ chối mọi yêu cầu đọc/ghi khi thiếu thông tin xác thực đám mây, từ chối file không tồn tại, không dùng mock fallback.</w:t>
+      </w:r>
+    </w:p>
+    <w:p>
+      <w:pPr>
+        <w:pStyle w:val="ListBullet"/>
+        <w:spacing w:after="60"/>
+        <w:jc w:val="both"/>
+      </w:pPr>
+      <w:r>
+        <w:rPr>
+          <w:rFonts w:ascii="Times New Roman" w:hAnsi="Times New Roman"/>
+          <w:b/>
+          <w:sz w:val="25"/>
+        </w:rPr>
+        <w:t xml:space="preserve">• Fast-Track 4 Phòng Tuyến: </w:t>
+      </w:r>
+      <w:r>
+        <w:rPr>
+          <w:rFonts w:ascii="Times New Roman" w:hAnsi="Times New Roman"/>
+          <w:sz w:val="25"/>
+        </w:rPr>
+        <w:t>Xác thực chặn đứng tài khoản Level 0 chưa eKYC, chặn tài khoản đang có tranh chấp, chặn vượt quá 1 đơn đồng thời, chặn vượt trần tài sản.</w:t>
+      </w:r>
+    </w:p>
+    <w:p>
+      <w:pPr>
+        <w:pStyle w:val="ListBullet"/>
+        <w:spacing w:after="60"/>
+        <w:jc w:val="both"/>
+      </w:pPr>
+      <w:r>
+        <w:rPr>
+          <w:rFonts w:ascii="Times New Roman" w:hAnsi="Times New Roman"/>
+          <w:b/>
+          <w:sz w:val="25"/>
+        </w:rPr>
+        <w:t xml:space="preserve">• Zero IDOR Authorization: </w:t>
+      </w:r>
+      <w:r>
+        <w:rPr>
+          <w:rFonts w:ascii="Times New Roman" w:hAnsi="Times New Roman"/>
+          <w:sz w:val="25"/>
+        </w:rPr>
+        <w:t>Bảo đảm người dùng chỉ được quyền truy xuất các tập tin bằng chứng thuộc chính đơn hàng tranh chấp của mình.</w:t>
+      </w:r>
+    </w:p>
+    <w:p>
+      <w:pPr>
+        <w:keepNext/>
+        <w:spacing w:before="320" w:after="120"/>
+      </w:pPr>
+      <w:r>
+        <w:rPr>
+          <w:rFonts w:ascii="Times New Roman" w:hAnsi="Times New Roman"/>
+          <w:b/>
+          <w:color w:val="0F4A34"/>
+          <w:sz w:val="28"/>
+        </w:rPr>
+        <w:t>XI. LỘ TRÌNH TRIỂN KHAI 3 GIAI ĐOẠN (PRODUCT ROADMAP)</w:t>
       </w:r>
     </w:p>
     <w:p>
@@ -5132,7 +6544,7 @@
           <w:rFonts w:ascii="Times New Roman" w:hAnsi="Times New Roman"/>
           <w:sz w:val="25"/>
         </w:rPr>
-        <w:t>Next.js + Supabase Auth (Email/Phone OTP) + VietQR PayOS Orchestration + Trust Score V1 (cọc 100% với user mới) + Upload video Before/After + Logistics GHN san sẻ ship 50/50 + Digital Damage Protocol (3 cấp độ). Chi phí eKYC: 0 đồng.</w:t>
+        <w:t>Next.js + Supabase Auth (Email/Phone OTP) + VietQR PayOS Orchestration + Trust Score V1 (cọc 100% với user mới) + Upload video Before/After + Logistics GHN san sẻ ship 50/50 + Digital Damage Protocol (3 cấp độ) + Fast-Track 4 Phòng Tuyến. Chi phí eKYC: 0 đồng.</w:t>
       </w:r>
     </w:p>
     <w:p>
@@ -5154,7 +6566,7 @@
           <w:rFonts w:ascii="Times New Roman" w:hAnsi="Times New Roman"/>
           <w:sz w:val="25"/>
         </w:rPr>
-        <w:t>Tự động hóa Exposure Limit Engine + Progressive Trust tự giảm cọc + Digital Evidence Timeline UI + Pessimistic locking tại DB khi concurrency cao + Micro-resolution tự động.</w:t>
+        <w:t>Tự động hóa Exposure Limit Engine + Progressive Trust tự giảm cọc + Digital Evidence Timeline UI + Pessimistic locking tại DB khi concurrency cao + Micro-resolution tự động giải quyết khiếu nại nhỏ dưới 50k.</w:t>
       </w:r>
     </w:p>
     <w:p>
@@ -5192,7 +6604,7 @@
           <w:color w:val="0F4A34"/>
           <w:sz w:val="25"/>
         </w:rPr>
-        <w:t>KẾT LUẬN: Báo cáo v4.0 khẳng định CLOOP không né tránh rủi ro mà trực diện đối thoại và hóa giải 4 Tử huyệt lớn nhất của ngành kinh tế chia sẻ thời trang. Bằng sự kết hợp giữa Digital Damage Protocol, Lớp Điều Phối Thanh Toán, Khung Bảo Vệ Dữ Liệu Cá Nhân Chuẩn Luật 91/2025/QH15 và Lộ trình phân kỳ 3 giai đoạn sắc bén, CLOOP chứng minh năng lực sẵn sàng bảo vệ thành công trước Hội Đồng Giám Khảo Techfest và tự tin tiến vào vòng gọi vốn hạt giống (Seed Round).</w:t>
+        <w:t>KẾT LUẬN TOÀN DIỆN: Báo cáo v5.0 khẳng định CLOOP không né tránh rủi ro mà trực diện đối thoại và hóa giải 4 Tử huyệt lớn nhất của ngành kinh tế chia sẻ thời trang. Bằng sự kết hợp giữa Digital Damage Protocol, Lớp Điều Phối Thanh Toán VietQR, 4 Lớp Phòng Tuyến Fast-Track, Khung Bảo Vệ Dữ Liệu Cá Nhân Chuẩn Luật 91/2025/QH15, Bộ Kiểm Thử Tự Động 37/37 PASSED và Lộ trình phân kỳ 3 giai đoạn sắc bén, CLOOP chứng minh năng lực sẵn sàng bảo vệ thành công trước Hội Đồng Giám Khảo Techfest và tự tin tiến vào vòng gọi vốn hạt giống (Seed Round).</w:t>
       </w:r>
     </w:p>
     <w:sectPr>

</xml_diff>

<commit_message>
feat(trust): implement fund-driven conservative deposit guarantee and multi-factor tier eligibility
</commit_message>
<xml_diff>
--- a/BAO_CAO_KIEN_TRUC_VAN_HANH_CLOOP.docx
+++ b/BAO_CAO_KIEN_TRUC_VAN_HANH_CLOOP.docx
@@ -31,9 +31,9 @@
         </w:rPr>
         <w:t>Tài liệu Kỹ thuật, Luận giải Kiến trúc, Digital Damage Protocol, 4 Lớp Phòng Tuyến Fast-Track,</w:t>
         <w:br/>
-        <w:t>Lớp Điều Phối Dòng Tiền &amp; Báo Cáo Thẩm Định Sẵn Sàng Triển Khai Techfest</w:t>
+        <w:t>Cơ Chế Bảo Lãnh Cọc Bảo Toàn Vốn, Circuit Breaker &amp; Báo Cáo Thẩm Định Sẵn Sàng Triển Khai Techfest</w:t>
         <w:br/>
-        <w:t>Phiên bản 5.0 Production Hardened • Cập nhật: Tháng 09/2026 • Trạng thái: Live Production (cloop-sable.vercel.app)</w:t>
+        <w:t>Phiên bản 5.1 Production Hardened • Cập nhật: Tháng 09/2026 • Trạng thái: Live Production (cloop-sable.vercel.app)</w:t>
       </w:r>
     </w:p>
     <w:p>
@@ -46,7 +46,7 @@
           <w:rFonts w:ascii="Times New Roman" w:hAnsi="Times New Roman"/>
           <w:sz w:val="25"/>
         </w:rPr>
-        <w:t>Tài liệu này trình bày chi tiết toàn bộ kiến trúc hạ tầng công nghệ thời gian thực, mô hình điều phối thanh toán (Payment Orchestration Layer), quy chuẩn xử lý hư hỏng (Digital Damage Protocol), giải mã 4 Tử huyệt ngành cho thuê thời trang, bộ đối thoại 7 câu hỏi tử thần của Quỹ đầu tư mạo hiểm (VC), hệ thống CLOOP Trust Stack, trần rủi ro tài sản (Transaction Exposure Limit), 4 lớp phòng tuyến bảo vệ Fast-Track, bảo chứng an ninh kho lưu trữ GCS Fail-Closed và kết quả kiểm thử tự động 37/37 của nền tảng CLOOP. Tài liệu áp dụng phương pháp luận Đánh giá Kiến trúc và Đánh đổi Chiến lược 5 Tầng, tuân thủ nghiêm ngặt Luật Bảo vệ Dữ liệu Cá nhân số 91/2025/QH15, Nghị định 356/2025/NĐ-CP và Nghị định 52/2024/NĐ-CP về thanh toán không dùng tiền mặt.</w:t>
+        <w:t>Tài liệu này trình bày chi tiết toàn bộ kiến trúc hạ tầng công nghệ thời gian thực, mô hình điều phối thanh toán (Payment Orchestration Layer), quy chuẩn xử lý hư hỏng (Digital Damage Protocol), giải mã 4 Tử huyệt ngành cho thuê thời trang, bộ đối thoại 7 câu hỏi tử thần của Quỹ đầu tư mạo hiểm (VC), hệ thống CLOOP Trust Stack bảo toàn vốn sàn (Fund-Capacity Constrained Guarantee), trần rủi ro tài sản (Transaction Exposure Limit), 4 lớp phòng tuyến bảo vệ Fast-Track, cơ chế ngắt mạch Circuit Breaker, mô hình phân tích điểm hòa vốn 3 kịch bản, bảo chứng an ninh kho lưu trữ GCS Fail-Closed và kết quả kiểm thử tự động 45/45 của nền tảng CLOOP. Tài liệu áp dụng phương pháp luận Đánh giá Kiến trúc và Đánh đổi Chiến lược 5 Tầng, tuân thủ nghiêm ngặt Luật Bảo vệ Dữ liệu Cá nhân số 91/2025/QH15, Nghị định 356/2025/NĐ-CP và Nghị định 52/2024/NĐ-CP về thanh toán không dùng tiền mặt.</w:t>
       </w:r>
     </w:p>
     <w:tbl>
@@ -96,7 +96,7 @@
                 <w:i/>
                 <w:sz w:val="23"/>
               </w:rPr>
-              <w:t>Bản báo cáo v5.0 tích hợp toàn bộ các kết quả kiểm định mã nguồn thực tế tại commit mới nhất trên nhánh chính (origin/main). Hệ thống đạt 0 lỗi TypeScript (npx tsc --noEmit), 0 lỗi ESLint, vượt qua 37/37 bài kiểm thử tự động (23 Unit Tests + 14 Integration Tests) và xóa bỏ triệt để các biểu tượng trang trí lấp lánh để chuyển hóa 100% giao diện sang chuẩn mực số hóa cao cấp của Fintech/E-Commerce.</w:t>
+              <w:t>Bản báo cáo v5.1 tích hợp toàn bộ các kết quả kiểm định mã nguồn thực tế tại commit mới nhất trên nhánh chính (origin/main). Hệ thống đạt 0 lỗi TypeScript (npx tsc --noEmit), 0 lỗi ESLint, vượt qua 45/45 bài kiểm thử tự động (31 Unit Tests + 14 Integration Tests), bãi bỏ hoàn toàn các giả định phi thực tế về miễn cọc 0 đồng và xóa bỏ triệt để các biểu tượng trang trí lấp lánh để chuyển hóa 100% giao diện sang chuẩn mực số hóa cao cấp của Fintech/E-Commerce.</w:t>
             </w:r>
           </w:p>
         </w:tc>
@@ -3962,7 +3962,7 @@
           <w:color w:val="0F4A34"/>
           <w:sz w:val="28"/>
         </w:rPr>
-        <w:t>VII. HỆ THỐNG 'CLOOP TRUST STACK' &amp; 4 LỚP PHÒNG TUYẾN FAST-TRACK (PRODUCTION HARDENED)</w:t>
+        <w:t>VII. HỆ THỐNG 'CLOOP TRUST STACK' &amp; BẢO LÃNH CỌC BẢO TOÀN VỐN (PRODUCTION HARDENED)</w:t>
       </w:r>
     </w:p>
     <w:p>
@@ -3975,7 +3975,7 @@
           <w:rFonts w:ascii="Times New Roman" w:hAnsi="Times New Roman"/>
           <w:sz w:val="25"/>
         </w:rPr>
-        <w:t>Thay vì áp dụng cơ chế eKYC nặng nề chặn cửa (bắt chụp CCCD + selfie ngay lúc đăng ký), CLOOP chuyển dịch sang mô hình 'Trust Stack Tích Lũy Lũy Tiến' kết hợp 'Kiểm Soát Trần Thiệt Hại' (Damage Isolation) và 4 Lớp Phòng Tuyến Fast-Track đã được lập trình và kiểm thử nghiêm ngặt:</w:t>
+        <w:t>Thay vì áp dụng cơ chế eKYC nặng nề chặn cửa hoặc cấp ưu đãi giảm cọc vô điều kiện dẫn đến nguy cơ vỡ quỹ, CLOOP phát triển mô hình 'Hợp Đồng Bảo Lãnh Cọc Giới Hạn Năng Lực Quỹ' (Fund-Capacity Constrained Guarantee). Mọi quyền lợi giảm cọc đều được quản trị bởi điều kiện đa yếu tố, bảo chứng bằng số dư Quỹ dự phòng rủi ro khả dụng thực tế, giới hạn trần bảo lãnh trên từng đơn và có cơ chế ngắt mạch Circuit Breaker tự động:</w:t>
       </w:r>
     </w:p>
     <w:tbl>
@@ -4048,7 +4048,7 @@
                 <w:color w:val="0A2517"/>
                 <w:sz w:val="22"/>
               </w:rPr>
-              <w:t>Khoảng Điểm Trust Score</w:t>
+              <w:t>Điều Kiện Thăng Hạng Bắt Buộc</w:t>
             </w:r>
           </w:p>
         </w:tc>
@@ -4074,7 +4074,7 @@
                 <w:color w:val="0A2517"/>
                 <w:sz w:val="22"/>
               </w:rPr>
-              <w:t>Hạn Mức Tiêu Chuẩn</w:t>
+              <w:t>Ngưỡng Quỹ Bảo Chứng</w:t>
             </w:r>
           </w:p>
         </w:tc>
@@ -4100,7 +4100,7 @@
                 <w:color w:val="0A2517"/>
                 <w:sz w:val="22"/>
               </w:rPr>
-              <w:t>Trần Fast-Track Tuyệt Đối</w:t>
+              <w:t>Hạn Mức &amp; Trần Fast-Track</w:t>
             </w:r>
           </w:p>
         </w:tc>
@@ -4126,7 +4126,7 @@
                 <w:color w:val="0A2517"/>
                 <w:sz w:val="22"/>
               </w:rPr>
-              <w:t>Chính Sách Cọc</w:t>
+              <w:t>Chính Sách Cọc &amp; Bảo Lãnh</w:t>
             </w:r>
           </w:p>
         </w:tc>
@@ -4150,9 +4150,11 @@
             <w:r>
               <w:rPr>
                 <w:rFonts w:ascii="Times New Roman" w:hAnsi="Times New Roman"/>
-                <w:sz w:val="21"/>
+                <w:sz w:val="20"/>
               </w:rPr>
               <w:t>LEVEL_0_NEW</w:t>
+              <w:br/>
+              <w:t>(Thành viên Mới)</w:t>
             </w:r>
           </w:p>
         </w:tc>
@@ -4169,14 +4171,14 @@
           </w:tcPr>
           <w:p>
             <w:pPr>
-              <w:jc w:val="center"/>
+              <w:jc w:val="left"/>
             </w:pPr>
             <w:r>
               <w:rPr>
                 <w:rFonts w:ascii="Times New Roman" w:hAnsi="Times New Roman"/>
-                <w:sz w:val="21"/>
+                <w:sz w:val="20"/>
               </w:rPr>
-              <w:t>0 – 29 PTS</w:t>
+              <w:t>0 đơn hoàn tất (Mặc định khi đăng ký)</w:t>
             </w:r>
           </w:p>
         </w:tc>
@@ -4193,14 +4195,14 @@
           </w:tcPr>
           <w:p>
             <w:pPr>
-              <w:jc w:val="center"/>
+              <w:jc w:val="left"/>
             </w:pPr>
             <w:r>
               <w:rPr>
                 <w:rFonts w:ascii="Times New Roman" w:hAnsi="Times New Roman"/>
-                <w:sz w:val="21"/>
+                <w:sz w:val="20"/>
               </w:rPr>
-              <w:t>2.000.000 VNĐ</w:t>
+              <w:t>Không áp dụng</w:t>
             </w:r>
           </w:p>
         </w:tc>
@@ -4217,14 +4219,16 @@
           </w:tcPr>
           <w:p>
             <w:pPr>
-              <w:jc w:val="center"/>
+              <w:jc w:val="left"/>
             </w:pPr>
             <w:r>
               <w:rPr>
                 <w:rFonts w:ascii="Times New Roman" w:hAnsi="Times New Roman"/>
-                <w:sz w:val="21"/>
+                <w:sz w:val="20"/>
               </w:rPr>
-              <w:t>6.000.000 VNĐ</w:t>
+              <w:t>Tiêu chuẩn: 2.000.000đ</w:t>
+              <w:br/>
+              <w:t>Fast-Track: 6.000.000đ</w:t>
             </w:r>
           </w:p>
         </w:tc>
@@ -4241,14 +4245,16 @@
           </w:tcPr>
           <w:p>
             <w:pPr>
-              <w:jc w:val="center"/>
+              <w:jc w:val="left"/>
             </w:pPr>
             <w:r>
               <w:rPr>
                 <w:rFonts w:ascii="Times New Roman" w:hAnsi="Times New Roman"/>
-                <w:sz w:val="21"/>
+                <w:sz w:val="20"/>
               </w:rPr>
-              <w:t>Cọc 100% giá trị</w:t>
+              <w:t>Cọc 100% giá trị niêm yết</w:t>
+              <w:br/>
+              <w:t>(Không chiết khấu cọc)</w:t>
             </w:r>
           </w:p>
         </w:tc>
@@ -4272,9 +4278,11 @@
             <w:r>
               <w:rPr>
                 <w:rFonts w:ascii="Times New Roman" w:hAnsi="Times New Roman"/>
-                <w:sz w:val="21"/>
+                <w:sz w:val="20"/>
               </w:rPr>
               <w:t>LEVEL_1_VERIFIED</w:t>
+              <w:br/>
+              <w:t>(Tín nhiệm Cơ bản)</w:t>
             </w:r>
           </w:p>
         </w:tc>
@@ -4291,14 +4299,24 @@
           </w:tcPr>
           <w:p>
             <w:pPr>
-              <w:jc w:val="center"/>
+              <w:jc w:val="left"/>
             </w:pPr>
             <w:r>
               <w:rPr>
                 <w:rFonts w:ascii="Times New Roman" w:hAnsi="Times New Roman"/>
-                <w:sz w:val="21"/>
+                <w:sz w:val="20"/>
               </w:rPr>
-              <w:t>30 – 59 PTS</w:t>
+              <w:t>≥ 3 đơn hoàn tất</w:t>
+              <w:br/>
+              <w:t>≥ 1.000.000đ chi tiêu thuê</w:t>
+              <w:br/>
+              <w:t>≥ 3 đánh giá ≥ 4.0 sao</w:t>
+              <w:br/>
+              <w:t>≥ 2 chủ đồ khác nhau</w:t>
+              <w:br/>
+              <w:t>≥ 14 ngày từ đơn đầu</w:t>
+              <w:br/>
+              <w:t>0 tranh chấp/hủy</w:t>
             </w:r>
           </w:p>
         </w:tc>
@@ -4315,14 +4333,16 @@
           </w:tcPr>
           <w:p>
             <w:pPr>
-              <w:jc w:val="center"/>
+              <w:jc w:val="left"/>
             </w:pPr>
             <w:r>
               <w:rPr>
                 <w:rFonts w:ascii="Times New Roman" w:hAnsi="Times New Roman"/>
-                <w:sz w:val="21"/>
+                <w:sz w:val="20"/>
               </w:rPr>
-              <w:t>5.000.000 VNĐ</w:t>
+              <w:t>Quỹ rủi ro ≥ 5.000.000đ</w:t>
+              <w:br/>
+              <w:t>(Dưới 5tr: cọc 100% toàn sàn)</w:t>
             </w:r>
           </w:p>
         </w:tc>
@@ -4339,14 +4359,16 @@
           </w:tcPr>
           <w:p>
             <w:pPr>
-              <w:jc w:val="center"/>
+              <w:jc w:val="left"/>
             </w:pPr>
             <w:r>
               <w:rPr>
                 <w:rFonts w:ascii="Times New Roman" w:hAnsi="Times New Roman"/>
-                <w:sz w:val="21"/>
+                <w:sz w:val="20"/>
               </w:rPr>
-              <w:t>12.000.000 VNĐ</w:t>
+              <w:t>Tiêu chuẩn: 5.000.000đ</w:t>
+              <w:br/>
+              <w:t>Fast-Track: 12.000.000đ</w:t>
             </w:r>
           </w:p>
         </w:tc>
@@ -4363,14 +4385,16 @@
           </w:tcPr>
           <w:p>
             <w:pPr>
-              <w:jc w:val="center"/>
+              <w:jc w:val="left"/>
             </w:pPr>
             <w:r>
               <w:rPr>
                 <w:rFonts w:ascii="Times New Roman" w:hAnsi="Times New Roman"/>
-                <w:sz w:val="21"/>
+                <w:sz w:val="20"/>
               </w:rPr>
-              <w:t>Giảm 25% cọc (trả 75%)</w:t>
+              <w:t>Bảo lãnh giảm 10% cọc (trả 90%)</w:t>
+              <w:br/>
+              <w:t>Trần bảo lãnh tối đa: 200.000đ/đơn</w:t>
             </w:r>
           </w:p>
         </w:tc>
@@ -4394,9 +4418,11 @@
             <w:r>
               <w:rPr>
                 <w:rFonts w:ascii="Times New Roman" w:hAnsi="Times New Roman"/>
-                <w:sz w:val="21"/>
+                <w:sz w:val="20"/>
               </w:rPr>
               <w:t>LEVEL_2_TRUSTED</w:t>
+              <w:br/>
+              <w:t>(Khách Quen Uy Tín)</w:t>
             </w:r>
           </w:p>
         </w:tc>
@@ -4413,14 +4439,22 @@
           </w:tcPr>
           <w:p>
             <w:pPr>
-              <w:jc w:val="center"/>
+              <w:jc w:val="left"/>
             </w:pPr>
             <w:r>
               <w:rPr>
                 <w:rFonts w:ascii="Times New Roman" w:hAnsi="Times New Roman"/>
-                <w:sz w:val="21"/>
+                <w:sz w:val="20"/>
               </w:rPr>
-              <w:t>60 – 84 PTS</w:t>
+              <w:t>≥ 8 đơn hoàn tất</w:t>
+              <w:br/>
+              <w:t>≥ 3.000.000đ chi tiêu thuê</w:t>
+              <w:br/>
+              <w:t>≥ 8 đánh giá ≥ 4.0 sao</w:t>
+              <w:br/>
+              <w:t>≥ 3 chủ đồ khác nhau</w:t>
+              <w:br/>
+              <w:t>0 tranh chấp/hủy</w:t>
             </w:r>
           </w:p>
         </w:tc>
@@ -4437,14 +4471,16 @@
           </w:tcPr>
           <w:p>
             <w:pPr>
-              <w:jc w:val="center"/>
+              <w:jc w:val="left"/>
             </w:pPr>
             <w:r>
               <w:rPr>
                 <w:rFonts w:ascii="Times New Roman" w:hAnsi="Times New Roman"/>
-                <w:sz w:val="21"/>
+                <w:sz w:val="20"/>
               </w:rPr>
-              <w:t>10.000.000 VNĐ</w:t>
+              <w:t>Quỹ rủi ro ≥ 15.000.000đ</w:t>
+              <w:br/>
+              <w:t>(Dưới 15tr: hạ về Level 1)</w:t>
             </w:r>
           </w:p>
         </w:tc>
@@ -4461,14 +4497,16 @@
           </w:tcPr>
           <w:p>
             <w:pPr>
-              <w:jc w:val="center"/>
+              <w:jc w:val="left"/>
             </w:pPr>
             <w:r>
               <w:rPr>
                 <w:rFonts w:ascii="Times New Roman" w:hAnsi="Times New Roman"/>
-                <w:sz w:val="21"/>
+                <w:sz w:val="20"/>
               </w:rPr>
-              <w:t>20.000.000 VNĐ</w:t>
+              <w:t>Tiêu chuẩn: 10.000.000đ</w:t>
+              <w:br/>
+              <w:t>Fast-Track: 20.000.000đ</w:t>
             </w:r>
           </w:p>
         </w:tc>
@@ -4485,14 +4523,16 @@
           </w:tcPr>
           <w:p>
             <w:pPr>
-              <w:jc w:val="center"/>
+              <w:jc w:val="left"/>
             </w:pPr>
             <w:r>
               <w:rPr>
                 <w:rFonts w:ascii="Times New Roman" w:hAnsi="Times New Roman"/>
-                <w:sz w:val="21"/>
+                <w:sz w:val="20"/>
               </w:rPr>
-              <w:t>Giảm 50% cọc (trả 50%)</w:t>
+              <w:t>Bảo lãnh giảm 20% cọc (trả 80%)</w:t>
+              <w:br/>
+              <w:t>Trần bảo lãnh tối đa: 500.000đ/đơn</w:t>
             </w:r>
           </w:p>
         </w:tc>
@@ -4516,9 +4556,11 @@
             <w:r>
               <w:rPr>
                 <w:rFonts w:ascii="Times New Roman" w:hAnsi="Times New Roman"/>
-                <w:sz w:val="21"/>
+                <w:sz w:val="20"/>
               </w:rPr>
               <w:t>LEVEL_3_VIP</w:t>
+              <w:br/>
+              <w:t>(CLOOP VIP Club)</w:t>
             </w:r>
           </w:p>
         </w:tc>
@@ -4535,14 +4577,22 @@
           </w:tcPr>
           <w:p>
             <w:pPr>
-              <w:jc w:val="center"/>
+              <w:jc w:val="left"/>
             </w:pPr>
             <w:r>
               <w:rPr>
                 <w:rFonts w:ascii="Times New Roman" w:hAnsi="Times New Roman"/>
-                <w:sz w:val="21"/>
+                <w:sz w:val="20"/>
               </w:rPr>
-              <w:t>85 – 100 PTS</w:t>
+              <w:t>≥ 12 đơn hoàn tất</w:t>
+              <w:br/>
+              <w:t>≥ 8.000.000đ chi tiêu thuê</w:t>
+              <w:br/>
+              <w:t>Đánh giá TB ≥ 4.5 sao</w:t>
+              <w:br/>
+              <w:t>≥ 5 chủ đồ khác nhau</w:t>
+              <w:br/>
+              <w:t>0 tranh chấp/hủy</w:t>
             </w:r>
           </w:p>
         </w:tc>
@@ -4559,14 +4609,16 @@
           </w:tcPr>
           <w:p>
             <w:pPr>
-              <w:jc w:val="center"/>
+              <w:jc w:val="left"/>
             </w:pPr>
             <w:r>
               <w:rPr>
                 <w:rFonts w:ascii="Times New Roman" w:hAnsi="Times New Roman"/>
-                <w:sz w:val="21"/>
+                <w:sz w:val="20"/>
               </w:rPr>
-              <w:t>20.000.000 VNĐ</w:t>
+              <w:t>Quỹ rủi ro ≥ 30.000.000đ</w:t>
+              <w:br/>
+              <w:t>(Dưới 30tr: hạ về Level 2)</w:t>
             </w:r>
           </w:p>
         </w:tc>
@@ -4583,14 +4635,16 @@
           </w:tcPr>
           <w:p>
             <w:pPr>
-              <w:jc w:val="center"/>
+              <w:jc w:val="left"/>
             </w:pPr>
             <w:r>
               <w:rPr>
                 <w:rFonts w:ascii="Times New Roman" w:hAnsi="Times New Roman"/>
-                <w:sz w:val="21"/>
+                <w:sz w:val="20"/>
               </w:rPr>
-              <w:t>35.000.000 VNĐ</w:t>
+              <w:t>Tiêu chuẩn: 25.000.000đ</w:t>
+              <w:br/>
+              <w:t>Fast-Track: 35.000.000đ</w:t>
             </w:r>
           </w:p>
         </w:tc>
@@ -4607,14 +4661,18 @@
           </w:tcPr>
           <w:p>
             <w:pPr>
-              <w:jc w:val="center"/>
+              <w:jc w:val="left"/>
             </w:pPr>
             <w:r>
               <w:rPr>
                 <w:rFonts w:ascii="Times New Roman" w:hAnsi="Times New Roman"/>
-                <w:sz w:val="21"/>
+                <w:sz w:val="20"/>
               </w:rPr>
-              <w:t>Giảm 75% cọc / Miễn cọc (&lt;1tr)</w:t>
+              <w:t>Bảo lãnh giảm 30% cọc (trả 70%)</w:t>
+              <w:br/>
+              <w:t>Trần bảo lãnh tối đa: 1.000.000đ/đơn</w:t>
+              <w:br/>
+              <w:t>(TUYỆT ĐỐI KHÔNG CỌC 0 ĐỒNG)</w:t>
             </w:r>
           </w:p>
         </w:tc>
@@ -4632,7 +4690,7 @@
           <w:color w:val="183A2D"/>
           <w:sz w:val="26"/>
         </w:rPr>
-        <w:t>Chi Tiết 4 Lớp Phòng Tuyến Fast-Track (Server-Enforced Defenses)</w:t>
+        <w:t>1. Chi Tiết 4 Lớp Phòng Tuyến Fast-Track (Server-Enforced Defenses)</w:t>
       </w:r>
     </w:p>
     <w:p>
@@ -4736,6 +4794,929 @@
         <w:t>Ngay cả khi bật Fast-Track và nộp đủ 100% cọc, giá trị món đồ không được vượt quá trần tuyệt đối của hạng tín nhiệm (Level 0 tối đa 6 triệu; Level 1 tối đa 12 triệu; Level 2 tối đa 20 triệu; Level 3 tối đa 35 triệu). Mọi nỗ lực thuê đồ vượt trần hạng sẽ bị hệ thống từ chối.</w:t>
       </w:r>
     </w:p>
+    <w:p>
+      <w:pPr>
+        <w:keepNext/>
+        <w:spacing w:before="200" w:after="80"/>
+      </w:pPr>
+      <w:r>
+        <w:rPr>
+          <w:rFonts w:ascii="Times New Roman" w:hAnsi="Times New Roman"/>
+          <w:b/>
+          <w:color w:val="183A2D"/>
+          <w:sz w:val="26"/>
+        </w:rPr>
+        <w:t>2. Cơ Chế Ngắt Mạch Circuit Breaker &amp; Bảo Toàn Vốn Sàn</w:t>
+      </w:r>
+    </w:p>
+    <w:p>
+      <w:pPr>
+        <w:spacing w:after="80"/>
+        <w:jc w:val="both"/>
+      </w:pPr>
+      <w:r>
+        <w:rPr>
+          <w:rFonts w:ascii="Times New Roman" w:hAnsi="Times New Roman"/>
+          <w:sz w:val="25"/>
+        </w:rPr>
+        <w:t>Nhằm loại bỏ hoàn toàn nguy cơ 'vỡ quỹ dự phòng' do nhiều tranh chấp phát sinh đồng thời trong cùng một chu kỳ kinh doanh, CLOOP thiết lập thuật toán Circuit Breaker tự động:</w:t>
+      </w:r>
+    </w:p>
+    <w:p>
+      <w:pPr>
+        <w:pStyle w:val="ListBullet"/>
+        <w:spacing w:after="60"/>
+        <w:jc w:val="both"/>
+      </w:pPr>
+      <w:r>
+        <w:rPr>
+          <w:rFonts w:ascii="Times New Roman" w:hAnsi="Times New Roman"/>
+          <w:b/>
+          <w:sz w:val="25"/>
+        </w:rPr>
+        <w:t xml:space="preserve">Trần Chi Trả Hàng Tháng (30% Monthly Ceiling): </w:t>
+      </w:r>
+      <w:r>
+        <w:rPr>
+          <w:rFonts w:ascii="Times New Roman" w:hAnsi="Times New Roman"/>
+          <w:sz w:val="25"/>
+        </w:rPr>
+        <w:t>Tổng số tiền bồi thường đã chi trả cộng dồn với tổng hạn mức bảo lãnh cam kết trong 1 tháng tuyệt đối không vượt quá 30% số dư đầu tháng của Quỹ dự phòng rủi ro. Cơ chế này đảm bảo Quỹ luôn giữ lại ít nhất 70% đệm thanh khoản phòng thủ độc lập.</w:t>
+      </w:r>
+    </w:p>
+    <w:p>
+      <w:pPr>
+        <w:pStyle w:val="ListBullet"/>
+        <w:spacing w:after="60"/>
+        <w:jc w:val="both"/>
+      </w:pPr>
+      <w:r>
+        <w:rPr>
+          <w:rFonts w:ascii="Times New Roman" w:hAnsi="Times New Roman"/>
+          <w:b/>
+          <w:sz w:val="25"/>
+        </w:rPr>
+        <w:t xml:space="preserve">Tự Động Khóa Ưu Đãi Giảm Cọc: </w:t>
+      </w:r>
+      <w:r>
+        <w:rPr>
+          <w:rFonts w:ascii="Times New Roman" w:hAnsi="Times New Roman"/>
+          <w:sz w:val="25"/>
+        </w:rPr>
+        <w:t>Khi tổng cam kết bồi thường chạm trần 30% hoặc khi số dư quỹ khả dụng cạn kiệt, Circuit Breaker lập tức chuyển trạng thái toàn sàn về cọc 100% đối với mọi đơn hàng phát sinh mới. Ưu đãi chỉ được mở lại tự động vào đầu chu kỳ tháng tiếp theo khi quỹ được trích lập mới.</w:t>
+      </w:r>
+    </w:p>
+    <w:p>
+      <w:pPr>
+        <w:keepNext/>
+        <w:spacing w:before="200" w:after="80"/>
+      </w:pPr>
+      <w:r>
+        <w:rPr>
+          <w:rFonts w:ascii="Times New Roman" w:hAnsi="Times New Roman"/>
+          <w:b/>
+          <w:color w:val="183A2D"/>
+          <w:sz w:val="26"/>
+        </w:rPr>
+        <w:t>3. Phân Tách Huy Hiệu Sinh Viên Khỏi Quyền Lợi Cọc</w:t>
+      </w:r>
+    </w:p>
+    <w:p>
+      <w:pPr>
+        <w:spacing w:after="80"/>
+        <w:jc w:val="both"/>
+      </w:pPr>
+      <w:r>
+        <w:rPr>
+          <w:rFonts w:ascii="Times New Roman" w:hAnsi="Times New Roman"/>
+          <w:sz w:val="25"/>
+        </w:rPr>
+        <w:t>CLOOP khắc phục triệt để lỗ hổng 'dùng email sinh viên để thuê miễn cọc'. Email trường học (@edu.vn) chỉ được ghi nhận là một tín hiệu định danh ban đầu. Sinh viên xác thực email được nhận Huy hiệu 'Sinh Viên Năng Động' và Voucher giảm 10% phí thuê (Shopee-style). Tuyệt đối KHÔNG có đặc quyền tự động giảm tiền cọc nếu sinh viên đó chưa tích lũy đủ số đơn hoàn tất, chi tiêu thực tế và đánh giá tích cực theo đúng khung tiêu chuẩn.</w:t>
+      </w:r>
+    </w:p>
+    <w:p>
+      <w:pPr>
+        <w:keepNext/>
+        <w:spacing w:before="200" w:after="80"/>
+      </w:pPr>
+      <w:r>
+        <w:rPr>
+          <w:rFonts w:ascii="Times New Roman" w:hAnsi="Times New Roman"/>
+          <w:b/>
+          <w:color w:val="183A2D"/>
+          <w:sz w:val="26"/>
+        </w:rPr>
+        <w:t>4. Quy Định Giới Hạn Trách Nhiệm Sàn (Limit of Liability &amp; Valuation Cap)</w:t>
+      </w:r>
+    </w:p>
+    <w:p>
+      <w:pPr>
+        <w:spacing w:after="80"/>
+        <w:jc w:val="both"/>
+      </w:pPr>
+      <w:r>
+        <w:rPr>
+          <w:rFonts w:ascii="Times New Roman" w:hAnsi="Times New Roman"/>
+          <w:sz w:val="25"/>
+        </w:rPr>
+        <w:t>Cọc 100% không đồng nghĩa với rủi ro bằng 0 nếu giá trị tài sản thị trường cao hơn số tiền cọc thu được. Do đó, CLOOP thiết lập Điều khoản Giới hạn Trách nhiệm Sàn rõ ràng trong Hợp đồng Dịch vụ Điện tử:</w:t>
+      </w:r>
+    </w:p>
+    <w:p>
+      <w:pPr>
+        <w:pStyle w:val="ListBullet"/>
+        <w:spacing w:after="60"/>
+        <w:jc w:val="both"/>
+      </w:pPr>
+      <w:r>
+        <w:rPr>
+          <w:rFonts w:ascii="Times New Roman" w:hAnsi="Times New Roman"/>
+          <w:b/>
+          <w:sz w:val="25"/>
+        </w:rPr>
+        <w:t xml:space="preserve">Trần Trách Nhiệm Tối Đa Của Sàn: </w:t>
+      </w:r>
+      <w:r>
+        <w:rPr>
+          <w:rFonts w:ascii="Times New Roman" w:hAnsi="Times New Roman"/>
+          <w:sz w:val="25"/>
+        </w:rPr>
+        <w:t>Trong mọi trường hợp phát sinh tranh chấp hoặc mất đồ ngoài ý muốn, tổng nghĩa vụ bồi thường tối đa của CLOOP đối với Chủ tủ bị giới hạn bằng: Số tiền cọc thực tế đã thu từ khách thuê + Hạn mức bảo lãnh tối đa được phê duyệt theo hạng của đơn đó (Level 1: 200.000đ, Level 2: 500.000đ, Level 3: 1.000.000đ).</w:t>
+      </w:r>
+    </w:p>
+    <w:p>
+      <w:pPr>
+        <w:pStyle w:val="ListBullet"/>
+        <w:spacing w:after="60"/>
+        <w:jc w:val="both"/>
+      </w:pPr>
+      <w:r>
+        <w:rPr>
+          <w:rFonts w:ascii="Times New Roman" w:hAnsi="Times New Roman"/>
+          <w:b/>
+          <w:sz w:val="25"/>
+        </w:rPr>
+        <w:t xml:space="preserve">Chấp Thuận Định Giá Khi Niêm Yết: </w:t>
+      </w:r>
+      <w:r>
+        <w:rPr>
+          <w:rFonts w:ascii="Times New Roman" w:hAnsi="Times New Roman"/>
+          <w:sz w:val="25"/>
+        </w:rPr>
+        <w:t>Chủ tủ đồng ý với mức trần trách nhiệm này ngay khi niêm yết trang phục lên nền tảng. Sàn không chịu trách nhiệm đối với bất kỳ khoản chênh lệch phát sinh nào vượt quá trần bảo lãnh đã cam kết.</w:t>
+      </w:r>
+    </w:p>
+    <w:p>
+      <w:pPr>
+        <w:keepNext/>
+        <w:spacing w:before="200" w:after="80"/>
+      </w:pPr>
+      <w:r>
+        <w:rPr>
+          <w:rFonts w:ascii="Times New Roman" w:hAnsi="Times New Roman"/>
+          <w:b/>
+          <w:color w:val="183A2D"/>
+          <w:sz w:val="26"/>
+        </w:rPr>
+        <w:t>5. Mô Hình Điểm Hòa Vốn &amp; Kiểm Thử Sức Căng 3 Kịch Bản (Actuarial Break-Even Sensitivity Analysis)</w:t>
+      </w:r>
+    </w:p>
+    <w:p>
+      <w:pPr>
+        <w:spacing w:after="80"/>
+        <w:jc w:val="both"/>
+      </w:pPr>
+      <w:r>
+        <w:rPr>
+          <w:rFonts w:ascii="Times New Roman" w:hAnsi="Times New Roman"/>
+          <w:sz w:val="25"/>
+        </w:rPr>
+        <w:t>CLOOP không tuyên bố chủ quan 'sàn không thể lỗ'. Thay vào đó, tính khả thi tài chính được chứng minh thông qua mô hình phân tích sức căng 3 kịch bản thực tế dựa trên chi phí rủi ro và tỷ lệ tổn thất danh mục:</w:t>
+      </w:r>
+    </w:p>
+    <w:tbl>
+      <w:tblPr>
+        <w:tblW w:type="auto" w:w="0"/>
+        <w:jc w:val="center"/>
+        <w:tblLook w:firstColumn="1" w:firstRow="1" w:lastColumn="0" w:lastRow="0" w:noHBand="0" w:noVBand="1" w:val="04A0"/>
+        <w:tblBorders>
+          <w:top w:val="single" w:sz="6" w:space="0" w:color="D3D3D3"/>
+          <w:bottom w:val="single" w:sz="6" w:space="0" w:color="D3D3D3"/>
+          <w:insideH w:val="single" w:sz="4" w:space="0" w:color="D3D3D3"/>
+          <w:insideV w:val="none"/>
+          <w:left w:val="none"/>
+          <w:right w:val="none"/>
+        </w:tblBorders>
+      </w:tblPr>
+      <w:tblGrid>
+        <w:gridCol w:w="2268"/>
+        <w:gridCol w:w="2268"/>
+        <w:gridCol w:w="2268"/>
+        <w:gridCol w:w="2268"/>
+      </w:tblGrid>
+      <w:tr>
+        <w:tc>
+          <w:tcPr>
+            <w:tcW w:type="dxa" w:w="2268"/>
+            <w:shd w:fill="E6F4EA"/>
+            <w:tcMar>
+              <w:top w:w="120" w:type="dxa"/>
+              <w:bottom w:w="120" w:type="dxa"/>
+              <w:left w:w="100" w:type="dxa"/>
+              <w:right w:w="100" w:type="dxa"/>
+            </w:tcMar>
+          </w:tcPr>
+          <w:p>
+            <w:pPr>
+              <w:jc w:val="center"/>
+            </w:pPr>
+            <w:r>
+              <w:rPr>
+                <w:rFonts w:ascii="Times New Roman" w:hAnsi="Times New Roman"/>
+                <w:b/>
+                <w:color w:val="0A2517"/>
+                <w:sz w:val="22"/>
+              </w:rPr>
+              <w:t>Chỉ Số Tài Chính / Vận Hành</w:t>
+            </w:r>
+          </w:p>
+        </w:tc>
+        <w:tc>
+          <w:tcPr>
+            <w:tcW w:type="dxa" w:w="2268"/>
+            <w:shd w:fill="E6F4EA"/>
+            <w:tcMar>
+              <w:top w:w="120" w:type="dxa"/>
+              <w:bottom w:w="120" w:type="dxa"/>
+              <w:left w:w="100" w:type="dxa"/>
+              <w:right w:w="100" w:type="dxa"/>
+            </w:tcMar>
+          </w:tcPr>
+          <w:p>
+            <w:pPr>
+              <w:jc w:val="center"/>
+            </w:pPr>
+            <w:r>
+              <w:rPr>
+                <w:rFonts w:ascii="Times New Roman" w:hAnsi="Times New Roman"/>
+                <w:b/>
+                <w:color w:val="0A2517"/>
+                <w:sz w:val="22"/>
+              </w:rPr>
+              <w:t>Kịch Bản Thuận Lợi</w:t>
+            </w:r>
+          </w:p>
+        </w:tc>
+        <w:tc>
+          <w:tcPr>
+            <w:tcW w:type="dxa" w:w="2268"/>
+            <w:shd w:fill="E6F4EA"/>
+            <w:tcMar>
+              <w:top w:w="120" w:type="dxa"/>
+              <w:bottom w:w="120" w:type="dxa"/>
+              <w:left w:w="100" w:type="dxa"/>
+              <w:right w:w="100" w:type="dxa"/>
+            </w:tcMar>
+          </w:tcPr>
+          <w:p>
+            <w:pPr>
+              <w:jc w:val="center"/>
+            </w:pPr>
+            <w:r>
+              <w:rPr>
+                <w:rFonts w:ascii="Times New Roman" w:hAnsi="Times New Roman"/>
+                <w:b/>
+                <w:color w:val="0A2517"/>
+                <w:sz w:val="22"/>
+              </w:rPr>
+              <w:t>Kịch Bản Cơ Sở</w:t>
+            </w:r>
+          </w:p>
+        </w:tc>
+        <w:tc>
+          <w:tcPr>
+            <w:tcW w:type="dxa" w:w="2268"/>
+            <w:shd w:fill="E6F4EA"/>
+            <w:tcMar>
+              <w:top w:w="120" w:type="dxa"/>
+              <w:bottom w:w="120" w:type="dxa"/>
+              <w:left w:w="100" w:type="dxa"/>
+              <w:right w:w="100" w:type="dxa"/>
+            </w:tcMar>
+          </w:tcPr>
+          <w:p>
+            <w:pPr>
+              <w:jc w:val="center"/>
+            </w:pPr>
+            <w:r>
+              <w:rPr>
+                <w:rFonts w:ascii="Times New Roman" w:hAnsi="Times New Roman"/>
+                <w:b/>
+                <w:color w:val="0A2517"/>
+                <w:sz w:val="22"/>
+              </w:rPr>
+              <w:t>Kịch Bản Thử Thách</w:t>
+            </w:r>
+          </w:p>
+        </w:tc>
+      </w:tr>
+      <w:tr>
+        <w:tc>
+          <w:tcPr>
+            <w:tcW w:type="dxa" w:w="2268"/>
+            <w:shd w:fill="FFFFFF"/>
+            <w:tcMar>
+              <w:top w:w="80" w:type="dxa"/>
+              <w:bottom w:w="80" w:type="dxa"/>
+              <w:left w:w="100" w:type="dxa"/>
+              <w:right w:w="100" w:type="dxa"/>
+            </w:tcMar>
+          </w:tcPr>
+          <w:p>
+            <w:pPr>
+              <w:jc w:val="left"/>
+            </w:pPr>
+            <w:r>
+              <w:rPr>
+                <w:rFonts w:ascii="Times New Roman" w:hAnsi="Times New Roman"/>
+                <w:sz w:val="20"/>
+              </w:rPr>
+              <w:t>Tỷ lệ phát sinh tranh chấp (Dispute Rate)</w:t>
+            </w:r>
+          </w:p>
+        </w:tc>
+        <w:tc>
+          <w:tcPr>
+            <w:tcW w:type="dxa" w:w="2268"/>
+            <w:shd w:fill="FFFFFF"/>
+            <w:tcMar>
+              <w:top w:w="80" w:type="dxa"/>
+              <w:bottom w:w="80" w:type="dxa"/>
+              <w:left w:w="100" w:type="dxa"/>
+              <w:right w:w="100" w:type="dxa"/>
+            </w:tcMar>
+          </w:tcPr>
+          <w:p>
+            <w:pPr>
+              <w:jc w:val="center"/>
+            </w:pPr>
+            <w:r>
+              <w:rPr>
+                <w:rFonts w:ascii="Times New Roman" w:hAnsi="Times New Roman"/>
+                <w:sz w:val="20"/>
+              </w:rPr>
+              <w:t>1.0% tổng đơn</w:t>
+            </w:r>
+          </w:p>
+        </w:tc>
+        <w:tc>
+          <w:tcPr>
+            <w:tcW w:type="dxa" w:w="2268"/>
+            <w:shd w:fill="FFFFFF"/>
+            <w:tcMar>
+              <w:top w:w="80" w:type="dxa"/>
+              <w:bottom w:w="80" w:type="dxa"/>
+              <w:left w:w="100" w:type="dxa"/>
+              <w:right w:w="100" w:type="dxa"/>
+            </w:tcMar>
+          </w:tcPr>
+          <w:p>
+            <w:pPr>
+              <w:jc w:val="center"/>
+            </w:pPr>
+            <w:r>
+              <w:rPr>
+                <w:rFonts w:ascii="Times New Roman" w:hAnsi="Times New Roman"/>
+                <w:sz w:val="20"/>
+              </w:rPr>
+              <w:t>3.0% tổng đơn</w:t>
+            </w:r>
+          </w:p>
+        </w:tc>
+        <w:tc>
+          <w:tcPr>
+            <w:tcW w:type="dxa" w:w="2268"/>
+            <w:shd w:fill="FFFFFF"/>
+            <w:tcMar>
+              <w:top w:w="80" w:type="dxa"/>
+              <w:bottom w:w="80" w:type="dxa"/>
+              <w:left w:w="100" w:type="dxa"/>
+              <w:right w:w="100" w:type="dxa"/>
+            </w:tcMar>
+          </w:tcPr>
+          <w:p>
+            <w:pPr>
+              <w:jc w:val="center"/>
+            </w:pPr>
+            <w:r>
+              <w:rPr>
+                <w:rFonts w:ascii="Times New Roman" w:hAnsi="Times New Roman"/>
+                <w:sz w:val="20"/>
+              </w:rPr>
+              <w:t>6.0% tổng đơn</w:t>
+            </w:r>
+          </w:p>
+        </w:tc>
+      </w:tr>
+      <w:tr>
+        <w:tc>
+          <w:tcPr>
+            <w:tcW w:type="dxa" w:w="2268"/>
+            <w:shd w:fill="F9FBF9"/>
+            <w:tcMar>
+              <w:top w:w="80" w:type="dxa"/>
+              <w:bottom w:w="80" w:type="dxa"/>
+              <w:left w:w="100" w:type="dxa"/>
+              <w:right w:w="100" w:type="dxa"/>
+            </w:tcMar>
+          </w:tcPr>
+          <w:p>
+            <w:pPr>
+              <w:jc w:val="left"/>
+            </w:pPr>
+            <w:r>
+              <w:rPr>
+                <w:rFonts w:ascii="Times New Roman" w:hAnsi="Times New Roman"/>
+                <w:sz w:val="20"/>
+              </w:rPr>
+              <w:t>Tỷ lệ mất đồ / không thu hồi được (Default Rate)</w:t>
+            </w:r>
+          </w:p>
+        </w:tc>
+        <w:tc>
+          <w:tcPr>
+            <w:tcW w:type="dxa" w:w="2268"/>
+            <w:shd w:fill="F9FBF9"/>
+            <w:tcMar>
+              <w:top w:w="80" w:type="dxa"/>
+              <w:bottom w:w="80" w:type="dxa"/>
+              <w:left w:w="100" w:type="dxa"/>
+              <w:right w:w="100" w:type="dxa"/>
+            </w:tcMar>
+          </w:tcPr>
+          <w:p>
+            <w:pPr>
+              <w:jc w:val="center"/>
+            </w:pPr>
+            <w:r>
+              <w:rPr>
+                <w:rFonts w:ascii="Times New Roman" w:hAnsi="Times New Roman"/>
+                <w:sz w:val="20"/>
+              </w:rPr>
+              <w:t>0.10% tổng đơn</w:t>
+            </w:r>
+          </w:p>
+        </w:tc>
+        <w:tc>
+          <w:tcPr>
+            <w:tcW w:type="dxa" w:w="2268"/>
+            <w:shd w:fill="F9FBF9"/>
+            <w:tcMar>
+              <w:top w:w="80" w:type="dxa"/>
+              <w:bottom w:w="80" w:type="dxa"/>
+              <w:left w:w="100" w:type="dxa"/>
+              <w:right w:w="100" w:type="dxa"/>
+            </w:tcMar>
+          </w:tcPr>
+          <w:p>
+            <w:pPr>
+              <w:jc w:val="center"/>
+            </w:pPr>
+            <w:r>
+              <w:rPr>
+                <w:rFonts w:ascii="Times New Roman" w:hAnsi="Times New Roman"/>
+                <w:sz w:val="20"/>
+              </w:rPr>
+              <w:t>0.30% tổng đơn</w:t>
+            </w:r>
+          </w:p>
+        </w:tc>
+        <w:tc>
+          <w:tcPr>
+            <w:tcW w:type="dxa" w:w="2268"/>
+            <w:shd w:fill="F9FBF9"/>
+            <w:tcMar>
+              <w:top w:w="80" w:type="dxa"/>
+              <w:bottom w:w="80" w:type="dxa"/>
+              <w:left w:w="100" w:type="dxa"/>
+              <w:right w:w="100" w:type="dxa"/>
+            </w:tcMar>
+          </w:tcPr>
+          <w:p>
+            <w:pPr>
+              <w:jc w:val="center"/>
+            </w:pPr>
+            <w:r>
+              <w:rPr>
+                <w:rFonts w:ascii="Times New Roman" w:hAnsi="Times New Roman"/>
+                <w:sz w:val="20"/>
+              </w:rPr>
+              <w:t>0.80% tổng đơn</w:t>
+            </w:r>
+          </w:p>
+        </w:tc>
+      </w:tr>
+      <w:tr>
+        <w:tc>
+          <w:tcPr>
+            <w:tcW w:type="dxa" w:w="2268"/>
+            <w:shd w:fill="FFFFFF"/>
+            <w:tcMar>
+              <w:top w:w="80" w:type="dxa"/>
+              <w:bottom w:w="80" w:type="dxa"/>
+              <w:left w:w="100" w:type="dxa"/>
+              <w:right w:w="100" w:type="dxa"/>
+            </w:tcMar>
+          </w:tcPr>
+          <w:p>
+            <w:pPr>
+              <w:jc w:val="left"/>
+            </w:pPr>
+            <w:r>
+              <w:rPr>
+                <w:rFonts w:ascii="Times New Roman" w:hAnsi="Times New Roman"/>
+                <w:sz w:val="20"/>
+              </w:rPr>
+              <w:t>Doanh thu thuần sàn thu được / đơn</w:t>
+            </w:r>
+          </w:p>
+        </w:tc>
+        <w:tc>
+          <w:tcPr>
+            <w:tcW w:type="dxa" w:w="2268"/>
+            <w:shd w:fill="FFFFFF"/>
+            <w:tcMar>
+              <w:top w:w="80" w:type="dxa"/>
+              <w:bottom w:w="80" w:type="dxa"/>
+              <w:left w:w="100" w:type="dxa"/>
+              <w:right w:w="100" w:type="dxa"/>
+            </w:tcMar>
+          </w:tcPr>
+          <w:p>
+            <w:pPr>
+              <w:jc w:val="center"/>
+            </w:pPr>
+            <w:r>
+              <w:rPr>
+                <w:rFonts w:ascii="Times New Roman" w:hAnsi="Times New Roman"/>
+                <w:sz w:val="20"/>
+              </w:rPr>
+              <w:t>44.000 VNĐ</w:t>
+            </w:r>
+          </w:p>
+        </w:tc>
+        <w:tc>
+          <w:tcPr>
+            <w:tcW w:type="dxa" w:w="2268"/>
+            <w:shd w:fill="FFFFFF"/>
+            <w:tcMar>
+              <w:top w:w="80" w:type="dxa"/>
+              <w:bottom w:w="80" w:type="dxa"/>
+              <w:left w:w="100" w:type="dxa"/>
+              <w:right w:w="100" w:type="dxa"/>
+            </w:tcMar>
+          </w:tcPr>
+          <w:p>
+            <w:pPr>
+              <w:jc w:val="center"/>
+            </w:pPr>
+            <w:r>
+              <w:rPr>
+                <w:rFonts w:ascii="Times New Roman" w:hAnsi="Times New Roman"/>
+                <w:sz w:val="20"/>
+              </w:rPr>
+              <w:t>44.000 VNĐ</w:t>
+            </w:r>
+          </w:p>
+        </w:tc>
+        <w:tc>
+          <w:tcPr>
+            <w:tcW w:type="dxa" w:w="2268"/>
+            <w:shd w:fill="FFFFFF"/>
+            <w:tcMar>
+              <w:top w:w="80" w:type="dxa"/>
+              <w:bottom w:w="80" w:type="dxa"/>
+              <w:left w:w="100" w:type="dxa"/>
+              <w:right w:w="100" w:type="dxa"/>
+            </w:tcMar>
+          </w:tcPr>
+          <w:p>
+            <w:pPr>
+              <w:jc w:val="center"/>
+            </w:pPr>
+            <w:r>
+              <w:rPr>
+                <w:rFonts w:ascii="Times New Roman" w:hAnsi="Times New Roman"/>
+                <w:sz w:val="20"/>
+              </w:rPr>
+              <w:t>44.000 VNĐ</w:t>
+            </w:r>
+          </w:p>
+        </w:tc>
+      </w:tr>
+      <w:tr>
+        <w:tc>
+          <w:tcPr>
+            <w:tcW w:type="dxa" w:w="2268"/>
+            <w:shd w:fill="F9FBF9"/>
+            <w:tcMar>
+              <w:top w:w="80" w:type="dxa"/>
+              <w:bottom w:w="80" w:type="dxa"/>
+              <w:left w:w="100" w:type="dxa"/>
+              <w:right w:w="100" w:type="dxa"/>
+            </w:tcMar>
+          </w:tcPr>
+          <w:p>
+            <w:pPr>
+              <w:jc w:val="left"/>
+            </w:pPr>
+            <w:r>
+              <w:rPr>
+                <w:rFonts w:ascii="Times New Roman" w:hAnsi="Times New Roman"/>
+                <w:sz w:val="20"/>
+              </w:rPr>
+              <w:t>Chi phí rủi ro &amp; bồi thường dự kiến / đơn</w:t>
+            </w:r>
+          </w:p>
+        </w:tc>
+        <w:tc>
+          <w:tcPr>
+            <w:tcW w:type="dxa" w:w="2268"/>
+            <w:shd w:fill="F9FBF9"/>
+            <w:tcMar>
+              <w:top w:w="80" w:type="dxa"/>
+              <w:bottom w:w="80" w:type="dxa"/>
+              <w:left w:w="100" w:type="dxa"/>
+              <w:right w:w="100" w:type="dxa"/>
+            </w:tcMar>
+          </w:tcPr>
+          <w:p>
+            <w:pPr>
+              <w:jc w:val="center"/>
+            </w:pPr>
+            <w:r>
+              <w:rPr>
+                <w:rFonts w:ascii="Times New Roman" w:hAnsi="Times New Roman"/>
+                <w:sz w:val="20"/>
+              </w:rPr>
+              <w:t>3.500 VNĐ</w:t>
+            </w:r>
+          </w:p>
+        </w:tc>
+        <w:tc>
+          <w:tcPr>
+            <w:tcW w:type="dxa" w:w="2268"/>
+            <w:shd w:fill="F9FBF9"/>
+            <w:tcMar>
+              <w:top w:w="80" w:type="dxa"/>
+              <w:bottom w:w="80" w:type="dxa"/>
+              <w:left w:w="100" w:type="dxa"/>
+              <w:right w:w="100" w:type="dxa"/>
+            </w:tcMar>
+          </w:tcPr>
+          <w:p>
+            <w:pPr>
+              <w:jc w:val="center"/>
+            </w:pPr>
+            <w:r>
+              <w:rPr>
+                <w:rFonts w:ascii="Times New Roman" w:hAnsi="Times New Roman"/>
+                <w:sz w:val="20"/>
+              </w:rPr>
+              <w:t>8.500 VNĐ</w:t>
+            </w:r>
+          </w:p>
+        </w:tc>
+        <w:tc>
+          <w:tcPr>
+            <w:tcW w:type="dxa" w:w="2268"/>
+            <w:shd w:fill="F9FBF9"/>
+            <w:tcMar>
+              <w:top w:w="80" w:type="dxa"/>
+              <w:bottom w:w="80" w:type="dxa"/>
+              <w:left w:w="100" w:type="dxa"/>
+              <w:right w:w="100" w:type="dxa"/>
+            </w:tcMar>
+          </w:tcPr>
+          <w:p>
+            <w:pPr>
+              <w:jc w:val="center"/>
+            </w:pPr>
+            <w:r>
+              <w:rPr>
+                <w:rFonts w:ascii="Times New Roman" w:hAnsi="Times New Roman"/>
+                <w:sz w:val="20"/>
+              </w:rPr>
+              <w:t>17.500 VNĐ</w:t>
+            </w:r>
+          </w:p>
+        </w:tc>
+      </w:tr>
+      <w:tr>
+        <w:tc>
+          <w:tcPr>
+            <w:tcW w:type="dxa" w:w="2268"/>
+            <w:shd w:fill="FFFFFF"/>
+            <w:tcMar>
+              <w:top w:w="80" w:type="dxa"/>
+              <w:bottom w:w="80" w:type="dxa"/>
+              <w:left w:w="100" w:type="dxa"/>
+              <w:right w:w="100" w:type="dxa"/>
+            </w:tcMar>
+          </w:tcPr>
+          <w:p>
+            <w:pPr>
+              <w:jc w:val="left"/>
+            </w:pPr>
+            <w:r>
+              <w:rPr>
+                <w:rFonts w:ascii="Times New Roman" w:hAnsi="Times New Roman"/>
+                <w:sz w:val="20"/>
+              </w:rPr>
+              <w:t>Chi phí vận hành cố định (OPEX) / tháng</w:t>
+            </w:r>
+          </w:p>
+        </w:tc>
+        <w:tc>
+          <w:tcPr>
+            <w:tcW w:type="dxa" w:w="2268"/>
+            <w:shd w:fill="FFFFFF"/>
+            <w:tcMar>
+              <w:top w:w="80" w:type="dxa"/>
+              <w:bottom w:w="80" w:type="dxa"/>
+              <w:left w:w="100" w:type="dxa"/>
+              <w:right w:w="100" w:type="dxa"/>
+            </w:tcMar>
+          </w:tcPr>
+          <w:p>
+            <w:pPr>
+              <w:jc w:val="center"/>
+            </w:pPr>
+            <w:r>
+              <w:rPr>
+                <w:rFonts w:ascii="Times New Roman" w:hAnsi="Times New Roman"/>
+                <w:sz w:val="20"/>
+              </w:rPr>
+              <w:t>28.000.000 VNĐ</w:t>
+            </w:r>
+          </w:p>
+        </w:tc>
+        <w:tc>
+          <w:tcPr>
+            <w:tcW w:type="dxa" w:w="2268"/>
+            <w:shd w:fill="FFFFFF"/>
+            <w:tcMar>
+              <w:top w:w="80" w:type="dxa"/>
+              <w:bottom w:w="80" w:type="dxa"/>
+              <w:left w:w="100" w:type="dxa"/>
+              <w:right w:w="100" w:type="dxa"/>
+            </w:tcMar>
+          </w:tcPr>
+          <w:p>
+            <w:pPr>
+              <w:jc w:val="center"/>
+            </w:pPr>
+            <w:r>
+              <w:rPr>
+                <w:rFonts w:ascii="Times New Roman" w:hAnsi="Times New Roman"/>
+                <w:sz w:val="20"/>
+              </w:rPr>
+              <w:t>48.000.000 VNĐ</w:t>
+            </w:r>
+          </w:p>
+        </w:tc>
+        <w:tc>
+          <w:tcPr>
+            <w:tcW w:type="dxa" w:w="2268"/>
+            <w:shd w:fill="FFFFFF"/>
+            <w:tcMar>
+              <w:top w:w="80" w:type="dxa"/>
+              <w:bottom w:w="80" w:type="dxa"/>
+              <w:left w:w="100" w:type="dxa"/>
+              <w:right w:w="100" w:type="dxa"/>
+            </w:tcMar>
+          </w:tcPr>
+          <w:p>
+            <w:pPr>
+              <w:jc w:val="center"/>
+            </w:pPr>
+            <w:r>
+              <w:rPr>
+                <w:rFonts w:ascii="Times New Roman" w:hAnsi="Times New Roman"/>
+                <w:sz w:val="20"/>
+              </w:rPr>
+              <w:t>70.000.000 VNĐ</w:t>
+            </w:r>
+          </w:p>
+        </w:tc>
+      </w:tr>
+      <w:tr>
+        <w:tc>
+          <w:tcPr>
+            <w:tcW w:type="dxa" w:w="2268"/>
+            <w:shd w:fill="F9FBF9"/>
+            <w:tcMar>
+              <w:top w:w="80" w:type="dxa"/>
+              <w:bottom w:w="80" w:type="dxa"/>
+              <w:left w:w="100" w:type="dxa"/>
+              <w:right w:w="100" w:type="dxa"/>
+            </w:tcMar>
+          </w:tcPr>
+          <w:p>
+            <w:pPr>
+              <w:jc w:val="left"/>
+            </w:pPr>
+            <w:r>
+              <w:rPr>
+                <w:rFonts w:ascii="Times New Roman" w:hAnsi="Times New Roman"/>
+                <w:b/>
+                <w:color w:val="0F4A34"/>
+                <w:sz w:val="20"/>
+              </w:rPr>
+              <w:t>ĐIỂM HÒA VỐN THỰC TẾ (Break-Even Volume)</w:t>
+            </w:r>
+          </w:p>
+        </w:tc>
+        <w:tc>
+          <w:tcPr>
+            <w:tcW w:type="dxa" w:w="2268"/>
+            <w:shd w:fill="F9FBF9"/>
+            <w:tcMar>
+              <w:top w:w="80" w:type="dxa"/>
+              <w:bottom w:w="80" w:type="dxa"/>
+              <w:left w:w="100" w:type="dxa"/>
+              <w:right w:w="100" w:type="dxa"/>
+            </w:tcMar>
+          </w:tcPr>
+          <w:p>
+            <w:pPr>
+              <w:jc w:val="center"/>
+            </w:pPr>
+            <w:r>
+              <w:rPr>
+                <w:rFonts w:ascii="Times New Roman" w:hAnsi="Times New Roman"/>
+                <w:b/>
+                <w:color w:val="0F4A34"/>
+                <w:sz w:val="20"/>
+              </w:rPr>
+              <w:t>690 đơn / tháng</w:t>
+            </w:r>
+          </w:p>
+        </w:tc>
+        <w:tc>
+          <w:tcPr>
+            <w:tcW w:type="dxa" w:w="2268"/>
+            <w:shd w:fill="F9FBF9"/>
+            <w:tcMar>
+              <w:top w:w="80" w:type="dxa"/>
+              <w:bottom w:w="80" w:type="dxa"/>
+              <w:left w:w="100" w:type="dxa"/>
+              <w:right w:w="100" w:type="dxa"/>
+            </w:tcMar>
+          </w:tcPr>
+          <w:p>
+            <w:pPr>
+              <w:jc w:val="center"/>
+            </w:pPr>
+            <w:r>
+              <w:rPr>
+                <w:rFonts w:ascii="Times New Roman" w:hAnsi="Times New Roman"/>
+                <w:b/>
+                <w:color w:val="0F4A34"/>
+                <w:sz w:val="20"/>
+              </w:rPr>
+              <w:t>1.364 đơn / tháng</w:t>
+            </w:r>
+          </w:p>
+        </w:tc>
+        <w:tc>
+          <w:tcPr>
+            <w:tcW w:type="dxa" w:w="2268"/>
+            <w:shd w:fill="F9FBF9"/>
+            <w:tcMar>
+              <w:top w:w="80" w:type="dxa"/>
+              <w:bottom w:w="80" w:type="dxa"/>
+              <w:left w:w="100" w:type="dxa"/>
+              <w:right w:w="100" w:type="dxa"/>
+            </w:tcMar>
+          </w:tcPr>
+          <w:p>
+            <w:pPr>
+              <w:jc w:val="center"/>
+            </w:pPr>
+            <w:r>
+              <w:rPr>
+                <w:rFonts w:ascii="Times New Roman" w:hAnsi="Times New Roman"/>
+                <w:b/>
+                <w:color w:val="0F4A34"/>
+                <w:sz w:val="20"/>
+              </w:rPr>
+              <w:t>2.667 đơn / tháng</w:t>
+            </w:r>
+          </w:p>
+        </w:tc>
+      </w:tr>
+    </w:tbl>
     <w:p>
       <w:pPr>
         <w:keepNext/>
@@ -5895,7 +6876,7 @@
                 <w:rFonts w:ascii="Times New Roman" w:hAnsi="Times New Roman"/>
                 <w:sz w:val="21"/>
               </w:rPr>
-              <w:t>2. Thuật Toán Trust Score &amp; Phân Hạng Tín Nhiệm</w:t>
+              <w:t>2. Thuật Toán Trust Score &amp; Điều Kiện Đa Yếu Tố</w:t>
             </w:r>
           </w:p>
         </w:tc>
@@ -5919,7 +6900,7 @@
                 <w:rFonts w:ascii="Times New Roman" w:hAnsi="Times New Roman"/>
                 <w:sz w:val="21"/>
               </w:rPr>
-              <w:t>5 tests</w:t>
+              <w:t>9 tests</w:t>
             </w:r>
           </w:p>
         </w:tc>
@@ -5943,7 +6924,7 @@
                 <w:rFonts w:ascii="Times New Roman" w:hAnsi="Times New Roman"/>
                 <w:sz w:val="21"/>
               </w:rPr>
-              <w:t>Khởi tạo Level 0, email sinh viên, lũy thừa đơn hàng, trừ điểm khiếu nại</w:t>
+              <w:t>Level 0, Student email không giảm cọc, chống cày đơn ảo, chống thông đồng 1 chủ đồ, hủy cấp khi có tranh chấp</w:t>
             </w:r>
           </w:p>
         </w:tc>
@@ -5967,7 +6948,7 @@
                 <w:rFonts w:ascii="Times New Roman" w:hAnsi="Times New Roman"/>
                 <w:sz w:val="21"/>
               </w:rPr>
-              <w:t>5/5 PASSED (100%)</w:t>
+              <w:t>9/9 PASSED (100%)</w:t>
             </w:r>
           </w:p>
         </w:tc>
@@ -5993,7 +6974,7 @@
                 <w:rFonts w:ascii="Times New Roman" w:hAnsi="Times New Roman"/>
                 <w:sz w:val="21"/>
               </w:rPr>
-              <w:t>3. Công Thức Cọc Động (Dynamic Deposit)</w:t>
+              <w:t>3. Công Thức Cọc Động Bảo Toàn Vốn &amp; Circuit Breaker</w:t>
             </w:r>
           </w:p>
         </w:tc>
@@ -6017,7 +6998,7 @@
                 <w:rFonts w:ascii="Times New Roman" w:hAnsi="Times New Roman"/>
                 <w:sz w:val="21"/>
               </w:rPr>
-              <w:t>6 tests</w:t>
+              <w:t>10 tests</w:t>
             </w:r>
           </w:p>
         </w:tc>
@@ -6041,7 +7022,7 @@
                 <w:rFonts w:ascii="Times New Roman" w:hAnsi="Times New Roman"/>
                 <w:sz w:val="21"/>
               </w:rPr>
-              <w:t>Tỷ lệ cọc 100% -&gt; 75% -&gt; 50% -&gt; 25% -&gt; 0đ, ép cọc 100% khi Fast-Track</w:t>
+              <w:t>Cọc 100% -&gt; 90% -&gt; 80% -&gt; 70%, trần bảo lãnh 200k, ngắt Circuit Breaker tại 30%, cọc 100% khi quỹ &lt; 5tr, hạ cấp khi quỹ 10tr, ép 100% Fast-Track</w:t>
             </w:r>
           </w:p>
         </w:tc>
@@ -6065,7 +7046,7 @@
                 <w:rFonts w:ascii="Times New Roman" w:hAnsi="Times New Roman"/>
                 <w:sz w:val="21"/>
               </w:rPr>
-              <w:t>6/6 PASSED (100%)</w:t>
+              <w:t>10/10 PASSED (100%)</w:t>
             </w:r>
           </w:p>
         </w:tc>
@@ -6091,7 +7072,7 @@
                 <w:rFonts w:ascii="Times New Roman" w:hAnsi="Times New Roman"/>
                 <w:sz w:val="21"/>
               </w:rPr>
-              <w:t>4. Trần Thiệt Hại &amp; Hạn Mức Tín Nhiệm</w:t>
+              <w:t>4. Trần Thiệt Hại &amp; Hạn Mức Fast-Track</w:t>
             </w:r>
           </w:p>
         </w:tc>
@@ -6384,7 +7365,7 @@
           <w:rFonts w:ascii="Times New Roman" w:hAnsi="Times New Roman"/>
           <w:sz w:val="25"/>
         </w:rPr>
-        <w:t>Bên cạnh 23 Unit Tests, bộ 14 Integration Tests (Fail-Closed &amp; Transactions) xác nhận tính toàn vẹn của hệ thống khi chạy thực tế:</w:t>
+        <w:t>Bên cạnh 31 Unit Tests, bộ 14 Integration Tests (Fail-Closed &amp; Transactions) xác nhận tính toàn vẹn của hệ thống khi chạy thực tế (Tổng cộng: 45/45 bài kiểm thử PASSED 100%):</w:t>
       </w:r>
     </w:p>
     <w:p>
@@ -6604,7 +7585,7 @@
           <w:color w:val="0F4A34"/>
           <w:sz w:val="25"/>
         </w:rPr>
-        <w:t>KẾT LUẬN TOÀN DIỆN: Báo cáo v5.0 khẳng định CLOOP không né tránh rủi ro mà trực diện đối thoại và hóa giải 4 Tử huyệt lớn nhất của ngành kinh tế chia sẻ thời trang. Bằng sự kết hợp giữa Digital Damage Protocol, Lớp Điều Phối Thanh Toán VietQR, 4 Lớp Phòng Tuyến Fast-Track, Khung Bảo Vệ Dữ Liệu Cá Nhân Chuẩn Luật 91/2025/QH15, Bộ Kiểm Thử Tự Động 37/37 PASSED và Lộ trình phân kỳ 3 giai đoạn sắc bén, CLOOP chứng minh năng lực sẵn sàng bảo vệ thành công trước Hội Đồng Giám Khảo Techfest và tự tin tiến vào vòng gọi vốn hạt giống (Seed Round).</w:t>
+        <w:t>KẾT LUẬN TOÀN DIỆN: Báo cáo v5.1 khẳng định CLOOP không né tránh rủi ro mà trực diện đối thoại và hóa giải 4 Tử huyệt lớn nhất của ngành kinh tế chia sẻ thời trang. Bằng sự kết hợp giữa Digital Damage Protocol, Lớp Điều Phối Thanh Toán VietQR, 4 Lớp Phòng Tuyến Fast-Track, Cơ chế Bảo lãnh Cọc Giới hạn Năng lực Quỹ &amp; Circuit Breaker, Khung Bảo Vệ Dữ Liệu Cá Nhân Chuẩn Luật 91/2025/QH15, Bộ Kiểm Thử Tự Động 45/45 PASSED và Lộ trình phân kỳ 3 giai đoạn sắc bén, CLOOP chứng minh năng lực sẵn sàng bảo vệ thành công trước Hội Đồng Giám Khảo Techfest và tự tin tiến vào vòng gọi vốn hạt giống (Seed Round).</w:t>
       </w:r>
     </w:p>
     <w:sectPr>

</xml_diff>